<commit_message>
Remove file-arrival triggers from the workshop
The trigger didn't fire in the Azure test workspace, and only optional parts
used it: the Lab 1 "Event-driven" stretch and smoke test 6. Removed both, the
troubleshooting row and the slide mentions; smoke tests renumbered (now 11).
Handouts and walkthrough rebuilt.

Co-authored-by: Isaac <no-reply@databricks.com>
</commit_message>
<xml_diff>
--- a/facilitator/dist/Workshop_Walkthrough.docx
+++ b/facilitator/dist/Workshop_Walkthrough.docx
@@ -18908,54 +18908,6 @@
           <w:b/>
           <w:bCs/>
         </w:rPr>
-        <w:t xml:space="preserve">Event-driven:</w:t>
-      </w:r>
-      <w:r>
-        <w:t xml:space="preserve"> </w:t>
-      </w:r>
-      <w:r>
-        <w:t xml:space="preserve">in</w:t>
-      </w:r>
-      <w:r>
-        <w:t xml:space="preserve"> </w:t>
-      </w:r>
-      <w:r>
-        <w:rPr>
-          <w:b/>
-          <w:bCs/>
-        </w:rPr>
-        <w:t xml:space="preserve">Jobs &amp; Pipelines</w:t>
-      </w:r>
-      <w:r>
-        <w:t xml:space="preserve">, open your job →</w:t>
-      </w:r>
-      <w:r>
-        <w:t xml:space="preserve"> </w:t>
-      </w:r>
-      <w:r>
-        <w:rPr>
-          <w:b/>
-          <w:bCs/>
-        </w:rPr>
-        <w:t xml:space="preserve">Add trigger → File arrival</w:t>
-      </w:r>
-      <w:r>
-        <w:t xml:space="preserve">, and point it at a folder in a volume in your own schema. Upload a file and watch the run start.</w:t>
-      </w:r>
-    </w:p>
-    <w:p>
-      <w:pPr>
-        <w:pStyle w:val="Compact"/>
-        <w:numPr>
-          <w:ilvl w:val="0"/>
-          <w:numId w:val="1028"/>
-        </w:numPr>
-      </w:pPr>
-      <w:r>
-        <w:rPr>
-          <w:b/>
-          <w:bCs/>
-        </w:rPr>
         <w:t xml:space="preserve">Alerting:</w:t>
       </w:r>
       <w:r>
@@ -24371,105 +24323,6 @@
             </w:pPr>
             <w:r>
               <w:t xml:space="preserve">Ask a facilitator</w:t>
-            </w:r>
-          </w:p>
-        </w:tc>
-      </w:tr>
-      <w:tr>
-        <w:tc>
-          <w:tcPr>
-            <w:tcW w:w="3213" w:type="dxa"/>
-            <w:tcBorders>
-              <w:top w:val="single" w:sz="4" w:space="0" w:color="BFBFBF"/>
-              <w:left w:val="single" w:sz="4" w:space="0" w:color="BFBFBF"/>
-              <w:bottom w:val="single" w:sz="4" w:space="0" w:color="BFBFBF"/>
-              <w:right w:val="single" w:sz="4" w:space="0" w:color="BFBFBF"/>
-            </w:tcBorders>
-          </w:tcPr>
-          <w:p>
-            <w:pPr>
-              <w:pStyle w:val="Compact"/>
-            </w:pPr>
-            <w:r>
-              <w:rPr>
-                <w:b/>
-                <w:bCs/>
-              </w:rPr>
-              <w:t xml:space="preserve">Test connection</w:t>
-            </w:r>
-            <w:r>
-              <w:t xml:space="preserve"> </w:t>
-            </w:r>
-            <w:r>
-              <w:t xml:space="preserve">fails on a file-arrival trigger</w:t>
-            </w:r>
-          </w:p>
-        </w:tc>
-        <w:tc>
-          <w:tcPr>
-            <w:tcW w:w="3213" w:type="dxa"/>
-            <w:tcBorders>
-              <w:top w:val="single" w:sz="4" w:space="0" w:color="BFBFBF"/>
-              <w:left w:val="single" w:sz="4" w:space="0" w:color="BFBFBF"/>
-              <w:bottom w:val="single" w:sz="4" w:space="0" w:color="BFBFBF"/>
-              <w:right w:val="single" w:sz="4" w:space="0" w:color="BFBFBF"/>
-            </w:tcBorders>
-          </w:tcPr>
-          <w:p>
-            <w:pPr>
-              <w:pStyle w:val="Compact"/>
-            </w:pPr>
-            <w:r>
-              <w:t xml:space="preserve">Path isn't a volume or external location, or missing</w:t>
-            </w:r>
-            <w:r>
-              <w:t xml:space="preserve"> </w:t>
-            </w:r>
-            <w:r>
-              <w:rPr>
-                <w:rStyle w:val="VerbatimChar"/>
-              </w:rPr>
-              <w:t xml:space="preserve">READ</w:t>
-            </w:r>
-            <w:r>
-              <w:t xml:space="preserve"> </w:t>
-            </w:r>
-            <w:r>
-              <w:t xml:space="preserve">on it /</w:t>
-            </w:r>
-            <w:r>
-              <w:t xml:space="preserve"> </w:t>
-            </w:r>
-            <w:r>
-              <w:rPr>
-                <w:rStyle w:val="VerbatimChar"/>
-              </w:rPr>
-              <w:t xml:space="preserve">CAN MANAGE</w:t>
-            </w:r>
-            <w:r>
-              <w:t xml:space="preserve"> </w:t>
-            </w:r>
-            <w:r>
-              <w:t xml:space="preserve">on the job</w:t>
-            </w:r>
-          </w:p>
-        </w:tc>
-        <w:tc>
-          <w:tcPr>
-            <w:tcW w:w="3213" w:type="dxa"/>
-            <w:tcBorders>
-              <w:top w:val="single" w:sz="4" w:space="0" w:color="BFBFBF"/>
-              <w:left w:val="single" w:sz="4" w:space="0" w:color="BFBFBF"/>
-              <w:bottom w:val="single" w:sz="4" w:space="0" w:color="BFBFBF"/>
-              <w:right w:val="single" w:sz="4" w:space="0" w:color="BFBFBF"/>
-            </w:tcBorders>
-          </w:tcPr>
-          <w:p>
-            <w:pPr>
-              <w:pStyle w:val="Compact"/>
-            </w:pPr>
-            <w:r>
-              <w:t xml:space="preserve">Use a folder in a volume in your own schema</w:t>
             </w:r>
           </w:p>
         </w:tc>
@@ -24845,7 +24698,7 @@
               <w:pStyle w:val="Compact"/>
             </w:pPr>
             <w:r>
-              <w:t xml:space="preserve">Everything: Designer, Genie Agents, lineage, file-arrival triggers</w:t>
+              <w:t xml:space="preserve">Everything: Designer, Genie Agents, lineage</w:t>
             </w:r>
           </w:p>
         </w:tc>
@@ -29054,110 +28907,6 @@
               <w:pStyle w:val="Compact"/>
             </w:pPr>
             <w:r>
-              <w:t xml:space="preserve">On that job,</w:t>
-            </w:r>
-            <w:r>
-              <w:t xml:space="preserve"> </w:t>
-            </w:r>
-            <w:r>
-              <w:rPr>
-                <w:b/>
-                <w:bCs/>
-              </w:rPr>
-              <w:t xml:space="preserve">Add trigger → File arrival</w:t>
-            </w:r>
-            <w:r>
-              <w:t xml:space="preserve"> </w:t>
-            </w:r>
-            <w:r>
-              <w:t xml:space="preserve">on a folder in your own volume →</w:t>
-            </w:r>
-            <w:r>
-              <w:t xml:space="preserve"> </w:t>
-            </w:r>
-            <w:r>
-              <w:rPr>
-                <w:b/>
-                <w:bCs/>
-              </w:rPr>
-              <w:t xml:space="preserve">Test connection</w:t>
-            </w:r>
-          </w:p>
-        </w:tc>
-        <w:tc>
-          <w:tcPr>
-            <w:tcW w:w="3122" w:type="dxa"/>
-            <w:tcBorders>
-              <w:top w:val="single" w:sz="4" w:space="0" w:color="BFBFBF"/>
-              <w:left w:val="single" w:sz="4" w:space="0" w:color="BFBFBF"/>
-              <w:bottom w:val="single" w:sz="4" w:space="0" w:color="BFBFBF"/>
-              <w:right w:val="single" w:sz="4" w:space="0" w:color="BFBFBF"/>
-            </w:tcBorders>
-          </w:tcPr>
-          <w:p>
-            <w:pPr>
-              <w:pStyle w:val="Compact"/>
-            </w:pPr>
-            <w:r>
-              <w:t xml:space="preserve">Connection succeeds</w:t>
-            </w:r>
-          </w:p>
-        </w:tc>
-        <w:tc>
-          <w:tcPr>
-            <w:tcW w:w="2739" w:type="dxa"/>
-            <w:tcBorders>
-              <w:top w:val="single" w:sz="4" w:space="0" w:color="BFBFBF"/>
-              <w:left w:val="single" w:sz="4" w:space="0" w:color="BFBFBF"/>
-              <w:bottom w:val="single" w:sz="4" w:space="0" w:color="BFBFBF"/>
-              <w:right w:val="single" w:sz="4" w:space="0" w:color="BFBFBF"/>
-            </w:tcBorders>
-          </w:tcPr>
-          <w:p>
-            <w:pPr>
-              <w:pStyle w:val="Compact"/>
-            </w:pPr>
-            <w:r>
-              <w:t xml:space="preserve">File-arrival triggers</w:t>
-            </w:r>
-          </w:p>
-        </w:tc>
-      </w:tr>
-      <w:tr>
-        <w:tc>
-          <w:tcPr>
-            <w:tcW w:w="490" w:type="dxa"/>
-            <w:tcBorders>
-              <w:top w:val="single" w:sz="4" w:space="0" w:color="BFBFBF"/>
-              <w:left w:val="single" w:sz="4" w:space="0" w:color="BFBFBF"/>
-              <w:bottom w:val="single" w:sz="4" w:space="0" w:color="BFBFBF"/>
-              <w:right w:val="single" w:sz="4" w:space="0" w:color="BFBFBF"/>
-            </w:tcBorders>
-          </w:tcPr>
-          <w:p>
-            <w:pPr>
-              <w:pStyle w:val="Compact"/>
-            </w:pPr>
-            <w:r>
-              <w:t xml:space="preserve">7</w:t>
-            </w:r>
-          </w:p>
-        </w:tc>
-        <w:tc>
-          <w:tcPr>
-            <w:tcW w:w="3287" w:type="dxa"/>
-            <w:tcBorders>
-              <w:top w:val="single" w:sz="4" w:space="0" w:color="BFBFBF"/>
-              <w:left w:val="single" w:sz="4" w:space="0" w:color="BFBFBF"/>
-              <w:bottom w:val="single" w:sz="4" w:space="0" w:color="BFBFBF"/>
-              <w:right w:val="single" w:sz="4" w:space="0" w:color="BFBFBF"/>
-            </w:tcBorders>
-          </w:tcPr>
-          <w:p>
-            <w:pPr>
-              <w:pStyle w:val="Compact"/>
-            </w:pPr>
-            <w:r>
               <w:rPr>
                 <w:b/>
                 <w:bCs/>
@@ -29246,7 +28995,7 @@
               <w:pStyle w:val="Compact"/>
             </w:pPr>
             <w:r>
-              <w:t xml:space="preserve">8</w:t>
+              <w:t xml:space="preserve">7</w:t>
             </w:r>
           </w:p>
         </w:tc>
@@ -29357,7 +29106,7 @@
               <w:pStyle w:val="Compact"/>
             </w:pPr>
             <w:r>
-              <w:t xml:space="preserve">9</w:t>
+              <w:t xml:space="preserve">8</w:t>
             </w:r>
           </w:p>
         </w:tc>
@@ -29450,7 +29199,7 @@
               <w:pStyle w:val="Compact"/>
             </w:pPr>
             <w:r>
-              <w:t xml:space="preserve">10</w:t>
+              <w:t xml:space="preserve">9</w:t>
             </w:r>
           </w:p>
         </w:tc>
@@ -29538,7 +29287,7 @@
               <w:pStyle w:val="Compact"/>
             </w:pPr>
             <w:r>
-              <w:t xml:space="preserve">11</w:t>
+              <w:t xml:space="preserve">10</w:t>
             </w:r>
           </w:p>
         </w:tc>
@@ -29632,7 +29381,7 @@
               <w:pStyle w:val="Compact"/>
             </w:pPr>
             <w:r>
-              <w:t xml:space="preserve">12</w:t>
+              <w:t xml:space="preserve">11</w:t>
             </w:r>
           </w:p>
         </w:tc>
@@ -33447,18 +33196,6 @@
       </w:pPr>
       <w:r>
         <w:t xml:space="preserve">Engineer's path: Genie Code in agent mode, with expectations, for example CONSTRAINT valid_commitment EXPECT (committed_amount &gt; 0) ON VIOLATION DROP ROW. Compare the data-quality metrics with the Guardrails output.</w:t>
-      </w:r>
-    </w:p>
-    <w:p>
-      <w:pPr>
-        <w:pStyle w:val="Compact"/>
-        <w:numPr>
-          <w:ilvl w:val="0"/>
-          <w:numId w:val="1066"/>
-        </w:numPr>
-      </w:pPr>
-      <w:r>
-        <w:t xml:space="preserve">Event-driven: Jobs &amp; Pipelines → your job → Add trigger → File arrival, pointed at a folder in a volume in your own schema.</w:t>
       </w:r>
     </w:p>
     <w:p>

</xml_diff>

<commit_message>
Remove the group requirement and use any SQL warehouse
The setup no longer needs attendee or facilitator groups. It assumes
attendees have access to smbc_workshop (guide 3.6 has the grants), shares
with the workspace's built-in users group, and lists facilitators by
email. It uses an existing pro or serverless warehouse instead of creating
one. Attendees create their Lab 1 schema with the new check-in block.

The catalog is now created only when it's missing: CREATE CATALOG IF NOT
EXISTS fails on metastores without root storage even when it exists.

Co-authored-by: Isaac <no-reply@databricks.com>
</commit_message>
<xml_diff>
--- a/facilitator/dist/Workshop_Walkthrough.docx
+++ b/facilitator/dist/Workshop_Walkthrough.docx
@@ -3819,7 +3819,37 @@
               <w:t xml:space="preserve"> </w:t>
             </w:r>
             <w:r>
-              <w:t xml:space="preserve">(guide §4). It should finish with "none failed". Then set up the Genie One homepage (guide §3.3)</w:t>
+              <w:t xml:space="preserve">(guide §4). It should finish with "none failed" and name the SQL warehouse to give attendees. Then grant attendees access to</w:t>
+            </w:r>
+            <w:r>
+              <w:t xml:space="preserve"> </w:t>
+            </w:r>
+            <w:r>
+              <w:rPr>
+                <w:rStyle w:val="VerbatimChar"/>
+              </w:rPr>
+              <w:t xml:space="preserve">smbc_workshop</w:t>
+            </w:r>
+            <w:r>
+              <w:t xml:space="preserve"> </w:t>
+            </w:r>
+            <w:r>
+              <w:t xml:space="preserve">(guide §3.6), run</w:t>
+            </w:r>
+            <w:r>
+              <w:t xml:space="preserve"> </w:t>
+            </w:r>
+            <w:r>
+              <w:rPr>
+                <w:rStyle w:val="VerbatimChar"/>
+              </w:rPr>
+              <w:t xml:space="preserve">07_check_requirements</w:t>
+            </w:r>
+            <w:r>
+              <w:t xml:space="preserve"> </w:t>
+            </w:r>
+            <w:r>
+              <w:t xml:space="preserve">again, and set up the Genie One homepage (guide §3.3)</w:t>
             </w:r>
           </w:p>
         </w:tc>
@@ -3937,7 +3967,7 @@
               <w:pStyle w:val="Compact"/>
             </w:pPr>
             <w:r>
-              <w:t xml:space="preserve">Send the pre-work email (guide §5). Agree the executive briefing with Richard and Peter (section 7)</w:t>
+              <w:t xml:space="preserve">Send the pre-work email (guide §5), with the workspace URL and warehouse name filled in. Agree the executive briefing with Richard and Peter (section 7)</w:t>
             </w:r>
           </w:p>
         </w:tc>
@@ -4123,7 +4153,108 @@
               <w:pStyle w:val="Compact"/>
             </w:pPr>
             <w:r>
-              <w:t xml:space="preserve">Late registrations: add their emails to</w:t>
+              <w:t xml:space="preserve">Late registrations: check they can sign in and have access to</w:t>
+            </w:r>
+            <w:r>
+              <w:t xml:space="preserve"> </w:t>
+            </w:r>
+            <w:r>
+              <w:rPr>
+                <w:rStyle w:val="VerbatimChar"/>
+              </w:rPr>
+              <w:t xml:space="preserve">smbc_workshop</w:t>
+            </w:r>
+            <w:r>
+              <w:t xml:space="preserve">; their check-in creates their schema. Then run</w:t>
+            </w:r>
+            <w:r>
+              <w:t xml:space="preserve"> </w:t>
+            </w:r>
+            <w:r>
+              <w:rPr>
+                <w:rStyle w:val="VerbatimChar"/>
+              </w:rPr>
+              <w:t xml:space="preserve">08_reset_or_teardown</w:t>
+            </w:r>
+            <w:r>
+              <w:t xml:space="preserve"> </w:t>
+            </w:r>
+            <w:r>
+              <w:t xml:space="preserve">→</w:t>
+            </w:r>
+            <w:r>
+              <w:t xml:space="preserve"> </w:t>
+            </w:r>
+            <w:r>
+              <w:rPr>
+                <w:rStyle w:val="VerbatimChar"/>
+              </w:rPr>
+              <w:t xml:space="preserve">reset_progress</w:t>
+            </w:r>
+            <w:r>
+              <w:t xml:space="preserve"> </w:t>
+            </w:r>
+            <w:r>
+              <w:t xml:space="preserve">so the board starts at zero</w:t>
+            </w:r>
+          </w:p>
+        </w:tc>
+        <w:tc>
+          <w:tcPr>
+            <w:tcW w:w="990" w:type="dxa"/>
+            <w:tcBorders>
+              <w:top w:val="single" w:sz="4" w:space="0" w:color="BFBFBF"/>
+              <w:left w:val="single" w:sz="4" w:space="0" w:color="BFBFBF"/>
+              <w:bottom w:val="single" w:sz="4" w:space="0" w:color="BFBFBF"/>
+              <w:right w:val="single" w:sz="4" w:space="0" w:color="BFBFBF"/>
+            </w:tcBorders>
+          </w:tcPr>
+          <w:p>
+            <w:pPr>
+              <w:pStyle w:val="Compact"/>
+            </w:pPr>
+            <w:r>
+              <w:t xml:space="preserve">☐</w:t>
+            </w:r>
+          </w:p>
+        </w:tc>
+      </w:tr>
+      <w:tr>
+        <w:tc>
+          <w:tcPr>
+            <w:tcW w:w="1441" w:type="dxa"/>
+            <w:tcBorders>
+              <w:top w:val="single" w:sz="4" w:space="0" w:color="BFBFBF"/>
+              <w:left w:val="single" w:sz="4" w:space="0" w:color="BFBFBF"/>
+              <w:bottom w:val="single" w:sz="4" w:space="0" w:color="BFBFBF"/>
+              <w:right w:val="single" w:sz="4" w:space="0" w:color="BFBFBF"/>
+            </w:tcBorders>
+          </w:tcPr>
+          <w:p>
+            <w:pPr>
+              <w:pStyle w:val="Compact"/>
+            </w:pPr>
+            <w:r>
+              <w:t xml:space="preserve">Day, −90 min</w:t>
+            </w:r>
+          </w:p>
+        </w:tc>
+        <w:tc>
+          <w:tcPr>
+            <w:tcW w:w="7207" w:type="dxa"/>
+            <w:tcBorders>
+              <w:top w:val="single" w:sz="4" w:space="0" w:color="BFBFBF"/>
+              <w:left w:val="single" w:sz="4" w:space="0" w:color="BFBFBF"/>
+              <w:bottom w:val="single" w:sz="4" w:space="0" w:color="BFBFBF"/>
+              <w:right w:val="single" w:sz="4" w:space="0" w:color="BFBFBF"/>
+            </w:tcBorders>
+          </w:tcPr>
+          <w:p>
+            <w:pPr>
+              <w:pStyle w:val="Compact"/>
+            </w:pPr>
+            <w:r>
+              <w:t xml:space="preserve">Arrive. Test the projector, clicker and Wi-Fi. Open the presenter tabs (section 3). Start the workshop's SQL warehouse (the one</w:t>
             </w:r>
             <w:r>
               <w:t xml:space="preserve"> </w:t>
@@ -4138,124 +4269,7 @@
               <w:t xml:space="preserve"> </w:t>
             </w:r>
             <w:r>
-              <w:t xml:space="preserve">and re-run it, with</w:t>
-            </w:r>
-            <w:r>
-              <w:t xml:space="preserve"> </w:t>
-            </w:r>
-            <w:r>
-              <w:rPr>
-                <w:b/>
-                <w:bCs/>
-              </w:rPr>
-              <w:t xml:space="preserve">Generate the synthetic data</w:t>
-            </w:r>
-            <w:r>
-              <w:t xml:space="preserve"> </w:t>
-            </w:r>
-            <w:r>
-              <w:t xml:space="preserve">set to</w:t>
-            </w:r>
-            <w:r>
-              <w:t xml:space="preserve"> </w:t>
-            </w:r>
-            <w:r>
-              <w:rPr>
-                <w:rStyle w:val="VerbatimChar"/>
-              </w:rPr>
-              <w:t xml:space="preserve">no</w:t>
-            </w:r>
-            <w:r>
-              <w:t xml:space="preserve">. Then run</w:t>
-            </w:r>
-            <w:r>
-              <w:t xml:space="preserve"> </w:t>
-            </w:r>
-            <w:r>
-              <w:rPr>
-                <w:rStyle w:val="VerbatimChar"/>
-              </w:rPr>
-              <w:t xml:space="preserve">08_reset_or_teardown</w:t>
-            </w:r>
-            <w:r>
-              <w:t xml:space="preserve"> </w:t>
-            </w:r>
-            <w:r>
-              <w:t xml:space="preserve">→</w:t>
-            </w:r>
-            <w:r>
-              <w:t xml:space="preserve"> </w:t>
-            </w:r>
-            <w:r>
-              <w:rPr>
-                <w:rStyle w:val="VerbatimChar"/>
-              </w:rPr>
-              <w:t xml:space="preserve">reset_progress</w:t>
-            </w:r>
-            <w:r>
-              <w:t xml:space="preserve"> </w:t>
-            </w:r>
-            <w:r>
-              <w:t xml:space="preserve">so the board starts at zero</w:t>
-            </w:r>
-          </w:p>
-        </w:tc>
-        <w:tc>
-          <w:tcPr>
-            <w:tcW w:w="990" w:type="dxa"/>
-            <w:tcBorders>
-              <w:top w:val="single" w:sz="4" w:space="0" w:color="BFBFBF"/>
-              <w:left w:val="single" w:sz="4" w:space="0" w:color="BFBFBF"/>
-              <w:bottom w:val="single" w:sz="4" w:space="0" w:color="BFBFBF"/>
-              <w:right w:val="single" w:sz="4" w:space="0" w:color="BFBFBF"/>
-            </w:tcBorders>
-          </w:tcPr>
-          <w:p>
-            <w:pPr>
-              <w:pStyle w:val="Compact"/>
-            </w:pPr>
-            <w:r>
-              <w:t xml:space="preserve">☐</w:t>
-            </w:r>
-          </w:p>
-        </w:tc>
-      </w:tr>
-      <w:tr>
-        <w:tc>
-          <w:tcPr>
-            <w:tcW w:w="1441" w:type="dxa"/>
-            <w:tcBorders>
-              <w:top w:val="single" w:sz="4" w:space="0" w:color="BFBFBF"/>
-              <w:left w:val="single" w:sz="4" w:space="0" w:color="BFBFBF"/>
-              <w:bottom w:val="single" w:sz="4" w:space="0" w:color="BFBFBF"/>
-              <w:right w:val="single" w:sz="4" w:space="0" w:color="BFBFBF"/>
-            </w:tcBorders>
-          </w:tcPr>
-          <w:p>
-            <w:pPr>
-              <w:pStyle w:val="Compact"/>
-            </w:pPr>
-            <w:r>
-              <w:t xml:space="preserve">Day, −90 min</w:t>
-            </w:r>
-          </w:p>
-        </w:tc>
-        <w:tc>
-          <w:tcPr>
-            <w:tcW w:w="7207" w:type="dxa"/>
-            <w:tcBorders>
-              <w:top w:val="single" w:sz="4" w:space="0" w:color="BFBFBF"/>
-              <w:left w:val="single" w:sz="4" w:space="0" w:color="BFBFBF"/>
-              <w:bottom w:val="single" w:sz="4" w:space="0" w:color="BFBFBF"/>
-              <w:right w:val="single" w:sz="4" w:space="0" w:color="BFBFBF"/>
-            </w:tcBorders>
-          </w:tcPr>
-          <w:p>
-            <w:pPr>
-              <w:pStyle w:val="Compact"/>
-            </w:pPr>
-            <w:r>
-              <w:t xml:space="preserve">Arrive. Test the projector, clicker and Wi-Fi. Open the presenter tabs (section 3). Start the SQL warehouse and lengthen its auto-stop for the day</w:t>
+              <w:t xml:space="preserve">named) and, if you manage it, lengthen its auto-stop for the day</w:t>
             </w:r>
           </w:p>
         </w:tc>
@@ -6518,7 +6532,7 @@
               <w:pStyle w:val="Compact"/>
             </w:pPr>
             <w:r>
-              <w:t xml:space="preserve">Raise its maximum clusters in SQL Warehouses</w:t>
+              <w:t xml:space="preserve">Raise its maximum clusters in SQL Warehouses, or ask its owner to</w:t>
             </w:r>
           </w:p>
         </w:tc>
@@ -7904,6 +7918,43 @@
       </w:r>
       <w:r>
         <w:t xml:space="preserve">the output location isn't the person's own schema.</w:t>
+      </w:r>
+    </w:p>
+    <w:p>
+      <w:pPr>
+        <w:pStyle w:val="Compact"/>
+        <w:numPr>
+          <w:ilvl w:val="0"/>
+          <w:numId w:val="1014"/>
+        </w:numPr>
+      </w:pPr>
+      <w:r>
+        <w:rPr>
+          <w:b/>
+          <w:bCs/>
+        </w:rPr>
+        <w:t xml:space="preserve">Permission error at check-in:</w:t>
+      </w:r>
+      <w:r>
+        <w:t xml:space="preserve"> </w:t>
+      </w:r>
+      <w:r>
+        <w:t xml:space="preserve">the person doesn't have access to</w:t>
+      </w:r>
+      <w:r>
+        <w:t xml:space="preserve"> </w:t>
+      </w:r>
+      <w:r>
+        <w:rPr>
+          <w:rStyle w:val="VerbatimChar"/>
+        </w:rPr>
+        <w:t xml:space="preserve">smbc_workshop</w:t>
+      </w:r>
+      <w:r>
+        <w:t xml:space="preserve"> </w:t>
+      </w:r>
+      <w:r>
+        <w:t xml:space="preserve">yet (guide §3.6); tell the lab lead.</w:t>
       </w:r>
     </w:p>
     <w:p>
@@ -15203,7 +15254,7 @@
         <w:t xml:space="preserve">SQL Editor</w:t>
       </w:r>
       <w:r>
-        <w:t xml:space="preserve">, choose the</w:t>
+        <w:t xml:space="preserve">, choose the workshop's SQL warehouse (your facilitator will name it), paste this block and click</w:t>
       </w:r>
       <w:r>
         <w:t xml:space="preserve"> </w:t>
@@ -15213,139 +15264,423 @@
           <w:b/>
           <w:bCs/>
         </w:rPr>
-        <w:t xml:space="preserve">SMBC Workshop</w:t>
-      </w:r>
-      <w:r>
-        <w:t xml:space="preserve"> </w:t>
-      </w:r>
-      <w:r>
-        <w:t xml:space="preserve">warehouse, paste this line and click</w:t>
-      </w:r>
-      <w:r>
-        <w:t xml:space="preserve"> </w:t>
-      </w:r>
+        <w:t xml:space="preserve">Run</w:t>
+      </w:r>
+      <w:r>
+        <w:t xml:space="preserve">. It checks you in and creates your schema for Lab 1. Change</w:t>
+      </w:r>
+      <w:r>
+        <w:t xml:space="preserve"> </w:t>
+      </w:r>
+      <w:r>
+        <w:rPr>
+          <w:rStyle w:val="VerbatimChar"/>
+        </w:rPr>
+        <w:t xml:space="preserve">DA</w:t>
+      </w:r>
+      <w:r>
+        <w:t xml:space="preserve"> </w:t>
+      </w:r>
+      <w:r>
+        <w:t xml:space="preserve">to</w:t>
+      </w:r>
+      <w:r>
+        <w:t xml:space="preserve"> </w:t>
+      </w:r>
+      <w:r>
+        <w:rPr>
+          <w:rStyle w:val="VerbatimChar"/>
+        </w:rPr>
+        <w:t xml:space="preserve">DE</w:t>
+      </w:r>
+      <w:r>
+        <w:t xml:space="preserve"> </w:t>
+      </w:r>
+      <w:r>
+        <w:t xml:space="preserve">if you're a data engineer.</w:t>
+      </w:r>
+    </w:p>
+    <w:p>
+      <w:pPr>
+        <w:pStyle w:val="SourceCode"/>
+      </w:pPr>
+      <w:r>
+        <w:rPr>
+          <w:rStyle w:val="CommentTok"/>
+        </w:rPr>
+        <w:t xml:space="preserve">-- Check in and create your Lab 1 schema. Change 'DA' to 'DE' if you're a data engineer.</w:t>
+      </w:r>
+      <w:r>
+        <w:br/>
+      </w:r>
+      <w:r>
+        <w:rPr>
+          <w:rStyle w:val="ControlFlowTok"/>
+        </w:rPr>
+        <w:t xml:space="preserve">BEGIN</w:t>
+      </w:r>
+      <w:r>
+        <w:br/>
+      </w:r>
+      <w:r>
+        <w:rPr>
+          <w:rStyle w:val="NormalTok"/>
+        </w:rPr>
+        <w:t xml:space="preserve">  </w:t>
+      </w:r>
+      <w:r>
+        <w:rPr>
+          <w:rStyle w:val="KeywordTok"/>
+        </w:rPr>
+        <w:t xml:space="preserve">DECLARE</w:t>
+      </w:r>
+      <w:r>
+        <w:rPr>
+          <w:rStyle w:val="NormalTok"/>
+        </w:rPr>
+        <w:t xml:space="preserve"> my_schema STRING </w:t>
+      </w:r>
+      <w:r>
+        <w:rPr>
+          <w:rStyle w:val="KeywordTok"/>
+        </w:rPr>
+        <w:t xml:space="preserve">DEFAULT</w:t>
+      </w:r>
+      <w:r>
+        <w:rPr>
+          <w:rStyle w:val="NormalTok"/>
+        </w:rPr>
+        <w:t xml:space="preserve"> </w:t>
+      </w:r>
+      <w:r>
+        <w:rPr>
+          <w:rStyle w:val="FunctionTok"/>
+        </w:rPr>
+        <w:t xml:space="preserve">regexp_replace</w:t>
+      </w:r>
+      <w:r>
+        <w:rPr>
+          <w:rStyle w:val="NormalTok"/>
+        </w:rPr>
+        <w:t xml:space="preserve">(</w:t>
+      </w:r>
+      <w:r>
+        <w:rPr>
+          <w:rStyle w:val="FunctionTok"/>
+        </w:rPr>
+        <w:t xml:space="preserve">lower</w:t>
+      </w:r>
+      <w:r>
+        <w:rPr>
+          <w:rStyle w:val="NormalTok"/>
+        </w:rPr>
+        <w:t xml:space="preserve">(split_part(current_user(), </w:t>
+      </w:r>
+      <w:r>
+        <w:rPr>
+          <w:rStyle w:val="StringTok"/>
+        </w:rPr>
+        <w:t xml:space="preserve">'@'</w:t>
+      </w:r>
+      <w:r>
+        <w:rPr>
+          <w:rStyle w:val="NormalTok"/>
+        </w:rPr>
+        <w:t xml:space="preserve">, </w:t>
+      </w:r>
+      <w:r>
+        <w:rPr>
+          <w:rStyle w:val="DecValTok"/>
+        </w:rPr>
+        <w:t xml:space="preserve">1</w:t>
+      </w:r>
+      <w:r>
+        <w:rPr>
+          <w:rStyle w:val="NormalTok"/>
+        </w:rPr>
+        <w:t xml:space="preserve">)), </w:t>
+      </w:r>
+      <w:r>
+        <w:rPr>
+          <w:rStyle w:val="StringTok"/>
+        </w:rPr>
+        <w:t xml:space="preserve">'[^a-z0-9_]'</w:t>
+      </w:r>
+      <w:r>
+        <w:rPr>
+          <w:rStyle w:val="NormalTok"/>
+        </w:rPr>
+        <w:t xml:space="preserve">, </w:t>
+      </w:r>
+      <w:r>
+        <w:rPr>
+          <w:rStyle w:val="StringTok"/>
+        </w:rPr>
+        <w:t xml:space="preserve">'_'</w:t>
+      </w:r>
+      <w:r>
+        <w:rPr>
+          <w:rStyle w:val="NormalTok"/>
+        </w:rPr>
+        <w:t xml:space="preserve">);</w:t>
+      </w:r>
+      <w:r>
+        <w:br/>
+      </w:r>
+      <w:r>
+        <w:rPr>
+          <w:rStyle w:val="NormalTok"/>
+        </w:rPr>
+        <w:t xml:space="preserve">  </w:t>
+      </w:r>
+      <w:r>
+        <w:rPr>
+          <w:rStyle w:val="KeywordTok"/>
+        </w:rPr>
+        <w:t xml:space="preserve">INSERT</w:t>
+      </w:r>
+      <w:r>
+        <w:rPr>
+          <w:rStyle w:val="NormalTok"/>
+        </w:rPr>
+        <w:t xml:space="preserve"> </w:t>
+      </w:r>
+      <w:r>
+        <w:rPr>
+          <w:rStyle w:val="KeywordTok"/>
+        </w:rPr>
+        <w:t xml:space="preserve">INTO</w:t>
+      </w:r>
+      <w:r>
+        <w:rPr>
+          <w:rStyle w:val="NormalTok"/>
+        </w:rPr>
+        <w:t xml:space="preserve"> smbc_workshop.ops.checkin </w:t>
+      </w:r>
+      <w:r>
+        <w:rPr>
+          <w:rStyle w:val="KeywordTok"/>
+        </w:rPr>
+        <w:t xml:space="preserve">SELECT</w:t>
+      </w:r>
+      <w:r>
+        <w:rPr>
+          <w:rStyle w:val="NormalTok"/>
+        </w:rPr>
+        <w:t xml:space="preserve"> current_user(), </w:t>
+      </w:r>
+      <w:r>
+        <w:rPr>
+          <w:rStyle w:val="StringTok"/>
+        </w:rPr>
+        <w:t xml:space="preserve">'DA'</w:t>
+      </w:r>
+      <w:r>
+        <w:rPr>
+          <w:rStyle w:val="NormalTok"/>
+        </w:rPr>
+        <w:t xml:space="preserve">, </w:t>
+      </w:r>
+      <w:r>
+        <w:rPr>
+          <w:rStyle w:val="FunctionTok"/>
+        </w:rPr>
+        <w:t xml:space="preserve">current_timestamp</w:t>
+      </w:r>
+      <w:r>
+        <w:rPr>
+          <w:rStyle w:val="NormalTok"/>
+        </w:rPr>
+        <w:t xml:space="preserve">();</w:t>
+      </w:r>
+      <w:r>
+        <w:br/>
+      </w:r>
+      <w:r>
+        <w:rPr>
+          <w:rStyle w:val="NormalTok"/>
+        </w:rPr>
+        <w:t xml:space="preserve">  </w:t>
+      </w:r>
+      <w:r>
+        <w:rPr>
+          <w:rStyle w:val="KeywordTok"/>
+        </w:rPr>
+        <w:t xml:space="preserve">CREATE</w:t>
+      </w:r>
+      <w:r>
+        <w:rPr>
+          <w:rStyle w:val="NormalTok"/>
+        </w:rPr>
+        <w:t xml:space="preserve"> </w:t>
+      </w:r>
+      <w:r>
+        <w:rPr>
+          <w:rStyle w:val="KeywordTok"/>
+        </w:rPr>
+        <w:t xml:space="preserve">SCHEMA</w:t>
+      </w:r>
+      <w:r>
+        <w:rPr>
+          <w:rStyle w:val="NormalTok"/>
+        </w:rPr>
+        <w:t xml:space="preserve"> </w:t>
+      </w:r>
+      <w:r>
+        <w:rPr>
+          <w:rStyle w:val="ControlFlowTok"/>
+        </w:rPr>
+        <w:t xml:space="preserve">IF</w:t>
+      </w:r>
+      <w:r>
+        <w:rPr>
+          <w:rStyle w:val="NormalTok"/>
+        </w:rPr>
+        <w:t xml:space="preserve"> </w:t>
+      </w:r>
+      <w:r>
+        <w:rPr>
+          <w:rStyle w:val="KeywordTok"/>
+        </w:rPr>
+        <w:t xml:space="preserve">NOT</w:t>
+      </w:r>
+      <w:r>
+        <w:rPr>
+          <w:rStyle w:val="NormalTok"/>
+        </w:rPr>
+        <w:t xml:space="preserve"> </w:t>
+      </w:r>
+      <w:r>
+        <w:rPr>
+          <w:rStyle w:val="KeywordTok"/>
+        </w:rPr>
+        <w:t xml:space="preserve">EXISTS</w:t>
+      </w:r>
+      <w:r>
+        <w:rPr>
+          <w:rStyle w:val="NormalTok"/>
+        </w:rPr>
+        <w:t xml:space="preserve"> </w:t>
+      </w:r>
+      <w:r>
+        <w:rPr>
+          <w:rStyle w:val="KeywordTok"/>
+        </w:rPr>
+        <w:t xml:space="preserve">IDENTIFIER</w:t>
+      </w:r>
+      <w:r>
+        <w:rPr>
+          <w:rStyle w:val="NormalTok"/>
+        </w:rPr>
+        <w:t xml:space="preserve">(</w:t>
+      </w:r>
+      <w:r>
+        <w:rPr>
+          <w:rStyle w:val="StringTok"/>
+        </w:rPr>
+        <w:t xml:space="preserve">'smbc_workshop.'</w:t>
+      </w:r>
+      <w:r>
+        <w:rPr>
+          <w:rStyle w:val="NormalTok"/>
+        </w:rPr>
+        <w:t xml:space="preserve"> </w:t>
+      </w:r>
+      <w:r>
+        <w:rPr>
+          <w:rStyle w:val="OperatorTok"/>
+        </w:rPr>
+        <w:t xml:space="preserve">||</w:t>
+      </w:r>
+      <w:r>
+        <w:rPr>
+          <w:rStyle w:val="NormalTok"/>
+        </w:rPr>
+        <w:t xml:space="preserve"> my_schema);</w:t>
+      </w:r>
+      <w:r>
+        <w:br/>
+      </w:r>
+      <w:r>
+        <w:rPr>
+          <w:rStyle w:val="NormalTok"/>
+        </w:rPr>
+        <w:t xml:space="preserve">  </w:t>
+      </w:r>
+      <w:r>
+        <w:rPr>
+          <w:rStyle w:val="KeywordTok"/>
+        </w:rPr>
+        <w:t xml:space="preserve">SELECT</w:t>
+      </w:r>
+      <w:r>
+        <w:rPr>
+          <w:rStyle w:val="NormalTok"/>
+        </w:rPr>
+        <w:t xml:space="preserve"> </w:t>
+      </w:r>
+      <w:r>
+        <w:rPr>
+          <w:rStyle w:val="StringTok"/>
+        </w:rPr>
+        <w:t xml:space="preserve">'smbc_workshop.'</w:t>
+      </w:r>
+      <w:r>
+        <w:rPr>
+          <w:rStyle w:val="NormalTok"/>
+        </w:rPr>
+        <w:t xml:space="preserve"> </w:t>
+      </w:r>
+      <w:r>
+        <w:rPr>
+          <w:rStyle w:val="OperatorTok"/>
+        </w:rPr>
+        <w:t xml:space="preserve">||</w:t>
+      </w:r>
+      <w:r>
+        <w:rPr>
+          <w:rStyle w:val="NormalTok"/>
+        </w:rPr>
+        <w:t xml:space="preserve"> my_schema </w:t>
+      </w:r>
+      <w:r>
+        <w:rPr>
+          <w:rStyle w:val="KeywordTok"/>
+        </w:rPr>
+        <w:t xml:space="preserve">AS</w:t>
+      </w:r>
+      <w:r>
+        <w:rPr>
+          <w:rStyle w:val="NormalTok"/>
+        </w:rPr>
+        <w:t xml:space="preserve"> your_schema;</w:t>
+      </w:r>
+      <w:r>
+        <w:br/>
+      </w:r>
+      <w:r>
+        <w:rPr>
+          <w:rStyle w:val="ControlFlowTok"/>
+        </w:rPr>
+        <w:t xml:space="preserve">END</w:t>
+      </w:r>
+    </w:p>
+    <w:p>
+      <w:pPr>
+        <w:pStyle w:val="FirstParagraph"/>
+      </w:pPr>
       <w:r>
         <w:rPr>
           <w:b/>
           <w:bCs/>
         </w:rPr>
-        <w:t xml:space="preserve">Run</w:t>
-      </w:r>
-      <w:r>
-        <w:t xml:space="preserve">. Change</w:t>
-      </w:r>
-      <w:r>
-        <w:t xml:space="preserve"> </w:t>
-      </w:r>
-      <w:r>
-        <w:rPr>
-          <w:rStyle w:val="VerbatimChar"/>
-        </w:rPr>
-        <w:t xml:space="preserve">DA</w:t>
-      </w:r>
-      <w:r>
-        <w:t xml:space="preserve"> </w:t>
-      </w:r>
-      <w:r>
-        <w:t xml:space="preserve">to</w:t>
-      </w:r>
-      <w:r>
-        <w:t xml:space="preserve"> </w:t>
-      </w:r>
-      <w:r>
-        <w:rPr>
-          <w:rStyle w:val="VerbatimChar"/>
-        </w:rPr>
-        <w:t xml:space="preserve">DE</w:t>
-      </w:r>
-      <w:r>
-        <w:t xml:space="preserve"> </w:t>
-      </w:r>
-      <w:r>
-        <w:t xml:space="preserve">if you're a data engineer.</w:t>
-      </w:r>
-    </w:p>
-    <w:p>
-      <w:pPr>
-        <w:pStyle w:val="SourceCode"/>
-      </w:pPr>
-      <w:r>
-        <w:rPr>
-          <w:rStyle w:val="KeywordTok"/>
-        </w:rPr>
-        <w:t xml:space="preserve">INSERT</w:t>
-      </w:r>
-      <w:r>
-        <w:rPr>
-          <w:rStyle w:val="NormalTok"/>
-        </w:rPr>
-        <w:t xml:space="preserve"> </w:t>
-      </w:r>
-      <w:r>
-        <w:rPr>
-          <w:rStyle w:val="KeywordTok"/>
-        </w:rPr>
-        <w:t xml:space="preserve">INTO</w:t>
-      </w:r>
-      <w:r>
-        <w:rPr>
-          <w:rStyle w:val="NormalTok"/>
-        </w:rPr>
-        <w:t xml:space="preserve"> smbc_workshop.ops.checkin </w:t>
-      </w:r>
-      <w:r>
-        <w:rPr>
-          <w:rStyle w:val="KeywordTok"/>
-        </w:rPr>
-        <w:t xml:space="preserve">SELECT</w:t>
-      </w:r>
-      <w:r>
-        <w:rPr>
-          <w:rStyle w:val="NormalTok"/>
-        </w:rPr>
-        <w:t xml:space="preserve"> current_user(), </w:t>
-      </w:r>
-      <w:r>
-        <w:rPr>
-          <w:rStyle w:val="StringTok"/>
-        </w:rPr>
-        <w:t xml:space="preserve">'DA'</w:t>
-      </w:r>
-      <w:r>
-        <w:rPr>
-          <w:rStyle w:val="NormalTok"/>
-        </w:rPr>
-        <w:t xml:space="preserve">, </w:t>
-      </w:r>
-      <w:r>
-        <w:rPr>
-          <w:rStyle w:val="FunctionTok"/>
-        </w:rPr>
-        <w:t xml:space="preserve">current_timestamp</w:t>
-      </w:r>
-      <w:r>
-        <w:rPr>
-          <w:rStyle w:val="NormalTok"/>
-        </w:rPr>
-        <w:t xml:space="preserve">();</w:t>
-      </w:r>
-    </w:p>
-    <w:p>
-      <w:pPr>
-        <w:pStyle w:val="FirstParagraph"/>
-      </w:pPr>
-      <w:r>
-        <w:rPr>
-          <w:b/>
-          <w:bCs/>
-        </w:rPr>
-        <w:t xml:space="preserve">3. Find your schema.</w:t>
-      </w:r>
-      <w:r>
-        <w:t xml:space="preserve"> </w:t>
-      </w:r>
-      <w:r>
-        <w:t xml:space="preserve">Your Lab 1 tables go in</w:t>
+        <w:t xml:space="preserve">3. Your schema.</w:t>
+      </w:r>
+      <w:r>
+        <w:t xml:space="preserve"> </w:t>
+      </w:r>
+      <w:r>
+        <w:t xml:space="preserve">The check-in shows its name. Your Lab 1 tables go in</w:t>
       </w:r>
       <w:r>
         <w:t xml:space="preserve"> </w:t>
@@ -16804,7 +17139,19 @@
         <w:t xml:space="preserve"> </w:t>
       </w:r>
       <w:r>
-        <w:t xml:space="preserve">In</w:t>
+        <w:t xml:space="preserve">Your check-in created it and showed its name: the part of your email address before the @, for example</w:t>
+      </w:r>
+      <w:r>
+        <w:t xml:space="preserve"> </w:t>
+      </w:r>
+      <w:r>
+        <w:rPr>
+          <w:rStyle w:val="VerbatimChar"/>
+        </w:rPr>
+        <w:t xml:space="preserve">jane_tan</w:t>
+      </w:r>
+      <w:r>
+        <w:t xml:space="preserve">. Find it in</w:t>
       </w:r>
       <w:r>
         <w:t xml:space="preserve"> </w:t>
@@ -16817,7 +17164,10 @@
         <w:t xml:space="preserve">Catalog Explorer</w:t>
       </w:r>
       <w:r>
-        <w:t xml:space="preserve">, open</w:t>
+        <w:t xml:space="preserve"> </w:t>
+      </w:r>
+      <w:r>
+        <w:t xml:space="preserve">→</w:t>
       </w:r>
       <w:r>
         <w:t xml:space="preserve"> </w:t>
@@ -16829,34 +17179,7 @@
         <w:t xml:space="preserve">smbc_workshop</w:t>
       </w:r>
       <w:r>
-        <w:t xml:space="preserve">. Your schema is named after your email address, for example</w:t>
-      </w:r>
-      <w:r>
-        <w:t xml:space="preserve"> </w:t>
-      </w:r>
-      <w:r>
-        <w:rPr>
-          <w:rStyle w:val="VerbatimChar"/>
-        </w:rPr>
-        <w:t xml:space="preserve">jane_tan</w:t>
-      </w:r>
-      <w:r>
-        <w:t xml:space="preserve">. If you don't have one, run</w:t>
-      </w:r>
-      <w:r>
-        <w:t xml:space="preserve"> </w:t>
-      </w:r>
-      <w:r>
-        <w:rPr>
-          <w:rStyle w:val="VerbatimChar"/>
-        </w:rPr>
-        <w:t xml:space="preserve">CREATE SCHEMA smbc_workshop.&lt;your_name&gt;;</w:t>
-      </w:r>
-      <w:r>
-        <w:t xml:space="preserve"> </w:t>
-      </w:r>
-      <w:r>
-        <w:t xml:space="preserve">in the SQL editor.</w:t>
+        <w:t xml:space="preserve">. Not there? Run the check-in block (A.1) again.</w:t>
       </w:r>
     </w:p>
     <w:p>
@@ -19466,20 +19789,7 @@
         <w:t xml:space="preserve"> </w:t>
       </w:r>
       <w:r>
-        <w:t xml:space="preserve">and the default warehouse to</w:t>
-      </w:r>
-      <w:r>
-        <w:t xml:space="preserve"> </w:t>
-      </w:r>
-      <w:r>
-        <w:rPr>
-          <w:b/>
-          <w:bCs/>
-        </w:rPr>
-        <w:t xml:space="preserve">SMBC Workshop</w:t>
-      </w:r>
-      <w:r>
-        <w:t xml:space="preserve">.</w:t>
+        <w:t xml:space="preserve">and the default warehouse to the SQL warehouse you checked in with.</w:t>
       </w:r>
     </w:p>
     <w:p>
@@ -20680,15 +20990,135 @@
         <w:rPr>
           <w:rStyle w:val="CommentTok"/>
         </w:rPr>
-        <w:t xml:space="preserve">-- Check-in (change 'DA' to 'DE' if you're a data engineer)</w:t>
+        <w:t xml:space="preserve">-- Check in and create your Lab 1 schema. Change 'DA' to 'DE' if you're a data engineer.</w:t>
       </w:r>
       <w:r>
         <w:br/>
       </w:r>
       <w:r>
         <w:rPr>
+          <w:rStyle w:val="ControlFlowTok"/>
+        </w:rPr>
+        <w:t xml:space="preserve">BEGIN</w:t>
+      </w:r>
+      <w:r>
+        <w:br/>
+      </w:r>
+      <w:r>
+        <w:rPr>
+          <w:rStyle w:val="NormalTok"/>
+        </w:rPr>
+        <w:t xml:space="preserve">  </w:t>
+      </w:r>
+      <w:r>
+        <w:rPr>
           <w:rStyle w:val="KeywordTok"/>
         </w:rPr>
+        <w:t xml:space="preserve">DECLARE</w:t>
+      </w:r>
+      <w:r>
+        <w:rPr>
+          <w:rStyle w:val="NormalTok"/>
+        </w:rPr>
+        <w:t xml:space="preserve"> my_schema STRING </w:t>
+      </w:r>
+      <w:r>
+        <w:rPr>
+          <w:rStyle w:val="KeywordTok"/>
+        </w:rPr>
+        <w:t xml:space="preserve">DEFAULT</w:t>
+      </w:r>
+      <w:r>
+        <w:rPr>
+          <w:rStyle w:val="NormalTok"/>
+        </w:rPr>
+        <w:t xml:space="preserve"> </w:t>
+      </w:r>
+      <w:r>
+        <w:rPr>
+          <w:rStyle w:val="FunctionTok"/>
+        </w:rPr>
+        <w:t xml:space="preserve">regexp_replace</w:t>
+      </w:r>
+      <w:r>
+        <w:rPr>
+          <w:rStyle w:val="NormalTok"/>
+        </w:rPr>
+        <w:t xml:space="preserve">(</w:t>
+      </w:r>
+      <w:r>
+        <w:rPr>
+          <w:rStyle w:val="FunctionTok"/>
+        </w:rPr>
+        <w:t xml:space="preserve">lower</w:t>
+      </w:r>
+      <w:r>
+        <w:rPr>
+          <w:rStyle w:val="NormalTok"/>
+        </w:rPr>
+        <w:t xml:space="preserve">(split_part(current_user(), </w:t>
+      </w:r>
+      <w:r>
+        <w:rPr>
+          <w:rStyle w:val="StringTok"/>
+        </w:rPr>
+        <w:t xml:space="preserve">'@'</w:t>
+      </w:r>
+      <w:r>
+        <w:rPr>
+          <w:rStyle w:val="NormalTok"/>
+        </w:rPr>
+        <w:t xml:space="preserve">, </w:t>
+      </w:r>
+      <w:r>
+        <w:rPr>
+          <w:rStyle w:val="DecValTok"/>
+        </w:rPr>
+        <w:t xml:space="preserve">1</w:t>
+      </w:r>
+      <w:r>
+        <w:rPr>
+          <w:rStyle w:val="NormalTok"/>
+        </w:rPr>
+        <w:t xml:space="preserve">)), </w:t>
+      </w:r>
+      <w:r>
+        <w:rPr>
+          <w:rStyle w:val="StringTok"/>
+        </w:rPr>
+        <w:t xml:space="preserve">'[^a-z0-9_]'</w:t>
+      </w:r>
+      <w:r>
+        <w:rPr>
+          <w:rStyle w:val="NormalTok"/>
+        </w:rPr>
+        <w:t xml:space="preserve">, </w:t>
+      </w:r>
+      <w:r>
+        <w:rPr>
+          <w:rStyle w:val="StringTok"/>
+        </w:rPr>
+        <w:t xml:space="preserve">'_'</w:t>
+      </w:r>
+      <w:r>
+        <w:rPr>
+          <w:rStyle w:val="NormalTok"/>
+        </w:rPr>
+        <w:t xml:space="preserve">);</w:t>
+      </w:r>
+      <w:r>
+        <w:br/>
+      </w:r>
+      <w:r>
+        <w:rPr>
+          <w:rStyle w:val="NormalTok"/>
+        </w:rPr>
+        <w:t xml:space="preserve">  </w:t>
+      </w:r>
+      <w:r>
+        <w:rPr>
+          <w:rStyle w:val="KeywordTok"/>
+        </w:rPr>
         <w:t xml:space="preserve">INSERT</w:t>
       </w:r>
       <w:r>
@@ -20744,6 +21174,177 @@
           <w:rStyle w:val="NormalTok"/>
         </w:rPr>
         <w:t xml:space="preserve">();</w:t>
+      </w:r>
+      <w:r>
+        <w:br/>
+      </w:r>
+      <w:r>
+        <w:rPr>
+          <w:rStyle w:val="NormalTok"/>
+        </w:rPr>
+        <w:t xml:space="preserve">  </w:t>
+      </w:r>
+      <w:r>
+        <w:rPr>
+          <w:rStyle w:val="KeywordTok"/>
+        </w:rPr>
+        <w:t xml:space="preserve">CREATE</w:t>
+      </w:r>
+      <w:r>
+        <w:rPr>
+          <w:rStyle w:val="NormalTok"/>
+        </w:rPr>
+        <w:t xml:space="preserve"> </w:t>
+      </w:r>
+      <w:r>
+        <w:rPr>
+          <w:rStyle w:val="KeywordTok"/>
+        </w:rPr>
+        <w:t xml:space="preserve">SCHEMA</w:t>
+      </w:r>
+      <w:r>
+        <w:rPr>
+          <w:rStyle w:val="NormalTok"/>
+        </w:rPr>
+        <w:t xml:space="preserve"> </w:t>
+      </w:r>
+      <w:r>
+        <w:rPr>
+          <w:rStyle w:val="ControlFlowTok"/>
+        </w:rPr>
+        <w:t xml:space="preserve">IF</w:t>
+      </w:r>
+      <w:r>
+        <w:rPr>
+          <w:rStyle w:val="NormalTok"/>
+        </w:rPr>
+        <w:t xml:space="preserve"> </w:t>
+      </w:r>
+      <w:r>
+        <w:rPr>
+          <w:rStyle w:val="KeywordTok"/>
+        </w:rPr>
+        <w:t xml:space="preserve">NOT</w:t>
+      </w:r>
+      <w:r>
+        <w:rPr>
+          <w:rStyle w:val="NormalTok"/>
+        </w:rPr>
+        <w:t xml:space="preserve"> </w:t>
+      </w:r>
+      <w:r>
+        <w:rPr>
+          <w:rStyle w:val="KeywordTok"/>
+        </w:rPr>
+        <w:t xml:space="preserve">EXISTS</w:t>
+      </w:r>
+      <w:r>
+        <w:rPr>
+          <w:rStyle w:val="NormalTok"/>
+        </w:rPr>
+        <w:t xml:space="preserve"> </w:t>
+      </w:r>
+      <w:r>
+        <w:rPr>
+          <w:rStyle w:val="KeywordTok"/>
+        </w:rPr>
+        <w:t xml:space="preserve">IDENTIFIER</w:t>
+      </w:r>
+      <w:r>
+        <w:rPr>
+          <w:rStyle w:val="NormalTok"/>
+        </w:rPr>
+        <w:t xml:space="preserve">(</w:t>
+      </w:r>
+      <w:r>
+        <w:rPr>
+          <w:rStyle w:val="StringTok"/>
+        </w:rPr>
+        <w:t xml:space="preserve">'smbc_workshop.'</w:t>
+      </w:r>
+      <w:r>
+        <w:rPr>
+          <w:rStyle w:val="NormalTok"/>
+        </w:rPr>
+        <w:t xml:space="preserve"> </w:t>
+      </w:r>
+      <w:r>
+        <w:rPr>
+          <w:rStyle w:val="OperatorTok"/>
+        </w:rPr>
+        <w:t xml:space="preserve">||</w:t>
+      </w:r>
+      <w:r>
+        <w:rPr>
+          <w:rStyle w:val="NormalTok"/>
+        </w:rPr>
+        <w:t xml:space="preserve"> my_schema);</w:t>
+      </w:r>
+      <w:r>
+        <w:br/>
+      </w:r>
+      <w:r>
+        <w:rPr>
+          <w:rStyle w:val="NormalTok"/>
+        </w:rPr>
+        <w:t xml:space="preserve">  </w:t>
+      </w:r>
+      <w:r>
+        <w:rPr>
+          <w:rStyle w:val="KeywordTok"/>
+        </w:rPr>
+        <w:t xml:space="preserve">SELECT</w:t>
+      </w:r>
+      <w:r>
+        <w:rPr>
+          <w:rStyle w:val="NormalTok"/>
+        </w:rPr>
+        <w:t xml:space="preserve"> </w:t>
+      </w:r>
+      <w:r>
+        <w:rPr>
+          <w:rStyle w:val="StringTok"/>
+        </w:rPr>
+        <w:t xml:space="preserve">'smbc_workshop.'</w:t>
+      </w:r>
+      <w:r>
+        <w:rPr>
+          <w:rStyle w:val="NormalTok"/>
+        </w:rPr>
+        <w:t xml:space="preserve"> </w:t>
+      </w:r>
+      <w:r>
+        <w:rPr>
+          <w:rStyle w:val="OperatorTok"/>
+        </w:rPr>
+        <w:t xml:space="preserve">||</w:t>
+      </w:r>
+      <w:r>
+        <w:rPr>
+          <w:rStyle w:val="NormalTok"/>
+        </w:rPr>
+        <w:t xml:space="preserve"> my_schema </w:t>
+      </w:r>
+      <w:r>
+        <w:rPr>
+          <w:rStyle w:val="KeywordTok"/>
+        </w:rPr>
+        <w:t xml:space="preserve">AS</w:t>
+      </w:r>
+      <w:r>
+        <w:rPr>
+          <w:rStyle w:val="NormalTok"/>
+        </w:rPr>
+        <w:t xml:space="preserve"> your_schema;</w:t>
+      </w:r>
+      <w:r>
+        <w:br/>
+      </w:r>
+      <w:r>
+        <w:rPr>
+          <w:rStyle w:val="ControlFlowTok"/>
+        </w:rPr>
+        <w:t xml:space="preserve">END</w:t>
       </w:r>
       <w:r>
         <w:br/>
@@ -23642,7 +24243,7 @@
               <w:pStyle w:val="Compact"/>
             </w:pPr>
             <w:r>
-              <w:t xml:space="preserve">Can't see the</w:t>
+              <w:t xml:space="preserve">The check-in fails with a permission error, or you can't see the</w:t>
             </w:r>
             <w:r>
               <w:t xml:space="preserve"> </w:t>
@@ -23676,7 +24277,7 @@
               <w:pStyle w:val="Compact"/>
             </w:pPr>
             <w:r>
-              <w:t xml:space="preserve">Missing</w:t>
+              <w:t xml:space="preserve">No access to</w:t>
             </w:r>
             <w:r>
               <w:t xml:space="preserve"> </w:t>
@@ -23685,13 +24286,13 @@
               <w:rPr>
                 <w:rStyle w:val="VerbatimChar"/>
               </w:rPr>
-              <w:t xml:space="preserve">READ VOLUME</w:t>
+              <w:t xml:space="preserve">smbc_workshop</w:t>
             </w:r>
             <w:r>
               <w:t xml:space="preserve"> </w:t>
             </w:r>
             <w:r>
-              <w:t xml:space="preserve">grant</w:t>
+              <w:t xml:space="preserve">yet</w:t>
             </w:r>
           </w:p>
         </w:tc>
@@ -24451,6 +25052,54 @@
       </w:r>
       <w:r>
         <w:t xml:space="preserve">(item 5).</w:t>
+      </w:r>
+    </w:p>
+    <w:p>
+      <w:pPr>
+        <w:pStyle w:val="BodyText"/>
+      </w:pPr>
+      <w:r>
+        <w:rPr>
+          <w:b/>
+          <w:bCs/>
+        </w:rPr>
+        <w:t xml:space="preserve">No groups are needed.</w:t>
+      </w:r>
+      <w:r>
+        <w:t xml:space="preserve"> </w:t>
+      </w:r>
+      <w:r>
+        <w:t xml:space="preserve">The setup shares everything with the workspace's built-in</w:t>
+      </w:r>
+      <w:r>
+        <w:t xml:space="preserve"> </w:t>
+      </w:r>
+      <w:r>
+        <w:rPr>
+          <w:rStyle w:val="VerbatimChar"/>
+        </w:rPr>
+        <w:t xml:space="preserve">users</w:t>
+      </w:r>
+      <w:r>
+        <w:t xml:space="preserve"> </w:t>
+      </w:r>
+      <w:r>
+        <w:t xml:space="preserve">group (everyone in the workspace) and recognises facilitators by email. Attendees need access to the</w:t>
+      </w:r>
+      <w:r>
+        <w:t xml:space="preserve"> </w:t>
+      </w:r>
+      <w:r>
+        <w:rPr>
+          <w:rStyle w:val="VerbatimChar"/>
+        </w:rPr>
+        <w:t xml:space="preserve">smbc_workshop</w:t>
+      </w:r>
+      <w:r>
+        <w:t xml:space="preserve"> </w:t>
+      </w:r>
+      <w:r>
+        <w:t xml:space="preserve">catalog (3.6) and to a SQL warehouse (3.4).</w:t>
       </w:r>
     </w:p>
     <w:bookmarkStart w:id="72" w:name="X5dc5dde3a9df68ef729f99e5eb74bd5ff0be601"/>
@@ -24470,13 +25119,13 @@
         <w:tblLook w:firstRow="1" w:lastRow="0" w:firstColumn="0" w:lastColumn="0" w:noHBand="0" w:noVBand="0" w:val="0020"/>
       </w:tblPr>
       <w:tblGrid>
-        <w:gridCol w:w="395"/>
-        <w:gridCol w:w="1705"/>
-        <w:gridCol w:w="1806"/>
-        <w:gridCol w:w="2331"/>
-        <w:gridCol w:w="1100"/>
-        <w:gridCol w:w="1503"/>
-        <w:gridCol w:w="798"/>
+        <w:gridCol w:w="447"/>
+        <w:gridCol w:w="1931"/>
+        <w:gridCol w:w="2045"/>
+        <w:gridCol w:w="1361"/>
+        <w:gridCol w:w="1246"/>
+        <w:gridCol w:w="1703"/>
+        <w:gridCol w:w="904"/>
       </w:tblGrid>
       <w:tr>
         <w:trPr>
@@ -24484,7 +25133,7 @@
         </w:trPr>
         <w:tc>
           <w:tcPr>
-            <w:tcW w:w="395" w:type="dxa"/>
+            <w:tcW w:w="447" w:type="dxa"/>
             <w:tcBorders>
               <w:top w:val="single" w:sz="4" w:space="0" w:color="BFBFBF"/>
               <w:left w:val="single" w:sz="4" w:space="0" w:color="BFBFBF"/>
@@ -24507,7 +25156,7 @@
         </w:tc>
         <w:tc>
           <w:tcPr>
-            <w:tcW w:w="1705" w:type="dxa"/>
+            <w:tcW w:w="1931" w:type="dxa"/>
             <w:tcBorders>
               <w:top w:val="single" w:sz="4" w:space="0" w:color="BFBFBF"/>
               <w:left w:val="single" w:sz="4" w:space="0" w:color="BFBFBF"/>
@@ -24530,7 +25179,7 @@
         </w:tc>
         <w:tc>
           <w:tcPr>
-            <w:tcW w:w="1806" w:type="dxa"/>
+            <w:tcW w:w="2045" w:type="dxa"/>
             <w:tcBorders>
               <w:top w:val="single" w:sz="4" w:space="0" w:color="BFBFBF"/>
               <w:left w:val="single" w:sz="4" w:space="0" w:color="BFBFBF"/>
@@ -24553,7 +25202,7 @@
         </w:tc>
         <w:tc>
           <w:tcPr>
-            <w:tcW w:w="2331" w:type="dxa"/>
+            <w:tcW w:w="1361" w:type="dxa"/>
             <w:tcBorders>
               <w:top w:val="single" w:sz="4" w:space="0" w:color="BFBFBF"/>
               <w:left w:val="single" w:sz="4" w:space="0" w:color="BFBFBF"/>
@@ -24576,7 +25225,7 @@
         </w:tc>
         <w:tc>
           <w:tcPr>
-            <w:tcW w:w="1100" w:type="dxa"/>
+            <w:tcW w:w="1246" w:type="dxa"/>
             <w:tcBorders>
               <w:top w:val="single" w:sz="4" w:space="0" w:color="BFBFBF"/>
               <w:left w:val="single" w:sz="4" w:space="0" w:color="BFBFBF"/>
@@ -24599,7 +25248,7 @@
         </w:tc>
         <w:tc>
           <w:tcPr>
-            <w:tcW w:w="1503" w:type="dxa"/>
+            <w:tcW w:w="1703" w:type="dxa"/>
             <w:tcBorders>
               <w:top w:val="single" w:sz="4" w:space="0" w:color="BFBFBF"/>
               <w:left w:val="single" w:sz="4" w:space="0" w:color="BFBFBF"/>
@@ -24622,7 +25271,7 @@
         </w:tc>
         <w:tc>
           <w:tcPr>
-            <w:tcW w:w="798" w:type="dxa"/>
+            <w:tcW w:w="904" w:type="dxa"/>
             <w:tcBorders>
               <w:top w:val="single" w:sz="4" w:space="0" w:color="BFBFBF"/>
               <w:left w:val="single" w:sz="4" w:space="0" w:color="BFBFBF"/>
@@ -24647,7 +25296,7 @@
       <w:tr>
         <w:tc>
           <w:tcPr>
-            <w:tcW w:w="395" w:type="dxa"/>
+            <w:tcW w:w="447" w:type="dxa"/>
             <w:tcBorders>
               <w:top w:val="single" w:sz="4" w:space="0" w:color="BFBFBF"/>
               <w:left w:val="single" w:sz="4" w:space="0" w:color="BFBFBF"/>
@@ -24666,7 +25315,7 @@
         </w:tc>
         <w:tc>
           <w:tcPr>
-            <w:tcW w:w="1705" w:type="dxa"/>
+            <w:tcW w:w="1931" w:type="dxa"/>
             <w:tcBorders>
               <w:top w:val="single" w:sz="4" w:space="0" w:color="BFBFBF"/>
               <w:left w:val="single" w:sz="4" w:space="0" w:color="BFBFBF"/>
@@ -24685,7 +25334,7 @@
         </w:tc>
         <w:tc>
           <w:tcPr>
-            <w:tcW w:w="1806" w:type="dxa"/>
+            <w:tcW w:w="2045" w:type="dxa"/>
             <w:tcBorders>
               <w:top w:val="single" w:sz="4" w:space="0" w:color="BFBFBF"/>
               <w:left w:val="single" w:sz="4" w:space="0" w:color="BFBFBF"/>
@@ -24704,7 +25353,7 @@
         </w:tc>
         <w:tc>
           <w:tcPr>
-            <w:tcW w:w="2331" w:type="dxa"/>
+            <w:tcW w:w="1361" w:type="dxa"/>
             <w:tcBorders>
               <w:top w:val="single" w:sz="4" w:space="0" w:color="BFBFBF"/>
               <w:left w:val="single" w:sz="4" w:space="0" w:color="BFBFBF"/>
@@ -24723,7 +25372,7 @@
         </w:tc>
         <w:tc>
           <w:tcPr>
-            <w:tcW w:w="1100" w:type="dxa"/>
+            <w:tcW w:w="1246" w:type="dxa"/>
             <w:tcBorders>
               <w:top w:val="single" w:sz="4" w:space="0" w:color="BFBFBF"/>
               <w:left w:val="single" w:sz="4" w:space="0" w:color="BFBFBF"/>
@@ -24742,7 +25391,7 @@
         </w:tc>
         <w:tc>
           <w:tcPr>
-            <w:tcW w:w="1503" w:type="dxa"/>
+            <w:tcW w:w="1703" w:type="dxa"/>
             <w:tcBorders>
               <w:top w:val="single" w:sz="4" w:space="0" w:color="BFBFBF"/>
               <w:left w:val="single" w:sz="4" w:space="0" w:color="BFBFBF"/>
@@ -24761,7 +25410,7 @@
         </w:tc>
         <w:tc>
           <w:tcPr>
-            <w:tcW w:w="798" w:type="dxa"/>
+            <w:tcW w:w="904" w:type="dxa"/>
             <w:tcBorders>
               <w:top w:val="single" w:sz="4" w:space="0" w:color="BFBFBF"/>
               <w:left w:val="single" w:sz="4" w:space="0" w:color="BFBFBF"/>
@@ -24782,7 +25431,7 @@
       <w:tr>
         <w:tc>
           <w:tcPr>
-            <w:tcW w:w="395" w:type="dxa"/>
+            <w:tcW w:w="447" w:type="dxa"/>
             <w:tcBorders>
               <w:top w:val="single" w:sz="4" w:space="0" w:color="BFBFBF"/>
               <w:left w:val="single" w:sz="4" w:space="0" w:color="BFBFBF"/>
@@ -24801,7 +25450,7 @@
         </w:tc>
         <w:tc>
           <w:tcPr>
-            <w:tcW w:w="1705" w:type="dxa"/>
+            <w:tcW w:w="1931" w:type="dxa"/>
             <w:tcBorders>
               <w:top w:val="single" w:sz="4" w:space="0" w:color="BFBFBF"/>
               <w:left w:val="single" w:sz="4" w:space="0" w:color="BFBFBF"/>
@@ -24820,7 +25469,7 @@
         </w:tc>
         <w:tc>
           <w:tcPr>
-            <w:tcW w:w="1806" w:type="dxa"/>
+            <w:tcW w:w="2045" w:type="dxa"/>
             <w:tcBorders>
               <w:top w:val="single" w:sz="4" w:space="0" w:color="BFBFBF"/>
               <w:left w:val="single" w:sz="4" w:space="0" w:color="BFBFBF"/>
@@ -24839,7 +25488,7 @@
         </w:tc>
         <w:tc>
           <w:tcPr>
-            <w:tcW w:w="2331" w:type="dxa"/>
+            <w:tcW w:w="1361" w:type="dxa"/>
             <w:tcBorders>
               <w:top w:val="single" w:sz="4" w:space="0" w:color="BFBFBF"/>
               <w:left w:val="single" w:sz="4" w:space="0" w:color="BFBFBF"/>
@@ -24858,7 +25507,7 @@
         </w:tc>
         <w:tc>
           <w:tcPr>
-            <w:tcW w:w="1100" w:type="dxa"/>
+            <w:tcW w:w="1246" w:type="dxa"/>
             <w:tcBorders>
               <w:top w:val="single" w:sz="4" w:space="0" w:color="BFBFBF"/>
               <w:left w:val="single" w:sz="4" w:space="0" w:color="BFBFBF"/>
@@ -24877,23 +25526,23 @@
         </w:tc>
         <w:tc>
           <w:tcPr>
-            <w:tcW w:w="1503" w:type="dxa"/>
-            <w:tcBorders>
-              <w:top w:val="single" w:sz="4" w:space="0" w:color="BFBFBF"/>
-              <w:left w:val="single" w:sz="4" w:space="0" w:color="BFBFBF"/>
-              <w:bottom w:val="single" w:sz="4" w:space="0" w:color="BFBFBF"/>
-              <w:right w:val="single" w:sz="4" w:space="0" w:color="BFBFBF"/>
-            </w:tcBorders>
-          </w:tcPr>
-          <w:p>
-            <w:pPr>
-              <w:pStyle w:val="Compact"/>
-            </w:pPr>
-          </w:p>
-        </w:tc>
-        <w:tc>
-          <w:tcPr>
-            <w:tcW w:w="798" w:type="dxa"/>
+            <w:tcW w:w="1703" w:type="dxa"/>
+            <w:tcBorders>
+              <w:top w:val="single" w:sz="4" w:space="0" w:color="BFBFBF"/>
+              <w:left w:val="single" w:sz="4" w:space="0" w:color="BFBFBF"/>
+              <w:bottom w:val="single" w:sz="4" w:space="0" w:color="BFBFBF"/>
+              <w:right w:val="single" w:sz="4" w:space="0" w:color="BFBFBF"/>
+            </w:tcBorders>
+          </w:tcPr>
+          <w:p>
+            <w:pPr>
+              <w:pStyle w:val="Compact"/>
+            </w:pPr>
+          </w:p>
+        </w:tc>
+        <w:tc>
+          <w:tcPr>
+            <w:tcW w:w="904" w:type="dxa"/>
             <w:tcBorders>
               <w:top w:val="single" w:sz="4" w:space="0" w:color="BFBFBF"/>
               <w:left w:val="single" w:sz="4" w:space="0" w:color="BFBFBF"/>
@@ -24914,7 +25563,7 @@
       <w:tr>
         <w:tc>
           <w:tcPr>
-            <w:tcW w:w="395" w:type="dxa"/>
+            <w:tcW w:w="447" w:type="dxa"/>
             <w:tcBorders>
               <w:top w:val="single" w:sz="4" w:space="0" w:color="BFBFBF"/>
               <w:left w:val="single" w:sz="4" w:space="0" w:color="BFBFBF"/>
@@ -24933,26 +25582,42 @@
         </w:tc>
         <w:tc>
           <w:tcPr>
-            <w:tcW w:w="1705" w:type="dxa"/>
-            <w:tcBorders>
-              <w:top w:val="single" w:sz="4" w:space="0" w:color="BFBFBF"/>
-              <w:left w:val="single" w:sz="4" w:space="0" w:color="BFBFBF"/>
-              <w:bottom w:val="single" w:sz="4" w:space="0" w:color="BFBFBF"/>
-              <w:right w:val="single" w:sz="4" w:space="0" w:color="BFBFBF"/>
-            </w:tcBorders>
-          </w:tcPr>
-          <w:p>
-            <w:pPr>
-              <w:pStyle w:val="Compact"/>
-            </w:pPr>
-            <w:r>
-              <w:t xml:space="preserve">A serverless SQL warehouse for the workshop</w:t>
-            </w:r>
-          </w:p>
-        </w:tc>
-        <w:tc>
-          <w:tcPr>
-            <w:tcW w:w="1806" w:type="dxa"/>
+            <w:tcW w:w="1931" w:type="dxa"/>
+            <w:tcBorders>
+              <w:top w:val="single" w:sz="4" w:space="0" w:color="BFBFBF"/>
+              <w:left w:val="single" w:sz="4" w:space="0" w:color="BFBFBF"/>
+              <w:bottom w:val="single" w:sz="4" w:space="0" w:color="BFBFBF"/>
+              <w:right w:val="single" w:sz="4" w:space="0" w:color="BFBFBF"/>
+            </w:tcBorders>
+          </w:tcPr>
+          <w:p>
+            <w:pPr>
+              <w:pStyle w:val="Compact"/>
+            </w:pPr>
+            <w:r>
+              <w:t xml:space="preserve">A pro or serverless</w:t>
+            </w:r>
+            <w:r>
+              <w:t xml:space="preserve"> </w:t>
+            </w:r>
+            <w:r>
+              <w:rPr>
+                <w:b/>
+                <w:bCs/>
+              </w:rPr>
+              <w:t xml:space="preserve">SQL warehouse</w:t>
+            </w:r>
+            <w:r>
+              <w:t xml:space="preserve"> </w:t>
+            </w:r>
+            <w:r>
+              <w:t xml:space="preserve">that attendees can use</w:t>
+            </w:r>
+          </w:p>
+        </w:tc>
+        <w:tc>
+          <w:tcPr>
+            <w:tcW w:w="2045" w:type="dxa"/>
             <w:tcBorders>
               <w:top w:val="single" w:sz="4" w:space="0" w:color="BFBFBF"/>
               <w:left w:val="single" w:sz="4" w:space="0" w:color="BFBFBF"/>
@@ -24971,41 +25636,26 @@
         </w:tc>
         <w:tc>
           <w:tcPr>
-            <w:tcW w:w="2331" w:type="dxa"/>
-            <w:tcBorders>
-              <w:top w:val="single" w:sz="4" w:space="0" w:color="BFBFBF"/>
-              <w:left w:val="single" w:sz="4" w:space="0" w:color="BFBFBF"/>
-              <w:bottom w:val="single" w:sz="4" w:space="0" w:color="BFBFBF"/>
-              <w:right w:val="single" w:sz="4" w:space="0" w:color="BFBFBF"/>
-            </w:tcBorders>
-          </w:tcPr>
-          <w:p>
-            <w:pPr>
-              <w:pStyle w:val="Compact"/>
-            </w:pPr>
-            <w:r>
-              <w:t xml:space="preserve">SQL Warehouses → Create, or</w:t>
-            </w:r>
-            <w:r>
-              <w:t xml:space="preserve"> </w:t>
-            </w:r>
-            <w:r>
-              <w:rPr>
-                <w:rStyle w:val="VerbatimChar"/>
-              </w:rPr>
-              <w:t xml:space="preserve">06_deploy_dashboards_and_agents</w:t>
-            </w:r>
-            <w:r>
-              <w:t xml:space="preserve"> </w:t>
-            </w:r>
-            <w:r>
-              <w:t xml:space="preserve">creates it</w:t>
-            </w:r>
-          </w:p>
-        </w:tc>
-        <w:tc>
-          <w:tcPr>
-            <w:tcW w:w="1100" w:type="dxa"/>
+            <w:tcW w:w="1361" w:type="dxa"/>
+            <w:tcBorders>
+              <w:top w:val="single" w:sz="4" w:space="0" w:color="BFBFBF"/>
+              <w:left w:val="single" w:sz="4" w:space="0" w:color="BFBFBF"/>
+              <w:bottom w:val="single" w:sz="4" w:space="0" w:color="BFBFBF"/>
+              <w:right w:val="single" w:sz="4" w:space="0" w:color="BFBFBF"/>
+            </w:tcBorders>
+          </w:tcPr>
+          <w:p>
+            <w:pPr>
+              <w:pStyle w:val="Compact"/>
+            </w:pPr>
+            <w:r>
+              <w:t xml:space="preserve">Any existing warehouse, for example the Serverless Starter Warehouse (3.4)</w:t>
+            </w:r>
+          </w:p>
+        </w:tc>
+        <w:tc>
+          <w:tcPr>
+            <w:tcW w:w="1246" w:type="dxa"/>
             <w:tcBorders>
               <w:top w:val="single" w:sz="4" w:space="0" w:color="BFBFBF"/>
               <w:left w:val="single" w:sz="4" w:space="0" w:color="BFBFBF"/>
@@ -25024,23 +25674,23 @@
         </w:tc>
         <w:tc>
           <w:tcPr>
-            <w:tcW w:w="1503" w:type="dxa"/>
-            <w:tcBorders>
-              <w:top w:val="single" w:sz="4" w:space="0" w:color="BFBFBF"/>
-              <w:left w:val="single" w:sz="4" w:space="0" w:color="BFBFBF"/>
-              <w:bottom w:val="single" w:sz="4" w:space="0" w:color="BFBFBF"/>
-              <w:right w:val="single" w:sz="4" w:space="0" w:color="BFBFBF"/>
-            </w:tcBorders>
-          </w:tcPr>
-          <w:p>
-            <w:pPr>
-              <w:pStyle w:val="Compact"/>
-            </w:pPr>
-          </w:p>
-        </w:tc>
-        <w:tc>
-          <w:tcPr>
-            <w:tcW w:w="798" w:type="dxa"/>
+            <w:tcW w:w="1703" w:type="dxa"/>
+            <w:tcBorders>
+              <w:top w:val="single" w:sz="4" w:space="0" w:color="BFBFBF"/>
+              <w:left w:val="single" w:sz="4" w:space="0" w:color="BFBFBF"/>
+              <w:bottom w:val="single" w:sz="4" w:space="0" w:color="BFBFBF"/>
+              <w:right w:val="single" w:sz="4" w:space="0" w:color="BFBFBF"/>
+            </w:tcBorders>
+          </w:tcPr>
+          <w:p>
+            <w:pPr>
+              <w:pStyle w:val="Compact"/>
+            </w:pPr>
+          </w:p>
+        </w:tc>
+        <w:tc>
+          <w:tcPr>
+            <w:tcW w:w="904" w:type="dxa"/>
             <w:tcBorders>
               <w:top w:val="single" w:sz="4" w:space="0" w:color="BFBFBF"/>
               <w:left w:val="single" w:sz="4" w:space="0" w:color="BFBFBF"/>
@@ -25061,7 +25711,7 @@
       <w:tr>
         <w:tc>
           <w:tcPr>
-            <w:tcW w:w="395" w:type="dxa"/>
+            <w:tcW w:w="447" w:type="dxa"/>
             <w:tcBorders>
               <w:top w:val="single" w:sz="4" w:space="0" w:color="BFBFBF"/>
               <w:left w:val="single" w:sz="4" w:space="0" w:color="BFBFBF"/>
@@ -25080,7 +25730,7 @@
         </w:tc>
         <w:tc>
           <w:tcPr>
-            <w:tcW w:w="1705" w:type="dxa"/>
+            <w:tcW w:w="1931" w:type="dxa"/>
             <w:tcBorders>
               <w:top w:val="single" w:sz="4" w:space="0" w:color="BFBFBF"/>
               <w:left w:val="single" w:sz="4" w:space="0" w:color="BFBFBF"/>
@@ -25125,7 +25775,7 @@
         </w:tc>
         <w:tc>
           <w:tcPr>
-            <w:tcW w:w="1806" w:type="dxa"/>
+            <w:tcW w:w="2045" w:type="dxa"/>
             <w:tcBorders>
               <w:top w:val="single" w:sz="4" w:space="0" w:color="BFBFBF"/>
               <w:left w:val="single" w:sz="4" w:space="0" w:color="BFBFBF"/>
@@ -25144,7 +25794,7 @@
         </w:tc>
         <w:tc>
           <w:tcPr>
-            <w:tcW w:w="2331" w:type="dxa"/>
+            <w:tcW w:w="1361" w:type="dxa"/>
             <w:tcBorders>
               <w:top w:val="single" w:sz="4" w:space="0" w:color="BFBFBF"/>
               <w:left w:val="single" w:sz="4" w:space="0" w:color="BFBFBF"/>
@@ -25163,7 +25813,7 @@
         </w:tc>
         <w:tc>
           <w:tcPr>
-            <w:tcW w:w="1100" w:type="dxa"/>
+            <w:tcW w:w="1246" w:type="dxa"/>
             <w:tcBorders>
               <w:top w:val="single" w:sz="4" w:space="0" w:color="BFBFBF"/>
               <w:left w:val="single" w:sz="4" w:space="0" w:color="BFBFBF"/>
@@ -25182,7 +25832,7 @@
         </w:tc>
         <w:tc>
           <w:tcPr>
-            <w:tcW w:w="1503" w:type="dxa"/>
+            <w:tcW w:w="1703" w:type="dxa"/>
             <w:tcBorders>
               <w:top w:val="single" w:sz="4" w:space="0" w:color="BFBFBF"/>
               <w:left w:val="single" w:sz="4" w:space="0" w:color="BFBFBF"/>
@@ -25201,7 +25851,7 @@
         </w:tc>
         <w:tc>
           <w:tcPr>
-            <w:tcW w:w="798" w:type="dxa"/>
+            <w:tcW w:w="904" w:type="dxa"/>
             <w:tcBorders>
               <w:top w:val="single" w:sz="4" w:space="0" w:color="BFBFBF"/>
               <w:left w:val="single" w:sz="4" w:space="0" w:color="BFBFBF"/>
@@ -25222,7 +25872,7 @@
       <w:tr>
         <w:tc>
           <w:tcPr>
-            <w:tcW w:w="395" w:type="dxa"/>
+            <w:tcW w:w="447" w:type="dxa"/>
             <w:tcBorders>
               <w:top w:val="single" w:sz="4" w:space="0" w:color="BFBFBF"/>
               <w:left w:val="single" w:sz="4" w:space="0" w:color="BFBFBF"/>
@@ -25241,7 +25891,7 @@
         </w:tc>
         <w:tc>
           <w:tcPr>
-            <w:tcW w:w="1705" w:type="dxa"/>
+            <w:tcW w:w="1931" w:type="dxa"/>
             <w:tcBorders>
               <w:top w:val="single" w:sz="4" w:space="0" w:color="BFBFBF"/>
               <w:left w:val="single" w:sz="4" w:space="0" w:color="BFBFBF"/>
@@ -25270,7 +25920,7 @@
         </w:tc>
         <w:tc>
           <w:tcPr>
-            <w:tcW w:w="1806" w:type="dxa"/>
+            <w:tcW w:w="2045" w:type="dxa"/>
             <w:tcBorders>
               <w:top w:val="single" w:sz="4" w:space="0" w:color="BFBFBF"/>
               <w:left w:val="single" w:sz="4" w:space="0" w:color="BFBFBF"/>
@@ -25289,7 +25939,7 @@
         </w:tc>
         <w:tc>
           <w:tcPr>
-            <w:tcW w:w="2331" w:type="dxa"/>
+            <w:tcW w:w="1361" w:type="dxa"/>
             <w:tcBorders>
               <w:top w:val="single" w:sz="4" w:space="0" w:color="BFBFBF"/>
               <w:left w:val="single" w:sz="4" w:space="0" w:color="BFBFBF"/>
@@ -25308,7 +25958,7 @@
         </w:tc>
         <w:tc>
           <w:tcPr>
-            <w:tcW w:w="1100" w:type="dxa"/>
+            <w:tcW w:w="1246" w:type="dxa"/>
             <w:tcBorders>
               <w:top w:val="single" w:sz="4" w:space="0" w:color="BFBFBF"/>
               <w:left w:val="single" w:sz="4" w:space="0" w:color="BFBFBF"/>
@@ -25337,7 +25987,7 @@
         </w:tc>
         <w:tc>
           <w:tcPr>
-            <w:tcW w:w="1503" w:type="dxa"/>
+            <w:tcW w:w="1703" w:type="dxa"/>
             <w:tcBorders>
               <w:top w:val="single" w:sz="4" w:space="0" w:color="BFBFBF"/>
               <w:left w:val="single" w:sz="4" w:space="0" w:color="BFBFBF"/>
@@ -25356,7 +26006,7 @@
         </w:tc>
         <w:tc>
           <w:tcPr>
-            <w:tcW w:w="798" w:type="dxa"/>
+            <w:tcW w:w="904" w:type="dxa"/>
             <w:tcBorders>
               <w:top w:val="single" w:sz="4" w:space="0" w:color="BFBFBF"/>
               <w:left w:val="single" w:sz="4" w:space="0" w:color="BFBFBF"/>
@@ -25377,7 +26027,7 @@
       <w:tr>
         <w:tc>
           <w:tcPr>
-            <w:tcW w:w="395" w:type="dxa"/>
+            <w:tcW w:w="447" w:type="dxa"/>
             <w:tcBorders>
               <w:top w:val="single" w:sz="4" w:space="0" w:color="BFBFBF"/>
               <w:left w:val="single" w:sz="4" w:space="0" w:color="BFBFBF"/>
@@ -25396,7 +26046,7 @@
         </w:tc>
         <w:tc>
           <w:tcPr>
-            <w:tcW w:w="1705" w:type="dxa"/>
+            <w:tcW w:w="1931" w:type="dxa"/>
             <w:tcBorders>
               <w:top w:val="single" w:sz="4" w:space="0" w:color="BFBFBF"/>
               <w:left w:val="single" w:sz="4" w:space="0" w:color="BFBFBF"/>
@@ -25415,7 +26065,7 @@
         </w:tc>
         <w:tc>
           <w:tcPr>
-            <w:tcW w:w="1806" w:type="dxa"/>
+            <w:tcW w:w="2045" w:type="dxa"/>
             <w:tcBorders>
               <w:top w:val="single" w:sz="4" w:space="0" w:color="BFBFBF"/>
               <w:left w:val="single" w:sz="4" w:space="0" w:color="BFBFBF"/>
@@ -25434,7 +26084,7 @@
         </w:tc>
         <w:tc>
           <w:tcPr>
-            <w:tcW w:w="2331" w:type="dxa"/>
+            <w:tcW w:w="1361" w:type="dxa"/>
             <w:tcBorders>
               <w:top w:val="single" w:sz="4" w:space="0" w:color="BFBFBF"/>
               <w:left w:val="single" w:sz="4" w:space="0" w:color="BFBFBF"/>
@@ -25469,7 +26119,7 @@
         </w:tc>
         <w:tc>
           <w:tcPr>
-            <w:tcW w:w="1100" w:type="dxa"/>
+            <w:tcW w:w="1246" w:type="dxa"/>
             <w:tcBorders>
               <w:top w:val="single" w:sz="4" w:space="0" w:color="BFBFBF"/>
               <w:left w:val="single" w:sz="4" w:space="0" w:color="BFBFBF"/>
@@ -25488,23 +26138,23 @@
         </w:tc>
         <w:tc>
           <w:tcPr>
-            <w:tcW w:w="1503" w:type="dxa"/>
-            <w:tcBorders>
-              <w:top w:val="single" w:sz="4" w:space="0" w:color="BFBFBF"/>
-              <w:left w:val="single" w:sz="4" w:space="0" w:color="BFBFBF"/>
-              <w:bottom w:val="single" w:sz="4" w:space="0" w:color="BFBFBF"/>
-              <w:right w:val="single" w:sz="4" w:space="0" w:color="BFBFBF"/>
-            </w:tcBorders>
-          </w:tcPr>
-          <w:p>
-            <w:pPr>
-              <w:pStyle w:val="Compact"/>
-            </w:pPr>
-          </w:p>
-        </w:tc>
-        <w:tc>
-          <w:tcPr>
-            <w:tcW w:w="798" w:type="dxa"/>
+            <w:tcW w:w="1703" w:type="dxa"/>
+            <w:tcBorders>
+              <w:top w:val="single" w:sz="4" w:space="0" w:color="BFBFBF"/>
+              <w:left w:val="single" w:sz="4" w:space="0" w:color="BFBFBF"/>
+              <w:bottom w:val="single" w:sz="4" w:space="0" w:color="BFBFBF"/>
+              <w:right w:val="single" w:sz="4" w:space="0" w:color="BFBFBF"/>
+            </w:tcBorders>
+          </w:tcPr>
+          <w:p>
+            <w:pPr>
+              <w:pStyle w:val="Compact"/>
+            </w:pPr>
+          </w:p>
+        </w:tc>
+        <w:tc>
+          <w:tcPr>
+            <w:tcW w:w="904" w:type="dxa"/>
             <w:tcBorders>
               <w:top w:val="single" w:sz="4" w:space="0" w:color="BFBFBF"/>
               <w:left w:val="single" w:sz="4" w:space="0" w:color="BFBFBF"/>
@@ -25525,7 +26175,7 @@
       <w:tr>
         <w:tc>
           <w:tcPr>
-            <w:tcW w:w="395" w:type="dxa"/>
+            <w:tcW w:w="447" w:type="dxa"/>
             <w:tcBorders>
               <w:top w:val="single" w:sz="4" w:space="0" w:color="BFBFBF"/>
               <w:left w:val="single" w:sz="4" w:space="0" w:color="BFBFBF"/>
@@ -25544,26 +26194,55 @@
         </w:tc>
         <w:tc>
           <w:tcPr>
-            <w:tcW w:w="1705" w:type="dxa"/>
-            <w:tcBorders>
-              <w:top w:val="single" w:sz="4" w:space="0" w:color="BFBFBF"/>
-              <w:left w:val="single" w:sz="4" w:space="0" w:color="BFBFBF"/>
-              <w:bottom w:val="single" w:sz="4" w:space="0" w:color="BFBFBF"/>
-              <w:right w:val="single" w:sz="4" w:space="0" w:color="BFBFBF"/>
-            </w:tcBorders>
-          </w:tcPr>
-          <w:p>
-            <w:pPr>
-              <w:pStyle w:val="Compact"/>
-            </w:pPr>
-            <w:r>
-              <w:t xml:space="preserve">Attendee and facilitator groups, with entitlements</w:t>
-            </w:r>
-          </w:p>
-        </w:tc>
-        <w:tc>
-          <w:tcPr>
-            <w:tcW w:w="1806" w:type="dxa"/>
+            <w:tcW w:w="1931" w:type="dxa"/>
+            <w:tcBorders>
+              <w:top w:val="single" w:sz="4" w:space="0" w:color="BFBFBF"/>
+              <w:left w:val="single" w:sz="4" w:space="0" w:color="BFBFBF"/>
+              <w:bottom w:val="single" w:sz="4" w:space="0" w:color="BFBFBF"/>
+              <w:right w:val="single" w:sz="4" w:space="0" w:color="BFBFBF"/>
+            </w:tcBorders>
+          </w:tcPr>
+          <w:p>
+            <w:pPr>
+              <w:pStyle w:val="Compact"/>
+            </w:pPr>
+            <w:r>
+              <w:t xml:space="preserve">Attendees can sign in, with</w:t>
+            </w:r>
+            <w:r>
+              <w:t xml:space="preserve"> </w:t>
+            </w:r>
+            <w:r>
+              <w:rPr>
+                <w:b/>
+                <w:bCs/>
+              </w:rPr>
+              <w:t xml:space="preserve">Workspace access</w:t>
+            </w:r>
+            <w:r>
+              <w:t xml:space="preserve"> </w:t>
+            </w:r>
+            <w:r>
+              <w:t xml:space="preserve">and</w:t>
+            </w:r>
+            <w:r>
+              <w:t xml:space="preserve"> </w:t>
+            </w:r>
+            <w:r>
+              <w:rPr>
+                <w:b/>
+                <w:bCs/>
+              </w:rPr>
+              <w:t xml:space="preserve">Databricks SQL access</w:t>
+            </w:r>
+            <w:r>
+              <w:t xml:space="preserve">; no groups needed</w:t>
+            </w:r>
+          </w:p>
+        </w:tc>
+        <w:tc>
+          <w:tcPr>
+            <w:tcW w:w="2045" w:type="dxa"/>
             <w:tcBorders>
               <w:top w:val="single" w:sz="4" w:space="0" w:color="BFBFBF"/>
               <w:left w:val="single" w:sz="4" w:space="0" w:color="BFBFBF"/>
@@ -25582,7 +26261,7 @@
         </w:tc>
         <w:tc>
           <w:tcPr>
-            <w:tcW w:w="2331" w:type="dxa"/>
+            <w:tcW w:w="1361" w:type="dxa"/>
             <w:tcBorders>
               <w:top w:val="single" w:sz="4" w:space="0" w:color="BFBFBF"/>
               <w:left w:val="single" w:sz="4" w:space="0" w:color="BFBFBF"/>
@@ -25601,42 +26280,45 @@
         </w:tc>
         <w:tc>
           <w:tcPr>
-            <w:tcW w:w="1100" w:type="dxa"/>
-            <w:tcBorders>
-              <w:top w:val="single" w:sz="4" w:space="0" w:color="BFBFBF"/>
-              <w:left w:val="single" w:sz="4" w:space="0" w:color="BFBFBF"/>
-              <w:bottom w:val="single" w:sz="4" w:space="0" w:color="BFBFBF"/>
-              <w:right w:val="single" w:sz="4" w:space="0" w:color="BFBFBF"/>
-            </w:tcBorders>
-          </w:tcPr>
-          <w:p>
-            <w:pPr>
-              <w:pStyle w:val="Compact"/>
-            </w:pPr>
-            <w:r>
-              <w:t xml:space="preserve">Account or workspace admin</w:t>
-            </w:r>
-          </w:p>
-        </w:tc>
-        <w:tc>
-          <w:tcPr>
-            <w:tcW w:w="1503" w:type="dxa"/>
-            <w:tcBorders>
-              <w:top w:val="single" w:sz="4" w:space="0" w:color="BFBFBF"/>
-              <w:left w:val="single" w:sz="4" w:space="0" w:color="BFBFBF"/>
-              <w:bottom w:val="single" w:sz="4" w:space="0" w:color="BFBFBF"/>
-              <w:right w:val="single" w:sz="4" w:space="0" w:color="BFBFBF"/>
-            </w:tcBorders>
-          </w:tcPr>
-          <w:p>
-            <w:pPr>
-              <w:pStyle w:val="Compact"/>
-            </w:pPr>
-          </w:p>
-        </w:tc>
-        <w:tc>
-          <w:tcPr>
-            <w:tcW w:w="798" w:type="dxa"/>
+            <w:tcW w:w="1246" w:type="dxa"/>
+            <w:tcBorders>
+              <w:top w:val="single" w:sz="4" w:space="0" w:color="BFBFBF"/>
+              <w:left w:val="single" w:sz="4" w:space="0" w:color="BFBFBF"/>
+              <w:bottom w:val="single" w:sz="4" w:space="0" w:color="BFBFBF"/>
+              <w:right w:val="single" w:sz="4" w:space="0" w:color="BFBFBF"/>
+            </w:tcBorders>
+          </w:tcPr>
+          <w:p>
+            <w:pPr>
+              <w:pStyle w:val="Compact"/>
+            </w:pPr>
+            <w:r>
+              <w:t xml:space="preserve">Workspace admin</w:t>
+            </w:r>
+          </w:p>
+        </w:tc>
+        <w:tc>
+          <w:tcPr>
+            <w:tcW w:w="1703" w:type="dxa"/>
+            <w:tcBorders>
+              <w:top w:val="single" w:sz="4" w:space="0" w:color="BFBFBF"/>
+              <w:left w:val="single" w:sz="4" w:space="0" w:color="BFBFBF"/>
+              <w:bottom w:val="single" w:sz="4" w:space="0" w:color="BFBFBF"/>
+              <w:right w:val="single" w:sz="4" w:space="0" w:color="BFBFBF"/>
+            </w:tcBorders>
+          </w:tcPr>
+          <w:p>
+            <w:pPr>
+              <w:pStyle w:val="Compact"/>
+            </w:pPr>
+            <w:r>
+              <w:t xml:space="preserve">On for workspace users</w:t>
+            </w:r>
+          </w:p>
+        </w:tc>
+        <w:tc>
+          <w:tcPr>
+            <w:tcW w:w="904" w:type="dxa"/>
             <w:tcBorders>
               <w:top w:val="single" w:sz="4" w:space="0" w:color="BFBFBF"/>
               <w:left w:val="single" w:sz="4" w:space="0" w:color="BFBFBF"/>
@@ -25657,7 +26339,7 @@
       <w:tr>
         <w:tc>
           <w:tcPr>
-            <w:tcW w:w="395" w:type="dxa"/>
+            <w:tcW w:w="447" w:type="dxa"/>
             <w:tcBorders>
               <w:top w:val="single" w:sz="4" w:space="0" w:color="BFBFBF"/>
               <w:left w:val="single" w:sz="4" w:space="0" w:color="BFBFBF"/>
@@ -25676,7 +26358,7 @@
         </w:tc>
         <w:tc>
           <w:tcPr>
-            <w:tcW w:w="1705" w:type="dxa"/>
+            <w:tcW w:w="1931" w:type="dxa"/>
             <w:tcBorders>
               <w:top w:val="single" w:sz="4" w:space="0" w:color="BFBFBF"/>
               <w:left w:val="single" w:sz="4" w:space="0" w:color="BFBFBF"/>
@@ -25711,7 +26393,7 @@
         </w:tc>
         <w:tc>
           <w:tcPr>
-            <w:tcW w:w="1806" w:type="dxa"/>
+            <w:tcW w:w="2045" w:type="dxa"/>
             <w:tcBorders>
               <w:top w:val="single" w:sz="4" w:space="0" w:color="BFBFBF"/>
               <w:left w:val="single" w:sz="4" w:space="0" w:color="BFBFBF"/>
@@ -25730,7 +26412,7 @@
         </w:tc>
         <w:tc>
           <w:tcPr>
-            <w:tcW w:w="2331" w:type="dxa"/>
+            <w:tcW w:w="1361" w:type="dxa"/>
             <w:tcBorders>
               <w:top w:val="single" w:sz="4" w:space="0" w:color="BFBFBF"/>
               <w:left w:val="single" w:sz="4" w:space="0" w:color="BFBFBF"/>
@@ -25749,7 +26431,7 @@
         </w:tc>
         <w:tc>
           <w:tcPr>
-            <w:tcW w:w="1100" w:type="dxa"/>
+            <w:tcW w:w="1246" w:type="dxa"/>
             <w:tcBorders>
               <w:top w:val="single" w:sz="4" w:space="0" w:color="BFBFBF"/>
               <w:left w:val="single" w:sz="4" w:space="0" w:color="BFBFBF"/>
@@ -25768,23 +26450,23 @@
         </w:tc>
         <w:tc>
           <w:tcPr>
-            <w:tcW w:w="1503" w:type="dxa"/>
-            <w:tcBorders>
-              <w:top w:val="single" w:sz="4" w:space="0" w:color="BFBFBF"/>
-              <w:left w:val="single" w:sz="4" w:space="0" w:color="BFBFBF"/>
-              <w:bottom w:val="single" w:sz="4" w:space="0" w:color="BFBFBF"/>
-              <w:right w:val="single" w:sz="4" w:space="0" w:color="BFBFBF"/>
-            </w:tcBorders>
-          </w:tcPr>
-          <w:p>
-            <w:pPr>
-              <w:pStyle w:val="Compact"/>
-            </w:pPr>
-          </w:p>
-        </w:tc>
-        <w:tc>
-          <w:tcPr>
-            <w:tcW w:w="798" w:type="dxa"/>
+            <w:tcW w:w="1703" w:type="dxa"/>
+            <w:tcBorders>
+              <w:top w:val="single" w:sz="4" w:space="0" w:color="BFBFBF"/>
+              <w:left w:val="single" w:sz="4" w:space="0" w:color="BFBFBF"/>
+              <w:bottom w:val="single" w:sz="4" w:space="0" w:color="BFBFBF"/>
+              <w:right w:val="single" w:sz="4" w:space="0" w:color="BFBFBF"/>
+            </w:tcBorders>
+          </w:tcPr>
+          <w:p>
+            <w:pPr>
+              <w:pStyle w:val="Compact"/>
+            </w:pPr>
+          </w:p>
+        </w:tc>
+        <w:tc>
+          <w:tcPr>
+            <w:tcW w:w="904" w:type="dxa"/>
             <w:tcBorders>
               <w:top w:val="single" w:sz="4" w:space="0" w:color="BFBFBF"/>
               <w:left w:val="single" w:sz="4" w:space="0" w:color="BFBFBF"/>
@@ -25805,7 +26487,7 @@
       <w:tr>
         <w:tc>
           <w:tcPr>
-            <w:tcW w:w="395" w:type="dxa"/>
+            <w:tcW w:w="447" w:type="dxa"/>
             <w:tcBorders>
               <w:top w:val="single" w:sz="4" w:space="0" w:color="BFBFBF"/>
               <w:left w:val="single" w:sz="4" w:space="0" w:color="BFBFBF"/>
@@ -25824,26 +26506,41 @@
         </w:tc>
         <w:tc>
           <w:tcPr>
-            <w:tcW w:w="1705" w:type="dxa"/>
-            <w:tcBorders>
-              <w:top w:val="single" w:sz="4" w:space="0" w:color="BFBFBF"/>
-              <w:left w:val="single" w:sz="4" w:space="0" w:color="BFBFBF"/>
-              <w:bottom w:val="single" w:sz="4" w:space="0" w:color="BFBFBF"/>
-              <w:right w:val="single" w:sz="4" w:space="0" w:color="BFBFBF"/>
-            </w:tcBorders>
-          </w:tcPr>
-          <w:p>
-            <w:pPr>
-              <w:pStyle w:val="Compact"/>
-            </w:pPr>
-            <w:r>
-              <w:t xml:space="preserve">Workshop catalog, volumes, schemas and grants</w:t>
-            </w:r>
-          </w:p>
-        </w:tc>
-        <w:tc>
-          <w:tcPr>
-            <w:tcW w:w="1806" w:type="dxa"/>
+            <w:tcW w:w="1931" w:type="dxa"/>
+            <w:tcBorders>
+              <w:top w:val="single" w:sz="4" w:space="0" w:color="BFBFBF"/>
+              <w:left w:val="single" w:sz="4" w:space="0" w:color="BFBFBF"/>
+              <w:bottom w:val="single" w:sz="4" w:space="0" w:color="BFBFBF"/>
+              <w:right w:val="single" w:sz="4" w:space="0" w:color="BFBFBF"/>
+            </w:tcBorders>
+          </w:tcPr>
+          <w:p>
+            <w:pPr>
+              <w:pStyle w:val="Compact"/>
+            </w:pPr>
+            <w:r>
+              <w:t xml:space="preserve">The</w:t>
+            </w:r>
+            <w:r>
+              <w:t xml:space="preserve"> </w:t>
+            </w:r>
+            <w:r>
+              <w:rPr>
+                <w:rStyle w:val="VerbatimChar"/>
+              </w:rPr>
+              <w:t xml:space="preserve">smbc_workshop</w:t>
+            </w:r>
+            <w:r>
+              <w:t xml:space="preserve"> </w:t>
+            </w:r>
+            <w:r>
+              <w:t xml:space="preserve">catalog, and attendee access to it</w:t>
+            </w:r>
+          </w:p>
+        </w:tc>
+        <w:tc>
+          <w:tcPr>
+            <w:tcW w:w="2045" w:type="dxa"/>
             <w:tcBorders>
               <w:top w:val="single" w:sz="4" w:space="0" w:color="BFBFBF"/>
               <w:left w:val="single" w:sz="4" w:space="0" w:color="BFBFBF"/>
@@ -25862,61 +26559,61 @@
         </w:tc>
         <w:tc>
           <w:tcPr>
-            <w:tcW w:w="2331" w:type="dxa"/>
-            <w:tcBorders>
-              <w:top w:val="single" w:sz="4" w:space="0" w:color="BFBFBF"/>
-              <w:left w:val="single" w:sz="4" w:space="0" w:color="BFBFBF"/>
-              <w:bottom w:val="single" w:sz="4" w:space="0" w:color="BFBFBF"/>
-              <w:right w:val="single" w:sz="4" w:space="0" w:color="BFBFBF"/>
-            </w:tcBorders>
-          </w:tcPr>
-          <w:p>
-            <w:pPr>
-              <w:pStyle w:val="Compact"/>
-            </w:pPr>
-            <w:r>
-              <w:t xml:space="preserve">Setup notebook (section 4)</w:t>
-            </w:r>
-          </w:p>
-        </w:tc>
-        <w:tc>
-          <w:tcPr>
-            <w:tcW w:w="1100" w:type="dxa"/>
-            <w:tcBorders>
-              <w:top w:val="single" w:sz="4" w:space="0" w:color="BFBFBF"/>
-              <w:left w:val="single" w:sz="4" w:space="0" w:color="BFBFBF"/>
-              <w:bottom w:val="single" w:sz="4" w:space="0" w:color="BFBFBF"/>
-              <w:right w:val="single" w:sz="4" w:space="0" w:color="BFBFBF"/>
-            </w:tcBorders>
-          </w:tcPr>
-          <w:p>
-            <w:pPr>
-              <w:pStyle w:val="Compact"/>
-            </w:pPr>
-            <w:r>
-              <w:t xml:space="preserve">Metastore admin or catalog owner</w:t>
-            </w:r>
-          </w:p>
-        </w:tc>
-        <w:tc>
-          <w:tcPr>
-            <w:tcW w:w="1503" w:type="dxa"/>
-            <w:tcBorders>
-              <w:top w:val="single" w:sz="4" w:space="0" w:color="BFBFBF"/>
-              <w:left w:val="single" w:sz="4" w:space="0" w:color="BFBFBF"/>
-              <w:bottom w:val="single" w:sz="4" w:space="0" w:color="BFBFBF"/>
-              <w:right w:val="single" w:sz="4" w:space="0" w:color="BFBFBF"/>
-            </w:tcBorders>
-          </w:tcPr>
-          <w:p>
-            <w:pPr>
-              <w:pStyle w:val="Compact"/>
-            </w:pPr>
-          </w:p>
-        </w:tc>
-        <w:tc>
-          <w:tcPr>
-            <w:tcW w:w="798" w:type="dxa"/>
+            <w:tcW w:w="1361" w:type="dxa"/>
+            <w:tcBorders>
+              <w:top w:val="single" w:sz="4" w:space="0" w:color="BFBFBF"/>
+              <w:left w:val="single" w:sz="4" w:space="0" w:color="BFBFBF"/>
+              <w:bottom w:val="single" w:sz="4" w:space="0" w:color="BFBFBF"/>
+              <w:right w:val="single" w:sz="4" w:space="0" w:color="BFBFBF"/>
+            </w:tcBorders>
+          </w:tcPr>
+          <w:p>
+            <w:pPr>
+              <w:pStyle w:val="Compact"/>
+            </w:pPr>
+            <w:r>
+              <w:t xml:space="preserve">The setup notebook (section 4), then the grants in 3.6</w:t>
+            </w:r>
+          </w:p>
+        </w:tc>
+        <w:tc>
+          <w:tcPr>
+            <w:tcW w:w="1246" w:type="dxa"/>
+            <w:tcBorders>
+              <w:top w:val="single" w:sz="4" w:space="0" w:color="BFBFBF"/>
+              <w:left w:val="single" w:sz="4" w:space="0" w:color="BFBFBF"/>
+              <w:bottom w:val="single" w:sz="4" w:space="0" w:color="BFBFBF"/>
+              <w:right w:val="single" w:sz="4" w:space="0" w:color="BFBFBF"/>
+            </w:tcBorders>
+          </w:tcPr>
+          <w:p>
+            <w:pPr>
+              <w:pStyle w:val="Compact"/>
+            </w:pPr>
+            <w:r>
+              <w:t xml:space="preserve">Catalog owner or metastore admin</w:t>
+            </w:r>
+          </w:p>
+        </w:tc>
+        <w:tc>
+          <w:tcPr>
+            <w:tcW w:w="1703" w:type="dxa"/>
+            <w:tcBorders>
+              <w:top w:val="single" w:sz="4" w:space="0" w:color="BFBFBF"/>
+              <w:left w:val="single" w:sz="4" w:space="0" w:color="BFBFBF"/>
+              <w:bottom w:val="single" w:sz="4" w:space="0" w:color="BFBFBF"/>
+              <w:right w:val="single" w:sz="4" w:space="0" w:color="BFBFBF"/>
+            </w:tcBorders>
+          </w:tcPr>
+          <w:p>
+            <w:pPr>
+              <w:pStyle w:val="Compact"/>
+            </w:pPr>
+          </w:p>
+        </w:tc>
+        <w:tc>
+          <w:tcPr>
+            <w:tcW w:w="904" w:type="dxa"/>
             <w:tcBorders>
               <w:top w:val="single" w:sz="4" w:space="0" w:color="BFBFBF"/>
               <w:left w:val="single" w:sz="4" w:space="0" w:color="BFBFBF"/>
@@ -25937,7 +26634,7 @@
       <w:tr>
         <w:tc>
           <w:tcPr>
-            <w:tcW w:w="395" w:type="dxa"/>
+            <w:tcW w:w="447" w:type="dxa"/>
             <w:tcBorders>
               <w:top w:val="single" w:sz="4" w:space="0" w:color="BFBFBF"/>
               <w:left w:val="single" w:sz="4" w:space="0" w:color="BFBFBF"/>
@@ -25956,7 +26653,7 @@
         </w:tc>
         <w:tc>
           <w:tcPr>
-            <w:tcW w:w="1705" w:type="dxa"/>
+            <w:tcW w:w="1931" w:type="dxa"/>
             <w:tcBorders>
               <w:top w:val="single" w:sz="4" w:space="0" w:color="BFBFBF"/>
               <w:left w:val="single" w:sz="4" w:space="0" w:color="BFBFBF"/>
@@ -25975,7 +26672,7 @@
         </w:tc>
         <w:tc>
           <w:tcPr>
-            <w:tcW w:w="1806" w:type="dxa"/>
+            <w:tcW w:w="2045" w:type="dxa"/>
             <w:tcBorders>
               <w:top w:val="single" w:sz="4" w:space="0" w:color="BFBFBF"/>
               <w:left w:val="single" w:sz="4" w:space="0" w:color="BFBFBF"/>
@@ -25994,7 +26691,7 @@
         </w:tc>
         <w:tc>
           <w:tcPr>
-            <w:tcW w:w="2331" w:type="dxa"/>
+            <w:tcW w:w="1361" w:type="dxa"/>
             <w:tcBorders>
               <w:top w:val="single" w:sz="4" w:space="0" w:color="BFBFBF"/>
               <w:left w:val="single" w:sz="4" w:space="0" w:color="BFBFBF"/>
@@ -26013,7 +26710,7 @@
         </w:tc>
         <w:tc>
           <w:tcPr>
-            <w:tcW w:w="1100" w:type="dxa"/>
+            <w:tcW w:w="1246" w:type="dxa"/>
             <w:tcBorders>
               <w:top w:val="single" w:sz="4" w:space="0" w:color="BFBFBF"/>
               <w:left w:val="single" w:sz="4" w:space="0" w:color="BFBFBF"/>
@@ -26032,23 +26729,23 @@
         </w:tc>
         <w:tc>
           <w:tcPr>
-            <w:tcW w:w="1503" w:type="dxa"/>
-            <w:tcBorders>
-              <w:top w:val="single" w:sz="4" w:space="0" w:color="BFBFBF"/>
-              <w:left w:val="single" w:sz="4" w:space="0" w:color="BFBFBF"/>
-              <w:bottom w:val="single" w:sz="4" w:space="0" w:color="BFBFBF"/>
-              <w:right w:val="single" w:sz="4" w:space="0" w:color="BFBFBF"/>
-            </w:tcBorders>
-          </w:tcPr>
-          <w:p>
-            <w:pPr>
-              <w:pStyle w:val="Compact"/>
-            </w:pPr>
-          </w:p>
-        </w:tc>
-        <w:tc>
-          <w:tcPr>
-            <w:tcW w:w="798" w:type="dxa"/>
+            <w:tcW w:w="1703" w:type="dxa"/>
+            <w:tcBorders>
+              <w:top w:val="single" w:sz="4" w:space="0" w:color="BFBFBF"/>
+              <w:left w:val="single" w:sz="4" w:space="0" w:color="BFBFBF"/>
+              <w:bottom w:val="single" w:sz="4" w:space="0" w:color="BFBFBF"/>
+              <w:right w:val="single" w:sz="4" w:space="0" w:color="BFBFBF"/>
+            </w:tcBorders>
+          </w:tcPr>
+          <w:p>
+            <w:pPr>
+              <w:pStyle w:val="Compact"/>
+            </w:pPr>
+          </w:p>
+        </w:tc>
+        <w:tc>
+          <w:tcPr>
+            <w:tcW w:w="904" w:type="dxa"/>
             <w:tcBorders>
               <w:top w:val="single" w:sz="4" w:space="0" w:color="BFBFBF"/>
               <w:left w:val="single" w:sz="4" w:space="0" w:color="BFBFBF"/>
@@ -26069,7 +26766,7 @@
       <w:tr>
         <w:tc>
           <w:tcPr>
-            <w:tcW w:w="395" w:type="dxa"/>
+            <w:tcW w:w="447" w:type="dxa"/>
             <w:tcBorders>
               <w:top w:val="single" w:sz="4" w:space="0" w:color="BFBFBF"/>
               <w:left w:val="single" w:sz="4" w:space="0" w:color="BFBFBF"/>
@@ -26088,7 +26785,7 @@
         </w:tc>
         <w:tc>
           <w:tcPr>
-            <w:tcW w:w="1705" w:type="dxa"/>
+            <w:tcW w:w="1931" w:type="dxa"/>
             <w:tcBorders>
               <w:top w:val="single" w:sz="4" w:space="0" w:color="BFBFBF"/>
               <w:left w:val="single" w:sz="4" w:space="0" w:color="BFBFBF"/>
@@ -26117,7 +26814,7 @@
         </w:tc>
         <w:tc>
           <w:tcPr>
-            <w:tcW w:w="1806" w:type="dxa"/>
+            <w:tcW w:w="2045" w:type="dxa"/>
             <w:tcBorders>
               <w:top w:val="single" w:sz="4" w:space="0" w:color="BFBFBF"/>
               <w:left w:val="single" w:sz="4" w:space="0" w:color="BFBFBF"/>
@@ -26136,7 +26833,7 @@
         </w:tc>
         <w:tc>
           <w:tcPr>
-            <w:tcW w:w="2331" w:type="dxa"/>
+            <w:tcW w:w="1361" w:type="dxa"/>
             <w:tcBorders>
               <w:top w:val="single" w:sz="4" w:space="0" w:color="BFBFBF"/>
               <w:left w:val="single" w:sz="4" w:space="0" w:color="BFBFBF"/>
@@ -26155,7 +26852,7 @@
         </w:tc>
         <w:tc>
           <w:tcPr>
-            <w:tcW w:w="1100" w:type="dxa"/>
+            <w:tcW w:w="1246" w:type="dxa"/>
             <w:tcBorders>
               <w:top w:val="single" w:sz="4" w:space="0" w:color="BFBFBF"/>
               <w:left w:val="single" w:sz="4" w:space="0" w:color="BFBFBF"/>
@@ -26174,23 +26871,23 @@
         </w:tc>
         <w:tc>
           <w:tcPr>
-            <w:tcW w:w="1503" w:type="dxa"/>
-            <w:tcBorders>
-              <w:top w:val="single" w:sz="4" w:space="0" w:color="BFBFBF"/>
-              <w:left w:val="single" w:sz="4" w:space="0" w:color="BFBFBF"/>
-              <w:bottom w:val="single" w:sz="4" w:space="0" w:color="BFBFBF"/>
-              <w:right w:val="single" w:sz="4" w:space="0" w:color="BFBFBF"/>
-            </w:tcBorders>
-          </w:tcPr>
-          <w:p>
-            <w:pPr>
-              <w:pStyle w:val="Compact"/>
-            </w:pPr>
-          </w:p>
-        </w:tc>
-        <w:tc>
-          <w:tcPr>
-            <w:tcW w:w="798" w:type="dxa"/>
+            <w:tcW w:w="1703" w:type="dxa"/>
+            <w:tcBorders>
+              <w:top w:val="single" w:sz="4" w:space="0" w:color="BFBFBF"/>
+              <w:left w:val="single" w:sz="4" w:space="0" w:color="BFBFBF"/>
+              <w:bottom w:val="single" w:sz="4" w:space="0" w:color="BFBFBF"/>
+              <w:right w:val="single" w:sz="4" w:space="0" w:color="BFBFBF"/>
+            </w:tcBorders>
+          </w:tcPr>
+          <w:p>
+            <w:pPr>
+              <w:pStyle w:val="Compact"/>
+            </w:pPr>
+          </w:p>
+        </w:tc>
+        <w:tc>
+          <w:tcPr>
+            <w:tcW w:w="904" w:type="dxa"/>
             <w:tcBorders>
               <w:top w:val="single" w:sz="4" w:space="0" w:color="BFBFBF"/>
               <w:left w:val="single" w:sz="4" w:space="0" w:color="BFBFBF"/>
@@ -27044,7 +27741,7 @@
               <w:pStyle w:val="Compact"/>
             </w:pPr>
             <w:r>
-              <w:t xml:space="preserve">Serverless SQL warehouse</w:t>
+              <w:t xml:space="preserve">SQL warehouse</w:t>
             </w:r>
           </w:p>
         </w:tc>
@@ -27063,23 +27760,7 @@
               <w:pStyle w:val="Compact"/>
             </w:pPr>
             <w:r>
-              <w:t xml:space="preserve">Name it</w:t>
-            </w:r>
-            <w:r>
-              <w:t xml:space="preserve"> </w:t>
-            </w:r>
-            <w:r>
-              <w:rPr>
-                <w:b/>
-                <w:bCs/>
-              </w:rPr>
-              <w:t xml:space="preserve">SMBC Workshop</w:t>
-            </w:r>
-            <w:r>
-              <w:t xml:space="preserve">, size Small or Medium, minimum 1 and maximum 4 clusters for about 40–60 people. Set a longer auto-stop on the day. Give the attendee group</w:t>
-            </w:r>
-            <w:r>
-              <w:t xml:space="preserve"> </w:t>
+              <w:t xml:space="preserve">Any pro or serverless SQL warehouse that attendees can use (</w:t>
             </w:r>
             <w:r>
               <w:rPr>
@@ -27089,7 +27770,20 @@
               <w:t xml:space="preserve">CAN USE</w:t>
             </w:r>
             <w:r>
-              <w:t xml:space="preserve">. Genie Agents need a pro or serverless warehouse; serverless is recommended.</w:t>
+              <w:t xml:space="preserve">), for example the workspace's</w:t>
+            </w:r>
+            <w:r>
+              <w:t xml:space="preserve"> </w:t>
+            </w:r>
+            <w:r>
+              <w:rPr>
+                <w:b/>
+                <w:bCs/>
+              </w:rPr>
+              <w:t xml:space="preserve">Serverless Starter Warehouse</w:t>
+            </w:r>
+            <w:r>
+              <w:t xml:space="preserve">. The setup uses the one you name, or picks the first one you can use, and prints its name: give that name to attendees. For about 40–60 people, a Small or Medium serverless warehouse with up to 4 clusters is comfortable; if you manage it, set a longer auto-stop on the day. Genie Agents need pro or serverless; serverless is recommended.</w:t>
             </w:r>
           </w:p>
         </w:tc>
@@ -27169,9 +27863,9 @@
         <w:tblLook w:firstRow="1" w:lastRow="0" w:firstColumn="0" w:lastColumn="0" w:noHBand="0" w:noVBand="0" w:val="0020"/>
       </w:tblPr>
       <w:tblGrid>
-        <w:gridCol w:w="3040"/>
-        <w:gridCol w:w="2717"/>
-        <w:gridCol w:w="3881"/>
+        <w:gridCol w:w="2874"/>
+        <w:gridCol w:w="3382"/>
+        <w:gridCol w:w="3382"/>
       </w:tblGrid>
       <w:tr>
         <w:trPr>
@@ -27179,7 +27873,7 @@
         </w:trPr>
         <w:tc>
           <w:tcPr>
-            <w:tcW w:w="3040" w:type="dxa"/>
+            <w:tcW w:w="2874" w:type="dxa"/>
             <w:tcBorders>
               <w:top w:val="single" w:sz="4" w:space="0" w:color="BFBFBF"/>
               <w:left w:val="single" w:sz="4" w:space="0" w:color="BFBFBF"/>
@@ -27202,7 +27896,7 @@
         </w:tc>
         <w:tc>
           <w:tcPr>
-            <w:tcW w:w="2717" w:type="dxa"/>
+            <w:tcW w:w="3382" w:type="dxa"/>
             <w:tcBorders>
               <w:top w:val="single" w:sz="4" w:space="0" w:color="BFBFBF"/>
               <w:left w:val="single" w:sz="4" w:space="0" w:color="BFBFBF"/>
@@ -27225,7 +27919,7 @@
         </w:tc>
         <w:tc>
           <w:tcPr>
-            <w:tcW w:w="3881" w:type="dxa"/>
+            <w:tcW w:w="3382" w:type="dxa"/>
             <w:tcBorders>
               <w:top w:val="single" w:sz="4" w:space="0" w:color="BFBFBF"/>
               <w:left w:val="single" w:sz="4" w:space="0" w:color="BFBFBF"/>
@@ -27250,38 +27944,26 @@
       <w:tr>
         <w:tc>
           <w:tcPr>
-            <w:tcW w:w="3040" w:type="dxa"/>
-            <w:tcBorders>
-              <w:top w:val="single" w:sz="4" w:space="0" w:color="BFBFBF"/>
-              <w:left w:val="single" w:sz="4" w:space="0" w:color="BFBFBF"/>
-              <w:bottom w:val="single" w:sz="4" w:space="0" w:color="BFBFBF"/>
-              <w:right w:val="single" w:sz="4" w:space="0" w:color="BFBFBF"/>
-            </w:tcBorders>
-          </w:tcPr>
-          <w:p>
-            <w:pPr>
-              <w:pStyle w:val="Compact"/>
-            </w:pPr>
-            <w:r>
-              <w:t xml:space="preserve">Attendees (group</w:t>
-            </w:r>
-            <w:r>
-              <w:t xml:space="preserve"> </w:t>
-            </w:r>
-            <w:r>
-              <w:rPr>
-                <w:rStyle w:val="VerbatimChar"/>
-              </w:rPr>
-              <w:t xml:space="preserve">smbc_workshop_attendees</w:t>
-            </w:r>
-            <w:r>
-              <w:t xml:space="preserve">)</w:t>
-            </w:r>
-          </w:p>
-        </w:tc>
-        <w:tc>
-          <w:tcPr>
-            <w:tcW w:w="2717" w:type="dxa"/>
+            <w:tcW w:w="2874" w:type="dxa"/>
+            <w:tcBorders>
+              <w:top w:val="single" w:sz="4" w:space="0" w:color="BFBFBF"/>
+              <w:left w:val="single" w:sz="4" w:space="0" w:color="BFBFBF"/>
+              <w:bottom w:val="single" w:sz="4" w:space="0" w:color="BFBFBF"/>
+              <w:right w:val="single" w:sz="4" w:space="0" w:color="BFBFBF"/>
+            </w:tcBorders>
+          </w:tcPr>
+          <w:p>
+            <w:pPr>
+              <w:pStyle w:val="Compact"/>
+            </w:pPr>
+            <w:r>
+              <w:t xml:space="preserve">Attendees (any workspace users: no group is needed)</w:t>
+            </w:r>
+          </w:p>
+        </w:tc>
+        <w:tc>
+          <w:tcPr>
+            <w:tcW w:w="3382" w:type="dxa"/>
             <w:tcBorders>
               <w:top w:val="single" w:sz="4" w:space="0" w:color="BFBFBF"/>
               <w:left w:val="single" w:sz="4" w:space="0" w:color="BFBFBF"/>
@@ -27316,11 +27998,17 @@
               </w:rPr>
               <w:t xml:space="preserve">Databricks SQL access</w:t>
             </w:r>
-          </w:p>
-        </w:tc>
-        <w:tc>
-          <w:tcPr>
-            <w:tcW w:w="3881" w:type="dxa"/>
+            <w:r>
+              <w:t xml:space="preserve"> </w:t>
+            </w:r>
+            <w:r>
+              <w:t xml:space="preserve">(on for workspace users by default)</w:t>
+            </w:r>
+          </w:p>
+        </w:tc>
+        <w:tc>
+          <w:tcPr>
+            <w:tcW w:w="3382" w:type="dxa"/>
             <w:tcBorders>
               <w:top w:val="single" w:sz="4" w:space="0" w:color="BFBFBF"/>
               <w:left w:val="single" w:sz="4" w:space="0" w:color="BFBFBF"/>
@@ -27341,20 +28029,58 @@
       <w:tr>
         <w:tc>
           <w:tcPr>
-            <w:tcW w:w="3040" w:type="dxa"/>
-            <w:tcBorders>
-              <w:top w:val="single" w:sz="4" w:space="0" w:color="BFBFBF"/>
-              <w:left w:val="single" w:sz="4" w:space="0" w:color="BFBFBF"/>
-              <w:bottom w:val="single" w:sz="4" w:space="0" w:color="BFBFBF"/>
-              <w:right w:val="single" w:sz="4" w:space="0" w:color="BFBFBF"/>
-            </w:tcBorders>
-          </w:tcPr>
-          <w:p>
-            <w:pPr>
-              <w:pStyle w:val="Compact"/>
-            </w:pPr>
-            <w:r>
-              <w:t xml:space="preserve">Facilitators (group</w:t>
+            <w:tcW w:w="2874" w:type="dxa"/>
+            <w:tcBorders>
+              <w:top w:val="single" w:sz="4" w:space="0" w:color="BFBFBF"/>
+              <w:left w:val="single" w:sz="4" w:space="0" w:color="BFBFBF"/>
+              <w:bottom w:val="single" w:sz="4" w:space="0" w:color="BFBFBF"/>
+              <w:right w:val="single" w:sz="4" w:space="0" w:color="BFBFBF"/>
+            </w:tcBorders>
+          </w:tcPr>
+          <w:p>
+            <w:pPr>
+              <w:pStyle w:val="Compact"/>
+            </w:pPr>
+            <w:r>
+              <w:t xml:space="preserve">Facilitators</w:t>
+            </w:r>
+          </w:p>
+        </w:tc>
+        <w:tc>
+          <w:tcPr>
+            <w:tcW w:w="3382" w:type="dxa"/>
+            <w:tcBorders>
+              <w:top w:val="single" w:sz="4" w:space="0" w:color="BFBFBF"/>
+              <w:left w:val="single" w:sz="4" w:space="0" w:color="BFBFBF"/>
+              <w:bottom w:val="single" w:sz="4" w:space="0" w:color="BFBFBF"/>
+              <w:right w:val="single" w:sz="4" w:space="0" w:color="BFBFBF"/>
+            </w:tcBorders>
+          </w:tcPr>
+          <w:p>
+            <w:pPr>
+              <w:pStyle w:val="Compact"/>
+            </w:pPr>
+            <w:r>
+              <w:t xml:space="preserve">Workspace admin (recommended)</w:t>
+            </w:r>
+          </w:p>
+        </w:tc>
+        <w:tc>
+          <w:tcPr>
+            <w:tcW w:w="3382" w:type="dxa"/>
+            <w:tcBorders>
+              <w:top w:val="single" w:sz="4" w:space="0" w:color="BFBFBF"/>
+              <w:left w:val="single" w:sz="4" w:space="0" w:color="BFBFBF"/>
+              <w:bottom w:val="single" w:sz="4" w:space="0" w:color="BFBFBF"/>
+              <w:right w:val="single" w:sz="4" w:space="0" w:color="BFBFBF"/>
+            </w:tcBorders>
+          </w:tcPr>
+          <w:p>
+            <w:pPr>
+              <w:pStyle w:val="Compact"/>
+            </w:pPr>
+            <w:r>
+              <w:t xml:space="preserve">Run the setup notebooks and the governance demo. List the other facilitators' emails in the setup's</w:t>
             </w:r>
             <w:r>
               <w:t xml:space="preserve"> </w:t>
@@ -27363,48 +28089,13 @@
               <w:rPr>
                 <w:rStyle w:val="VerbatimChar"/>
               </w:rPr>
-              <w:t xml:space="preserve">smbc_workshop_facilitators</w:t>
-            </w:r>
-            <w:r>
-              <w:t xml:space="preserve">)</w:t>
-            </w:r>
-          </w:p>
-        </w:tc>
-        <w:tc>
-          <w:tcPr>
-            <w:tcW w:w="2717" w:type="dxa"/>
-            <w:tcBorders>
-              <w:top w:val="single" w:sz="4" w:space="0" w:color="BFBFBF"/>
-              <w:left w:val="single" w:sz="4" w:space="0" w:color="BFBFBF"/>
-              <w:bottom w:val="single" w:sz="4" w:space="0" w:color="BFBFBF"/>
-              <w:right w:val="single" w:sz="4" w:space="0" w:color="BFBFBF"/>
-            </w:tcBorders>
-          </w:tcPr>
-          <w:p>
-            <w:pPr>
-              <w:pStyle w:val="Compact"/>
-            </w:pPr>
-            <w:r>
-              <w:t xml:space="preserve">Workspace admin (recommended)</w:t>
-            </w:r>
-          </w:p>
-        </w:tc>
-        <w:tc>
-          <w:tcPr>
-            <w:tcW w:w="3881" w:type="dxa"/>
-            <w:tcBorders>
-              <w:top w:val="single" w:sz="4" w:space="0" w:color="BFBFBF"/>
-              <w:left w:val="single" w:sz="4" w:space="0" w:color="BFBFBF"/>
-              <w:bottom w:val="single" w:sz="4" w:space="0" w:color="BFBFBF"/>
-              <w:right w:val="single" w:sz="4" w:space="0" w:color="BFBFBF"/>
-            </w:tcBorders>
-          </w:tcPr>
-          <w:p>
-            <w:pPr>
-              <w:pStyle w:val="Compact"/>
-            </w:pPr>
-            <w:r>
-              <w:t xml:space="preserve">Runs the setup notebooks, owns the catalog, runs the governance demo.</w:t>
+              <w:t xml:space="preserve">facilitator_emails</w:t>
+            </w:r>
+            <w:r>
+              <w:t xml:space="preserve"> </w:t>
+            </w:r>
+            <w:r>
+              <w:t xml:space="preserve">setting: they get full access to the catalog, see every branch in the governance demo, and can edit the reference dashboards and Genie Agents.</w:t>
             </w:r>
           </w:p>
         </w:tc>
@@ -27412,7 +28103,7 @@
       <w:tr>
         <w:tc>
           <w:tcPr>
-            <w:tcW w:w="3040" w:type="dxa"/>
+            <w:tcW w:w="2874" w:type="dxa"/>
             <w:tcBorders>
               <w:top w:val="single" w:sz="4" w:space="0" w:color="BFBFBF"/>
               <w:left w:val="single" w:sz="4" w:space="0" w:color="BFBFBF"/>
@@ -27431,7 +28122,7 @@
         </w:tc>
         <w:tc>
           <w:tcPr>
-            <w:tcW w:w="2717" w:type="dxa"/>
+            <w:tcW w:w="3382" w:type="dxa"/>
             <w:tcBorders>
               <w:top w:val="single" w:sz="4" w:space="0" w:color="BFBFBF"/>
               <w:left w:val="single" w:sz="4" w:space="0" w:color="BFBFBF"/>
@@ -27460,7 +28151,7 @@
         </w:tc>
         <w:tc>
           <w:tcPr>
-            <w:tcW w:w="3881" w:type="dxa"/>
+            <w:tcW w:w="3382" w:type="dxa"/>
             <w:tcBorders>
               <w:top w:val="single" w:sz="4" w:space="0" w:color="BFBFBF"/>
               <w:left w:val="single" w:sz="4" w:space="0" w:color="BFBFBF"/>
@@ -27494,10 +28185,13 @@
           <w:b/>
           <w:bCs/>
         </w:rPr>
-        <w:t xml:space="preserve">The two groups must be account-level groups</w:t>
-      </w:r>
-      <w:r>
-        <w:t xml:space="preserve">, synced from Entra ID through SCIM or created in the account console, and assigned to the workshop workspace. Groups created inside the workspace are workspace-local: Unity Catalog can't grant them privileges, and</w:t>
+        <w:t xml:space="preserve">No groups need to be created.</w:t>
+      </w:r>
+      <w:r>
+        <w:t xml:space="preserve"> </w:t>
+      </w:r>
+      <w:r>
+        <w:t xml:space="preserve">The setup shares the dashboards, Genie Agents and lab workbook with the workspace's built-in</w:t>
       </w:r>
       <w:r>
         <w:t xml:space="preserve"> </w:t>
@@ -27506,13 +28200,40 @@
         <w:rPr>
           <w:rStyle w:val="VerbatimChar"/>
         </w:rPr>
-        <w:t xml:space="preserve">is_account_group_member()</w:t>
-      </w:r>
-      <w:r>
-        <w:t xml:space="preserve"> </w:t>
-      </w:r>
-      <w:r>
-        <w:t xml:space="preserve">(used by the governance demo) doesn't recognise them. The setup notebook stops with an explicit error if a grant fails.</w:t>
+        <w:t xml:space="preserve">users</w:t>
+      </w:r>
+      <w:r>
+        <w:t xml:space="preserve"> </w:t>
+      </w:r>
+      <w:r>
+        <w:t xml:space="preserve">group, which is everyone in the workspace, and recognises facilitators by email. To share with an existing group instead, set</w:t>
+      </w:r>
+      <w:r>
+        <w:t xml:space="preserve"> </w:t>
+      </w:r>
+      <w:r>
+        <w:rPr>
+          <w:rStyle w:val="VerbatimChar"/>
+        </w:rPr>
+        <w:t xml:space="preserve">share_with</w:t>
+      </w:r>
+      <w:r>
+        <w:t xml:space="preserve"> </w:t>
+      </w:r>
+      <w:r>
+        <w:t xml:space="preserve">in</w:t>
+      </w:r>
+      <w:r>
+        <w:t xml:space="preserve"> </w:t>
+      </w:r>
+      <w:r>
+        <w:rPr>
+          <w:rStyle w:val="VerbatimChar"/>
+        </w:rPr>
+        <w:t xml:space="preserve">00_master_setup</w:t>
+      </w:r>
+      <w:r>
+        <w:t xml:space="preserve">.</w:t>
       </w:r>
     </w:p>
     <w:bookmarkEnd w:id="77"/>
@@ -27545,7 +28266,52 @@
         <w:t xml:space="preserve"> </w:t>
       </w:r>
       <w:r>
-        <w:t xml:space="preserve">privilege, and on some metastores a managed storage location.</w:t>
+        <w:t xml:space="preserve">privilege, and on metastores without root storage a managed location: set it in the setup, or create</w:t>
+      </w:r>
+      <w:r>
+        <w:t xml:space="preserve"> </w:t>
+      </w:r>
+      <w:r>
+        <w:rPr>
+          <w:rStyle w:val="VerbatimChar"/>
+        </w:rPr>
+        <w:t xml:space="preserve">smbc_workshop</w:t>
+      </w:r>
+      <w:r>
+        <w:t xml:space="preserve"> </w:t>
+      </w:r>
+      <w:r>
+        <w:t xml:space="preserve">yourself in Catalog Explorer, which can use Default Storage. If the catalog already exists, whoever runs the setup needs</w:t>
+      </w:r>
+      <w:r>
+        <w:t xml:space="preserve"> </w:t>
+      </w:r>
+      <w:r>
+        <w:rPr>
+          <w:rStyle w:val="VerbatimChar"/>
+        </w:rPr>
+        <w:t xml:space="preserve">ALL PRIVILEGES</w:t>
+      </w:r>
+      <w:r>
+        <w:t xml:space="preserve"> </w:t>
+      </w:r>
+      <w:r>
+        <w:t xml:space="preserve">and</w:t>
+      </w:r>
+      <w:r>
+        <w:t xml:space="preserve"> </w:t>
+      </w:r>
+      <w:r>
+        <w:rPr>
+          <w:rStyle w:val="VerbatimChar"/>
+        </w:rPr>
+        <w:t xml:space="preserve">MANAGE</w:t>
+      </w:r>
+      <w:r>
+        <w:t xml:space="preserve"> </w:t>
+      </w:r>
+      <w:r>
+        <w:t xml:space="preserve">on it.</w:t>
       </w:r>
     </w:p>
     <w:tbl>
@@ -27556,9 +28322,9 @@
         <w:tblLook w:firstRow="1" w:lastRow="0" w:firstColumn="0" w:lastColumn="0" w:noHBand="0" w:noVBand="0" w:val="0020"/>
       </w:tblPr>
       <w:tblGrid>
-        <w:gridCol w:w="3433"/>
-        <w:gridCol w:w="3961"/>
-        <w:gridCol w:w="2244"/>
+        <w:gridCol w:w="3075"/>
+        <w:gridCol w:w="3548"/>
+        <w:gridCol w:w="3016"/>
       </w:tblGrid>
       <w:tr>
         <w:trPr>
@@ -27566,7 +28332,7 @@
         </w:trPr>
         <w:tc>
           <w:tcPr>
-            <w:tcW w:w="3433" w:type="dxa"/>
+            <w:tcW w:w="3075" w:type="dxa"/>
             <w:tcBorders>
               <w:top w:val="single" w:sz="4" w:space="0" w:color="BFBFBF"/>
               <w:left w:val="single" w:sz="4" w:space="0" w:color="BFBFBF"/>
@@ -27589,7 +28355,7 @@
         </w:tc>
         <w:tc>
           <w:tcPr>
-            <w:tcW w:w="3961" w:type="dxa"/>
+            <w:tcW w:w="3548" w:type="dxa"/>
             <w:tcBorders>
               <w:top w:val="single" w:sz="4" w:space="0" w:color="BFBFBF"/>
               <w:left w:val="single" w:sz="4" w:space="0" w:color="BFBFBF"/>
@@ -27612,7 +28378,7 @@
         </w:tc>
         <w:tc>
           <w:tcPr>
-            <w:tcW w:w="2244" w:type="dxa"/>
+            <w:tcW w:w="3016" w:type="dxa"/>
             <w:tcBorders>
               <w:top w:val="single" w:sz="4" w:space="0" w:color="BFBFBF"/>
               <w:left w:val="single" w:sz="4" w:space="0" w:color="BFBFBF"/>
@@ -27629,7 +28395,7 @@
               <w:rPr>
                 <w:b/>
               </w:rPr>
-              <w:t xml:space="preserve">Attendee privileges</w:t>
+              <w:t xml:space="preserve">What attendees need</w:t>
             </w:r>
           </w:p>
         </w:tc>
@@ -27637,7 +28403,7 @@
       <w:tr>
         <w:tc>
           <w:tcPr>
-            <w:tcW w:w="3433" w:type="dxa"/>
+            <w:tcW w:w="3075" w:type="dxa"/>
             <w:tcBorders>
               <w:top w:val="single" w:sz="4" w:space="0" w:color="BFBFBF"/>
               <w:left w:val="single" w:sz="4" w:space="0" w:color="BFBFBF"/>
@@ -27665,7 +28431,7 @@
         </w:tc>
         <w:tc>
           <w:tcPr>
-            <w:tcW w:w="3961" w:type="dxa"/>
+            <w:tcW w:w="3548" w:type="dxa"/>
             <w:tcBorders>
               <w:top w:val="single" w:sz="4" w:space="0" w:color="BFBFBF"/>
               <w:left w:val="single" w:sz="4" w:space="0" w:color="BFBFBF"/>
@@ -27714,7 +28480,7 @@
         </w:tc>
         <w:tc>
           <w:tcPr>
-            <w:tcW w:w="2244" w:type="dxa"/>
+            <w:tcW w:w="3016" w:type="dxa"/>
             <w:tcBorders>
               <w:top w:val="single" w:sz="4" w:space="0" w:color="BFBFBF"/>
               <w:left w:val="single" w:sz="4" w:space="0" w:color="BFBFBF"/>
@@ -27732,13 +28498,31 @@
               </w:rPr>
               <w:t xml:space="preserve">USE CATALOG</w:t>
             </w:r>
+            <w:r>
+              <w:t xml:space="preserve">, and</w:t>
+            </w:r>
+            <w:r>
+              <w:t xml:space="preserve"> </w:t>
+            </w:r>
+            <w:r>
+              <w:rPr>
+                <w:rStyle w:val="VerbatimChar"/>
+              </w:rPr>
+              <w:t xml:space="preserve">CREATE SCHEMA</w:t>
+            </w:r>
+            <w:r>
+              <w:t xml:space="preserve"> </w:t>
+            </w:r>
+            <w:r>
+              <w:t xml:space="preserve">for their own schema</w:t>
+            </w:r>
           </w:p>
         </w:tc>
       </w:tr>
       <w:tr>
         <w:tc>
           <w:tcPr>
-            <w:tcW w:w="3433" w:type="dxa"/>
+            <w:tcW w:w="3075" w:type="dxa"/>
             <w:tcBorders>
               <w:top w:val="single" w:sz="4" w:space="0" w:color="BFBFBF"/>
               <w:left w:val="single" w:sz="4" w:space="0" w:color="BFBFBF"/>
@@ -27766,7 +28550,7 @@
         </w:tc>
         <w:tc>
           <w:tcPr>
-            <w:tcW w:w="3961" w:type="dxa"/>
+            <w:tcW w:w="3548" w:type="dxa"/>
             <w:tcBorders>
               <w:top w:val="single" w:sz="4" w:space="0" w:color="BFBFBF"/>
               <w:left w:val="single" w:sz="4" w:space="0" w:color="BFBFBF"/>
@@ -27785,7 +28569,7 @@
         </w:tc>
         <w:tc>
           <w:tcPr>
-            <w:tcW w:w="2244" w:type="dxa"/>
+            <w:tcW w:w="3016" w:type="dxa"/>
             <w:tcBorders>
               <w:top w:val="single" w:sz="4" w:space="0" w:color="BFBFBF"/>
               <w:left w:val="single" w:sz="4" w:space="0" w:color="BFBFBF"/>
@@ -27809,7 +28593,7 @@
       <w:tr>
         <w:tc>
           <w:tcPr>
-            <w:tcW w:w="3433" w:type="dxa"/>
+            <w:tcW w:w="3075" w:type="dxa"/>
             <w:tcBorders>
               <w:top w:val="single" w:sz="4" w:space="0" w:color="BFBFBF"/>
               <w:left w:val="single" w:sz="4" w:space="0" w:color="BFBFBF"/>
@@ -27837,7 +28621,7 @@
         </w:tc>
         <w:tc>
           <w:tcPr>
-            <w:tcW w:w="3961" w:type="dxa"/>
+            <w:tcW w:w="3548" w:type="dxa"/>
             <w:tcBorders>
               <w:top w:val="single" w:sz="4" w:space="0" w:color="BFBFBF"/>
               <w:left w:val="single" w:sz="4" w:space="0" w:color="BFBFBF"/>
@@ -27856,20 +28640,20 @@
         </w:tc>
         <w:tc>
           <w:tcPr>
-            <w:tcW w:w="2244" w:type="dxa"/>
-            <w:tcBorders>
-              <w:top w:val="single" w:sz="4" w:space="0" w:color="BFBFBF"/>
-              <w:left w:val="single" w:sz="4" w:space="0" w:color="BFBFBF"/>
-              <w:bottom w:val="single" w:sz="4" w:space="0" w:color="BFBFBF"/>
-              <w:right w:val="single" w:sz="4" w:space="0" w:color="BFBFBF"/>
-            </w:tcBorders>
-          </w:tcPr>
-          <w:p>
-            <w:pPr>
-              <w:pStyle w:val="Compact"/>
-            </w:pPr>
-            <w:r>
-              <w:t xml:space="preserve">none</w:t>
+            <w:tcW w:w="3016" w:type="dxa"/>
+            <w:tcBorders>
+              <w:top w:val="single" w:sz="4" w:space="0" w:color="BFBFBF"/>
+              <w:left w:val="single" w:sz="4" w:space="0" w:color="BFBFBF"/>
+              <w:bottom w:val="single" w:sz="4" w:space="0" w:color="BFBFBF"/>
+              <w:right w:val="single" w:sz="4" w:space="0" w:color="BFBFBF"/>
+            </w:tcBorders>
+          </w:tcPr>
+          <w:p>
+            <w:pPr>
+              <w:pStyle w:val="Compact"/>
+            </w:pPr>
+            <w:r>
+              <w:t xml:space="preserve">Nothing</w:t>
             </w:r>
           </w:p>
         </w:tc>
@@ -27877,7 +28661,7 @@
       <w:tr>
         <w:tc>
           <w:tcPr>
-            <w:tcW w:w="3433" w:type="dxa"/>
+            <w:tcW w:w="3075" w:type="dxa"/>
             <w:tcBorders>
               <w:top w:val="single" w:sz="4" w:space="0" w:color="BFBFBF"/>
               <w:left w:val="single" w:sz="4" w:space="0" w:color="BFBFBF"/>
@@ -27905,7 +28689,7 @@
         </w:tc>
         <w:tc>
           <w:tcPr>
-            <w:tcW w:w="3961" w:type="dxa"/>
+            <w:tcW w:w="3548" w:type="dxa"/>
             <w:tcBorders>
               <w:top w:val="single" w:sz="4" w:space="0" w:color="BFBFBF"/>
               <w:left w:val="single" w:sz="4" w:space="0" w:color="BFBFBF"/>
@@ -27924,7 +28708,7 @@
         </w:tc>
         <w:tc>
           <w:tcPr>
-            <w:tcW w:w="2244" w:type="dxa"/>
+            <w:tcW w:w="3016" w:type="dxa"/>
             <w:tcBorders>
               <w:top w:val="single" w:sz="4" w:space="0" w:color="BFBFBF"/>
               <w:left w:val="single" w:sz="4" w:space="0" w:color="BFBFBF"/>
@@ -27960,7 +28744,7 @@
       <w:tr>
         <w:tc>
           <w:tcPr>
-            <w:tcW w:w="3433" w:type="dxa"/>
+            <w:tcW w:w="3075" w:type="dxa"/>
             <w:tcBorders>
               <w:top w:val="single" w:sz="4" w:space="0" w:color="BFBFBF"/>
               <w:left w:val="single" w:sz="4" w:space="0" w:color="BFBFBF"/>
@@ -27988,7 +28772,7 @@
         </w:tc>
         <w:tc>
           <w:tcPr>
-            <w:tcW w:w="3961" w:type="dxa"/>
+            <w:tcW w:w="3548" w:type="dxa"/>
             <w:tcBorders>
               <w:top w:val="single" w:sz="4" w:space="0" w:color="BFBFBF"/>
               <w:left w:val="single" w:sz="4" w:space="0" w:color="BFBFBF"/>
@@ -28007,7 +28791,7 @@
         </w:tc>
         <w:tc>
           <w:tcPr>
-            <w:tcW w:w="2244" w:type="dxa"/>
+            <w:tcW w:w="3016" w:type="dxa"/>
             <w:tcBorders>
               <w:top w:val="single" w:sz="4" w:space="0" w:color="BFBFBF"/>
               <w:left w:val="single" w:sz="4" w:space="0" w:color="BFBFBF"/>
@@ -28023,7 +28807,7 @@
               <w:rPr>
                 <w:rStyle w:val="VerbatimChar"/>
               </w:rPr>
-              <w:t xml:space="preserve">SELECT</w:t>
+              <w:t xml:space="preserve">USE SCHEMA</w:t>
             </w:r>
             <w:r>
               <w:t xml:space="preserve">,</w:t>
@@ -28037,19 +28821,13 @@
               </w:rPr>
               <w:t xml:space="preserve">MODIFY</w:t>
             </w:r>
-            <w:r>
-              <w:t xml:space="preserve"> </w:t>
-            </w:r>
-            <w:r>
-              <w:t xml:space="preserve">on those two tables</w:t>
-            </w:r>
           </w:p>
         </w:tc>
       </w:tr>
       <w:tr>
         <w:tc>
           <w:tcPr>
-            <w:tcW w:w="3433" w:type="dxa"/>
+            <w:tcW w:w="3075" w:type="dxa"/>
             <w:tcBorders>
               <w:top w:val="single" w:sz="4" w:space="0" w:color="BFBFBF"/>
               <w:left w:val="single" w:sz="4" w:space="0" w:color="BFBFBF"/>
@@ -28077,47 +28855,354 @@
         </w:tc>
         <w:tc>
           <w:tcPr>
-            <w:tcW w:w="3961" w:type="dxa"/>
-            <w:tcBorders>
-              <w:top w:val="single" w:sz="4" w:space="0" w:color="BFBFBF"/>
-              <w:left w:val="single" w:sz="4" w:space="0" w:color="BFBFBF"/>
-              <w:bottom w:val="single" w:sz="4" w:space="0" w:color="BFBFBF"/>
-              <w:right w:val="single" w:sz="4" w:space="0" w:color="BFBFBF"/>
-            </w:tcBorders>
-          </w:tcPr>
-          <w:p>
-            <w:pPr>
-              <w:pStyle w:val="Compact"/>
-            </w:pPr>
-            <w:r>
-              <w:t xml:space="preserve">Each person's Lab 1 output</w:t>
-            </w:r>
-          </w:p>
-        </w:tc>
-        <w:tc>
-          <w:tcPr>
-            <w:tcW w:w="2244" w:type="dxa"/>
-            <w:tcBorders>
-              <w:top w:val="single" w:sz="4" w:space="0" w:color="BFBFBF"/>
-              <w:left w:val="single" w:sz="4" w:space="0" w:color="BFBFBF"/>
-              <w:bottom w:val="single" w:sz="4" w:space="0" w:color="BFBFBF"/>
-              <w:right w:val="single" w:sz="4" w:space="0" w:color="BFBFBF"/>
-            </w:tcBorders>
-          </w:tcPr>
-          <w:p>
-            <w:pPr>
-              <w:pStyle w:val="Compact"/>
-            </w:pPr>
-            <w:r>
-              <w:rPr>
-                <w:rStyle w:val="VerbatimChar"/>
-              </w:rPr>
-              <w:t xml:space="preserve">ALL PRIVILEGES</w:t>
+            <w:tcW w:w="3548" w:type="dxa"/>
+            <w:tcBorders>
+              <w:top w:val="single" w:sz="4" w:space="0" w:color="BFBFBF"/>
+              <w:left w:val="single" w:sz="4" w:space="0" w:color="BFBFBF"/>
+              <w:bottom w:val="single" w:sz="4" w:space="0" w:color="BFBFBF"/>
+              <w:right w:val="single" w:sz="4" w:space="0" w:color="BFBFBF"/>
+            </w:tcBorders>
+          </w:tcPr>
+          <w:p>
+            <w:pPr>
+              <w:pStyle w:val="Compact"/>
+            </w:pPr>
+            <w:r>
+              <w:t xml:space="preserve">Each person's Lab 1 output; their check-in block creates it</w:t>
+            </w:r>
+          </w:p>
+        </w:tc>
+        <w:tc>
+          <w:tcPr>
+            <w:tcW w:w="3016" w:type="dxa"/>
+            <w:tcBorders>
+              <w:top w:val="single" w:sz="4" w:space="0" w:color="BFBFBF"/>
+              <w:left w:val="single" w:sz="4" w:space="0" w:color="BFBFBF"/>
+              <w:bottom w:val="single" w:sz="4" w:space="0" w:color="BFBFBF"/>
+              <w:right w:val="single" w:sz="4" w:space="0" w:color="BFBFBF"/>
+            </w:tcBorders>
+          </w:tcPr>
+          <w:p>
+            <w:pPr>
+              <w:pStyle w:val="Compact"/>
+            </w:pPr>
+            <w:r>
+              <w:t xml:space="preserve">They own it</w:t>
             </w:r>
           </w:p>
         </w:tc>
       </w:tr>
     </w:tbl>
+    <w:p>
+      <w:pPr>
+        <w:pStyle w:val="BodyText"/>
+      </w:pPr>
+      <w:r>
+        <w:rPr>
+          <w:b/>
+          <w:bCs/>
+        </w:rPr>
+        <w:t xml:space="preserve">Giving attendees access.</w:t>
+      </w:r>
+      <w:r>
+        <w:t xml:space="preserve"> </w:t>
+      </w:r>
+      <w:r>
+        <w:t xml:space="preserve">The setup grants attendees nothing. Once it has run, the catalog owner or a metastore admin runs these three statements.</w:t>
+      </w:r>
+      <w:r>
+        <w:t xml:space="preserve"> </w:t>
+      </w:r>
+      <w:r>
+        <w:rPr>
+          <w:rStyle w:val="VerbatimChar"/>
+        </w:rPr>
+        <w:t xml:space="preserve">account users</w:t>
+      </w:r>
+      <w:r>
+        <w:t xml:space="preserve"> </w:t>
+      </w:r>
+      <w:r>
+        <w:t xml:space="preserve">is everyone in the account; use an existing group instead if you prefer.</w:t>
+      </w:r>
+    </w:p>
+    <w:p>
+      <w:pPr>
+        <w:pStyle w:val="SourceCode"/>
+      </w:pPr>
+      <w:r>
+        <w:rPr>
+          <w:rStyle w:val="KeywordTok"/>
+        </w:rPr>
+        <w:t xml:space="preserve">GRANT</w:t>
+      </w:r>
+      <w:r>
+        <w:rPr>
+          <w:rStyle w:val="NormalTok"/>
+        </w:rPr>
+        <w:t xml:space="preserve"> </w:t>
+      </w:r>
+      <w:r>
+        <w:rPr>
+          <w:rStyle w:val="KeywordTok"/>
+        </w:rPr>
+        <w:t xml:space="preserve">USE</w:t>
+      </w:r>
+      <w:r>
+        <w:rPr>
+          <w:rStyle w:val="NormalTok"/>
+        </w:rPr>
+        <w:t xml:space="preserve"> CATALOG, </w:t>
+      </w:r>
+      <w:r>
+        <w:rPr>
+          <w:rStyle w:val="KeywordTok"/>
+        </w:rPr>
+        <w:t xml:space="preserve">USE</w:t>
+      </w:r>
+      <w:r>
+        <w:rPr>
+          <w:rStyle w:val="NormalTok"/>
+        </w:rPr>
+        <w:t xml:space="preserve"> </w:t>
+      </w:r>
+      <w:r>
+        <w:rPr>
+          <w:rStyle w:val="KeywordTok"/>
+        </w:rPr>
+        <w:t xml:space="preserve">SCHEMA</w:t>
+      </w:r>
+      <w:r>
+        <w:rPr>
+          <w:rStyle w:val="NormalTok"/>
+        </w:rPr>
+        <w:t xml:space="preserve">, </w:t>
+      </w:r>
+      <w:r>
+        <w:rPr>
+          <w:rStyle w:val="KeywordTok"/>
+        </w:rPr>
+        <w:t xml:space="preserve">SELECT</w:t>
+      </w:r>
+      <w:r>
+        <w:rPr>
+          <w:rStyle w:val="NormalTok"/>
+        </w:rPr>
+        <w:t xml:space="preserve">, </w:t>
+      </w:r>
+      <w:r>
+        <w:rPr>
+          <w:rStyle w:val="KeywordTok"/>
+        </w:rPr>
+        <w:t xml:space="preserve">CREATE</w:t>
+      </w:r>
+      <w:r>
+        <w:rPr>
+          <w:rStyle w:val="NormalTok"/>
+        </w:rPr>
+        <w:t xml:space="preserve"> </w:t>
+      </w:r>
+      <w:r>
+        <w:rPr>
+          <w:rStyle w:val="KeywordTok"/>
+        </w:rPr>
+        <w:t xml:space="preserve">SCHEMA</w:t>
+      </w:r>
+      <w:r>
+        <w:rPr>
+          <w:rStyle w:val="NormalTok"/>
+        </w:rPr>
+        <w:t xml:space="preserve"> </w:t>
+      </w:r>
+      <w:r>
+        <w:rPr>
+          <w:rStyle w:val="KeywordTok"/>
+        </w:rPr>
+        <w:t xml:space="preserve">ON</w:t>
+      </w:r>
+      <w:r>
+        <w:rPr>
+          <w:rStyle w:val="NormalTok"/>
+        </w:rPr>
+        <w:t xml:space="preserve"> CATALOG smbc_workshop </w:t>
+      </w:r>
+      <w:r>
+        <w:rPr>
+          <w:rStyle w:val="KeywordTok"/>
+        </w:rPr>
+        <w:t xml:space="preserve">TO</w:t>
+      </w:r>
+      <w:r>
+        <w:rPr>
+          <w:rStyle w:val="NormalTok"/>
+        </w:rPr>
+        <w:t xml:space="preserve"> `account users`;</w:t>
+      </w:r>
+      <w:r>
+        <w:br/>
+      </w:r>
+      <w:r>
+        <w:rPr>
+          <w:rStyle w:val="KeywordTok"/>
+        </w:rPr>
+        <w:t xml:space="preserve">GRANT</w:t>
+      </w:r>
+      <w:r>
+        <w:rPr>
+          <w:rStyle w:val="NormalTok"/>
+        </w:rPr>
+        <w:t xml:space="preserve"> </w:t>
+      </w:r>
+      <w:r>
+        <w:rPr>
+          <w:rStyle w:val="KeywordTok"/>
+        </w:rPr>
+        <w:t xml:space="preserve">READ</w:t>
+      </w:r>
+      <w:r>
+        <w:rPr>
+          <w:rStyle w:val="NormalTok"/>
+        </w:rPr>
+        <w:t xml:space="preserve"> VOLUME </w:t>
+      </w:r>
+      <w:r>
+        <w:rPr>
+          <w:rStyle w:val="KeywordTok"/>
+        </w:rPr>
+        <w:t xml:space="preserve">ON</w:t>
+      </w:r>
+      <w:r>
+        <w:rPr>
+          <w:rStyle w:val="NormalTok"/>
+        </w:rPr>
+        <w:t xml:space="preserve"> VOLUME smbc_workshop.</w:t>
+      </w:r>
+      <w:r>
+        <w:rPr>
+          <w:rStyle w:val="DataTypeTok"/>
+        </w:rPr>
+        <w:t xml:space="preserve">raw</w:t>
+      </w:r>
+      <w:r>
+        <w:rPr>
+          <w:rStyle w:val="NormalTok"/>
+        </w:rPr>
+        <w:t xml:space="preserve">.landing </w:t>
+      </w:r>
+      <w:r>
+        <w:rPr>
+          <w:rStyle w:val="KeywordTok"/>
+        </w:rPr>
+        <w:t xml:space="preserve">TO</w:t>
+      </w:r>
+      <w:r>
+        <w:rPr>
+          <w:rStyle w:val="NormalTok"/>
+        </w:rPr>
+        <w:t xml:space="preserve"> `account users`;</w:t>
+      </w:r>
+      <w:r>
+        <w:br/>
+      </w:r>
+      <w:r>
+        <w:rPr>
+          <w:rStyle w:val="KeywordTok"/>
+        </w:rPr>
+        <w:t xml:space="preserve">GRANT</w:t>
+      </w:r>
+      <w:r>
+        <w:rPr>
+          <w:rStyle w:val="NormalTok"/>
+        </w:rPr>
+        <w:t xml:space="preserve"> </w:t>
+      </w:r>
+      <w:r>
+        <w:rPr>
+          <w:rStyle w:val="KeywordTok"/>
+        </w:rPr>
+        <w:t xml:space="preserve">MODIFY</w:t>
+      </w:r>
+      <w:r>
+        <w:rPr>
+          <w:rStyle w:val="NormalTok"/>
+        </w:rPr>
+        <w:t xml:space="preserve"> </w:t>
+      </w:r>
+      <w:r>
+        <w:rPr>
+          <w:rStyle w:val="KeywordTok"/>
+        </w:rPr>
+        <w:t xml:space="preserve">ON</w:t>
+      </w:r>
+      <w:r>
+        <w:rPr>
+          <w:rStyle w:val="NormalTok"/>
+        </w:rPr>
+        <w:t xml:space="preserve"> </w:t>
+      </w:r>
+      <w:r>
+        <w:rPr>
+          <w:rStyle w:val="KeywordTok"/>
+        </w:rPr>
+        <w:t xml:space="preserve">SCHEMA</w:t>
+      </w:r>
+      <w:r>
+        <w:rPr>
+          <w:rStyle w:val="NormalTok"/>
+        </w:rPr>
+        <w:t xml:space="preserve"> smbc_workshop.ops </w:t>
+      </w:r>
+      <w:r>
+        <w:rPr>
+          <w:rStyle w:val="KeywordTok"/>
+        </w:rPr>
+        <w:t xml:space="preserve">TO</w:t>
+      </w:r>
+      <w:r>
+        <w:rPr>
+          <w:rStyle w:val="NormalTok"/>
+        </w:rPr>
+        <w:t xml:space="preserve"> `account users`;</w:t>
+      </w:r>
+    </w:p>
+    <w:p>
+      <w:pPr>
+        <w:pStyle w:val="FirstParagraph"/>
+      </w:pPr>
+      <w:r>
+        <w:t xml:space="preserve">Granting</w:t>
+      </w:r>
+      <w:r>
+        <w:t xml:space="preserve"> </w:t>
+      </w:r>
+      <w:r>
+        <w:rPr>
+          <w:rStyle w:val="VerbatimChar"/>
+        </w:rPr>
+        <w:t xml:space="preserve">READ VOLUME</w:t>
+      </w:r>
+      <w:r>
+        <w:t xml:space="preserve"> </w:t>
+      </w:r>
+      <w:r>
+        <w:t xml:space="preserve">on the landing volume only keeps the answer key private. Attendees need no privileges on the governance demo's functions, because row filters and column masks run with their owner's rights.</w:t>
+      </w:r>
+      <w:r>
+        <w:t xml:space="preserve"> </w:t>
+      </w:r>
+      <w:r>
+        <w:rPr>
+          <w:rStyle w:val="VerbatimChar"/>
+        </w:rPr>
+        <w:t xml:space="preserve">07_check_requirements</w:t>
+      </w:r>
+      <w:r>
+        <w:t xml:space="preserve"> </w:t>
+      </w:r>
+      <w:r>
+        <w:t xml:space="preserve">reports whether attendees have everything they need.</w:t>
+      </w:r>
+    </w:p>
     <w:bookmarkEnd w:id="78"/>
     <w:bookmarkStart w:id="79" w:name="X0037348c626822b3e16d4414267eaa49ca3c9ca"/>
     <w:p>
@@ -28424,39 +29509,35 @@
               <w:pStyle w:val="Compact"/>
             </w:pPr>
             <w:r>
-              <w:t xml:space="preserve">Sign in through SSO; open the SQL editor on</w:t>
+              <w:t xml:space="preserve">Sign in through SSO; open the SQL editor on the workshop's SQL warehouse; run the check-in block (A.1)</w:t>
+            </w:r>
+          </w:p>
+        </w:tc>
+        <w:tc>
+          <w:tcPr>
+            <w:tcW w:w="3122" w:type="dxa"/>
+            <w:tcBorders>
+              <w:top w:val="single" w:sz="4" w:space="0" w:color="BFBFBF"/>
+              <w:left w:val="single" w:sz="4" w:space="0" w:color="BFBFBF"/>
+              <w:bottom w:val="single" w:sz="4" w:space="0" w:color="BFBFBF"/>
+              <w:right w:val="single" w:sz="4" w:space="0" w:color="BFBFBF"/>
+            </w:tcBorders>
+          </w:tcPr>
+          <w:p>
+            <w:pPr>
+              <w:pStyle w:val="Compact"/>
+            </w:pPr>
+            <w:r>
+              <w:t xml:space="preserve">It shows your schema, e.g.</w:t>
             </w:r>
             <w:r>
               <w:t xml:space="preserve"> </w:t>
             </w:r>
             <w:r>
               <w:rPr>
-                <w:b/>
-                <w:bCs/>
+                <w:rStyle w:val="VerbatimChar"/>
               </w:rPr>
-              <w:t xml:space="preserve">SMBC Workshop</w:t>
-            </w:r>
-            <w:r>
-              <w:t xml:space="preserve">; run the check-in query (A.1)</w:t>
-            </w:r>
-          </w:p>
-        </w:tc>
-        <w:tc>
-          <w:tcPr>
-            <w:tcW w:w="3122" w:type="dxa"/>
-            <w:tcBorders>
-              <w:top w:val="single" w:sz="4" w:space="0" w:color="BFBFBF"/>
-              <w:left w:val="single" w:sz="4" w:space="0" w:color="BFBFBF"/>
-              <w:bottom w:val="single" w:sz="4" w:space="0" w:color="BFBFBF"/>
-              <w:right w:val="single" w:sz="4" w:space="0" w:color="BFBFBF"/>
-            </w:tcBorders>
-          </w:tcPr>
-          <w:p>
-            <w:pPr>
-              <w:pStyle w:val="Compact"/>
-            </w:pPr>
-            <w:r>
-              <w:t xml:space="preserve">One row inserted</w:t>
+              <w:t xml:space="preserve">smbc_workshop.jane_tan</w:t>
             </w:r>
           </w:p>
         </w:tc>
@@ -28475,7 +29556,7 @@
               <w:pStyle w:val="Compact"/>
             </w:pPr>
             <w:r>
-              <w:t xml:space="preserve">Access, entitlements, warehouse, grants</w:t>
+              <w:t xml:space="preserve">Access, entitlements, warehouse, catalog access</w:t>
             </w:r>
           </w:p>
         </w:tc>
@@ -30364,10 +31445,7 @@
         <w:t xml:space="preserve">setup/00_master_setup</w:t>
       </w:r>
       <w:r>
-        <w:t xml:space="preserve"> </w:t>
-      </w:r>
-      <w:r>
-        <w:t xml:space="preserve">and fill in its settings:</w:t>
+        <w:t xml:space="preserve">. Every setting is optional:</w:t>
       </w:r>
     </w:p>
     <w:p>
@@ -30379,7 +31457,7 @@
         </w:numPr>
       </w:pPr>
       <w:r>
-        <w:t xml:space="preserve">the two groups;</w:t>
+        <w:t xml:space="preserve">a SQL warehouse to use (blank: the first pro or serverless warehouse you can use, serverless and running ones first);</w:t>
       </w:r>
     </w:p>
     <w:p>
@@ -30391,7 +31469,7 @@
         </w:numPr>
       </w:pPr>
       <w:r>
-        <w:t xml:space="preserve">the attendee emails, if you know them;</w:t>
+        <w:t xml:space="preserve">the other facilitators' emails (you're always included);</w:t>
       </w:r>
     </w:p>
     <w:p>
@@ -30403,7 +31481,31 @@
         </w:numPr>
       </w:pPr>
       <w:r>
-        <w:t xml:space="preserve">a managed location, only if creating a catalog asks for one.</w:t>
+        <w:t xml:space="preserve">a managed location, only if creating a catalog asks for one;</w:t>
+      </w:r>
+    </w:p>
+    <w:p>
+      <w:pPr>
+        <w:pStyle w:val="Compact"/>
+        <w:numPr>
+          <w:ilvl w:val="0"/>
+          <w:numId w:val="1043"/>
+        </w:numPr>
+      </w:pPr>
+      <w:r>
+        <w:t xml:space="preserve">who to share the dashboards, Genie Agents and lab workbook with (default</w:t>
+      </w:r>
+      <w:r>
+        <w:t xml:space="preserve"> </w:t>
+      </w:r>
+      <w:r>
+        <w:rPr>
+          <w:rStyle w:val="VerbatimChar"/>
+        </w:rPr>
+        <w:t xml:space="preserve">users</w:t>
+      </w:r>
+      <w:r>
+        <w:t xml:space="preserve">: everyone in the workspace).</w:t>
       </w:r>
     </w:p>
     <w:p>
@@ -30440,7 +31542,52 @@
         <w:t xml:space="preserve">Run all</w:t>
       </w:r>
       <w:r>
-        <w:t xml:space="preserve">. Before it creates anything, it checks the prerequisites that most often break a setup: that Unity Catalog is attached, that both groups exist and are account-level, and that you can create the SQL warehouse. Then it runs steps 2–6 and 8 below in order. It finishes with links to everything it created and the requirement checks. In testing it took about 5 minutes, and it's safe to re-run. It needs a workspace admin who can create a catalog. Steps 7 and 9 are done by hand.</w:t>
+        <w:t xml:space="preserve">. Before it creates anything, it checks that Unity Catalog is attached and that you can run queries on the SQL warehouse. Then it runs steps 2–6 and 9 below in order, and finishes with links to everything it created, the requirement checks, and the name of the warehouse to give attendees. In testing it took about 5 minutes, and it's safe to re-run. It needs someone who can create the</w:t>
+      </w:r>
+      <w:r>
+        <w:t xml:space="preserve"> </w:t>
+      </w:r>
+      <w:r>
+        <w:rPr>
+          <w:rStyle w:val="VerbatimChar"/>
+        </w:rPr>
+        <w:t xml:space="preserve">smbc_workshop</w:t>
+      </w:r>
+      <w:r>
+        <w:t xml:space="preserve"> </w:t>
+      </w:r>
+      <w:r>
+        <w:t xml:space="preserve">catalog, or who already has</w:t>
+      </w:r>
+      <w:r>
+        <w:t xml:space="preserve"> </w:t>
+      </w:r>
+      <w:r>
+        <w:rPr>
+          <w:rStyle w:val="VerbatimChar"/>
+        </w:rPr>
+        <w:t xml:space="preserve">ALL PRIVILEGES</w:t>
+      </w:r>
+      <w:r>
+        <w:t xml:space="preserve"> </w:t>
+      </w:r>
+      <w:r>
+        <w:t xml:space="preserve">and</w:t>
+      </w:r>
+      <w:r>
+        <w:t xml:space="preserve"> </w:t>
+      </w:r>
+      <w:r>
+        <w:rPr>
+          <w:rStyle w:val="VerbatimChar"/>
+        </w:rPr>
+        <w:t xml:space="preserve">MANAGE</w:t>
+      </w:r>
+      <w:r>
+        <w:t xml:space="preserve"> </w:t>
+      </w:r>
+      <w:r>
+        <w:t xml:space="preserve">on it; no groups are needed. Steps 7, 8 and 10 are done by hand.</w:t>
       </w:r>
     </w:p>
     <w:p>
@@ -30460,8 +31607,8 @@
       </w:tblPr>
       <w:tblGrid>
         <w:gridCol w:w="740"/>
-        <w:gridCol w:w="5207"/>
-        <w:gridCol w:w="2951"/>
+        <w:gridCol w:w="4995"/>
+        <w:gridCol w:w="3163"/>
         <w:gridCol w:w="740"/>
       </w:tblGrid>
       <w:tr>
@@ -30493,7 +31640,7 @@
         </w:tc>
         <w:tc>
           <w:tcPr>
-            <w:tcW w:w="5207" w:type="dxa"/>
+            <w:tcW w:w="4995" w:type="dxa"/>
             <w:tcBorders>
               <w:top w:val="single" w:sz="4" w:space="0" w:color="BFBFBF"/>
               <w:left w:val="single" w:sz="4" w:space="0" w:color="BFBFBF"/>
@@ -30516,7 +31663,7 @@
         </w:tc>
         <w:tc>
           <w:tcPr>
-            <w:tcW w:w="2951" w:type="dxa"/>
+            <w:tcW w:w="3163" w:type="dxa"/>
             <w:tcBorders>
               <w:top w:val="single" w:sz="4" w:space="0" w:color="BFBFBF"/>
               <w:left w:val="single" w:sz="4" w:space="0" w:color="BFBFBF"/>
@@ -30583,7 +31730,7 @@
         </w:tc>
         <w:tc>
           <w:tcPr>
-            <w:tcW w:w="5207" w:type="dxa"/>
+            <w:tcW w:w="4995" w:type="dxa"/>
             <w:tcBorders>
               <w:top w:val="single" w:sz="4" w:space="0" w:color="BFBFBF"/>
               <w:left w:val="single" w:sz="4" w:space="0" w:color="BFBFBF"/>
@@ -30633,7 +31780,7 @@
         </w:tc>
         <w:tc>
           <w:tcPr>
-            <w:tcW w:w="2951" w:type="dxa"/>
+            <w:tcW w:w="3163" w:type="dxa"/>
             <w:tcBorders>
               <w:top w:val="single" w:sz="4" w:space="0" w:color="BFBFBF"/>
               <w:left w:val="single" w:sz="4" w:space="0" w:color="BFBFBF"/>
@@ -30692,7 +31839,7 @@
         </w:tc>
         <w:tc>
           <w:tcPr>
-            <w:tcW w:w="5207" w:type="dxa"/>
+            <w:tcW w:w="4995" w:type="dxa"/>
             <w:tcBorders>
               <w:top w:val="single" w:sz="4" w:space="0" w:color="BFBFBF"/>
               <w:left w:val="single" w:sz="4" w:space="0" w:color="BFBFBF"/>
@@ -30711,26 +31858,56 @@
               <w:t xml:space="preserve">setup/01_setup_workspace</w:t>
             </w:r>
             <w:r>
-              <w:t xml:space="preserve">: creates the catalog, schemas, volumes, ops tables, per-attendee schemas and grants, and generates the data into the landing volume. Set the widgets: groups, and attendee emails if known.</w:t>
-            </w:r>
-          </w:p>
-        </w:tc>
-        <w:tc>
-          <w:tcPr>
-            <w:tcW w:w="2951" w:type="dxa"/>
-            <w:tcBorders>
-              <w:top w:val="single" w:sz="4" w:space="0" w:color="BFBFBF"/>
-              <w:left w:val="single" w:sz="4" w:space="0" w:color="BFBFBF"/>
-              <w:bottom w:val="single" w:sz="4" w:space="0" w:color="BFBFBF"/>
-              <w:right w:val="single" w:sz="4" w:space="0" w:color="BFBFBF"/>
-            </w:tcBorders>
-          </w:tcPr>
-          <w:p>
-            <w:pPr>
-              <w:pStyle w:val="Compact"/>
-            </w:pPr>
-            <w:r>
-              <w:t xml:space="preserve">Facilitator with catalog rights</w:t>
+              <w:t xml:space="preserve">: creates the catalog, schemas, volumes and ops tables, generates the data into the landing volume, and gives the facilitators</w:t>
+            </w:r>
+            <w:r>
+              <w:t xml:space="preserve"> </w:t>
+            </w:r>
+            <w:r>
+              <w:rPr>
+                <w:rStyle w:val="VerbatimChar"/>
+              </w:rPr>
+              <w:t xml:space="preserve">ALL PRIVILEGES</w:t>
+            </w:r>
+            <w:r>
+              <w:t xml:space="preserve"> </w:t>
+            </w:r>
+            <w:r>
+              <w:t xml:space="preserve">and</w:t>
+            </w:r>
+            <w:r>
+              <w:t xml:space="preserve"> </w:t>
+            </w:r>
+            <w:r>
+              <w:rPr>
+                <w:rStyle w:val="VerbatimChar"/>
+              </w:rPr>
+              <w:t xml:space="preserve">MANAGE</w:t>
+            </w:r>
+            <w:r>
+              <w:t xml:space="preserve"> </w:t>
+            </w:r>
+            <w:r>
+              <w:t xml:space="preserve">on the catalog</w:t>
+            </w:r>
+          </w:p>
+        </w:tc>
+        <w:tc>
+          <w:tcPr>
+            <w:tcW w:w="3163" w:type="dxa"/>
+            <w:tcBorders>
+              <w:top w:val="single" w:sz="4" w:space="0" w:color="BFBFBF"/>
+              <w:left w:val="single" w:sz="4" w:space="0" w:color="BFBFBF"/>
+              <w:bottom w:val="single" w:sz="4" w:space="0" w:color="BFBFBF"/>
+              <w:right w:val="single" w:sz="4" w:space="0" w:color="BFBFBF"/>
+            </w:tcBorders>
+          </w:tcPr>
+          <w:p>
+            <w:pPr>
+              <w:pStyle w:val="Compact"/>
+            </w:pPr>
+            <w:r>
+              <w:t xml:space="preserve">Facilitator who can create the catalog</w:t>
             </w:r>
           </w:p>
         </w:tc>
@@ -30776,7 +31953,7 @@
         </w:tc>
         <w:tc>
           <w:tcPr>
-            <w:tcW w:w="5207" w:type="dxa"/>
+            <w:tcW w:w="4995" w:type="dxa"/>
             <w:tcBorders>
               <w:top w:val="single" w:sz="4" w:space="0" w:color="BFBFBF"/>
               <w:left w:val="single" w:sz="4" w:space="0" w:color="BFBFBF"/>
@@ -30804,7 +31981,7 @@
         </w:tc>
         <w:tc>
           <w:tcPr>
-            <w:tcW w:w="2951" w:type="dxa"/>
+            <w:tcW w:w="3163" w:type="dxa"/>
             <w:tcBorders>
               <w:top w:val="single" w:sz="4" w:space="0" w:color="BFBFBF"/>
               <w:left w:val="single" w:sz="4" w:space="0" w:color="BFBFBF"/>
@@ -30863,7 +32040,7 @@
         </w:tc>
         <w:tc>
           <w:tcPr>
-            <w:tcW w:w="5207" w:type="dxa"/>
+            <w:tcW w:w="4995" w:type="dxa"/>
             <w:tcBorders>
               <w:top w:val="single" w:sz="4" w:space="0" w:color="BFBFBF"/>
               <w:left w:val="single" w:sz="4" w:space="0" w:color="BFBFBF"/>
@@ -30888,7 +32065,7 @@
         </w:tc>
         <w:tc>
           <w:tcPr>
-            <w:tcW w:w="2951" w:type="dxa"/>
+            <w:tcW w:w="3163" w:type="dxa"/>
             <w:tcBorders>
               <w:top w:val="single" w:sz="4" w:space="0" w:color="BFBFBF"/>
               <w:left w:val="single" w:sz="4" w:space="0" w:color="BFBFBF"/>
@@ -30947,7 +32124,7 @@
         </w:tc>
         <w:tc>
           <w:tcPr>
-            <w:tcW w:w="5207" w:type="dxa"/>
+            <w:tcW w:w="4995" w:type="dxa"/>
             <w:tcBorders>
               <w:top w:val="single" w:sz="4" w:space="0" w:color="BFBFBF"/>
               <w:left w:val="single" w:sz="4" w:space="0" w:color="BFBFBF"/>
@@ -30972,7 +32149,7 @@
         </w:tc>
         <w:tc>
           <w:tcPr>
-            <w:tcW w:w="2951" w:type="dxa"/>
+            <w:tcW w:w="3163" w:type="dxa"/>
             <w:tcBorders>
               <w:top w:val="single" w:sz="4" w:space="0" w:color="BFBFBF"/>
               <w:left w:val="single" w:sz="4" w:space="0" w:color="BFBFBF"/>
@@ -31031,7 +32208,7 @@
         </w:tc>
         <w:tc>
           <w:tcPr>
-            <w:tcW w:w="5207" w:type="dxa"/>
+            <w:tcW w:w="4995" w:type="dxa"/>
             <w:tcBorders>
               <w:top w:val="single" w:sz="4" w:space="0" w:color="BFBFBF"/>
               <w:left w:val="single" w:sz="4" w:space="0" w:color="BFBFBF"/>
@@ -31050,23 +32227,7 @@
               <w:t xml:space="preserve">setup/06_deploy_dashboards_and_agents</w:t>
             </w:r>
             <w:r>
-              <w:t xml:space="preserve">: creates the</w:t>
-            </w:r>
-            <w:r>
-              <w:t xml:space="preserve"> </w:t>
-            </w:r>
-            <w:r>
-              <w:rPr>
-                <w:b/>
-                <w:bCs/>
-              </w:rPr>
-              <w:t xml:space="preserve">SMBC Workshop</w:t>
-            </w:r>
-            <w:r>
-              <w:t xml:space="preserve"> </w:t>
-            </w:r>
-            <w:r>
-              <w:t xml:space="preserve">SQL warehouse if it doesn't exist (3.4); tests and publishes the</w:t>
+              <w:t xml:space="preserve">: picks the SQL warehouse (3.4); tests and publishes the</w:t>
             </w:r>
             <w:r>
               <w:t xml:space="preserve"> </w:t>
@@ -31143,26 +32304,26 @@
               <w:t xml:space="preserve"> </w:t>
             </w:r>
             <w:r>
-              <w:t xml:space="preserve">notebook; and shares all of them with the attendee and facilitator groups. Creating the warehouse needs workspace admin rights.</w:t>
-            </w:r>
-          </w:p>
-        </w:tc>
-        <w:tc>
-          <w:tcPr>
-            <w:tcW w:w="2951" w:type="dxa"/>
-            <w:tcBorders>
-              <w:top w:val="single" w:sz="4" w:space="0" w:color="BFBFBF"/>
-              <w:left w:val="single" w:sz="4" w:space="0" w:color="BFBFBF"/>
-              <w:bottom w:val="single" w:sz="4" w:space="0" w:color="BFBFBF"/>
-              <w:right w:val="single" w:sz="4" w:space="0" w:color="BFBFBF"/>
-            </w:tcBorders>
-          </w:tcPr>
-          <w:p>
-            <w:pPr>
-              <w:pStyle w:val="Compact"/>
-            </w:pPr>
-            <w:r>
-              <w:t xml:space="preserve">Facilitator (workspace admin)</w:t>
+              <w:t xml:space="preserve">notebook; and shares all of them with everyone in the workspace</w:t>
+            </w:r>
+          </w:p>
+        </w:tc>
+        <w:tc>
+          <w:tcPr>
+            <w:tcW w:w="3163" w:type="dxa"/>
+            <w:tcBorders>
+              <w:top w:val="single" w:sz="4" w:space="0" w:color="BFBFBF"/>
+              <w:left w:val="single" w:sz="4" w:space="0" w:color="BFBFBF"/>
+              <w:bottom w:val="single" w:sz="4" w:space="0" w:color="BFBFBF"/>
+              <w:right w:val="single" w:sz="4" w:space="0" w:color="BFBFBF"/>
+            </w:tcBorders>
+          </w:tcPr>
+          <w:p>
+            <w:pPr>
+              <w:pStyle w:val="Compact"/>
+            </w:pPr>
+            <w:r>
+              <w:t xml:space="preserve">Facilitator</w:t>
             </w:r>
           </w:p>
         </w:tc>
@@ -31208,39 +32369,51 @@
         </w:tc>
         <w:tc>
           <w:tcPr>
-            <w:tcW w:w="5207" w:type="dxa"/>
-            <w:tcBorders>
-              <w:top w:val="single" w:sz="4" w:space="0" w:color="BFBFBF"/>
-              <w:left w:val="single" w:sz="4" w:space="0" w:color="BFBFBF"/>
-              <w:bottom w:val="single" w:sz="4" w:space="0" w:color="BFBFBF"/>
-              <w:right w:val="single" w:sz="4" w:space="0" w:color="BFBFBF"/>
-            </w:tcBorders>
-          </w:tcPr>
-          <w:p>
-            <w:pPr>
-              <w:pStyle w:val="Compact"/>
-            </w:pPr>
-            <w:r>
-              <w:t xml:space="preserve">Set up the Genie One homepage (3.3)</w:t>
-            </w:r>
-          </w:p>
-        </w:tc>
-        <w:tc>
-          <w:tcPr>
-            <w:tcW w:w="2951" w:type="dxa"/>
-            <w:tcBorders>
-              <w:top w:val="single" w:sz="4" w:space="0" w:color="BFBFBF"/>
-              <w:left w:val="single" w:sz="4" w:space="0" w:color="BFBFBF"/>
-              <w:bottom w:val="single" w:sz="4" w:space="0" w:color="BFBFBF"/>
-              <w:right w:val="single" w:sz="4" w:space="0" w:color="BFBFBF"/>
-            </w:tcBorders>
-          </w:tcPr>
-          <w:p>
-            <w:pPr>
-              <w:pStyle w:val="Compact"/>
-            </w:pPr>
-            <w:r>
-              <w:t xml:space="preserve">Workspace admin</w:t>
+            <w:tcW w:w="4995" w:type="dxa"/>
+            <w:tcBorders>
+              <w:top w:val="single" w:sz="4" w:space="0" w:color="BFBFBF"/>
+              <w:left w:val="single" w:sz="4" w:space="0" w:color="BFBFBF"/>
+              <w:bottom w:val="single" w:sz="4" w:space="0" w:color="BFBFBF"/>
+              <w:right w:val="single" w:sz="4" w:space="0" w:color="BFBFBF"/>
+            </w:tcBorders>
+          </w:tcPr>
+          <w:p>
+            <w:pPr>
+              <w:pStyle w:val="Compact"/>
+            </w:pPr>
+            <w:r>
+              <w:t xml:space="preserve">Give attendees access to</w:t>
+            </w:r>
+            <w:r>
+              <w:t xml:space="preserve"> </w:t>
+            </w:r>
+            <w:r>
+              <w:rPr>
+                <w:rStyle w:val="VerbatimChar"/>
+              </w:rPr>
+              <w:t xml:space="preserve">smbc_workshop</w:t>
+            </w:r>
+            <w:r>
+              <w:t xml:space="preserve">: the three grants in 3.6</w:t>
+            </w:r>
+          </w:p>
+        </w:tc>
+        <w:tc>
+          <w:tcPr>
+            <w:tcW w:w="3163" w:type="dxa"/>
+            <w:tcBorders>
+              <w:top w:val="single" w:sz="4" w:space="0" w:color="BFBFBF"/>
+              <w:left w:val="single" w:sz="4" w:space="0" w:color="BFBFBF"/>
+              <w:bottom w:val="single" w:sz="4" w:space="0" w:color="BFBFBF"/>
+              <w:right w:val="single" w:sz="4" w:space="0" w:color="BFBFBF"/>
+            </w:tcBorders>
+          </w:tcPr>
+          <w:p>
+            <w:pPr>
+              <w:pStyle w:val="Compact"/>
+            </w:pPr>
+            <w:r>
+              <w:t xml:space="preserve">Catalog owner or metastore admin</w:t>
             </w:r>
           </w:p>
         </w:tc>
@@ -31259,7 +32432,7 @@
               <w:pStyle w:val="Compact"/>
             </w:pPr>
             <w:r>
-              <w:t xml:space="preserve">5 min</w:t>
+              <w:t xml:space="preserve">1 min</w:t>
             </w:r>
           </w:p>
         </w:tc>
@@ -31286,7 +32459,85 @@
         </w:tc>
         <w:tc>
           <w:tcPr>
-            <w:tcW w:w="5207" w:type="dxa"/>
+            <w:tcW w:w="4995" w:type="dxa"/>
+            <w:tcBorders>
+              <w:top w:val="single" w:sz="4" w:space="0" w:color="BFBFBF"/>
+              <w:left w:val="single" w:sz="4" w:space="0" w:color="BFBFBF"/>
+              <w:bottom w:val="single" w:sz="4" w:space="0" w:color="BFBFBF"/>
+              <w:right w:val="single" w:sz="4" w:space="0" w:color="BFBFBF"/>
+            </w:tcBorders>
+          </w:tcPr>
+          <w:p>
+            <w:pPr>
+              <w:pStyle w:val="Compact"/>
+            </w:pPr>
+            <w:r>
+              <w:t xml:space="preserve">Set up the Genie One homepage (3.3)</w:t>
+            </w:r>
+          </w:p>
+        </w:tc>
+        <w:tc>
+          <w:tcPr>
+            <w:tcW w:w="3163" w:type="dxa"/>
+            <w:tcBorders>
+              <w:top w:val="single" w:sz="4" w:space="0" w:color="BFBFBF"/>
+              <w:left w:val="single" w:sz="4" w:space="0" w:color="BFBFBF"/>
+              <w:bottom w:val="single" w:sz="4" w:space="0" w:color="BFBFBF"/>
+              <w:right w:val="single" w:sz="4" w:space="0" w:color="BFBFBF"/>
+            </w:tcBorders>
+          </w:tcPr>
+          <w:p>
+            <w:pPr>
+              <w:pStyle w:val="Compact"/>
+            </w:pPr>
+            <w:r>
+              <w:t xml:space="preserve">Workspace admin</w:t>
+            </w:r>
+          </w:p>
+        </w:tc>
+        <w:tc>
+          <w:tcPr>
+            <w:tcW w:w="740" w:type="dxa"/>
+            <w:tcBorders>
+              <w:top w:val="single" w:sz="4" w:space="0" w:color="BFBFBF"/>
+              <w:left w:val="single" w:sz="4" w:space="0" w:color="BFBFBF"/>
+              <w:bottom w:val="single" w:sz="4" w:space="0" w:color="BFBFBF"/>
+              <w:right w:val="single" w:sz="4" w:space="0" w:color="BFBFBF"/>
+            </w:tcBorders>
+          </w:tcPr>
+          <w:p>
+            <w:pPr>
+              <w:pStyle w:val="Compact"/>
+            </w:pPr>
+            <w:r>
+              <w:t xml:space="preserve">5 min</w:t>
+            </w:r>
+          </w:p>
+        </w:tc>
+      </w:tr>
+      <w:tr>
+        <w:tc>
+          <w:tcPr>
+            <w:tcW w:w="740" w:type="dxa"/>
+            <w:tcBorders>
+              <w:top w:val="single" w:sz="4" w:space="0" w:color="BFBFBF"/>
+              <w:left w:val="single" w:sz="4" w:space="0" w:color="BFBFBF"/>
+              <w:bottom w:val="single" w:sz="4" w:space="0" w:color="BFBFBF"/>
+              <w:right w:val="single" w:sz="4" w:space="0" w:color="BFBFBF"/>
+            </w:tcBorders>
+          </w:tcPr>
+          <w:p>
+            <w:pPr>
+              <w:pStyle w:val="Compact"/>
+            </w:pPr>
+            <w:r>
+              <w:t xml:space="preserve">9</w:t>
+            </w:r>
+          </w:p>
+        </w:tc>
+        <w:tc>
+          <w:tcPr>
+            <w:tcW w:w="4995" w:type="dxa"/>
             <w:tcBorders>
               <w:top w:val="single" w:sz="4" w:space="0" w:color="BFBFBF"/>
               <w:left w:val="single" w:sz="4" w:space="0" w:color="BFBFBF"/>
@@ -31305,13 +32556,13 @@
               <w:t xml:space="preserve">setup/07_check_requirements</w:t>
             </w:r>
             <w:r>
-              <w:t xml:space="preserve">: automated checks of the requirements in section 3, including whether the groups are account-level and a live question to the reference Genie Agent. Every row should say PASS.</w:t>
-            </w:r>
-          </w:p>
-        </w:tc>
-        <w:tc>
-          <w:tcPr>
-            <w:tcW w:w="2951" w:type="dxa"/>
+              <w:t xml:space="preserve">: automated checks of the requirements in section 3, including attendee access and a live question to the reference Genie Agent. Every row should say PASS; the attendee-access check warns until step 7 is done, so run it again afterwards.</w:t>
+            </w:r>
+          </w:p>
+        </w:tc>
+        <w:tc>
+          <w:tcPr>
+            <w:tcW w:w="3163" w:type="dxa"/>
             <w:tcBorders>
               <w:top w:val="single" w:sz="4" w:space="0" w:color="BFBFBF"/>
               <w:left w:val="single" w:sz="4" w:space="0" w:color="BFBFBF"/>
@@ -31364,13 +32615,13 @@
               <w:pStyle w:val="Compact"/>
             </w:pPr>
             <w:r>
-              <w:t xml:space="preserve">9</w:t>
-            </w:r>
-          </w:p>
-        </w:tc>
-        <w:tc>
-          <w:tcPr>
-            <w:tcW w:w="5207" w:type="dxa"/>
+              <w:t xml:space="preserve">10</w:t>
+            </w:r>
+          </w:p>
+        </w:tc>
+        <w:tc>
+          <w:tcPr>
+            <w:tcW w:w="4995" w:type="dxa"/>
             <w:tcBorders>
               <w:top w:val="single" w:sz="4" w:space="0" w:color="BFBFBF"/>
               <w:left w:val="single" w:sz="4" w:space="0" w:color="BFBFBF"/>
@@ -31389,7 +32640,7 @@
         </w:tc>
         <w:tc>
           <w:tcPr>
-            <w:tcW w:w="2951" w:type="dxa"/>
+            <w:tcW w:w="3163" w:type="dxa"/>
             <w:tcBorders>
               <w:top w:val="single" w:sz="4" w:space="0" w:color="BFBFBF"/>
               <w:left w:val="single" w:sz="4" w:space="0" w:color="BFBFBF"/>
@@ -31544,35 +32795,7 @@
         <w:t xml:space="preserve"> </w:t>
       </w:r>
       <w:r>
-        <w:t xml:space="preserve">is safe, for example after adding late registrations: add their emails and set</w:t>
-      </w:r>
-      <w:r>
-        <w:t xml:space="preserve"> </w:t>
-      </w:r>
-      <w:r>
-        <w:rPr>
-          <w:b/>
-          <w:bCs/>
-        </w:rPr>
-        <w:t xml:space="preserve">Generate the synthetic data</w:t>
-      </w:r>
-      <w:r>
-        <w:t xml:space="preserve"> </w:t>
-      </w:r>
-      <w:r>
-        <w:t xml:space="preserve">to</w:t>
-      </w:r>
-      <w:r>
-        <w:t xml:space="preserve"> </w:t>
-      </w:r>
-      <w:r>
-        <w:rPr>
-          <w:rStyle w:val="VerbatimChar"/>
-        </w:rPr>
-        <w:t xml:space="preserve">no</w:t>
-      </w:r>
-      <w:r>
-        <w:t xml:space="preserve">.</w:t>
+        <w:t xml:space="preserve">is safe. Late registrations need nothing from the setup: once they can sign in and have access to the catalog, their check-in creates their schema.</w:t>
       </w:r>
     </w:p>
     <w:p>
@@ -31691,16 +32914,17 @@
       </w:r>
       <w:r>
         <w:rPr>
+          <w:rStyle w:val="VerbatimChar"/>
           <w:b/>
           <w:bCs/>
         </w:rPr>
-        <w:t xml:space="preserve">SMBC Workshop</w:t>
-      </w:r>
-      <w:r>
-        <w:t xml:space="preserve"> </w:t>
-      </w:r>
-      <w:r>
-        <w:t xml:space="preserve">warehouse, paste the line below and click</w:t>
+        <w:t xml:space="preserve">&lt;warehouse name&gt;</w:t>
+      </w:r>
+      <w:r>
+        <w:t xml:space="preserve"> </w:t>
+      </w:r>
+      <w:r>
+        <w:t xml:space="preserve">SQL warehouse, paste the check-in block from the end of this email and click</w:t>
       </w:r>
       <w:r>
         <w:t xml:space="preserve"> </w:t>
@@ -31713,22 +32937,7 @@
         <w:t xml:space="preserve">Run</w:t>
       </w:r>
       <w:r>
-        <w:t xml:space="preserve">:</w:t>
-      </w:r>
-      <w:r>
-        <w:t xml:space="preserve"> </w:t>
-      </w:r>
-      <w:r>
-        <w:rPr>
-          <w:rStyle w:val="VerbatimChar"/>
-        </w:rPr>
-        <w:t xml:space="preserve">INSERT INTO smbc_workshop.ops.checkin SELECT current_user(), 'DA', current_timestamp();</w:t>
-      </w:r>
-      <w:r>
-        <w:t xml:space="preserve"> </w:t>
-      </w:r>
-      <w:r>
-        <w:t xml:space="preserve">(Change</w:t>
+        <w:t xml:space="preserve">. It checks you in and creates your schema for the labs. (Change</w:t>
       </w:r>
       <w:r>
         <w:t xml:space="preserve"> </w:t>
@@ -31782,6 +32991,70 @@
       </w:r>
     </w:p>
     <w:p>
+      <w:pPr>
+        <w:pStyle w:val="BlockText"/>
+      </w:pPr>
+      <w:r>
+        <w:t xml:space="preserve">Check-in block:</w:t>
+      </w:r>
+    </w:p>
+    <w:p>
+      <w:pPr>
+        <w:pStyle w:val="SourceCode"/>
+      </w:pPr>
+      <w:r>
+        <w:rPr>
+          <w:rStyle w:val="VerbatimChar"/>
+        </w:rPr>
+        <w:t xml:space="preserve">BEGIN</w:t>
+      </w:r>
+      <w:r>
+        <w:br/>
+      </w:r>
+      <w:r>
+        <w:rPr>
+          <w:rStyle w:val="VerbatimChar"/>
+        </w:rPr>
+        <w:t xml:space="preserve">  DECLARE my_schema STRING DEFAULT regexp_replace(lower(split_part(current_user(), '@', 1)), '[^a-z0-9_]', '_');</w:t>
+      </w:r>
+      <w:r>
+        <w:br/>
+      </w:r>
+      <w:r>
+        <w:rPr>
+          <w:rStyle w:val="VerbatimChar"/>
+        </w:rPr>
+        <w:t xml:space="preserve">  INSERT INTO smbc_workshop.ops.checkin SELECT current_user(), 'DA', current_timestamp();</w:t>
+      </w:r>
+      <w:r>
+        <w:br/>
+      </w:r>
+      <w:r>
+        <w:rPr>
+          <w:rStyle w:val="VerbatimChar"/>
+        </w:rPr>
+        <w:t xml:space="preserve">  CREATE SCHEMA IF NOT EXISTS IDENTIFIER('smbc_workshop.' || my_schema);</w:t>
+      </w:r>
+      <w:r>
+        <w:br/>
+      </w:r>
+      <w:r>
+        <w:rPr>
+          <w:rStyle w:val="VerbatimChar"/>
+        </w:rPr>
+        <w:t xml:space="preserve">  SELECT 'smbc_workshop.' || my_schema AS your_schema;</w:t>
+      </w:r>
+      <w:r>
+        <w:br/>
+      </w:r>
+      <w:r>
+        <w:rPr>
+          <w:rStyle w:val="VerbatimChar"/>
+        </w:rPr>
+        <w:t xml:space="preserve">END</w:t>
+      </w:r>
+    </w:p>
+    <w:p>
       <w:r>
         <w:pict>
           <v:rect style="width:0;height:1.5pt" o:hralign="center" o:hrstd="t" o:hr="t"/>
@@ -31916,7 +33189,31 @@
         </w:numPr>
       </w:pPr>
       <w:r>
-        <w:t xml:space="preserve">The check-in line writes one row to smbc_workshop.ops.checkin, and the progress board counts check-ins live. Put the board on the second screen.</w:t>
+        <w:t xml:space="preserve">Fill in the warehouse name that 00_master_setup printed at the end.</w:t>
+      </w:r>
+    </w:p>
+    <w:p>
+      <w:pPr>
+        <w:pStyle w:val="Compact"/>
+        <w:numPr>
+          <w:ilvl w:val="0"/>
+          <w:numId w:val="1046"/>
+        </w:numPr>
+      </w:pPr>
+      <w:r>
+        <w:t xml:space="preserve">The check-in block writes one row to smbc_workshop.ops.checkin and creates the attendee's Lab 1 schema; the progress board shows both live. Put the board on the second screen.</w:t>
+      </w:r>
+    </w:p>
+    <w:p>
+      <w:pPr>
+        <w:pStyle w:val="Compact"/>
+        <w:numPr>
+          <w:ilvl w:val="0"/>
+          <w:numId w:val="1046"/>
+        </w:numPr>
+      </w:pPr>
+      <w:r>
+        <w:t xml:space="preserve">A permission error means the person doesn't have access to smbc_workshop yet (guide 3.6): a facilitator fixes it.</w:t>
       </w:r>
     </w:p>
     <w:p>
@@ -34166,7 +35463,7 @@
         </w:numPr>
       </w:pPr>
       <w:r>
-        <w:t xml:space="preserve">The demo agent "Credit Risk (secured demo)" sits on a copy of the facility table with a row filter (Singapore branch only, unless you're in the facilitator group) and a mask on borrower names.</w:t>
+        <w:t xml:space="preserve">The demo agent "Credit Risk (secured demo)" sits on a copy of the facility table with a row filter (Singapore branch only, unless you're on the facilitator list) and a mask on borrower names.</w:t>
       </w:r>
     </w:p>
     <w:p>

</xml_diff>

<commit_message>
Use bronze, silver and gold schemas and add a labs folder
The reference tables move from the single checkpoint schema into bronze,
silver and gold schemas, without the layer prefixes (for example
gold.group_exposure). 02 and 03 are renamed to match. Re-running 01 drops
the old checkpoint schema. Attendees' own Lab 1 tables keep their names.

The new labs folder holds the five attendee notebooks, built from the
guide by build_handouts.py. They replace the single lab workbook notebook.
06 copies them into a shared Labs folder, and 07 checks that the folder is
complete and shared. Guide, slides, run of show and handouts updated.

Co-authored-by: Isaac <no-reply@databricks.com>
</commit_message>
<xml_diff>
--- a/facilitator/dist/Workshop_Walkthrough.docx
+++ b/facilitator/dist/Workshop_Walkthrough.docx
@@ -3627,7 +3627,7 @@
               <w:pStyle w:val="Compact"/>
             </w:pPr>
             <w:r>
-              <w:t xml:space="preserve">Dataset generated and validated. Checkpoint tables, dashboards and Genie Agents built and tested in the Databricks test workspace (test report)</w:t>
+              <w:t xml:space="preserve">Dataset generated and validated. Reference tables, dashboards and Genie Agents built and tested in the Databricks test workspace (test report)</w:t>
             </w:r>
           </w:p>
         </w:tc>
@@ -5291,7 +5291,7 @@
               <w:t xml:space="preserve"> </w:t>
             </w:r>
             <w:r>
-              <w:t xml:space="preserve">anyone not past step 5 switches to the checkpoint tables.</w:t>
+              <w:t xml:space="preserve">anyone not past step 5 switches to the gold reference tables.</w:t>
             </w:r>
             <w:r>
               <w:t xml:space="preserve"> </w:t>
@@ -6572,7 +6572,7 @@
               <w:pStyle w:val="Compact"/>
             </w:pPr>
             <w:r>
-              <w:t xml:space="preserve">At 1:15 move everyone to the checkpoint tables; Lab 2 doesn't depend on Lab 1</w:t>
+              <w:t xml:space="preserve">At 1:15 move everyone to the gold reference tables; Lab 2 doesn't depend on Lab 1</w:t>
             </w:r>
           </w:p>
         </w:tc>
@@ -7994,7 +7994,7 @@
         <w:t xml:space="preserve"> </w:t>
       </w:r>
       <w:r>
-        <w:t xml:space="preserve">anyone can carry on from</w:t>
+        <w:t xml:space="preserve">anyone can carry on from the reference tables in</w:t>
       </w:r>
       <w:r>
         <w:t xml:space="preserve"> </w:t>
@@ -8003,7 +8003,7 @@
         <w:rPr>
           <w:rStyle w:val="VerbatimChar"/>
         </w:rPr>
-        <w:t xml:space="preserve">smbc_workshop.checkpoint</w:t>
+        <w:t xml:space="preserve">smbc_workshop.gold</w:t>
       </w:r>
       <w:r>
         <w:t xml:space="preserve">.</w:t>
@@ -15223,551 +15223,606 @@
         <w:t xml:space="preserve"> </w:t>
       </w:r>
       <w:r>
-        <w:t xml:space="preserve">in Microsoft Edge or Google Chrome and sign in with your SMBC account.</w:t>
-      </w:r>
-    </w:p>
-    <w:p>
-      <w:pPr>
-        <w:pStyle w:val="BodyText"/>
-      </w:pPr>
+        <w:t xml:space="preserve">in Microsoft Edge or Google Chrome and sign in with your SMBC account. The workshop's</w:t>
+      </w:r>
+      <w:r>
+        <w:t xml:space="preserve"> </w:t>
+      </w:r>
       <w:r>
         <w:rPr>
           <w:b/>
           <w:bCs/>
         </w:rPr>
-        <w:t xml:space="preserve">2. Check in.</w:t>
-      </w:r>
-      <w:r>
-        <w:t xml:space="preserve"> </w:t>
-      </w:r>
-      <w:r>
-        <w:t xml:space="preserve">Open</w:t>
-      </w:r>
-      <w:r>
-        <w:t xml:space="preserve"> </w:t>
+        <w:t xml:space="preserve">Labs</w:t>
+      </w:r>
+      <w:r>
+        <w:t xml:space="preserve"> </w:t>
+      </w:r>
+      <w:r>
+        <w:t xml:space="preserve">folder has one notebook per session, from</w:t>
+      </w:r>
+      <w:r>
+        <w:t xml:space="preserve"> </w:t>
+      </w:r>
+      <w:r>
+        <w:rPr>
+          <w:i/>
+          <w:iCs/>
+        </w:rPr>
+        <w:t xml:space="preserve">00 Start here</w:t>
+      </w:r>
+      <w:r>
+        <w:t xml:space="preserve"> </w:t>
+      </w:r>
+      <w:r>
+        <w:t xml:space="preserve">to</w:t>
+      </w:r>
+      <w:r>
+        <w:t xml:space="preserve"> </w:t>
+      </w:r>
+      <w:r>
+        <w:rPr>
+          <w:i/>
+          <w:iCs/>
+        </w:rPr>
+        <w:t xml:space="preserve">04 Kit and help</w:t>
+      </w:r>
+      <w:r>
+        <w:t xml:space="preserve">; clone one (</w:t>
       </w:r>
       <w:r>
         <w:rPr>
           <w:b/>
           <w:bCs/>
         </w:rPr>
-        <w:t xml:space="preserve">SQL Editor</w:t>
-      </w:r>
-      <w:r>
-        <w:t xml:space="preserve">, choose the workshop's SQL warehouse (your facilitator will name it), paste this block and click</w:t>
-      </w:r>
-      <w:r>
-        <w:t xml:space="preserve"> </w:t>
-      </w:r>
+        <w:t xml:space="preserve">File → Clone</w:t>
+      </w:r>
+      <w:r>
+        <w:t xml:space="preserve">) to run its cells.</w:t>
+      </w:r>
+    </w:p>
+    <w:p>
+      <w:pPr>
+        <w:pStyle w:val="BodyText"/>
+      </w:pPr>
       <w:r>
         <w:rPr>
           <w:b/>
           <w:bCs/>
         </w:rPr>
-        <w:t xml:space="preserve">Run</w:t>
-      </w:r>
-      <w:r>
-        <w:t xml:space="preserve">. It checks you in and creates your schema for Lab 1. Change</w:t>
-      </w:r>
-      <w:r>
-        <w:t xml:space="preserve"> </w:t>
-      </w:r>
-      <w:r>
-        <w:rPr>
-          <w:rStyle w:val="VerbatimChar"/>
-        </w:rPr>
-        <w:t xml:space="preserve">DA</w:t>
-      </w:r>
-      <w:r>
-        <w:t xml:space="preserve"> </w:t>
-      </w:r>
-      <w:r>
-        <w:t xml:space="preserve">to</w:t>
-      </w:r>
-      <w:r>
-        <w:t xml:space="preserve"> </w:t>
-      </w:r>
-      <w:r>
-        <w:rPr>
-          <w:rStyle w:val="VerbatimChar"/>
-        </w:rPr>
-        <w:t xml:space="preserve">DE</w:t>
-      </w:r>
-      <w:r>
-        <w:t xml:space="preserve"> </w:t>
-      </w:r>
-      <w:r>
-        <w:t xml:space="preserve">if you're a data engineer.</w:t>
-      </w:r>
-    </w:p>
-    <w:p>
-      <w:pPr>
-        <w:pStyle w:val="SourceCode"/>
-      </w:pPr>
-      <w:r>
-        <w:rPr>
-          <w:rStyle w:val="CommentTok"/>
-        </w:rPr>
-        <w:t xml:space="preserve">-- Check in and create your Lab 1 schema. Change 'DA' to 'DE' if you're a data engineer.</w:t>
-      </w:r>
-      <w:r>
-        <w:br/>
-      </w:r>
-      <w:r>
-        <w:rPr>
-          <w:rStyle w:val="ControlFlowTok"/>
-        </w:rPr>
-        <w:t xml:space="preserve">BEGIN</w:t>
-      </w:r>
-      <w:r>
-        <w:br/>
-      </w:r>
-      <w:r>
-        <w:rPr>
-          <w:rStyle w:val="NormalTok"/>
-        </w:rPr>
-        <w:t xml:space="preserve">  </w:t>
-      </w:r>
-      <w:r>
-        <w:rPr>
-          <w:rStyle w:val="KeywordTok"/>
-        </w:rPr>
-        <w:t xml:space="preserve">DECLARE</w:t>
-      </w:r>
-      <w:r>
-        <w:rPr>
-          <w:rStyle w:val="NormalTok"/>
-        </w:rPr>
-        <w:t xml:space="preserve"> my_schema STRING </w:t>
-      </w:r>
-      <w:r>
-        <w:rPr>
-          <w:rStyle w:val="KeywordTok"/>
-        </w:rPr>
-        <w:t xml:space="preserve">DEFAULT</w:t>
-      </w:r>
-      <w:r>
-        <w:rPr>
-          <w:rStyle w:val="NormalTok"/>
-        </w:rPr>
-        <w:t xml:space="preserve"> </w:t>
-      </w:r>
-      <w:r>
-        <w:rPr>
-          <w:rStyle w:val="FunctionTok"/>
-        </w:rPr>
-        <w:t xml:space="preserve">regexp_replace</w:t>
-      </w:r>
-      <w:r>
-        <w:rPr>
-          <w:rStyle w:val="NormalTok"/>
-        </w:rPr>
-        <w:t xml:space="preserve">(</w:t>
-      </w:r>
-      <w:r>
-        <w:rPr>
-          <w:rStyle w:val="FunctionTok"/>
-        </w:rPr>
-        <w:t xml:space="preserve">lower</w:t>
-      </w:r>
-      <w:r>
-        <w:rPr>
-          <w:rStyle w:val="NormalTok"/>
-        </w:rPr>
-        <w:t xml:space="preserve">(split_part(current_user(), </w:t>
-      </w:r>
-      <w:r>
-        <w:rPr>
-          <w:rStyle w:val="StringTok"/>
-        </w:rPr>
-        <w:t xml:space="preserve">'@'</w:t>
-      </w:r>
-      <w:r>
-        <w:rPr>
-          <w:rStyle w:val="NormalTok"/>
-        </w:rPr>
-        <w:t xml:space="preserve">, </w:t>
-      </w:r>
-      <w:r>
-        <w:rPr>
-          <w:rStyle w:val="DecValTok"/>
-        </w:rPr>
-        <w:t xml:space="preserve">1</w:t>
-      </w:r>
-      <w:r>
-        <w:rPr>
-          <w:rStyle w:val="NormalTok"/>
-        </w:rPr>
-        <w:t xml:space="preserve">)), </w:t>
-      </w:r>
-      <w:r>
-        <w:rPr>
-          <w:rStyle w:val="StringTok"/>
-        </w:rPr>
-        <w:t xml:space="preserve">'[^a-z0-9_]'</w:t>
-      </w:r>
-      <w:r>
-        <w:rPr>
-          <w:rStyle w:val="NormalTok"/>
-        </w:rPr>
-        <w:t xml:space="preserve">, </w:t>
-      </w:r>
-      <w:r>
-        <w:rPr>
-          <w:rStyle w:val="StringTok"/>
-        </w:rPr>
-        <w:t xml:space="preserve">'_'</w:t>
-      </w:r>
-      <w:r>
-        <w:rPr>
-          <w:rStyle w:val="NormalTok"/>
-        </w:rPr>
-        <w:t xml:space="preserve">);</w:t>
-      </w:r>
-      <w:r>
-        <w:br/>
-      </w:r>
-      <w:r>
-        <w:rPr>
-          <w:rStyle w:val="NormalTok"/>
-        </w:rPr>
-        <w:t xml:space="preserve">  </w:t>
-      </w:r>
-      <w:r>
-        <w:rPr>
-          <w:rStyle w:val="KeywordTok"/>
-        </w:rPr>
-        <w:t xml:space="preserve">INSERT</w:t>
-      </w:r>
-      <w:r>
-        <w:rPr>
-          <w:rStyle w:val="NormalTok"/>
-        </w:rPr>
-        <w:t xml:space="preserve"> </w:t>
-      </w:r>
-      <w:r>
-        <w:rPr>
-          <w:rStyle w:val="KeywordTok"/>
-        </w:rPr>
-        <w:t xml:space="preserve">INTO</w:t>
-      </w:r>
-      <w:r>
-        <w:rPr>
-          <w:rStyle w:val="NormalTok"/>
-        </w:rPr>
-        <w:t xml:space="preserve"> smbc_workshop.ops.checkin </w:t>
-      </w:r>
-      <w:r>
-        <w:rPr>
-          <w:rStyle w:val="KeywordTok"/>
-        </w:rPr>
-        <w:t xml:space="preserve">SELECT</w:t>
-      </w:r>
-      <w:r>
-        <w:rPr>
-          <w:rStyle w:val="NormalTok"/>
-        </w:rPr>
-        <w:t xml:space="preserve"> current_user(), </w:t>
-      </w:r>
-      <w:r>
-        <w:rPr>
-          <w:rStyle w:val="StringTok"/>
-        </w:rPr>
-        <w:t xml:space="preserve">'DA'</w:t>
-      </w:r>
-      <w:r>
-        <w:rPr>
-          <w:rStyle w:val="NormalTok"/>
-        </w:rPr>
-        <w:t xml:space="preserve">, </w:t>
-      </w:r>
-      <w:r>
-        <w:rPr>
-          <w:rStyle w:val="FunctionTok"/>
-        </w:rPr>
-        <w:t xml:space="preserve">current_timestamp</w:t>
-      </w:r>
-      <w:r>
-        <w:rPr>
-          <w:rStyle w:val="NormalTok"/>
-        </w:rPr>
-        <w:t xml:space="preserve">();</w:t>
-      </w:r>
-      <w:r>
-        <w:br/>
-      </w:r>
-      <w:r>
-        <w:rPr>
-          <w:rStyle w:val="NormalTok"/>
-        </w:rPr>
-        <w:t xml:space="preserve">  </w:t>
-      </w:r>
-      <w:r>
-        <w:rPr>
-          <w:rStyle w:val="KeywordTok"/>
-        </w:rPr>
-        <w:t xml:space="preserve">CREATE</w:t>
-      </w:r>
-      <w:r>
-        <w:rPr>
-          <w:rStyle w:val="NormalTok"/>
-        </w:rPr>
-        <w:t xml:space="preserve"> </w:t>
-      </w:r>
-      <w:r>
-        <w:rPr>
-          <w:rStyle w:val="KeywordTok"/>
-        </w:rPr>
-        <w:t xml:space="preserve">SCHEMA</w:t>
-      </w:r>
-      <w:r>
-        <w:rPr>
-          <w:rStyle w:val="NormalTok"/>
-        </w:rPr>
-        <w:t xml:space="preserve"> </w:t>
-      </w:r>
-      <w:r>
-        <w:rPr>
-          <w:rStyle w:val="ControlFlowTok"/>
-        </w:rPr>
-        <w:t xml:space="preserve">IF</w:t>
-      </w:r>
-      <w:r>
-        <w:rPr>
-          <w:rStyle w:val="NormalTok"/>
-        </w:rPr>
-        <w:t xml:space="preserve"> </w:t>
-      </w:r>
-      <w:r>
-        <w:rPr>
-          <w:rStyle w:val="KeywordTok"/>
-        </w:rPr>
-        <w:t xml:space="preserve">NOT</w:t>
-      </w:r>
-      <w:r>
-        <w:rPr>
-          <w:rStyle w:val="NormalTok"/>
-        </w:rPr>
-        <w:t xml:space="preserve"> </w:t>
-      </w:r>
-      <w:r>
-        <w:rPr>
-          <w:rStyle w:val="KeywordTok"/>
-        </w:rPr>
-        <w:t xml:space="preserve">EXISTS</w:t>
-      </w:r>
-      <w:r>
-        <w:rPr>
-          <w:rStyle w:val="NormalTok"/>
-        </w:rPr>
-        <w:t xml:space="preserve"> </w:t>
-      </w:r>
-      <w:r>
-        <w:rPr>
-          <w:rStyle w:val="KeywordTok"/>
-        </w:rPr>
-        <w:t xml:space="preserve">IDENTIFIER</w:t>
-      </w:r>
-      <w:r>
-        <w:rPr>
-          <w:rStyle w:val="NormalTok"/>
-        </w:rPr>
-        <w:t xml:space="preserve">(</w:t>
-      </w:r>
-      <w:r>
-        <w:rPr>
-          <w:rStyle w:val="StringTok"/>
-        </w:rPr>
-        <w:t xml:space="preserve">'smbc_workshop.'</w:t>
-      </w:r>
-      <w:r>
-        <w:rPr>
-          <w:rStyle w:val="NormalTok"/>
-        </w:rPr>
-        <w:t xml:space="preserve"> </w:t>
-      </w:r>
-      <w:r>
-        <w:rPr>
-          <w:rStyle w:val="OperatorTok"/>
-        </w:rPr>
-        <w:t xml:space="preserve">||</w:t>
-      </w:r>
-      <w:r>
-        <w:rPr>
-          <w:rStyle w:val="NormalTok"/>
-        </w:rPr>
-        <w:t xml:space="preserve"> my_schema);</w:t>
-      </w:r>
-      <w:r>
-        <w:br/>
-      </w:r>
-      <w:r>
-        <w:rPr>
-          <w:rStyle w:val="NormalTok"/>
-        </w:rPr>
-        <w:t xml:space="preserve">  </w:t>
-      </w:r>
-      <w:r>
-        <w:rPr>
-          <w:rStyle w:val="KeywordTok"/>
-        </w:rPr>
-        <w:t xml:space="preserve">SELECT</w:t>
-      </w:r>
-      <w:r>
-        <w:rPr>
-          <w:rStyle w:val="NormalTok"/>
-        </w:rPr>
-        <w:t xml:space="preserve"> </w:t>
-      </w:r>
-      <w:r>
-        <w:rPr>
-          <w:rStyle w:val="StringTok"/>
-        </w:rPr>
-        <w:t xml:space="preserve">'smbc_workshop.'</w:t>
-      </w:r>
-      <w:r>
-        <w:rPr>
-          <w:rStyle w:val="NormalTok"/>
-        </w:rPr>
-        <w:t xml:space="preserve"> </w:t>
-      </w:r>
-      <w:r>
-        <w:rPr>
-          <w:rStyle w:val="OperatorTok"/>
-        </w:rPr>
-        <w:t xml:space="preserve">||</w:t>
-      </w:r>
-      <w:r>
-        <w:rPr>
-          <w:rStyle w:val="NormalTok"/>
-        </w:rPr>
-        <w:t xml:space="preserve"> my_schema </w:t>
-      </w:r>
-      <w:r>
-        <w:rPr>
-          <w:rStyle w:val="KeywordTok"/>
-        </w:rPr>
-        <w:t xml:space="preserve">AS</w:t>
-      </w:r>
-      <w:r>
-        <w:rPr>
-          <w:rStyle w:val="NormalTok"/>
-        </w:rPr>
-        <w:t xml:space="preserve"> your_schema;</w:t>
-      </w:r>
-      <w:r>
-        <w:br/>
-      </w:r>
-      <w:r>
-        <w:rPr>
-          <w:rStyle w:val="ControlFlowTok"/>
-        </w:rPr>
-        <w:t xml:space="preserve">END</w:t>
-      </w:r>
-    </w:p>
-    <w:p>
-      <w:pPr>
-        <w:pStyle w:val="FirstParagraph"/>
-      </w:pPr>
+        <w:t xml:space="preserve">2. Check in.</w:t>
+      </w:r>
+      <w:r>
+        <w:t xml:space="preserve"> </w:t>
+      </w:r>
+      <w:r>
+        <w:t xml:space="preserve">Open</w:t>
+      </w:r>
+      <w:r>
+        <w:t xml:space="preserve"> </w:t>
+      </w:r>
       <w:r>
         <w:rPr>
           <w:b/>
           <w:bCs/>
         </w:rPr>
-        <w:t xml:space="preserve">3. Your schema.</w:t>
-      </w:r>
-      <w:r>
-        <w:t xml:space="preserve"> </w:t>
-      </w:r>
-      <w:r>
-        <w:t xml:space="preserve">The check-in shows its name. Your Lab 1 tables go in</w:t>
-      </w:r>
-      <w:r>
-        <w:t xml:space="preserve"> </w:t>
-      </w:r>
-      <w:r>
-        <w:rPr>
-          <w:rStyle w:val="VerbatimChar"/>
-        </w:rPr>
-        <w:t xml:space="preserve">smbc_workshop.&lt;your schema&gt;</w:t>
-      </w:r>
-      <w:r>
-        <w:t xml:space="preserve">: the part of your email address before the @, in lower case, with any other characters replaced by</w:t>
-      </w:r>
-      <w:r>
-        <w:t xml:space="preserve"> </w:t>
-      </w:r>
-      <w:r>
-        <w:rPr>
-          <w:rStyle w:val="VerbatimChar"/>
-        </w:rPr>
-        <w:t xml:space="preserve">_</w:t>
-      </w:r>
-      <w:r>
-        <w:t xml:space="preserve">. For example,</w:t>
-      </w:r>
-      <w:r>
-        <w:t xml:space="preserve"> </w:t>
-      </w:r>
-      <w:r>
-        <w:rPr>
-          <w:rStyle w:val="VerbatimChar"/>
-        </w:rPr>
-        <w:t xml:space="preserve">jane.tan@…</w:t>
-      </w:r>
-      <w:r>
-        <w:t xml:space="preserve"> </w:t>
-      </w:r>
-      <w:r>
-        <w:t xml:space="preserve">becomes</w:t>
-      </w:r>
-      <w:r>
-        <w:t xml:space="preserve"> </w:t>
-      </w:r>
-      <w:r>
-        <w:rPr>
-          <w:rStyle w:val="VerbatimChar"/>
-        </w:rPr>
-        <w:t xml:space="preserve">jane_tan</w:t>
-      </w:r>
-      <w:r>
-        <w:t xml:space="preserve">.</w:t>
-      </w:r>
-    </w:p>
-    <w:p>
-      <w:pPr>
-        <w:pStyle w:val="BodyText"/>
-      </w:pPr>
+        <w:t xml:space="preserve">SQL Editor</w:t>
+      </w:r>
+      <w:r>
+        <w:t xml:space="preserve">, choose the workshop's SQL warehouse (your facilitator will name it), paste this block and click</w:t>
+      </w:r>
+      <w:r>
+        <w:t xml:space="preserve"> </w:t>
+      </w:r>
       <w:r>
         <w:rPr>
           <w:b/>
           <w:bCs/>
         </w:rPr>
-        <w:t xml:space="preserve">4. Getting help.</w:t>
-      </w:r>
-      <w:r>
-        <w:t xml:space="preserve"> </w:t>
-      </w:r>
-      <w:r>
-        <w:t xml:space="preserve">Turn your card to red, or raise a hand, and a helper will come to you.</w:t>
-      </w:r>
-    </w:p>
-    <w:p>
-      <w:pPr>
-        <w:pStyle w:val="BodyText"/>
+        <w:t xml:space="preserve">Run</w:t>
+      </w:r>
+      <w:r>
+        <w:t xml:space="preserve">. It checks you in and creates your schema for Lab 1. Change</w:t>
+      </w:r>
+      <w:r>
+        <w:t xml:space="preserve"> </w:t>
+      </w:r>
+      <w:r>
+        <w:rPr>
+          <w:rStyle w:val="VerbatimChar"/>
+        </w:rPr>
+        <w:t xml:space="preserve">DA</w:t>
+      </w:r>
+      <w:r>
+        <w:t xml:space="preserve"> </w:t>
+      </w:r>
+      <w:r>
+        <w:t xml:space="preserve">to</w:t>
+      </w:r>
+      <w:r>
+        <w:t xml:space="preserve"> </w:t>
+      </w:r>
+      <w:r>
+        <w:rPr>
+          <w:rStyle w:val="VerbatimChar"/>
+        </w:rPr>
+        <w:t xml:space="preserve">DE</w:t>
+      </w:r>
+      <w:r>
+        <w:t xml:space="preserve"> </w:t>
+      </w:r>
+      <w:r>
+        <w:t xml:space="preserve">if you're a data engineer.</w:t>
+      </w:r>
+    </w:p>
+    <w:p>
+      <w:pPr>
+        <w:pStyle w:val="SourceCode"/>
+      </w:pPr>
+      <w:r>
+        <w:rPr>
+          <w:rStyle w:val="CommentTok"/>
+        </w:rPr>
+        <w:t xml:space="preserve">-- Check in and create your Lab 1 schema. Change 'DA' to 'DE' if you're a data engineer.</w:t>
+      </w:r>
+      <w:r>
+        <w:br/>
+      </w:r>
+      <w:r>
+        <w:rPr>
+          <w:rStyle w:val="ControlFlowTok"/>
+        </w:rPr>
+        <w:t xml:space="preserve">BEGIN</w:t>
+      </w:r>
+      <w:r>
+        <w:br/>
+      </w:r>
+      <w:r>
+        <w:rPr>
+          <w:rStyle w:val="NormalTok"/>
+        </w:rPr>
+        <w:t xml:space="preserve">  </w:t>
+      </w:r>
+      <w:r>
+        <w:rPr>
+          <w:rStyle w:val="KeywordTok"/>
+        </w:rPr>
+        <w:t xml:space="preserve">DECLARE</w:t>
+      </w:r>
+      <w:r>
+        <w:rPr>
+          <w:rStyle w:val="NormalTok"/>
+        </w:rPr>
+        <w:t xml:space="preserve"> my_schema STRING </w:t>
+      </w:r>
+      <w:r>
+        <w:rPr>
+          <w:rStyle w:val="KeywordTok"/>
+        </w:rPr>
+        <w:t xml:space="preserve">DEFAULT</w:t>
+      </w:r>
+      <w:r>
+        <w:rPr>
+          <w:rStyle w:val="NormalTok"/>
+        </w:rPr>
+        <w:t xml:space="preserve"> </w:t>
+      </w:r>
+      <w:r>
+        <w:rPr>
+          <w:rStyle w:val="FunctionTok"/>
+        </w:rPr>
+        <w:t xml:space="preserve">regexp_replace</w:t>
+      </w:r>
+      <w:r>
+        <w:rPr>
+          <w:rStyle w:val="NormalTok"/>
+        </w:rPr>
+        <w:t xml:space="preserve">(</w:t>
+      </w:r>
+      <w:r>
+        <w:rPr>
+          <w:rStyle w:val="FunctionTok"/>
+        </w:rPr>
+        <w:t xml:space="preserve">lower</w:t>
+      </w:r>
+      <w:r>
+        <w:rPr>
+          <w:rStyle w:val="NormalTok"/>
+        </w:rPr>
+        <w:t xml:space="preserve">(split_part(current_user(), </w:t>
+      </w:r>
+      <w:r>
+        <w:rPr>
+          <w:rStyle w:val="StringTok"/>
+        </w:rPr>
+        <w:t xml:space="preserve">'@'</w:t>
+      </w:r>
+      <w:r>
+        <w:rPr>
+          <w:rStyle w:val="NormalTok"/>
+        </w:rPr>
+        <w:t xml:space="preserve">, </w:t>
+      </w:r>
+      <w:r>
+        <w:rPr>
+          <w:rStyle w:val="DecValTok"/>
+        </w:rPr>
+        <w:t xml:space="preserve">1</w:t>
+      </w:r>
+      <w:r>
+        <w:rPr>
+          <w:rStyle w:val="NormalTok"/>
+        </w:rPr>
+        <w:t xml:space="preserve">)), </w:t>
+      </w:r>
+      <w:r>
+        <w:rPr>
+          <w:rStyle w:val="StringTok"/>
+        </w:rPr>
+        <w:t xml:space="preserve">'[^a-z0-9_]'</w:t>
+      </w:r>
+      <w:r>
+        <w:rPr>
+          <w:rStyle w:val="NormalTok"/>
+        </w:rPr>
+        <w:t xml:space="preserve">, </w:t>
+      </w:r>
+      <w:r>
+        <w:rPr>
+          <w:rStyle w:val="StringTok"/>
+        </w:rPr>
+        <w:t xml:space="preserve">'_'</w:t>
+      </w:r>
+      <w:r>
+        <w:rPr>
+          <w:rStyle w:val="NormalTok"/>
+        </w:rPr>
+        <w:t xml:space="preserve">);</w:t>
+      </w:r>
+      <w:r>
+        <w:br/>
+      </w:r>
+      <w:r>
+        <w:rPr>
+          <w:rStyle w:val="NormalTok"/>
+        </w:rPr>
+        <w:t xml:space="preserve">  </w:t>
+      </w:r>
+      <w:r>
+        <w:rPr>
+          <w:rStyle w:val="KeywordTok"/>
+        </w:rPr>
+        <w:t xml:space="preserve">INSERT</w:t>
+      </w:r>
+      <w:r>
+        <w:rPr>
+          <w:rStyle w:val="NormalTok"/>
+        </w:rPr>
+        <w:t xml:space="preserve"> </w:t>
+      </w:r>
+      <w:r>
+        <w:rPr>
+          <w:rStyle w:val="KeywordTok"/>
+        </w:rPr>
+        <w:t xml:space="preserve">INTO</w:t>
+      </w:r>
+      <w:r>
+        <w:rPr>
+          <w:rStyle w:val="NormalTok"/>
+        </w:rPr>
+        <w:t xml:space="preserve"> smbc_workshop.ops.checkin </w:t>
+      </w:r>
+      <w:r>
+        <w:rPr>
+          <w:rStyle w:val="KeywordTok"/>
+        </w:rPr>
+        <w:t xml:space="preserve">SELECT</w:t>
+      </w:r>
+      <w:r>
+        <w:rPr>
+          <w:rStyle w:val="NormalTok"/>
+        </w:rPr>
+        <w:t xml:space="preserve"> current_user(), </w:t>
+      </w:r>
+      <w:r>
+        <w:rPr>
+          <w:rStyle w:val="StringTok"/>
+        </w:rPr>
+        <w:t xml:space="preserve">'DA'</w:t>
+      </w:r>
+      <w:r>
+        <w:rPr>
+          <w:rStyle w:val="NormalTok"/>
+        </w:rPr>
+        <w:t xml:space="preserve">, </w:t>
+      </w:r>
+      <w:r>
+        <w:rPr>
+          <w:rStyle w:val="FunctionTok"/>
+        </w:rPr>
+        <w:t xml:space="preserve">current_timestamp</w:t>
+      </w:r>
+      <w:r>
+        <w:rPr>
+          <w:rStyle w:val="NormalTok"/>
+        </w:rPr>
+        <w:t xml:space="preserve">();</w:t>
+      </w:r>
+      <w:r>
+        <w:br/>
+      </w:r>
+      <w:r>
+        <w:rPr>
+          <w:rStyle w:val="NormalTok"/>
+        </w:rPr>
+        <w:t xml:space="preserve">  </w:t>
+      </w:r>
+      <w:r>
+        <w:rPr>
+          <w:rStyle w:val="KeywordTok"/>
+        </w:rPr>
+        <w:t xml:space="preserve">CREATE</w:t>
+      </w:r>
+      <w:r>
+        <w:rPr>
+          <w:rStyle w:val="NormalTok"/>
+        </w:rPr>
+        <w:t xml:space="preserve"> </w:t>
+      </w:r>
+      <w:r>
+        <w:rPr>
+          <w:rStyle w:val="KeywordTok"/>
+        </w:rPr>
+        <w:t xml:space="preserve">SCHEMA</w:t>
+      </w:r>
+      <w:r>
+        <w:rPr>
+          <w:rStyle w:val="NormalTok"/>
+        </w:rPr>
+        <w:t xml:space="preserve"> </w:t>
+      </w:r>
+      <w:r>
+        <w:rPr>
+          <w:rStyle w:val="ControlFlowTok"/>
+        </w:rPr>
+        <w:t xml:space="preserve">IF</w:t>
+      </w:r>
+      <w:r>
+        <w:rPr>
+          <w:rStyle w:val="NormalTok"/>
+        </w:rPr>
+        <w:t xml:space="preserve"> </w:t>
+      </w:r>
+      <w:r>
+        <w:rPr>
+          <w:rStyle w:val="KeywordTok"/>
+        </w:rPr>
+        <w:t xml:space="preserve">NOT</w:t>
+      </w:r>
+      <w:r>
+        <w:rPr>
+          <w:rStyle w:val="NormalTok"/>
+        </w:rPr>
+        <w:t xml:space="preserve"> </w:t>
+      </w:r>
+      <w:r>
+        <w:rPr>
+          <w:rStyle w:val="KeywordTok"/>
+        </w:rPr>
+        <w:t xml:space="preserve">EXISTS</w:t>
+      </w:r>
+      <w:r>
+        <w:rPr>
+          <w:rStyle w:val="NormalTok"/>
+        </w:rPr>
+        <w:t xml:space="preserve"> </w:t>
+      </w:r>
+      <w:r>
+        <w:rPr>
+          <w:rStyle w:val="KeywordTok"/>
+        </w:rPr>
+        <w:t xml:space="preserve">IDENTIFIER</w:t>
+      </w:r>
+      <w:r>
+        <w:rPr>
+          <w:rStyle w:val="NormalTok"/>
+        </w:rPr>
+        <w:t xml:space="preserve">(</w:t>
+      </w:r>
+      <w:r>
+        <w:rPr>
+          <w:rStyle w:val="StringTok"/>
+        </w:rPr>
+        <w:t xml:space="preserve">'smbc_workshop.'</w:t>
+      </w:r>
+      <w:r>
+        <w:rPr>
+          <w:rStyle w:val="NormalTok"/>
+        </w:rPr>
+        <w:t xml:space="preserve"> </w:t>
+      </w:r>
+      <w:r>
+        <w:rPr>
+          <w:rStyle w:val="OperatorTok"/>
+        </w:rPr>
+        <w:t xml:space="preserve">||</w:t>
+      </w:r>
+      <w:r>
+        <w:rPr>
+          <w:rStyle w:val="NormalTok"/>
+        </w:rPr>
+        <w:t xml:space="preserve"> my_schema);</w:t>
+      </w:r>
+      <w:r>
+        <w:br/>
+      </w:r>
+      <w:r>
+        <w:rPr>
+          <w:rStyle w:val="NormalTok"/>
+        </w:rPr>
+        <w:t xml:space="preserve">  </w:t>
+      </w:r>
+      <w:r>
+        <w:rPr>
+          <w:rStyle w:val="KeywordTok"/>
+        </w:rPr>
+        <w:t xml:space="preserve">SELECT</w:t>
+      </w:r>
+      <w:r>
+        <w:rPr>
+          <w:rStyle w:val="NormalTok"/>
+        </w:rPr>
+        <w:t xml:space="preserve"> </w:t>
+      </w:r>
+      <w:r>
+        <w:rPr>
+          <w:rStyle w:val="StringTok"/>
+        </w:rPr>
+        <w:t xml:space="preserve">'smbc_workshop.'</w:t>
+      </w:r>
+      <w:r>
+        <w:rPr>
+          <w:rStyle w:val="NormalTok"/>
+        </w:rPr>
+        <w:t xml:space="preserve"> </w:t>
+      </w:r>
+      <w:r>
+        <w:rPr>
+          <w:rStyle w:val="OperatorTok"/>
+        </w:rPr>
+        <w:t xml:space="preserve">||</w:t>
+      </w:r>
+      <w:r>
+        <w:rPr>
+          <w:rStyle w:val="NormalTok"/>
+        </w:rPr>
+        <w:t xml:space="preserve"> my_schema </w:t>
+      </w:r>
+      <w:r>
+        <w:rPr>
+          <w:rStyle w:val="KeywordTok"/>
+        </w:rPr>
+        <w:t xml:space="preserve">AS</w:t>
+      </w:r>
+      <w:r>
+        <w:rPr>
+          <w:rStyle w:val="NormalTok"/>
+        </w:rPr>
+        <w:t xml:space="preserve"> your_schema;</w:t>
+      </w:r>
+      <w:r>
+        <w:br/>
+      </w:r>
+      <w:r>
+        <w:rPr>
+          <w:rStyle w:val="ControlFlowTok"/>
+        </w:rPr>
+        <w:t xml:space="preserve">END</w:t>
+      </w:r>
+    </w:p>
+    <w:p>
+      <w:pPr>
+        <w:pStyle w:val="FirstParagraph"/>
       </w:pPr>
       <w:r>
         <w:rPr>
           <w:b/>
           <w:bCs/>
         </w:rPr>
+        <w:t xml:space="preserve">3. Your schema.</w:t>
+      </w:r>
+      <w:r>
+        <w:t xml:space="preserve"> </w:t>
+      </w:r>
+      <w:r>
+        <w:t xml:space="preserve">The check-in shows its name. Your Lab 1 tables go in</w:t>
+      </w:r>
+      <w:r>
+        <w:t xml:space="preserve"> </w:t>
+      </w:r>
+      <w:r>
+        <w:rPr>
+          <w:rStyle w:val="VerbatimChar"/>
+        </w:rPr>
+        <w:t xml:space="preserve">smbc_workshop.&lt;your schema&gt;</w:t>
+      </w:r>
+      <w:r>
+        <w:t xml:space="preserve">: the part of your email address before the @, in lower case, with any other characters replaced by</w:t>
+      </w:r>
+      <w:r>
+        <w:t xml:space="preserve"> </w:t>
+      </w:r>
+      <w:r>
+        <w:rPr>
+          <w:rStyle w:val="VerbatimChar"/>
+        </w:rPr>
+        <w:t xml:space="preserve">_</w:t>
+      </w:r>
+      <w:r>
+        <w:t xml:space="preserve">. For example,</w:t>
+      </w:r>
+      <w:r>
+        <w:t xml:space="preserve"> </w:t>
+      </w:r>
+      <w:r>
+        <w:rPr>
+          <w:rStyle w:val="VerbatimChar"/>
+        </w:rPr>
+        <w:t xml:space="preserve">jane.tan@…</w:t>
+      </w:r>
+      <w:r>
+        <w:t xml:space="preserve"> </w:t>
+      </w:r>
+      <w:r>
+        <w:t xml:space="preserve">becomes</w:t>
+      </w:r>
+      <w:r>
+        <w:t xml:space="preserve"> </w:t>
+      </w:r>
+      <w:r>
+        <w:rPr>
+          <w:rStyle w:val="VerbatimChar"/>
+        </w:rPr>
+        <w:t xml:space="preserve">jane_tan</w:t>
+      </w:r>
+      <w:r>
+        <w:t xml:space="preserve">.</w:t>
+      </w:r>
+    </w:p>
+    <w:p>
+      <w:pPr>
+        <w:pStyle w:val="BodyText"/>
+      </w:pPr>
+      <w:r>
+        <w:rPr>
+          <w:b/>
+          <w:bCs/>
+        </w:rPr>
+        <w:t xml:space="preserve">4. Getting help.</w:t>
+      </w:r>
+      <w:r>
+        <w:t xml:space="preserve"> </w:t>
+      </w:r>
+      <w:r>
+        <w:t xml:space="preserve">Turn your card to red, or raise a hand, and a helper will come to you.</w:t>
+      </w:r>
+    </w:p>
+    <w:p>
+      <w:pPr>
+        <w:pStyle w:val="BodyText"/>
+      </w:pPr>
+      <w:r>
+        <w:rPr>
+          <w:b/>
+          <w:bCs/>
+        </w:rPr>
         <w:t xml:space="preserve">5. Short on time?</w:t>
       </w:r>
       <w:r>
         <w:t xml:space="preserve"> </w:t>
       </w:r>
       <w:r>
-        <w:t xml:space="preserve">The checkpoint tables in</w:t>
+        <w:t xml:space="preserve">The reference tables in</w:t>
       </w:r>
       <w:r>
         <w:t xml:space="preserve"> </w:t>
@@ -15776,13 +15831,13 @@
         <w:rPr>
           <w:rStyle w:val="VerbatimChar"/>
         </w:rPr>
-        <w:t xml:space="preserve">smbc_workshop.checkpoint</w:t>
-      </w:r>
-      <w:r>
-        <w:t xml:space="preserve"> </w:t>
-      </w:r>
-      <w:r>
-        <w:t xml:space="preserve">hold the reference result, so you can carry on with Lab 2 and the Genie Code segment whatever happens in Lab 1.</w:t>
+        <w:t xml:space="preserve">smbc_workshop.gold</w:t>
+      </w:r>
+      <w:r>
+        <w:t xml:space="preserve"> </w:t>
+      </w:r>
+      <w:r>
+        <w:t xml:space="preserve">hold the Lab 1 result, so you can carry on with Lab 2 and the Genie Code segment whatever happens in Lab 1.</w:t>
       </w:r>
     </w:p>
     <w:p>
@@ -16691,19 +16746,46 @@
       </w:r>
     </w:p>
     <w:bookmarkEnd w:id="43"/>
-    <w:bookmarkStart w:id="44" w:name="X2ff3d29c647f9f15c695bc9b230d330549d8fb4"/>
+    <w:bookmarkStart w:id="44" w:name="reference-tables-bronze-silver-and-gold"/>
     <w:p>
       <w:pPr>
         <w:pStyle w:val="Heading3"/>
       </w:pPr>
       <w:r>
-        <w:t xml:space="preserve">Save-point tables (</w:t>
+        <w:t xml:space="preserve">Reference tables (</w:t>
       </w:r>
       <w:r>
         <w:rPr>
           <w:rStyle w:val="VerbatimChar"/>
         </w:rPr>
-        <w:t xml:space="preserve">smbc_workshop.checkpoint</w:t>
+        <w:t xml:space="preserve">bronze</w:t>
+      </w:r>
+      <w:r>
+        <w:t xml:space="preserve">,</w:t>
+      </w:r>
+      <w:r>
+        <w:t xml:space="preserve"> </w:t>
+      </w:r>
+      <w:r>
+        <w:rPr>
+          <w:rStyle w:val="VerbatimChar"/>
+        </w:rPr>
+        <w:t xml:space="preserve">silver</w:t>
+      </w:r>
+      <w:r>
+        <w:t xml:space="preserve"> </w:t>
+      </w:r>
+      <w:r>
+        <w:t xml:space="preserve">and</w:t>
+      </w:r>
+      <w:r>
+        <w:t xml:space="preserve"> </w:t>
+      </w:r>
+      <w:r>
+        <w:rPr>
+          <w:rStyle w:val="VerbatimChar"/>
+        </w:rPr>
+        <w:t xml:space="preserve">gold</w:t>
       </w:r>
       <w:r>
         <w:t xml:space="preserve">)</w:t>
@@ -16714,7 +16796,7 @@
         <w:pStyle w:val="FirstParagraph"/>
       </w:pPr>
       <w:r>
-        <w:t xml:space="preserve">The reference solution to Lab 1. Anyone can use these to carry on with Lab 2 and the Genie Code segment.</w:t>
+        <w:t xml:space="preserve">The reference solution to Lab 1, in the medallion layout. Anyone can use the gold tables to carry on with Lab 2 and the Genie Code segment.</w:t>
       </w:r>
     </w:p>
     <w:tbl>
@@ -16822,7 +16904,7 @@
               <w:rPr>
                 <w:rStyle w:val="VerbatimChar"/>
               </w:rPr>
-              <w:t xml:space="preserve">gold_group_exposure</w:t>
+              <w:t xml:space="preserve">gold.group_exposure</w:t>
             </w:r>
           </w:p>
         </w:tc>
@@ -16899,7 +16981,7 @@
               <w:rPr>
                 <w:rStyle w:val="VerbatimChar"/>
               </w:rPr>
-              <w:t xml:space="preserve">gold_facility_exposure</w:t>
+              <w:t xml:space="preserve">gold.facility_exposure</w:t>
             </w:r>
           </w:p>
         </w:tc>
@@ -16961,10 +17043,10 @@
               <w:rPr>
                 <w:rStyle w:val="VerbatimChar"/>
               </w:rPr>
-              <w:t xml:space="preserve">silver_*</w:t>
-            </w:r>
-            <w:r>
-              <w:t xml:space="preserve">,</w:t>
+              <w:t xml:space="preserve">silver.*</w:t>
+            </w:r>
+            <w:r>
+              <w:t xml:space="preserve">, including</w:t>
             </w:r>
             <w:r>
               <w:t xml:space="preserve"> </w:t>
@@ -16973,7 +17055,7 @@
               <w:rPr>
                 <w:rStyle w:val="VerbatimChar"/>
               </w:rPr>
-              <w:t xml:space="preserve">quarantine_facilities</w:t>
+              <w:t xml:space="preserve">silver.quarantine_facilities</w:t>
             </w:r>
           </w:p>
         </w:tc>
@@ -17012,6 +17094,68 @@
             </w:pPr>
             <w:r>
               <w:t xml:space="preserve">For comparing with your own Lab 1 output</w:t>
+            </w:r>
+          </w:p>
+        </w:tc>
+      </w:tr>
+      <w:tr>
+        <w:tc>
+          <w:tcPr>
+            <w:tcW w:w="2891" w:type="dxa"/>
+            <w:tcBorders>
+              <w:top w:val="single" w:sz="4" w:space="0" w:color="BFBFBF"/>
+              <w:left w:val="single" w:sz="4" w:space="0" w:color="BFBFBF"/>
+              <w:bottom w:val="single" w:sz="4" w:space="0" w:color="BFBFBF"/>
+              <w:right w:val="single" w:sz="4" w:space="0" w:color="BFBFBF"/>
+            </w:tcBorders>
+          </w:tcPr>
+          <w:p>
+            <w:pPr>
+              <w:pStyle w:val="Compact"/>
+            </w:pPr>
+            <w:r>
+              <w:rPr>
+                <w:rStyle w:val="VerbatimChar"/>
+              </w:rPr>
+              <w:t xml:space="preserve">bronze.*</w:t>
+            </w:r>
+          </w:p>
+        </w:tc>
+        <w:tc>
+          <w:tcPr>
+            <w:tcW w:w="3132" w:type="dxa"/>
+            <w:tcBorders>
+              <w:top w:val="single" w:sz="4" w:space="0" w:color="BFBFBF"/>
+              <w:left w:val="single" w:sz="4" w:space="0" w:color="BFBFBF"/>
+              <w:bottom w:val="single" w:sz="4" w:space="0" w:color="BFBFBF"/>
+              <w:right w:val="single" w:sz="4" w:space="0" w:color="BFBFBF"/>
+            </w:tcBorders>
+          </w:tcPr>
+          <w:p>
+            <w:pPr>
+              <w:pStyle w:val="Compact"/>
+            </w:pPr>
+            <w:r>
+              <w:t xml:space="preserve">The extracts as delivered, as tables</w:t>
+            </w:r>
+          </w:p>
+        </w:tc>
+        <w:tc>
+          <w:tcPr>
+            <w:tcW w:w="3614" w:type="dxa"/>
+            <w:tcBorders>
+              <w:top w:val="single" w:sz="4" w:space="0" w:color="BFBFBF"/>
+              <w:left w:val="single" w:sz="4" w:space="0" w:color="BFBFBF"/>
+              <w:bottom w:val="single" w:sz="4" w:space="0" w:color="BFBFBF"/>
+              <w:right w:val="single" w:sz="4" w:space="0" w:color="BFBFBF"/>
+            </w:tcBorders>
+          </w:tcPr>
+          <w:p>
+            <w:pPr>
+              <w:pStyle w:val="Compact"/>
+            </w:pPr>
+            <w:r>
+              <w:t xml:space="preserve">Where the cleaning starts</w:t>
             </w:r>
           </w:p>
         </w:tc>
@@ -17112,7 +17256,7 @@
         <w:t xml:space="preserve"> </w:t>
       </w:r>
       <w:r>
-        <w:t xml:space="preserve">Nothing in Lab 2 depends on finishing Lab 1: the checkpoint tables have the same result. Work in pairs, ideally one analyst and one engineer, with the engineer driving.</w:t>
+        <w:t xml:space="preserve">Nothing in Lab 2 depends on finishing Lab 1: the gold reference tables have the same result. Work in pairs, ideally one analyst and one engineer, with the engineer driving.</w:t>
       </w:r>
     </w:p>
     <w:bookmarkStart w:id="46" w:name="core-path"/>
@@ -18819,7 +18963,23 @@
         <w:t xml:space="preserve"> </w:t>
       </w:r>
       <w:r>
-        <w:t xml:space="preserve">your row on the progress board turns green. To check your result against the reference, run both queries; the two totals should be identical:</w:t>
+        <w:t xml:space="preserve">your row on the progress board turns green. To check your result against the reference, run both queries (notebook</w:t>
+      </w:r>
+      <w:r>
+        <w:t xml:space="preserve"> </w:t>
+      </w:r>
+      <w:r>
+        <w:rPr>
+          <w:i/>
+          <w:iCs/>
+        </w:rPr>
+        <w:t xml:space="preserve">01</w:t>
+      </w:r>
+      <w:r>
+        <w:t xml:space="preserve"> </w:t>
+      </w:r>
+      <w:r>
+        <w:t xml:space="preserve">in the Labs folder works out your schema for you); the two totals should be identical:</w:t>
       </w:r>
     </w:p>
     <w:p>
@@ -19088,19 +19248,7 @@
         <w:rPr>
           <w:rStyle w:val="NormalTok"/>
         </w:rPr>
-        <w:t xml:space="preserve"> smbc_workshop.</w:t>
-      </w:r>
-      <w:r>
-        <w:rPr>
-          <w:rStyle w:val="KeywordTok"/>
-        </w:rPr>
-        <w:t xml:space="preserve">checkpoint</w:t>
-      </w:r>
-      <w:r>
-        <w:rPr>
-          <w:rStyle w:val="NormalTok"/>
-        </w:rPr>
-        <w:t xml:space="preserve">.gold_group_exposure </w:t>
+        <w:t xml:space="preserve"> smbc_workshop.gold.group_exposure </w:t>
       </w:r>
       <w:r>
         <w:rPr>
@@ -19373,19 +19521,19 @@
           <w:b/>
           <w:bCs/>
         </w:rPr>
-        <w:t xml:space="preserve">checkpoint</w:t>
-      </w:r>
-      <w:r>
-        <w:t xml:space="preserve"> </w:t>
-      </w:r>
-      <w:r>
-        <w:t xml:space="preserve">tables (</w:t>
+        <w:t xml:space="preserve">gold</w:t>
+      </w:r>
+      <w:r>
+        <w:t xml:space="preserve"> </w:t>
+      </w:r>
+      <w:r>
+        <w:t xml:space="preserve">reference tables (</w:t>
       </w:r>
       <w:r>
         <w:rPr>
           <w:rStyle w:val="VerbatimChar"/>
         </w:rPr>
-        <w:t xml:space="preserve">smbc_workshop.checkpoint.gold_group_exposure</w:t>
+        <w:t xml:space="preserve">smbc_workshop.gold.group_exposure</w:t>
       </w:r>
       <w:r>
         <w:t xml:space="preserve"> </w:t>
@@ -19400,7 +19548,7 @@
         <w:rPr>
           <w:rStyle w:val="VerbatimChar"/>
         </w:rPr>
-        <w:t xml:space="preserve">gold_facility_exposure</w:t>
+        <w:t xml:space="preserve">smbc_workshop.gold.facility_exposure</w:t>
       </w:r>
       <w:r>
         <w:t xml:space="preserve">) so everyone's answers match. If you finished Lab 1, your own tables give the same numbers.</w:t>
@@ -19465,7 +19613,7 @@
         <w:t xml:space="preserve"> </w:t>
       </w:r>
       <w:r>
-        <w:t xml:space="preserve">tab, add both checkpoint gold tables.</w:t>
+        <w:t xml:space="preserve">tab, add both gold tables.</w:t>
       </w:r>
     </w:p>
     <w:p>
@@ -19724,7 +19872,31 @@
         <w:t xml:space="preserve">Genie Agents → New</w:t>
       </w:r>
       <w:r>
-        <w:t xml:space="preserve">, select the two checkpoint gold tables, and click</w:t>
+        <w:t xml:space="preserve">, select the two gold tables (</w:t>
+      </w:r>
+      <w:r>
+        <w:rPr>
+          <w:rStyle w:val="VerbatimChar"/>
+        </w:rPr>
+        <w:t xml:space="preserve">group_exposure</w:t>
+      </w:r>
+      <w:r>
+        <w:t xml:space="preserve"> </w:t>
+      </w:r>
+      <w:r>
+        <w:t xml:space="preserve">and</w:t>
+      </w:r>
+      <w:r>
+        <w:t xml:space="preserve"> </w:t>
+      </w:r>
+      <w:r>
+        <w:rPr>
+          <w:rStyle w:val="VerbatimChar"/>
+        </w:rPr>
+        <w:t xml:space="preserve">facility_exposure</w:t>
+      </w:r>
+      <w:r>
+        <w:t xml:space="preserve">), and click</w:t>
       </w:r>
       <w:r>
         <w:t xml:space="preserve"> </w:t>
@@ -20287,7 +20459,23 @@
         <w:t xml:space="preserve">15 minutes</w:t>
       </w:r>
       <w:r>
-        <w:t xml:space="preserve">, mostly a live demo; participants can follow along in a notebook. The prompts are in A.8.</w:t>
+        <w:t xml:space="preserve">, mostly a live demo; participants can follow along in notebook</w:t>
+      </w:r>
+      <w:r>
+        <w:t xml:space="preserve"> </w:t>
+      </w:r>
+      <w:r>
+        <w:rPr>
+          <w:i/>
+          <w:iCs/>
+        </w:rPr>
+        <w:t xml:space="preserve">03</w:t>
+      </w:r>
+      <w:r>
+        <w:t xml:space="preserve"> </w:t>
+      </w:r>
+      <w:r>
+        <w:t xml:space="preserve">in the Labs folder, which has the prompts (A.8) and the legacy procedure (A.9).</w:t>
       </w:r>
     </w:p>
     <w:p>
@@ -20318,7 +20506,7 @@
         <w:rPr>
           <w:rStyle w:val="VerbatimChar"/>
         </w:rPr>
-        <w:t xml:space="preserve">gold_group_exposure</w:t>
+        <w:t xml:space="preserve">gold.group_exposure</w:t>
       </w:r>
       <w:r>
         <w:t xml:space="preserve"> </w:t>
@@ -21541,7 +21729,7 @@
         <w:rPr>
           <w:rStyle w:val="VerbatimChar"/>
         </w:rPr>
-        <w:t xml:space="preserve">  gold_group_exposure). Above 90% is "near its limit"; above 100% is "in breach".</w:t>
+        <w:t xml:space="preserve">  group_exposure). Above 90% is "near its limit"; above 100% is "in breach".</w:t>
       </w:r>
       <w:r>
         <w:br/>
@@ -21766,94 +21954,70 @@
         <w:rPr>
           <w:rStyle w:val="NormalTok"/>
         </w:rPr>
-        <w:t xml:space="preserve"> smbc_workshop.</w:t>
+        <w:t xml:space="preserve"> smbc_workshop.gold.group_exposure</w:t>
+      </w:r>
+      <w:r>
+        <w:br/>
       </w:r>
       <w:r>
         <w:rPr>
           <w:rStyle w:val="KeywordTok"/>
         </w:rPr>
-        <w:t xml:space="preserve">checkpoint</w:t>
+        <w:t xml:space="preserve">WHERE</w:t>
       </w:r>
       <w:r>
         <w:rPr>
           <w:rStyle w:val="NormalTok"/>
         </w:rPr>
-        <w:t xml:space="preserve">.gold_group_exposure</w:t>
-      </w:r>
-      <w:r>
-        <w:br/>
+        <w:t xml:space="preserve"> as_of_date </w:t>
+      </w:r>
+      <w:r>
+        <w:rPr>
+          <w:rStyle w:val="OperatorTok"/>
+        </w:rPr>
+        <w:t xml:space="preserve">=</w:t>
+      </w:r>
+      <w:r>
+        <w:rPr>
+          <w:rStyle w:val="NormalTok"/>
+        </w:rPr>
+        <w:t xml:space="preserve"> (</w:t>
       </w:r>
       <w:r>
         <w:rPr>
           <w:rStyle w:val="KeywordTok"/>
         </w:rPr>
-        <w:t xml:space="preserve">WHERE</w:t>
+        <w:t xml:space="preserve">SELECT</w:t>
       </w:r>
       <w:r>
         <w:rPr>
           <w:rStyle w:val="NormalTok"/>
         </w:rPr>
-        <w:t xml:space="preserve"> as_of_date </w:t>
-      </w:r>
-      <w:r>
-        <w:rPr>
-          <w:rStyle w:val="OperatorTok"/>
-        </w:rPr>
-        <w:t xml:space="preserve">=</w:t>
+        <w:t xml:space="preserve"> </w:t>
+      </w:r>
+      <w:r>
+        <w:rPr>
+          <w:rStyle w:val="FunctionTok"/>
+        </w:rPr>
+        <w:t xml:space="preserve">max</w:t>
       </w:r>
       <w:r>
         <w:rPr>
           <w:rStyle w:val="NormalTok"/>
         </w:rPr>
-        <w:t xml:space="preserve"> (</w:t>
+        <w:t xml:space="preserve">(as_of_date) </w:t>
       </w:r>
       <w:r>
         <w:rPr>
           <w:rStyle w:val="KeywordTok"/>
         </w:rPr>
-        <w:t xml:space="preserve">SELECT</w:t>
+        <w:t xml:space="preserve">FROM</w:t>
       </w:r>
       <w:r>
         <w:rPr>
           <w:rStyle w:val="NormalTok"/>
         </w:rPr>
-        <w:t xml:space="preserve"> </w:t>
-      </w:r>
-      <w:r>
-        <w:rPr>
-          <w:rStyle w:val="FunctionTok"/>
-        </w:rPr>
-        <w:t xml:space="preserve">max</w:t>
-      </w:r>
-      <w:r>
-        <w:rPr>
-          <w:rStyle w:val="NormalTok"/>
-        </w:rPr>
-        <w:t xml:space="preserve">(as_of_date) </w:t>
-      </w:r>
-      <w:r>
-        <w:rPr>
-          <w:rStyle w:val="KeywordTok"/>
-        </w:rPr>
-        <w:t xml:space="preserve">FROM</w:t>
-      </w:r>
-      <w:r>
-        <w:rPr>
-          <w:rStyle w:val="NormalTok"/>
-        </w:rPr>
-        <w:t xml:space="preserve"> smbc_workshop.</w:t>
-      </w:r>
-      <w:r>
-        <w:rPr>
-          <w:rStyle w:val="KeywordTok"/>
-        </w:rPr>
-        <w:t xml:space="preserve">checkpoint</w:t>
-      </w:r>
-      <w:r>
-        <w:rPr>
-          <w:rStyle w:val="NormalTok"/>
-        </w:rPr>
-        <w:t xml:space="preserve">.gold_group_exposure)</w:t>
+        <w:t xml:space="preserve"> smbc_workshop.gold.group_exposure)</w:t>
       </w:r>
       <w:r>
         <w:br/>
@@ -22035,19 +22199,7 @@
         <w:rPr>
           <w:rStyle w:val="NormalTok"/>
         </w:rPr>
-        <w:t xml:space="preserve"> smbc_workshop.</w:t>
-      </w:r>
-      <w:r>
-        <w:rPr>
-          <w:rStyle w:val="KeywordTok"/>
-        </w:rPr>
-        <w:t xml:space="preserve">checkpoint</w:t>
-      </w:r>
-      <w:r>
-        <w:rPr>
-          <w:rStyle w:val="NormalTok"/>
-        </w:rPr>
-        <w:t xml:space="preserve">.gold_facility_exposure</w:t>
+        <w:t xml:space="preserve"> smbc_workshop.gold.facility_exposure</w:t>
       </w:r>
       <w:r>
         <w:br/>
@@ -22316,7 +22468,7 @@
               <w:rPr>
                 <w:rStyle w:val="VerbatimChar"/>
               </w:rPr>
-              <w:t xml:space="preserve">SELECT sum(exposure_usd) FROM smbc_workshop.checkpoint.gold_facility_exposure WHERE as_of_date = '2026-09-30'</w:t>
+              <w:t xml:space="preserve">SELECT sum(exposure_usd) FROM smbc_workshop.gold.facility_exposure WHERE as_of_date = '2026-09-30'</w:t>
             </w:r>
           </w:p>
         </w:tc>
@@ -22359,7 +22511,7 @@
               <w:rPr>
                 <w:rStyle w:val="VerbatimChar"/>
               </w:rPr>
-              <w:t xml:space="preserve">SELECT group_name, utilisation_pct FROM smbc_workshop.checkpoint.gold_group_exposure WHERE as_of_date = '2026-09-30' AND utilisation_pct &gt; 90</w:t>
+              <w:t xml:space="preserve">SELECT group_name, utilisation_pct FROM smbc_workshop.gold.group_exposure WHERE as_of_date = '2026-09-30' AND utilisation_pct &gt; 90</w:t>
             </w:r>
           </w:p>
         </w:tc>
@@ -22402,7 +22554,7 @@
               <w:rPr>
                 <w:rStyle w:val="VerbatimChar"/>
               </w:rPr>
-              <w:t xml:space="preserve">SELECT group_name, exposure_usd FROM smbc_workshop.checkpoint.gold_group_exposure WHERE as_of_date = '2026-06-30' ORDER BY exposure_usd DESC LIMIT 5</w:t>
+              <w:t xml:space="preserve">SELECT group_name, exposure_usd FROM smbc_workshop.gold.group_exposure WHERE as_of_date = '2026-06-30' ORDER BY exposure_usd DESC LIMIT 5</w:t>
             </w:r>
           </w:p>
         </w:tc>
@@ -22445,7 +22597,7 @@
               <w:rPr>
                 <w:rStyle w:val="VerbatimChar"/>
               </w:rPr>
-              <w:t xml:space="preserve">SELECT as_of_date, utilisation_pct FROM smbc_workshop.checkpoint.gold_group_exposure WHERE parent_group_id = (SELECT parent_group_id FROM smbc_workshop.checkpoint.gold_group_exposure WHERE as_of_date = '2026-09-30' ORDER BY utilisation_pct DESC LIMIT 1) AND as_of_date &gt;= '2026-04-30' ORDER BY as_of_date</w:t>
+              <w:t xml:space="preserve">SELECT as_of_date, utilisation_pct FROM smbc_workshop.gold.group_exposure WHERE parent_group_id = (SELECT parent_group_id FROM smbc_workshop.gold.group_exposure WHERE as_of_date = '2026-09-30' ORDER BY utilisation_pct DESC LIMIT 1) AND as_of_date &gt;= '2026-04-30' ORDER BY as_of_date</w:t>
             </w:r>
           </w:p>
         </w:tc>
@@ -22488,7 +22640,7 @@
               <w:rPr>
                 <w:rStyle w:val="VerbatimChar"/>
               </w:rPr>
-              <w:t xml:space="preserve">SELECT 100 * sum(CASE WHEN days_past_due &gt; 30 THEN exposure_usd ELSE 0 END) / sum(exposure_usd) FROM smbc_workshop.checkpoint.gold_facility_exposure WHERE as_of_date = '2026-09-30' AND booking_branch = 'SGN' AND source_system = 'TRADE_FIN'</w:t>
+              <w:t xml:space="preserve">SELECT 100 * sum(CASE WHEN days_past_due &gt; 30 THEN exposure_usd ELSE 0 END) / sum(exposure_usd) FROM smbc_workshop.gold.facility_exposure WHERE as_of_date = '2026-09-30' AND booking_branch = 'SGN' AND source_system = 'TRADE_FIN'</w:t>
             </w:r>
           </w:p>
         </w:tc>
@@ -22512,7 +22664,7 @@
         <w:rPr>
           <w:rStyle w:val="VerbatimChar"/>
         </w:rPr>
-        <w:t xml:space="preserve">Profile smbc_workshop.checkpoint.gold_group_exposure and tell me what is unusual about the latest month</w:t>
+        <w:t xml:space="preserve">Profile smbc_workshop.gold.group_exposure and tell me what is unusual about the latest month</w:t>
       </w:r>
       <w:r>
         <w:br/>
@@ -22550,7 +22702,7 @@
         <w:rPr>
           <w:rStyle w:val="VerbatimChar"/>
         </w:rPr>
-        <w:t xml:space="preserve">smbc_workshop.checkpoint.gold_facility_exposure. Use: volume = (Sep balance − Apr balance) × Apr rate;</w:t>
+        <w:t xml:space="preserve">smbc_workshop.gold.facility_exposure. Use: volume = (Sep balance − Apr balance) × Apr rate;</w:t>
       </w:r>
       <w:r>
         <w:br/>
@@ -22579,7 +22731,7 @@
         <w:rPr>
           <w:rStyle w:val="VerbatimChar"/>
         </w:rPr>
-        <w:t xml:space="preserve">the smbc_workshop.checkpoint tables. Just explain first, don't run any code.</w:t>
+        <w:t xml:space="preserve">the smbc_workshop.gold tables. Just explain first, don't run any code.</w:t>
       </w:r>
       <w:r>
         <w:br/>
@@ -28191,7 +28343,7 @@
         <w:t xml:space="preserve"> </w:t>
       </w:r>
       <w:r>
-        <w:t xml:space="preserve">The setup shares the dashboards, Genie Agents and lab workbook with the workspace's built-in</w:t>
+        <w:t xml:space="preserve">The setup shares the dashboards, Genie Agents and Labs folder with the workspace's built-in</w:t>
       </w:r>
       <w:r>
         <w:t xml:space="preserve"> </w:t>
@@ -28674,7 +28826,7 @@
               <w:pStyle w:val="Compact"/>
             </w:pPr>
             <w:r>
-              <w:t xml:space="preserve">Schema</w:t>
+              <w:t xml:space="preserve">Schemas</w:t>
             </w:r>
             <w:r>
               <w:t xml:space="preserve"> </w:t>
@@ -28683,7 +28835,34 @@
               <w:rPr>
                 <w:rStyle w:val="VerbatimChar"/>
               </w:rPr>
-              <w:t xml:space="preserve">smbc_workshop.checkpoint</w:t>
+              <w:t xml:space="preserve">smbc_workshop.bronze</w:t>
+            </w:r>
+            <w:r>
+              <w:t xml:space="preserve">,</w:t>
+            </w:r>
+            <w:r>
+              <w:t xml:space="preserve"> </w:t>
+            </w:r>
+            <w:r>
+              <w:rPr>
+                <w:rStyle w:val="VerbatimChar"/>
+              </w:rPr>
+              <w:t xml:space="preserve">silver</w:t>
+            </w:r>
+            <w:r>
+              <w:t xml:space="preserve"> </w:t>
+            </w:r>
+            <w:r>
+              <w:t xml:space="preserve">and</w:t>
+            </w:r>
+            <w:r>
+              <w:t xml:space="preserve"> </w:t>
+            </w:r>
+            <w:r>
+              <w:rPr>
+                <w:rStyle w:val="VerbatimChar"/>
+              </w:rPr>
+              <w:t xml:space="preserve">gold</w:t>
             </w:r>
           </w:p>
         </w:tc>
@@ -28702,7 +28881,7 @@
               <w:pStyle w:val="Compact"/>
             </w:pPr>
             <w:r>
-              <w:t xml:space="preserve">Save-point tables (Lab 1 reference solution)</w:t>
+              <w:t xml:space="preserve">The reference tables (the Lab 1 solution): the extracts as tables, cleaned tables, and the gold tables Lab 2 uses</w:t>
             </w:r>
           </w:p>
         </w:tc>
@@ -30004,7 +30183,7 @@
               <w:rPr>
                 <w:rStyle w:val="VerbatimChar"/>
               </w:rPr>
-              <w:t xml:space="preserve">smbc_workshop.checkpoint.gold_group_exposure</w:t>
+              <w:t xml:space="preserve">smbc_workshop.gold.group_exposure</w:t>
             </w:r>
             <w:r>
               <w:t xml:space="preserve">; ask the AI assistant for a bar chart;</w:t>
@@ -30105,7 +30284,28 @@
               <w:t xml:space="preserve"> </w:t>
             </w:r>
             <w:r>
-              <w:t xml:space="preserve">on the two checkpoint gold tables; ask</w:t>
+              <w:t xml:space="preserve">on the two gold tables (</w:t>
+            </w:r>
+            <w:r>
+              <w:rPr>
+                <w:rStyle w:val="VerbatimChar"/>
+              </w:rPr>
+              <w:t xml:space="preserve">group_exposure</w:t>
+            </w:r>
+            <w:r>
+              <w:t xml:space="preserve">,</w:t>
+            </w:r>
+            <w:r>
+              <w:t xml:space="preserve"> </w:t>
+            </w:r>
+            <w:r>
+              <w:rPr>
+                <w:rStyle w:val="VerbatimChar"/>
+              </w:rPr>
+              <w:t xml:space="preserve">facility_exposure</w:t>
+            </w:r>
+            <w:r>
+              <w:t xml:space="preserve">); ask</w:t>
             </w:r>
             <w:r>
               <w:t xml:space="preserve"> </w:t>
@@ -30309,7 +30509,7 @@
                 <w:i/>
                 <w:iCs/>
               </w:rPr>
-              <w:t xml:space="preserve">"profile smbc_workshop.checkpoint.gold_group_exposure"</w:t>
+              <w:t xml:space="preserve">"profile smbc_workshop.gold.group_exposure"</w:t>
             </w:r>
           </w:p>
         </w:tc>
@@ -31493,7 +31693,7 @@
         </w:numPr>
       </w:pPr>
       <w:r>
-        <w:t xml:space="preserve">who to share the dashboards, Genie Agents and lab workbook with (default</w:t>
+        <w:t xml:space="preserve">who to share the dashboards, Genie Agents and Labs folder with (default</w:t>
       </w:r>
       <w:r>
         <w:t xml:space="preserve"> </w:t>
@@ -31969,97 +32169,139 @@
               <w:rPr>
                 <w:rStyle w:val="VerbatimChar"/>
               </w:rPr>
-              <w:t xml:space="preserve">setup/02_build_checkpoints</w:t>
+              <w:t xml:space="preserve">setup/02_build_bronze_silver_gold</w:t>
             </w:r>
             <w:r>
               <w:t xml:space="preserve"> </w:t>
             </w:r>
             <w:r>
-              <w:t xml:space="preserve">(SQL): builds the bronze, silver and gold save-point tables</w:t>
-            </w:r>
-          </w:p>
-        </w:tc>
-        <w:tc>
-          <w:tcPr>
-            <w:tcW w:w="3163" w:type="dxa"/>
-            <w:tcBorders>
-              <w:top w:val="single" w:sz="4" w:space="0" w:color="BFBFBF"/>
-              <w:left w:val="single" w:sz="4" w:space="0" w:color="BFBFBF"/>
-              <w:bottom w:val="single" w:sz="4" w:space="0" w:color="BFBFBF"/>
-              <w:right w:val="single" w:sz="4" w:space="0" w:color="BFBFBF"/>
-            </w:tcBorders>
-          </w:tcPr>
-          <w:p>
-            <w:pPr>
-              <w:pStyle w:val="Compact"/>
-            </w:pPr>
-            <w:r>
-              <w:t xml:space="preserve">Facilitator</w:t>
-            </w:r>
-          </w:p>
-        </w:tc>
-        <w:tc>
-          <w:tcPr>
-            <w:tcW w:w="740" w:type="dxa"/>
-            <w:tcBorders>
-              <w:top w:val="single" w:sz="4" w:space="0" w:color="BFBFBF"/>
-              <w:left w:val="single" w:sz="4" w:space="0" w:color="BFBFBF"/>
-              <w:bottom w:val="single" w:sz="4" w:space="0" w:color="BFBFBF"/>
-              <w:right w:val="single" w:sz="4" w:space="0" w:color="BFBFBF"/>
-            </w:tcBorders>
-          </w:tcPr>
-          <w:p>
-            <w:pPr>
-              <w:pStyle w:val="Compact"/>
-            </w:pPr>
-            <w:r>
-              <w:t xml:space="preserve">2 min</w:t>
-            </w:r>
-          </w:p>
-        </w:tc>
-      </w:tr>
-      <w:tr>
-        <w:tc>
-          <w:tcPr>
-            <w:tcW w:w="740" w:type="dxa"/>
-            <w:tcBorders>
-              <w:top w:val="single" w:sz="4" w:space="0" w:color="BFBFBF"/>
-              <w:left w:val="single" w:sz="4" w:space="0" w:color="BFBFBF"/>
-              <w:bottom w:val="single" w:sz="4" w:space="0" w:color="BFBFBF"/>
-              <w:right w:val="single" w:sz="4" w:space="0" w:color="BFBFBF"/>
-            </w:tcBorders>
-          </w:tcPr>
-          <w:p>
-            <w:pPr>
-              <w:pStyle w:val="Compact"/>
-            </w:pPr>
-            <w:r>
-              <w:t xml:space="preserve">4</w:t>
-            </w:r>
-          </w:p>
-        </w:tc>
-        <w:tc>
-          <w:tcPr>
-            <w:tcW w:w="4995" w:type="dxa"/>
-            <w:tcBorders>
-              <w:top w:val="single" w:sz="4" w:space="0" w:color="BFBFBF"/>
-              <w:left w:val="single" w:sz="4" w:space="0" w:color="BFBFBF"/>
-              <w:bottom w:val="single" w:sz="4" w:space="0" w:color="BFBFBF"/>
-              <w:right w:val="single" w:sz="4" w:space="0" w:color="BFBFBF"/>
-            </w:tcBorders>
-          </w:tcPr>
-          <w:p>
-            <w:pPr>
-              <w:pStyle w:val="Compact"/>
-            </w:pPr>
+              <w:t xml:space="preserve">(SQL): builds the reference tables in the</w:t>
+            </w:r>
+            <w:r>
+              <w:t xml:space="preserve"> </w:t>
+            </w:r>
             <w:r>
               <w:rPr>
                 <w:rStyle w:val="VerbatimChar"/>
               </w:rPr>
-              <w:t xml:space="preserve">setup/03_validate_checkpoints</w:t>
-            </w:r>
-            <w:r>
-              <w:t xml:space="preserve">: compares the checkpoint tables with the answer key; every row must say PASS</w:t>
+              <w:t xml:space="preserve">bronze</w:t>
+            </w:r>
+            <w:r>
+              <w:t xml:space="preserve">,</w:t>
+            </w:r>
+            <w:r>
+              <w:t xml:space="preserve"> </w:t>
+            </w:r>
+            <w:r>
+              <w:rPr>
+                <w:rStyle w:val="VerbatimChar"/>
+              </w:rPr>
+              <w:t xml:space="preserve">silver</w:t>
+            </w:r>
+            <w:r>
+              <w:t xml:space="preserve"> </w:t>
+            </w:r>
+            <w:r>
+              <w:t xml:space="preserve">and</w:t>
+            </w:r>
+            <w:r>
+              <w:t xml:space="preserve"> </w:t>
+            </w:r>
+            <w:r>
+              <w:rPr>
+                <w:rStyle w:val="VerbatimChar"/>
+              </w:rPr>
+              <w:t xml:space="preserve">gold</w:t>
+            </w:r>
+            <w:r>
+              <w:t xml:space="preserve"> </w:t>
+            </w:r>
+            <w:r>
+              <w:t xml:space="preserve">schemas</w:t>
+            </w:r>
+          </w:p>
+        </w:tc>
+        <w:tc>
+          <w:tcPr>
+            <w:tcW w:w="3163" w:type="dxa"/>
+            <w:tcBorders>
+              <w:top w:val="single" w:sz="4" w:space="0" w:color="BFBFBF"/>
+              <w:left w:val="single" w:sz="4" w:space="0" w:color="BFBFBF"/>
+              <w:bottom w:val="single" w:sz="4" w:space="0" w:color="BFBFBF"/>
+              <w:right w:val="single" w:sz="4" w:space="0" w:color="BFBFBF"/>
+            </w:tcBorders>
+          </w:tcPr>
+          <w:p>
+            <w:pPr>
+              <w:pStyle w:val="Compact"/>
+            </w:pPr>
+            <w:r>
+              <w:t xml:space="preserve">Facilitator</w:t>
+            </w:r>
+          </w:p>
+        </w:tc>
+        <w:tc>
+          <w:tcPr>
+            <w:tcW w:w="740" w:type="dxa"/>
+            <w:tcBorders>
+              <w:top w:val="single" w:sz="4" w:space="0" w:color="BFBFBF"/>
+              <w:left w:val="single" w:sz="4" w:space="0" w:color="BFBFBF"/>
+              <w:bottom w:val="single" w:sz="4" w:space="0" w:color="BFBFBF"/>
+              <w:right w:val="single" w:sz="4" w:space="0" w:color="BFBFBF"/>
+            </w:tcBorders>
+          </w:tcPr>
+          <w:p>
+            <w:pPr>
+              <w:pStyle w:val="Compact"/>
+            </w:pPr>
+            <w:r>
+              <w:t xml:space="preserve">2 min</w:t>
+            </w:r>
+          </w:p>
+        </w:tc>
+      </w:tr>
+      <w:tr>
+        <w:tc>
+          <w:tcPr>
+            <w:tcW w:w="740" w:type="dxa"/>
+            <w:tcBorders>
+              <w:top w:val="single" w:sz="4" w:space="0" w:color="BFBFBF"/>
+              <w:left w:val="single" w:sz="4" w:space="0" w:color="BFBFBF"/>
+              <w:bottom w:val="single" w:sz="4" w:space="0" w:color="BFBFBF"/>
+              <w:right w:val="single" w:sz="4" w:space="0" w:color="BFBFBF"/>
+            </w:tcBorders>
+          </w:tcPr>
+          <w:p>
+            <w:pPr>
+              <w:pStyle w:val="Compact"/>
+            </w:pPr>
+            <w:r>
+              <w:t xml:space="preserve">4</w:t>
+            </w:r>
+          </w:p>
+        </w:tc>
+        <w:tc>
+          <w:tcPr>
+            <w:tcW w:w="4995" w:type="dxa"/>
+            <w:tcBorders>
+              <w:top w:val="single" w:sz="4" w:space="0" w:color="BFBFBF"/>
+              <w:left w:val="single" w:sz="4" w:space="0" w:color="BFBFBF"/>
+              <w:bottom w:val="single" w:sz="4" w:space="0" w:color="BFBFBF"/>
+              <w:right w:val="single" w:sz="4" w:space="0" w:color="BFBFBF"/>
+            </w:tcBorders>
+          </w:tcPr>
+          <w:p>
+            <w:pPr>
+              <w:pStyle w:val="Compact"/>
+            </w:pPr>
+            <w:r>
+              <w:rPr>
+                <w:rStyle w:val="VerbatimChar"/>
+              </w:rPr>
+              <w:t xml:space="preserve">setup/03_validate_bronze_silver_gold</w:t>
+            </w:r>
+            <w:r>
+              <w:t xml:space="preserve">: compares those tables with the answer key; every row must say PASS</w:t>
             </w:r>
           </w:p>
         </w:tc>
@@ -32288,7 +32530,22 @@
               <w:t xml:space="preserve"> </w:t>
             </w:r>
             <w:r>
-              <w:t xml:space="preserve">Genie Agents; copies the participants'</w:t>
+              <w:t xml:space="preserve">Genie Agents; copies the attendee notebooks in</w:t>
+            </w:r>
+            <w:r>
+              <w:t xml:space="preserve"> </w:t>
+            </w:r>
+            <w:r>
+              <w:rPr>
+                <w:rStyle w:val="VerbatimChar"/>
+              </w:rPr>
+              <w:t xml:space="preserve">labs/</w:t>
+            </w:r>
+            <w:r>
+              <w:t xml:space="preserve"> </w:t>
+            </w:r>
+            <w:r>
+              <w:t xml:space="preserve">into a</w:t>
             </w:r>
             <w:r>
               <w:t xml:space="preserve"> </w:t>
@@ -32298,13 +32555,13 @@
                 <w:b/>
                 <w:bCs/>
               </w:rPr>
-              <w:t xml:space="preserve">Lab workbook</w:t>
+              <w:t xml:space="preserve">Labs</w:t>
             </w:r>
             <w:r>
               <w:t xml:space="preserve"> </w:t>
             </w:r>
             <w:r>
-              <w:t xml:space="preserve">notebook; and shares all of them with everyone in the workspace</w:t>
+              <w:t xml:space="preserve">folder; and shares all of them with everyone in the workspace</w:t>
             </w:r>
           </w:p>
         </w:tc>
@@ -33295,7 +33552,7 @@
         </w:numPr>
       </w:pPr>
       <w:r>
-        <w:t xml:space="preserve">Save-point tables mean nobody gets stuck: if Lab 1 runs long, Lab 2 still works.</w:t>
+        <w:t xml:space="preserve">The reference tables in bronze, silver and gold mean nobody gets stuck: if Lab 1 runs long, Lab 2 still works.</w:t>
       </w:r>
     </w:p>
     <w:p>
@@ -33901,7 +34158,7 @@
         </w:numPr>
       </w:pPr>
       <w:r>
-        <w:t xml:space="preserve">Nothing in Lab 2 depends on finishing Lab 1: the checkpoint tables have the same result.</w:t>
+        <w:t xml:space="preserve">Nothing in Lab 2 depends on finishing Lab 1: the gold reference tables have the same result.</w:t>
       </w:r>
     </w:p>
     <w:p>
@@ -33913,7 +34170,7 @@
         </w:numPr>
       </w:pPr>
       <w:r>
-        <w:t xml:space="preserve">The full steps are in the lab workbook (PDF, and the "Lab workbook" notebook in the workspace).</w:t>
+        <w:t xml:space="preserve">The full steps are in the lab workbook PDF and in the Labs folder in the workspace: notebook 01 is Lab 1.</w:t>
       </w:r>
     </w:p>
     <w:p>
@@ -34422,7 +34679,7 @@
         </w:numPr>
       </w:pPr>
       <w:r>
-        <w:t xml:space="preserve">Run both queries in the SQL editor. The Lab workbook notebook has a version that works out your schema from your login.</w:t>
+        <w:t xml:space="preserve">Run both queries in the SQL editor. Notebook 01 in the Labs folder has a version that works out your schema from your login.</w:t>
       </w:r>
     </w:p>
     <w:p>
@@ -34458,7 +34715,7 @@
         </w:numPr>
       </w:pPr>
       <w:r>
-        <w:t xml:space="preserve">1:15: anyone not past step 5 switches to the checkpoint tables.</w:t>
+        <w:t xml:space="preserve">1:15: anyone not past step 5 switches to the gold reference tables.</w:t>
       </w:r>
     </w:p>
     <w:bookmarkEnd w:id="109"/>
@@ -34997,7 +35254,7 @@
         </w:numPr>
       </w:pPr>
       <w:r>
-        <w:t xml:space="preserve">The tables: smbc_workshop.checkpoint.gold_group_exposure and smbc_workshop.checkpoint.gold_facility_exposure.</w:t>
+        <w:t xml:space="preserve">The tables: smbc_workshop.gold.group_exposure and smbc_workshop.gold.facility_exposure.</w:t>
       </w:r>
     </w:p>
     <w:bookmarkEnd w:id="120"/>

</xml_diff>

<commit_message>
Add the workshop's storyline to the README and Start here notebook
The story of the Monday exposure report: the CDAO's question, why it's
hard to answer today, and how each session and asset solves it. It's
written in guide section 6, so the Start here notebook and the lab
workbook pick it up when they're built. The README tells it with a table
of the assets the setup creates. It doesn't give away the findings, which
the labs and the quiz depend on.

Co-authored-by: Isaac <no-reply@databricks.com>
</commit_message>
<xml_diff>
--- a/facilitator/dist/Workshop_Walkthrough.docx
+++ b/facilitator/dist/Workshop_Walkthrough.docx
@@ -1726,7 +1726,7 @@
         <w:t xml:space="preserve"> </w:t>
       </w:r>
       <w:r>
-        <w:t xml:space="preserve">It's 8am on Monday at the APAC hub. The Credit Committee wants the top counterparty-group exposures across all booking branches, in USD and JPY, by 10am. Today that means four system extracts, a spreadsheet of limits, and days of reconciliation. In Lab 1 participants automate it, in Lab 2 they make it self-service, and in the Genie Code segment they investigate what they found.</w:t>
+        <w:t xml:space="preserve">It's 8am on Monday at the APAC hub. The Credit Committee wants the top counterparty-group exposures across all booking branches, in USD and JPY, by 10am. Today that means four system extracts, a spreadsheet of limits, and days of reconciliation. In Lab 1 participants automate it, in Lab 2 they make it self-service, and in the Genie Code segment they investigate what they found. Section 6 tells the full story, as participants read it.</w:t>
       </w:r>
     </w:p>
     <w:p>
@@ -15273,7 +15273,7 @@
     </w:p>
     <w:bookmarkEnd w:id="39"/>
     <w:bookmarkEnd w:id="40"/>
-    <w:bookmarkStart w:id="71" w:name="part-3-attendee-guide"/>
+    <w:bookmarkStart w:id="72" w:name="part-3-attendee-guide"/>
     <w:p>
       <w:pPr>
         <w:pStyle w:val="Heading1"/>
@@ -15972,7 +15972,7 @@
       </w:r>
     </w:p>
     <w:bookmarkEnd w:id="41"/>
-    <w:bookmarkStart w:id="45" w:name="Xfefe26028280eea74e7821ddeaaf7a5053f6189"/>
+    <w:bookmarkStart w:id="46" w:name="Xfefe26028280eea74e7821ddeaaf7a5053f6189"/>
     <w:p>
       <w:pPr>
         <w:pStyle w:val="Heading2"/>
@@ -16005,7 +16005,506 @@
         <w:t xml:space="preserve">corporate lending book with about USD 27bn of drawn exposure across 12 booking branches in Asia Pacific. Every borrower, group and figure is made up. Borrowers belong to counterparty groups, such as a conglomerate and its subsidiaries in several countries, and each group has an approved credit limit set by the risk team. As at SMBC, the fiscal year runs from April to March.</w:t>
       </w:r>
     </w:p>
-    <w:bookmarkStart w:id="42" w:name="X92c5b160c37b36e6dbf9bd624ddb1aaf92445e3"/>
+    <w:bookmarkStart w:id="42" w:name="the-story-the-monday-exposure-report"/>
+    <w:p>
+      <w:pPr>
+        <w:pStyle w:val="Heading3"/>
+      </w:pPr>
+      <w:r>
+        <w:t xml:space="preserve">The story: the Monday exposure report</w:t>
+      </w:r>
+    </w:p>
+    <w:p>
+      <w:pPr>
+        <w:pStyle w:val="FirstParagraph"/>
+      </w:pPr>
+      <w:r>
+        <w:t xml:space="preserve">It's 8:00 on Monday at the APAC hub. The Credit Committee meets at 10:00 and wants the top counterparty-group exposures across all 12 booking branches, in USD and JPY. Behind it is the question the CDAO asks the room at the start of the day:</w:t>
+      </w:r>
+      <w:r>
+        <w:t xml:space="preserve"> </w:t>
+      </w:r>
+      <w:r>
+        <w:rPr>
+          <w:i/>
+          <w:iCs/>
+        </w:rPr>
+        <w:t xml:space="preserve">"Which client groups are closest to their limits, and why?"</w:t>
+      </w:r>
+    </w:p>
+    <w:p>
+      <w:pPr>
+        <w:pStyle w:val="BodyText"/>
+      </w:pPr>
+      <w:r>
+        <w:rPr>
+          <w:b/>
+          <w:bCs/>
+        </w:rPr>
+        <w:t xml:space="preserve">Why that's hard today.</w:t>
+      </w:r>
+      <w:r>
+        <w:t xml:space="preserve"> </w:t>
+      </w:r>
+      <w:r>
+        <w:t xml:space="preserve">A group's exposure is spread across subsidiaries in several countries, booked in different branches and currencies, so no single system adds it up. Answering means four system extracts, the risk team's spreadsheet of limits and days of reconciliation, and the extracts have the problems in the notes below. A group can creep towards its limit without any one report showing it. And the committee asks in the bank's own terms, such as</w:t>
+      </w:r>
+      <w:r>
+        <w:t xml:space="preserve"> </w:t>
+      </w:r>
+      <w:r>
+        <w:rPr>
+          <w:i/>
+          <w:iCs/>
+        </w:rPr>
+        <w:t xml:space="preserve">"the end of FY2026 H1"</w:t>
+      </w:r>
+      <w:r>
+        <w:t xml:space="preserve">, which a tool that assumes a calendar year gets wrong.</w:t>
+      </w:r>
+    </w:p>
+    <w:p>
+      <w:pPr>
+        <w:pStyle w:val="BodyText"/>
+      </w:pPr>
+      <w:r>
+        <w:rPr>
+          <w:b/>
+          <w:bCs/>
+        </w:rPr>
+        <w:t xml:space="preserve">How you solve it, one session at a time:</w:t>
+      </w:r>
+    </w:p>
+    <w:tbl>
+      <w:tblPr>
+        <w:tblStyle w:val="Table"/>
+        <w:tblW w:type="pct" w:w="5000"/>
+        <w:tblLayout w:type="fixed"/>
+        <w:tblLook w:firstRow="1" w:lastRow="0" w:firstColumn="0" w:lastColumn="0" w:noHBand="0" w:noVBand="0" w:val="0020"/>
+      </w:tblPr>
+      <w:tblGrid>
+        <w:gridCol w:w="1770"/>
+        <w:gridCol w:w="3934"/>
+        <w:gridCol w:w="3934"/>
+      </w:tblGrid>
+      <w:tr>
+        <w:trPr>
+          <w:tblHeader w:val="on"/>
+        </w:trPr>
+        <w:tc>
+          <w:tcPr>
+            <w:tcW w:w="1770" w:type="dxa"/>
+            <w:tcBorders>
+              <w:top w:val="single" w:sz="4" w:space="0" w:color="BFBFBF"/>
+              <w:left w:val="single" w:sz="4" w:space="0" w:color="BFBFBF"/>
+              <w:bottom w:val="single" w:sz="4" w:space="0" w:color="BFBFBF"/>
+              <w:right w:val="single" w:sz="4" w:space="0" w:color="BFBFBF"/>
+            </w:tcBorders>
+            <w:shd w:val="clear" w:color="auto" w:fill="EEEDE9"/>
+          </w:tcPr>
+          <w:p>
+            <w:pPr>
+              <w:pStyle w:val="Compact"/>
+            </w:pPr>
+            <w:r>
+              <w:rPr>
+                <w:b/>
+              </w:rPr>
+              <w:t xml:space="preserve">Session</w:t>
+            </w:r>
+          </w:p>
+        </w:tc>
+        <w:tc>
+          <w:tcPr>
+            <w:tcW w:w="3934" w:type="dxa"/>
+            <w:tcBorders>
+              <w:top w:val="single" w:sz="4" w:space="0" w:color="BFBFBF"/>
+              <w:left w:val="single" w:sz="4" w:space="0" w:color="BFBFBF"/>
+              <w:bottom w:val="single" w:sz="4" w:space="0" w:color="BFBFBF"/>
+              <w:right w:val="single" w:sz="4" w:space="0" w:color="BFBFBF"/>
+            </w:tcBorders>
+            <w:shd w:val="clear" w:color="auto" w:fill="EEEDE9"/>
+          </w:tcPr>
+          <w:p>
+            <w:pPr>
+              <w:pStyle w:val="Compact"/>
+            </w:pPr>
+            <w:r>
+              <w:rPr>
+                <w:b/>
+              </w:rPr>
+              <w:t xml:space="preserve">What you build or use</w:t>
+            </w:r>
+          </w:p>
+        </w:tc>
+        <w:tc>
+          <w:tcPr>
+            <w:tcW w:w="3934" w:type="dxa"/>
+            <w:tcBorders>
+              <w:top w:val="single" w:sz="4" w:space="0" w:color="BFBFBF"/>
+              <w:left w:val="single" w:sz="4" w:space="0" w:color="BFBFBF"/>
+              <w:bottom w:val="single" w:sz="4" w:space="0" w:color="BFBFBF"/>
+              <w:right w:val="single" w:sz="4" w:space="0" w:color="BFBFBF"/>
+            </w:tcBorders>
+            <w:shd w:val="clear" w:color="auto" w:fill="EEEDE9"/>
+          </w:tcPr>
+          <w:p>
+            <w:pPr>
+              <w:pStyle w:val="Compact"/>
+            </w:pPr>
+            <w:r>
+              <w:rPr>
+                <w:b/>
+              </w:rPr>
+              <w:t xml:space="preserve">What it solves</w:t>
+            </w:r>
+          </w:p>
+        </w:tc>
+      </w:tr>
+      <w:tr>
+        <w:tc>
+          <w:tcPr>
+            <w:tcW w:w="1770" w:type="dxa"/>
+            <w:tcBorders>
+              <w:top w:val="single" w:sz="4" w:space="0" w:color="BFBFBF"/>
+              <w:left w:val="single" w:sz="4" w:space="0" w:color="BFBFBF"/>
+              <w:bottom w:val="single" w:sz="4" w:space="0" w:color="BFBFBF"/>
+              <w:right w:val="single" w:sz="4" w:space="0" w:color="BFBFBF"/>
+            </w:tcBorders>
+          </w:tcPr>
+          <w:p>
+            <w:pPr>
+              <w:pStyle w:val="Compact"/>
+            </w:pPr>
+            <w:r>
+              <w:t xml:space="preserve">Lab 1: automate it</w:t>
+            </w:r>
+          </w:p>
+        </w:tc>
+        <w:tc>
+          <w:tcPr>
+            <w:tcW w:w="3934" w:type="dxa"/>
+            <w:tcBorders>
+              <w:top w:val="single" w:sz="4" w:space="0" w:color="BFBFBF"/>
+              <w:left w:val="single" w:sz="4" w:space="0" w:color="BFBFBF"/>
+              <w:bottom w:val="single" w:sz="4" w:space="0" w:color="BFBFBF"/>
+              <w:right w:val="single" w:sz="4" w:space="0" w:color="BFBFBF"/>
+            </w:tcBorders>
+          </w:tcPr>
+          <w:p>
+            <w:pPr>
+              <w:pStyle w:val="Compact"/>
+            </w:pPr>
+            <w:r>
+              <w:t xml:space="preserve">A</w:t>
+            </w:r>
+            <w:r>
+              <w:t xml:space="preserve"> </w:t>
+            </w:r>
+            <w:r>
+              <w:rPr>
+                <w:b/>
+                <w:bCs/>
+              </w:rPr>
+              <w:t xml:space="preserve">Lakeflow Designer</w:t>
+            </w:r>
+            <w:r>
+              <w:t xml:space="preserve"> </w:t>
+            </w:r>
+            <w:r>
+              <w:t xml:space="preserve">pipeline from the raw extracts to your own</w:t>
+            </w:r>
+            <w:r>
+              <w:t xml:space="preserve"> </w:t>
+            </w:r>
+            <w:r>
+              <w:rPr>
+                <w:rStyle w:val="VerbatimChar"/>
+              </w:rPr>
+              <w:t xml:space="preserve">gold_group_exposure</w:t>
+            </w:r>
+            <w:r>
+              <w:t xml:space="preserve"> </w:t>
+            </w:r>
+            <w:r>
+              <w:t xml:space="preserve">table, scheduled daily with</w:t>
+            </w:r>
+            <w:r>
+              <w:t xml:space="preserve"> </w:t>
+            </w:r>
+            <w:r>
+              <w:rPr>
+                <w:b/>
+                <w:bCs/>
+              </w:rPr>
+              <w:t xml:space="preserve">Lakeflow Jobs</w:t>
+            </w:r>
+          </w:p>
+        </w:tc>
+        <w:tc>
+          <w:tcPr>
+            <w:tcW w:w="3934" w:type="dxa"/>
+            <w:tcBorders>
+              <w:top w:val="single" w:sz="4" w:space="0" w:color="BFBFBF"/>
+              <w:left w:val="single" w:sz="4" w:space="0" w:color="BFBFBF"/>
+              <w:bottom w:val="single" w:sz="4" w:space="0" w:color="BFBFBF"/>
+              <w:right w:val="single" w:sz="4" w:space="0" w:color="BFBFBF"/>
+            </w:tcBorders>
+          </w:tcPr>
+          <w:p>
+            <w:pPr>
+              <w:pStyle w:val="Compact"/>
+            </w:pPr>
+            <w:r>
+              <w:t xml:space="preserve">One trusted figure per group and month: duplicates removed; currencies, dates and FX rates fixed; bad rows held back with a reason; every step visible as code and as lineage</w:t>
+            </w:r>
+          </w:p>
+        </w:tc>
+      </w:tr>
+      <w:tr>
+        <w:tc>
+          <w:tcPr>
+            <w:tcW w:w="1770" w:type="dxa"/>
+            <w:tcBorders>
+              <w:top w:val="single" w:sz="4" w:space="0" w:color="BFBFBF"/>
+              <w:left w:val="single" w:sz="4" w:space="0" w:color="BFBFBF"/>
+              <w:bottom w:val="single" w:sz="4" w:space="0" w:color="BFBFBF"/>
+              <w:right w:val="single" w:sz="4" w:space="0" w:color="BFBFBF"/>
+            </w:tcBorders>
+          </w:tcPr>
+          <w:p>
+            <w:pPr>
+              <w:pStyle w:val="Compact"/>
+            </w:pPr>
+            <w:r>
+              <w:t xml:space="preserve">Lab 2: make it self-service</w:t>
+            </w:r>
+          </w:p>
+        </w:tc>
+        <w:tc>
+          <w:tcPr>
+            <w:tcW w:w="3934" w:type="dxa"/>
+            <w:tcBorders>
+              <w:top w:val="single" w:sz="4" w:space="0" w:color="BFBFBF"/>
+              <w:left w:val="single" w:sz="4" w:space="0" w:color="BFBFBF"/>
+              <w:bottom w:val="single" w:sz="4" w:space="0" w:color="BFBFBF"/>
+              <w:right w:val="single" w:sz="4" w:space="0" w:color="BFBFBF"/>
+            </w:tcBorders>
+          </w:tcPr>
+          <w:p>
+            <w:pPr>
+              <w:pStyle w:val="Compact"/>
+            </w:pPr>
+            <w:r>
+              <w:t xml:space="preserve">An</w:t>
+            </w:r>
+            <w:r>
+              <w:t xml:space="preserve"> </w:t>
+            </w:r>
+            <w:r>
+              <w:rPr>
+                <w:b/>
+                <w:bCs/>
+              </w:rPr>
+              <w:t xml:space="preserve">AI/BI dashboard</w:t>
+            </w:r>
+            <w:r>
+              <w:t xml:space="preserve"> </w:t>
+            </w:r>
+            <w:r>
+              <w:t xml:space="preserve">for the Credit Committee and a</w:t>
+            </w:r>
+            <w:r>
+              <w:t xml:space="preserve"> </w:t>
+            </w:r>
+            <w:r>
+              <w:rPr>
+                <w:b/>
+                <w:bCs/>
+              </w:rPr>
+              <w:t xml:space="preserve">Genie Agent</w:t>
+            </w:r>
+            <w:r>
+              <w:t xml:space="preserve">, shared through</w:t>
+            </w:r>
+            <w:r>
+              <w:t xml:space="preserve"> </w:t>
+            </w:r>
+            <w:r>
+              <w:rPr>
+                <w:b/>
+                <w:bCs/>
+              </w:rPr>
+              <w:t xml:space="preserve">Genie One</w:t>
+            </w:r>
+          </w:p>
+        </w:tc>
+        <w:tc>
+          <w:tcPr>
+            <w:tcW w:w="3934" w:type="dxa"/>
+            <w:tcBorders>
+              <w:top w:val="single" w:sz="4" w:space="0" w:color="BFBFBF"/>
+              <w:left w:val="single" w:sz="4" w:space="0" w:color="BFBFBF"/>
+              <w:bottom w:val="single" w:sz="4" w:space="0" w:color="BFBFBF"/>
+              <w:right w:val="single" w:sz="4" w:space="0" w:color="BFBFBF"/>
+            </w:tcBorders>
+          </w:tcPr>
+          <w:p>
+            <w:pPr>
+              <w:pStyle w:val="Compact"/>
+            </w:pPr>
+            <w:r>
+              <w:t xml:space="preserve">The questions the committee always asks, on one page: total exposure, the largest groups and how close each is to its limit, the trend, and a watchlist. New questions answered in plain English or Japanese, using the April-to-March fiscal year you teach the agent, with the SQL behind every answer</w:t>
+            </w:r>
+          </w:p>
+        </w:tc>
+      </w:tr>
+      <w:tr>
+        <w:tc>
+          <w:tcPr>
+            <w:tcW w:w="1770" w:type="dxa"/>
+            <w:tcBorders>
+              <w:top w:val="single" w:sz="4" w:space="0" w:color="BFBFBF"/>
+              <w:left w:val="single" w:sz="4" w:space="0" w:color="BFBFBF"/>
+              <w:bottom w:val="single" w:sz="4" w:space="0" w:color="BFBFBF"/>
+              <w:right w:val="single" w:sz="4" w:space="0" w:color="BFBFBF"/>
+            </w:tcBorders>
+          </w:tcPr>
+          <w:p>
+            <w:pPr>
+              <w:pStyle w:val="Compact"/>
+            </w:pPr>
+            <w:r>
+              <w:t xml:space="preserve">Genie Code: find out why</w:t>
+            </w:r>
+          </w:p>
+        </w:tc>
+        <w:tc>
+          <w:tcPr>
+            <w:tcW w:w="3934" w:type="dxa"/>
+            <w:tcBorders>
+              <w:top w:val="single" w:sz="4" w:space="0" w:color="BFBFBF"/>
+              <w:left w:val="single" w:sz="4" w:space="0" w:color="BFBFBF"/>
+              <w:bottom w:val="single" w:sz="4" w:space="0" w:color="BFBFBF"/>
+              <w:right w:val="single" w:sz="4" w:space="0" w:color="BFBFBF"/>
+            </w:tcBorders>
+          </w:tcPr>
+          <w:p>
+            <w:pPr>
+              <w:pStyle w:val="Compact"/>
+            </w:pPr>
+            <w:r>
+              <w:rPr>
+                <w:b/>
+                <w:bCs/>
+              </w:rPr>
+              <w:t xml:space="preserve">Genie Code</w:t>
+            </w:r>
+            <w:r>
+              <w:t xml:space="preserve"> </w:t>
+            </w:r>
+            <w:r>
+              <w:t xml:space="preserve">in a notebook</w:t>
+            </w:r>
+          </w:p>
+        </w:tc>
+        <w:tc>
+          <w:tcPr>
+            <w:tcW w:w="3934" w:type="dxa"/>
+            <w:tcBorders>
+              <w:top w:val="single" w:sz="4" w:space="0" w:color="BFBFBF"/>
+              <w:left w:val="single" w:sz="4" w:space="0" w:color="BFBFBF"/>
+              <w:bottom w:val="single" w:sz="4" w:space="0" w:color="BFBFBF"/>
+              <w:right w:val="single" w:sz="4" w:space="0" w:color="BFBFBF"/>
+            </w:tcBorders>
+          </w:tcPr>
+          <w:p>
+            <w:pPr>
+              <w:pStyle w:val="Compact"/>
+            </w:pPr>
+            <w:r>
+              <w:t xml:space="preserve">What changed since April; how much of a group's rise is currency movement rather than new lending; and a legacy SQL procedure rewritten for Databricks, with you in control of what runs</w:t>
+            </w:r>
+          </w:p>
+        </w:tc>
+      </w:tr>
+      <w:tr>
+        <w:tc>
+          <w:tcPr>
+            <w:tcW w:w="1770" w:type="dxa"/>
+            <w:tcBorders>
+              <w:top w:val="single" w:sz="4" w:space="0" w:color="BFBFBF"/>
+              <w:left w:val="single" w:sz="4" w:space="0" w:color="BFBFBF"/>
+              <w:bottom w:val="single" w:sz="4" w:space="0" w:color="BFBFBF"/>
+              <w:right w:val="single" w:sz="4" w:space="0" w:color="BFBFBF"/>
+            </w:tcBorders>
+          </w:tcPr>
+          <w:p>
+            <w:pPr>
+              <w:pStyle w:val="Compact"/>
+            </w:pPr>
+            <w:r>
+              <w:t xml:space="preserve">All day: governance</w:t>
+            </w:r>
+          </w:p>
+        </w:tc>
+        <w:tc>
+          <w:tcPr>
+            <w:tcW w:w="3934" w:type="dxa"/>
+            <w:tcBorders>
+              <w:top w:val="single" w:sz="4" w:space="0" w:color="BFBFBF"/>
+              <w:left w:val="single" w:sz="4" w:space="0" w:color="BFBFBF"/>
+              <w:bottom w:val="single" w:sz="4" w:space="0" w:color="BFBFBF"/>
+              <w:right w:val="single" w:sz="4" w:space="0" w:color="BFBFBF"/>
+            </w:tcBorders>
+          </w:tcPr>
+          <w:p>
+            <w:pPr>
+              <w:pStyle w:val="Compact"/>
+            </w:pPr>
+            <w:r>
+              <w:rPr>
+                <w:b/>
+                <w:bCs/>
+              </w:rPr>
+              <w:t xml:space="preserve">Unity Catalog</w:t>
+            </w:r>
+            <w:r>
+              <w:t xml:space="preserve">, under everything you build</w:t>
+            </w:r>
+          </w:p>
+        </w:tc>
+        <w:tc>
+          <w:tcPr>
+            <w:tcW w:w="3934" w:type="dxa"/>
+            <w:tcBorders>
+              <w:top w:val="single" w:sz="4" w:space="0" w:color="BFBFBF"/>
+              <w:left w:val="single" w:sz="4" w:space="0" w:color="BFBFBF"/>
+              <w:bottom w:val="single" w:sz="4" w:space="0" w:color="BFBFBF"/>
+              <w:right w:val="single" w:sz="4" w:space="0" w:color="BFBFBF"/>
+            </w:tcBorders>
+          </w:tcPr>
+          <w:p>
+            <w:pPr>
+              <w:pStyle w:val="Compact"/>
+            </w:pPr>
+            <w:r>
+              <w:t xml:space="preserve">Lineage, data-quality checks and permissions that follow the data: a Genie Agent shows each person only the branches and borrower names they're allowed to see</w:t>
+            </w:r>
+          </w:p>
+        </w:tc>
+      </w:tr>
+    </w:tbl>
+    <w:p>
+      <w:pPr>
+        <w:pStyle w:val="BodyText"/>
+      </w:pPr>
+      <w:r>
+        <w:t xml:space="preserve">By the end of the day you can answer the CDAO's question yourself, with numbers you can trace back to the source files. The quiz checks what you found.</w:t>
+      </w:r>
+    </w:p>
+    <w:bookmarkEnd w:id="42"/>
+    <w:bookmarkStart w:id="43" w:name="X92c5b160c37b36e6dbf9bd624ddb1aaf92445e3"/>
     <w:p>
       <w:pPr>
         <w:pStyle w:val="Heading3"/>
@@ -16638,8 +17137,8 @@
         </w:tc>
       </w:tr>
     </w:tbl>
-    <w:bookmarkEnd w:id="42"/>
-    <w:bookmarkStart w:id="43" w:name="notes-from-the-source-system-owners"/>
+    <w:bookmarkEnd w:id="43"/>
+    <w:bookmarkStart w:id="44" w:name="notes-from-the-source-system-owners"/>
     <w:p>
       <w:pPr>
         <w:pStyle w:val="Heading3"/>
@@ -16869,8 +17368,8 @@
         <w:t xml:space="preserve">"A few facilities were booked before the customer record was created in the master."</w:t>
       </w:r>
     </w:p>
-    <w:bookmarkEnd w:id="43"/>
-    <w:bookmarkStart w:id="44" w:name="reference-tables-bronze-silver-and-gold"/>
+    <w:bookmarkEnd w:id="44"/>
+    <w:bookmarkStart w:id="45" w:name="reference-tables-bronze-silver-and-gold"/>
     <w:p>
       <w:pPr>
         <w:pStyle w:val="Heading3"/>
@@ -17292,9 +17791,9 @@
         </w:pict>
       </w:r>
     </w:p>
-    <w:bookmarkEnd w:id="44"/>
     <w:bookmarkEnd w:id="45"/>
-    <w:bookmarkStart w:id="48" w:name="Xf9ab387f240c1d7b77102b3fc5a313034401255"/>
+    <w:bookmarkEnd w:id="46"/>
+    <w:bookmarkStart w:id="49" w:name="Xf9ab387f240c1d7b77102b3fc5a313034401255"/>
     <w:p>
       <w:pPr>
         <w:pStyle w:val="Heading2"/>
@@ -17383,7 +17882,7 @@
         <w:t xml:space="preserve">Nothing in Lab 2 depends on finishing Lab 1: the gold reference tables have the same result. Work in pairs, ideally one analyst and one engineer, with the engineer driving.</w:t>
       </w:r>
     </w:p>
-    <w:bookmarkStart w:id="46" w:name="core-path"/>
+    <w:bookmarkStart w:id="47" w:name="core-path"/>
     <w:p>
       <w:pPr>
         <w:pStyle w:val="Heading3"/>
@@ -19411,8 +19910,8 @@
         <w:t xml:space="preserve">;</w:t>
       </w:r>
     </w:p>
-    <w:bookmarkEnd w:id="46"/>
-    <w:bookmarkStart w:id="47" w:name="stretch-pick-any"/>
+    <w:bookmarkEnd w:id="47"/>
+    <w:bookmarkStart w:id="48" w:name="stretch-pick-any"/>
     <w:p>
       <w:pPr>
         <w:pStyle w:val="Heading3"/>
@@ -19569,9 +20068,9 @@
         </w:pict>
       </w:r>
     </w:p>
-    <w:bookmarkEnd w:id="47"/>
     <w:bookmarkEnd w:id="48"/>
-    <w:bookmarkStart w:id="51" w:name="X9a77c333740725278a0e5799fead1c7fecd3a5a"/>
+    <w:bookmarkEnd w:id="49"/>
+    <w:bookmarkStart w:id="52" w:name="X9a77c333740725278a0e5799fead1c7fecd3a5a"/>
     <w:p>
       <w:pPr>
         <w:pStyle w:val="Heading2"/>
@@ -19678,7 +20177,7 @@
         <w:t xml:space="preserve">) so everyone's answers match. If you finished Lab 1, your own tables give the same numbers.</w:t>
       </w:r>
     </w:p>
-    <w:bookmarkStart w:id="49" w:name="core-path-1"/>
+    <w:bookmarkStart w:id="50" w:name="core-path-1"/>
     <w:p>
       <w:pPr>
         <w:pStyle w:val="Heading3"/>
@@ -20322,8 +20821,8 @@
         <w:t xml:space="preserve">();</w:t>
       </w:r>
     </w:p>
-    <w:bookmarkEnd w:id="49"/>
-    <w:bookmarkStart w:id="50" w:name="stretch-pick-any-1"/>
+    <w:bookmarkEnd w:id="50"/>
+    <w:bookmarkStart w:id="51" w:name="stretch-pick-any-1"/>
     <w:p>
       <w:pPr>
         <w:pStyle w:val="Heading3"/>
@@ -20560,9 +21059,9 @@
         </w:pict>
       </w:r>
     </w:p>
-    <w:bookmarkEnd w:id="50"/>
     <w:bookmarkEnd w:id="51"/>
-    <w:bookmarkStart w:id="52" w:name="Xc8c189ae206b9c8161ed9c9b5ce289ed9124509"/>
+    <w:bookmarkEnd w:id="52"/>
+    <w:bookmarkStart w:id="53" w:name="Xc8c189ae206b9c8161ed9c9b5ce289ed9124509"/>
     <w:p>
       <w:pPr>
         <w:pStyle w:val="Heading2"/>
@@ -20796,8 +21295,8 @@
         </w:pict>
       </w:r>
     </w:p>
-    <w:bookmarkEnd w:id="52"/>
-    <w:bookmarkStart w:id="59" w:name="X89f83c886faea839ce07249a229743169fcb775"/>
+    <w:bookmarkEnd w:id="53"/>
+    <w:bookmarkStart w:id="60" w:name="X89f83c886faea839ce07249a229743169fcb775"/>
     <w:p>
       <w:pPr>
         <w:pStyle w:val="Heading2"/>
@@ -20947,7 +21446,7 @@
             <w:pPr>
               <w:pStyle w:val="Compact"/>
             </w:pPr>
-            <w:hyperlink r:id="rId53">
+            <w:hyperlink r:id="rId54">
               <w:r>
                 <w:rPr>
                   <w:rStyle w:val="Hyperlink"/>
@@ -21076,7 +21575,7 @@
             <w:pPr>
               <w:pStyle w:val="Compact"/>
             </w:pPr>
-            <w:hyperlink r:id="rId54">
+            <w:hyperlink r:id="rId55">
               <w:r>
                 <w:rPr>
                   <w:rStyle w:val="Hyperlink"/>
@@ -21121,7 +21620,7 @@
             <w:pPr>
               <w:pStyle w:val="Compact"/>
             </w:pPr>
-            <w:hyperlink r:id="rId55">
+            <w:hyperlink r:id="rId56">
               <w:r>
                 <w:rPr>
                   <w:rStyle w:val="Hyperlink"/>
@@ -21166,7 +21665,7 @@
             <w:pPr>
               <w:pStyle w:val="Compact"/>
             </w:pPr>
-            <w:hyperlink r:id="rId56">
+            <w:hyperlink r:id="rId57">
               <w:r>
                 <w:rPr>
                   <w:rStyle w:val="Hyperlink"/>
@@ -21211,7 +21710,7 @@
             <w:pPr>
               <w:pStyle w:val="Compact"/>
             </w:pPr>
-            <w:hyperlink r:id="rId57">
+            <w:hyperlink r:id="rId58">
               <w:r>
                 <w:rPr>
                   <w:rStyle w:val="Hyperlink"/>
@@ -21256,7 +21755,7 @@
             <w:pPr>
               <w:pStyle w:val="Compact"/>
             </w:pPr>
-            <w:hyperlink r:id="rId58">
+            <w:hyperlink r:id="rId59">
               <w:r>
                 <w:rPr>
                   <w:rStyle w:val="Hyperlink"/>
@@ -21275,8 +21774,8 @@
         </w:pict>
       </w:r>
     </w:p>
-    <w:bookmarkEnd w:id="59"/>
-    <w:bookmarkStart w:id="69" w:name="appendix-a-copy-paste-kit"/>
+    <w:bookmarkEnd w:id="60"/>
+    <w:bookmarkStart w:id="70" w:name="appendix-a-copy-paste-kit"/>
     <w:p>
       <w:pPr>
         <w:pStyle w:val="Heading2"/>
@@ -21285,7 +21784,7 @@
         <w:t xml:space="preserve">Appendix A: Copy-paste kit</w:t>
       </w:r>
     </w:p>
-    <w:bookmarkStart w:id="60" w:name="a1-check-in-and-checkpoint-queries"/>
+    <w:bookmarkStart w:id="61" w:name="a1-check-in-and-checkpoint-queries"/>
     <w:p>
       <w:pPr>
         <w:pStyle w:val="Heading3"/>
@@ -21746,8 +22245,8 @@
         <w:t xml:space="preserve">();</w:t>
       </w:r>
     </w:p>
-    <w:bookmarkEnd w:id="60"/>
-    <w:bookmarkStart w:id="61" w:name="a2-genie-code-prompts-for-lab-1-designer"/>
+    <w:bookmarkEnd w:id="61"/>
+    <w:bookmarkStart w:id="62" w:name="a2-genie-code-prompts-for-lab-1-designer"/>
     <w:p>
       <w:pPr>
         <w:pStyle w:val="Heading3"/>
@@ -21805,8 +22304,8 @@
         <w:t xml:space="preserve">and exposure_jpy = drawn_amount × jpy_rate.</w:t>
       </w:r>
     </w:p>
-    <w:bookmarkEnd w:id="61"/>
-    <w:bookmarkStart w:id="62" w:name="a3-genie-agent-starter-instructions"/>
+    <w:bookmarkEnd w:id="62"/>
+    <w:bookmarkStart w:id="63" w:name="a3-genie-agent-starter-instructions"/>
     <w:p>
       <w:pPr>
         <w:pStyle w:val="Heading3"/>
@@ -21919,8 +22418,8 @@
         <w:t xml:space="preserve">- Show amounts in USD millions with one decimal place unless asked otherwise.</w:t>
       </w:r>
     </w:p>
-    <w:bookmarkEnd w:id="62"/>
-    <w:bookmarkStart w:id="63" w:name="X913b63a9cedc050a49fab46dfe5b57d22f41418"/>
+    <w:bookmarkEnd w:id="63"/>
+    <w:bookmarkStart w:id="64" w:name="X913b63a9cedc050a49fab46dfe5b57d22f41418"/>
     <w:p>
       <w:pPr>
         <w:pStyle w:val="Heading3"/>
@@ -21967,8 +22466,8 @@
         <w:t xml:space="preserve">"End of FY2026 H1" means as_of_date = 2026-09-30. "FY2026 to date" means as_of_date from 2026-04-30 onwards.</w:t>
       </w:r>
     </w:p>
-    <w:bookmarkEnd w:id="63"/>
-    <w:bookmarkStart w:id="64" w:name="a5-example-sql-queries"/>
+    <w:bookmarkEnd w:id="64"/>
+    <w:bookmarkStart w:id="65" w:name="a5-example-sql-queries"/>
     <w:p>
       <w:pPr>
         <w:pStyle w:val="Heading3"/>
@@ -22425,8 +22924,8 @@
         <w:t xml:space="preserve">;</w:t>
       </w:r>
     </w:p>
-    <w:bookmarkEnd w:id="64"/>
-    <w:bookmarkStart w:id="65" w:name="a6-common-questions"/>
+    <w:bookmarkEnd w:id="65"/>
+    <w:bookmarkStart w:id="66" w:name="a6-common-questions"/>
     <w:p>
       <w:pPr>
         <w:pStyle w:val="Heading3"/>
@@ -22482,8 +22981,8 @@
         <w:t xml:space="preserve">Which booking branch has the highest share of trade finance in arrears?</w:t>
       </w:r>
     </w:p>
-    <w:bookmarkEnd w:id="65"/>
-    <w:bookmarkStart w:id="66" w:name="a7-benchmark-questions-stretch"/>
+    <w:bookmarkEnd w:id="66"/>
+    <w:bookmarkStart w:id="67" w:name="a7-benchmark-questions-stretch"/>
     <w:p>
       <w:pPr>
         <w:pStyle w:val="Heading3"/>
@@ -22770,8 +23269,8 @@
         </w:tc>
       </w:tr>
     </w:tbl>
-    <w:bookmarkEnd w:id="66"/>
-    <w:bookmarkStart w:id="67" w:name="Xb3d8e474c82359234fd09f77a8d7b31c614c80c"/>
+    <w:bookmarkEnd w:id="67"/>
+    <w:bookmarkStart w:id="68" w:name="Xb3d8e474c82359234fd09f77a8d7b31c614c80c"/>
     <w:p>
       <w:pPr>
         <w:pStyle w:val="Heading3"/>
@@ -22867,8 +23366,8 @@
         <w:t xml:space="preserve">&lt;paste A.9&gt;</w:t>
       </w:r>
     </w:p>
-    <w:bookmarkEnd w:id="67"/>
-    <w:bookmarkStart w:id="68" w:name="X9d3a8470de6a6dcb4c47fe21df728324d6cdb51"/>
+    <w:bookmarkEnd w:id="68"/>
+    <w:bookmarkStart w:id="69" w:name="X9d3a8470de6a6dcb4c47fe21df728324d6cdb51"/>
     <w:p>
       <w:pPr>
         <w:pStyle w:val="Heading3"/>
@@ -24278,9 +24777,9 @@
         </w:pict>
       </w:r>
     </w:p>
-    <w:bookmarkEnd w:id="68"/>
     <w:bookmarkEnd w:id="69"/>
-    <w:bookmarkStart w:id="70" w:name="appendix-b-troubleshooting"/>
+    <w:bookmarkEnd w:id="70"/>
+    <w:bookmarkStart w:id="71" w:name="appendix-b-troubleshooting"/>
     <w:p>
       <w:pPr>
         <w:pStyle w:val="Heading2"/>
@@ -25205,9 +25704,9 @@
         </w:tc>
       </w:tr>
     </w:tbl>
-    <w:bookmarkEnd w:id="70"/>
     <w:bookmarkEnd w:id="71"/>
-    <w:bookmarkStart w:id="87" w:name="part-4-workspace-setup-and-requirements"/>
+    <w:bookmarkEnd w:id="72"/>
+    <w:bookmarkStart w:id="88" w:name="part-4-workspace-setup-and-requirements"/>
     <w:p>
       <w:pPr>
         <w:pStyle w:val="Heading1"/>
@@ -25224,7 +25723,7 @@
         <w:t xml:space="preserve">For SMBC's SAG team and workspace administrators. Section numbers match the workshop guide.</w:t>
       </w:r>
     </w:p>
-    <w:bookmarkStart w:id="84" w:name="Xf20fa85265cdac618bab9d2b24d1a4c98c219ee"/>
+    <w:bookmarkStart w:id="85" w:name="Xf20fa85265cdac618bab9d2b24d1a4c98c219ee"/>
     <w:p>
       <w:pPr>
         <w:pStyle w:val="Heading2"/>
@@ -25378,7 +25877,7 @@
         <w:t xml:space="preserve">catalog (3.6) and to a SQL warehouse (3.4).</w:t>
       </w:r>
     </w:p>
-    <w:bookmarkStart w:id="72" w:name="X5dc5dde3a9df68ef729f99e5eb74bd5ff0be601"/>
+    <w:bookmarkStart w:id="73" w:name="X5dc5dde3a9df68ef729f99e5eb74bd5ff0be601"/>
     <w:p>
       <w:pPr>
         <w:pStyle w:val="Heading3"/>
@@ -27182,8 +27681,8 @@
         </w:tc>
       </w:tr>
     </w:tbl>
-    <w:bookmarkEnd w:id="72"/>
-    <w:bookmarkStart w:id="74" w:name="Xf30590ce4a84f32cf4a268d95d7672d47800670"/>
+    <w:bookmarkEnd w:id="73"/>
+    <w:bookmarkStart w:id="75" w:name="Xf30590ce4a84f32cf4a268d95d7672d47800670"/>
     <w:p>
       <w:pPr>
         <w:pStyle w:val="Heading3"/>
@@ -27224,7 +27723,7 @@
       <w:r>
         <w:t xml:space="preserve"> </w:t>
       </w:r>
-      <w:hyperlink r:id="rId73">
+      <w:hyperlink r:id="rId74">
         <w:r>
           <w:rPr>
             <w:rStyle w:val="Hyperlink"/>
@@ -27575,8 +28074,8 @@
         <w:t xml:space="preserve">If the workspace uses the compliance security profile, partner-powered AI features are off by default and need an explicit decision.</w:t>
       </w:r>
     </w:p>
-    <w:bookmarkEnd w:id="74"/>
-    <w:bookmarkStart w:id="75" w:name="Xbf4e7e8e32e083c059fe423220621a83f34cf88"/>
+    <w:bookmarkEnd w:id="75"/>
+    <w:bookmarkStart w:id="76" w:name="Xbf4e7e8e32e083c059fe423220621a83f34cf88"/>
     <w:p>
       <w:pPr>
         <w:pStyle w:val="Heading3"/>
@@ -27929,8 +28428,8 @@
         <w:t xml:space="preserve">*All data in this workspace is synthetic: the borrowers, groups and figures are made up.*</w:t>
       </w:r>
     </w:p>
-    <w:bookmarkEnd w:id="75"/>
-    <w:bookmarkStart w:id="76" w:name="X44b15ffcb6afdd166114388f8b2940e61e1b035"/>
+    <w:bookmarkEnd w:id="76"/>
+    <w:bookmarkStart w:id="77" w:name="X44b15ffcb6afdd166114388f8b2940e61e1b035"/>
     <w:p>
       <w:pPr>
         <w:pStyle w:val="Heading3"/>
@@ -28121,8 +28620,8 @@
         </w:tc>
       </w:tr>
     </w:tbl>
-    <w:bookmarkEnd w:id="76"/>
-    <w:bookmarkStart w:id="77" w:name="X00dda23f184f8e2af5a3ed11efc1074a5a73d10"/>
+    <w:bookmarkEnd w:id="77"/>
+    <w:bookmarkStart w:id="78" w:name="X00dda23f184f8e2af5a3ed11efc1074a5a73d10"/>
     <w:p>
       <w:pPr>
         <w:pStyle w:val="Heading3"/>
@@ -28512,8 +29011,8 @@
         <w:t xml:space="preserve">.</w:t>
       </w:r>
     </w:p>
-    <w:bookmarkEnd w:id="77"/>
-    <w:bookmarkStart w:id="78" w:name="X5db55288a7920b91a07c9e8c53af9bfe0f63358"/>
+    <w:bookmarkEnd w:id="78"/>
+    <w:bookmarkStart w:id="79" w:name="X5db55288a7920b91a07c9e8c53af9bfe0f63358"/>
     <w:p>
       <w:pPr>
         <w:pStyle w:val="Heading3"/>
@@ -29506,8 +30005,8 @@
         <w:t xml:space="preserve">reports whether attendees have everything they need.</w:t>
       </w:r>
     </w:p>
-    <w:bookmarkEnd w:id="78"/>
-    <w:bookmarkStart w:id="79" w:name="X0037348c626822b3e16d4414267eaa49ca3c9ca"/>
+    <w:bookmarkEnd w:id="79"/>
+    <w:bookmarkStart w:id="80" w:name="X0037348c626822b3e16d4414267eaa49ca3c9ca"/>
     <w:p>
       <w:pPr>
         <w:pStyle w:val="Heading3"/>
@@ -29605,8 +30104,8 @@
         <w:t xml:space="preserve">The quiz and the polls run on phones (Slido), so nothing needs installing on laptops.</w:t>
       </w:r>
     </w:p>
-    <w:bookmarkEnd w:id="79"/>
-    <w:bookmarkStart w:id="80" w:name="Xd3127dabbb551814d087718d40b85244929ca6e"/>
+    <w:bookmarkEnd w:id="80"/>
+    <w:bookmarkStart w:id="81" w:name="Xd3127dabbb551814d087718d40b85244929ca6e"/>
     <w:p>
       <w:pPr>
         <w:pStyle w:val="Heading3"/>
@@ -30865,8 +31364,8 @@
         </w:tc>
       </w:tr>
     </w:tbl>
-    <w:bookmarkEnd w:id="80"/>
-    <w:bookmarkStart w:id="83" w:name="Xa5d620a28da4d36d3a4410e0035cdfeb40b6c47"/>
+    <w:bookmarkEnd w:id="81"/>
+    <w:bookmarkStart w:id="84" w:name="Xa5d620a28da4d36d3a4410e0035cdfeb40b6c47"/>
     <w:p>
       <w:pPr>
         <w:pStyle w:val="Heading3"/>
@@ -30885,7 +31384,7 @@
       <w:r>
         <w:t xml:space="preserve"> </w:t>
       </w:r>
-      <w:hyperlink r:id="rId81">
+      <w:hyperlink r:id="rId82">
         <w:r>
           <w:rPr>
             <w:rStyle w:val="Hyperlink"/>
@@ -30902,7 +31401,7 @@
       <w:r>
         <w:t xml:space="preserve"> </w:t>
       </w:r>
-      <w:hyperlink r:id="rId82">
+      <w:hyperlink r:id="rId83">
         <w:r>
           <w:rPr>
             <w:rStyle w:val="Hyperlink"/>
@@ -31707,9 +32206,9 @@
         </w:pict>
       </w:r>
     </w:p>
-    <w:bookmarkEnd w:id="83"/>
     <w:bookmarkEnd w:id="84"/>
-    <w:bookmarkStart w:id="85" w:name="Xe01c5abbc6e4ee016d304d30e8a24c868a0ea7b"/>
+    <w:bookmarkEnd w:id="85"/>
+    <w:bookmarkStart w:id="86" w:name="Xe01c5abbc6e4ee016d304d30e8a24c868a0ea7b"/>
     <w:p>
       <w:pPr>
         <w:pStyle w:val="Heading2"/>
@@ -33211,8 +33710,8 @@
         </w:pict>
       </w:r>
     </w:p>
-    <w:bookmarkEnd w:id="85"/>
-    <w:bookmarkStart w:id="86" w:name="X619fa5f6e8179904930625f3a8be4545e9a5b1d"/>
+    <w:bookmarkEnd w:id="86"/>
+    <w:bookmarkStart w:id="87" w:name="X619fa5f6e8179904930625f3a8be4545e9a5b1d"/>
     <w:p>
       <w:pPr>
         <w:pStyle w:val="Heading2"/>
@@ -33467,9 +33966,9 @@
         </w:pict>
       </w:r>
     </w:p>
-    <w:bookmarkEnd w:id="86"/>
     <w:bookmarkEnd w:id="87"/>
-    <w:bookmarkStart w:id="145" w:name="part-5-presenter-script"/>
+    <w:bookmarkEnd w:id="88"/>
+    <w:bookmarkStart w:id="146" w:name="part-5-presenter-script"/>
     <w:p>
       <w:pPr>
         <w:pStyle w:val="Heading1"/>
@@ -33486,7 +33985,7 @@
         <w:t xml:space="preserve">Slide-by-slide speaker notes from the workshop slides: timing, what to say, what helpers should watch for, and fallbacks.</w:t>
       </w:r>
     </w:p>
-    <w:bookmarkStart w:id="94" w:name="welcome-and-check-in--000"/>
+    <w:bookmarkStart w:id="95" w:name="welcome-and-check-in--000"/>
     <w:p>
       <w:pPr>
         <w:pStyle w:val="Heading2"/>
@@ -33495,7 +33994,7 @@
         <w:t xml:space="preserve">Welcome and check-in · 0:00</w:t>
       </w:r>
     </w:p>
-    <w:bookmarkStart w:id="88" w:name="X0010a600bda366d4ed8cfff064b54f12afa2de9"/>
+    <w:bookmarkStart w:id="89" w:name="X0010a600bda366d4ed8cfff064b54f12afa2de9"/>
     <w:p>
       <w:pPr>
         <w:pStyle w:val="Heading3"/>
@@ -33552,8 +34051,8 @@
         <w:t xml:space="preserve">Say it early and often: everything today uses a synthetic SMBC APAC lending book. The borrowers, groups and figures are made up, and no SMBC data, systems or customer information is used at any point.</w:t>
       </w:r>
     </w:p>
-    <w:bookmarkEnd w:id="88"/>
-    <w:bookmarkStart w:id="89" w:name="slide-2-get-set-up"/>
+    <w:bookmarkEnd w:id="89"/>
+    <w:bookmarkStart w:id="90" w:name="slide-2-get-set-up"/>
     <w:p>
       <w:pPr>
         <w:pStyle w:val="Heading3"/>
@@ -33646,8 +34145,8 @@
         <w:t xml:space="preserve">Red card up: a helper comes over. Pair anyone who is still blocked with a neighbour so they don't miss Lab 1.</w:t>
       </w:r>
     </w:p>
-    <w:bookmarkEnd w:id="89"/>
-    <w:bookmarkStart w:id="90" w:name="slide-3-todays-agenda"/>
+    <w:bookmarkEnd w:id="90"/>
+    <w:bookmarkStart w:id="91" w:name="slide-3-todays-agenda"/>
     <w:p>
       <w:pPr>
         <w:pStyle w:val="Heading3"/>
@@ -33716,8 +34215,8 @@
         <w:t xml:space="preserve">Times are relative to the start time.</w:t>
       </w:r>
     </w:p>
-    <w:bookmarkEnd w:id="90"/>
-    <w:bookmarkStart w:id="91" w:name="slide-4-the-monday-exposure-report"/>
+    <w:bookmarkEnd w:id="91"/>
+    <w:bookmarkStart w:id="92" w:name="slide-4-the-monday-exposure-report"/>
     <w:p>
       <w:pPr>
         <w:pStyle w:val="Heading3"/>
@@ -33774,8 +34273,8 @@
         <w:t xml:space="preserve">By the end, everyone has built a pipeline, a dashboard and a Genie Agent themselves.</w:t>
       </w:r>
     </w:p>
-    <w:bookmarkEnd w:id="91"/>
-    <w:bookmarkStart w:id="92" w:name="X6ec7a79ce4c1f4295c2ed85c9fe7953127e345d"/>
+    <w:bookmarkEnd w:id="92"/>
+    <w:bookmarkStart w:id="93" w:name="X6ec7a79ce4c1f4295c2ed85c9fe7953127e345d"/>
     <w:p>
       <w:pPr>
         <w:pStyle w:val="Heading3"/>
@@ -33844,8 +34343,8 @@
         <w:t xml:space="preserve">The fiscal year runs April to March. Remember that for Lab 2.</w:t>
       </w:r>
     </w:p>
-    <w:bookmarkEnd w:id="92"/>
-    <w:bookmarkStart w:id="93" w:name="slide-6-your-inbox-this-morning"/>
+    <w:bookmarkEnd w:id="93"/>
+    <w:bookmarkStart w:id="94" w:name="slide-6-your-inbox-this-morning"/>
     <w:p>
       <w:pPr>
         <w:pStyle w:val="Heading3"/>
@@ -33890,9 +34389,9 @@
         <w:t xml:space="preserve">Ask the room: which one would hurt the Credit Committee most? Don't answer yet; we reveal it after Lab 1.</w:t>
       </w:r>
     </w:p>
-    <w:bookmarkEnd w:id="93"/>
     <w:bookmarkEnd w:id="94"/>
-    <w:bookmarkStart w:id="100" w:name="data-engineering-with-lakeflow--025"/>
+    <w:bookmarkEnd w:id="95"/>
+    <w:bookmarkStart w:id="101" w:name="data-engineering-with-lakeflow--025"/>
     <w:p>
       <w:pPr>
         <w:pStyle w:val="Heading2"/>
@@ -33901,7 +34400,7 @@
         <w:t xml:space="preserve">Data engineering with Lakeflow · 0:25</w:t>
       </w:r>
     </w:p>
-    <w:bookmarkStart w:id="95" w:name="slide-7-data-engineering-with-lakeflow"/>
+    <w:bookmarkStart w:id="96" w:name="slide-7-data-engineering-with-lakeflow"/>
     <w:p>
       <w:pPr>
         <w:pStyle w:val="Heading3"/>
@@ -33946,8 +34445,8 @@
         <w:t xml:space="preserve">Slides: the date hook, Lakeflow at a glance, and the trust message. Then the live demo, which is the first few steps of Lab 1.</w:t>
       </w:r>
     </w:p>
-    <w:bookmarkEnd w:id="95"/>
-    <w:bookmarkStart w:id="96" w:name="slide-8-quick-question"/>
+    <w:bookmarkEnd w:id="96"/>
+    <w:bookmarkStart w:id="97" w:name="slide-8-quick-question"/>
     <w:p>
       <w:pPr>
         <w:pStyle w:val="Heading3"/>
@@ -34004,8 +34503,8 @@
         <w:t xml:space="preserve">In this data, parsing only the ISO format silently drops USD 4,789.2m of exposure at 30 September 2026. Lab 1 handles both formats.</w:t>
       </w:r>
     </w:p>
-    <w:bookmarkEnd w:id="96"/>
-    <w:bookmarkStart w:id="97" w:name="slide-9-lakeflow-at-a-glance"/>
+    <w:bookmarkEnd w:id="97"/>
+    <w:bookmarkStart w:id="98" w:name="slide-9-lakeflow-at-a-glance"/>
     <w:p>
       <w:pPr>
         <w:pStyle w:val="Heading3"/>
@@ -34050,8 +34549,8 @@
         <w:t xml:space="preserve">Position it next to what people run today. Nobody has to replace everything at once.</w:t>
       </w:r>
     </w:p>
-    <w:bookmarkEnd w:id="97"/>
-    <w:bookmarkStart w:id="98" w:name="slide-10-no-code-without-shadow-it"/>
+    <w:bookmarkEnd w:id="98"/>
+    <w:bookmarkStart w:id="99" w:name="slide-10-no-code-without-shadow-it"/>
     <w:p>
       <w:pPr>
         <w:pStyle w:val="Heading3"/>
@@ -34120,8 +34619,8 @@
         <w:t xml:space="preserve">The Schedule button turns it into a Lakeflow Job, and Unity Catalog governs every table it reads and writes.</w:t>
       </w:r>
     </w:p>
-    <w:bookmarkEnd w:id="98"/>
-    <w:bookmarkStart w:id="99" w:name="slide-11-live-demo-what-youll-see"/>
+    <w:bookmarkEnd w:id="99"/>
+    <w:bookmarkStart w:id="100" w:name="slide-11-live-demo-what-youll-see"/>
     <w:p>
       <w:pPr>
         <w:pStyle w:val="Heading3"/>
@@ -34254,9 +34753,9 @@
         <w:t xml:space="preserve">The AI output differs from the rehearsal: use it. That's why a person reviews every step.</w:t>
       </w:r>
     </w:p>
-    <w:bookmarkEnd w:id="99"/>
     <w:bookmarkEnd w:id="100"/>
-    <w:bookmarkStart w:id="113" w:name="lab-1--045"/>
+    <w:bookmarkEnd w:id="101"/>
+    <w:bookmarkStart w:id="114" w:name="lab-1--045"/>
     <w:p>
       <w:pPr>
         <w:pStyle w:val="Heading2"/>
@@ -34265,7 +34764,7 @@
         <w:t xml:space="preserve">Lab 1 · 0:45</w:t>
       </w:r>
     </w:p>
-    <w:bookmarkStart w:id="101" w:name="X4b2238570d6b8f98274335b9bb21a628f65872f"/>
+    <w:bookmarkStart w:id="102" w:name="X4b2238570d6b8f98274335b9bb21a628f65872f"/>
     <w:p>
       <w:pPr>
         <w:pStyle w:val="Heading3"/>
@@ -34334,8 +34833,8 @@
         <w:t xml:space="preserve">Helpers: watch for red cards, and for anyone who hasn't added a Source after five minutes.</w:t>
       </w:r>
     </w:p>
-    <w:bookmarkEnd w:id="101"/>
-    <w:bookmarkStart w:id="102" w:name="slide-13-lab-1-at-a-glance"/>
+    <w:bookmarkEnd w:id="102"/>
+    <w:bookmarkStart w:id="103" w:name="slide-13-lab-1-at-a-glance"/>
     <w:p>
       <w:pPr>
         <w:pStyle w:val="Heading3"/>
@@ -34432,8 +34931,8 @@
         <w:t xml:space="preserve">Genie Code prompts unavailable: partner-powered AI features or cross-Geo processing. Tell a facilitator.</w:t>
       </w:r>
     </w:p>
-    <w:bookmarkEnd w:id="102"/>
-    <w:bookmarkStart w:id="103" w:name="X17c3d8f5b1acf57d84db7715baf014bc43c4c6c"/>
+    <w:bookmarkEnd w:id="103"/>
+    <w:bookmarkStart w:id="104" w:name="X17c3d8f5b1acf57d84db7715baf014bc43c4c6c"/>
     <w:p>
       <w:pPr>
         <w:pStyle w:val="Heading3"/>
@@ -34490,8 +34989,8 @@
         <w:t xml:space="preserve">The two date formats are the 03/04/2026 problem from the intro.</w:t>
       </w:r>
     </w:p>
-    <w:bookmarkEnd w:id="103"/>
-    <w:bookmarkStart w:id="104" w:name="Xe75cd0f73f55fb90dc50667fb271e4f4e3087a8"/>
+    <w:bookmarkEnd w:id="104"/>
+    <w:bookmarkStart w:id="105" w:name="Xe75cd0f73f55fb90dc50667fb271e4f4e3087a8"/>
     <w:p>
       <w:pPr>
         <w:pStyle w:val="Heading3"/>
@@ -34560,8 +35059,8 @@
         <w:t xml:space="preserve">If the prompt doesn't respond: partner-powered AI features or cross-Geo processing are off. Add the Prepare actions by hand.</w:t>
       </w:r>
     </w:p>
-    <w:bookmarkEnd w:id="104"/>
-    <w:bookmarkStart w:id="105" w:name="X751c85537caf6858db90cdb1dff01422ea22e8e"/>
+    <w:bookmarkEnd w:id="105"/>
+    <w:bookmarkStart w:id="106" w:name="X751c85537caf6858db90cdb1dff01422ea22e8e"/>
     <w:p>
       <w:pPr>
         <w:pStyle w:val="Heading3"/>
@@ -34618,8 +35117,8 @@
         <w:t xml:space="preserve">Helpers: if someone sees far more than 21, the dates weren't parsed in step 4 (unparsed dates fail the not-null check).</w:t>
       </w:r>
     </w:p>
-    <w:bookmarkEnd w:id="105"/>
-    <w:bookmarkStart w:id="106" w:name="X1314540178eba9401cf3181bd1ea63caa52290a"/>
+    <w:bookmarkEnd w:id="106"/>
+    <w:bookmarkStart w:id="107" w:name="X1314540178eba9401cf3181bd1ea63caa52290a"/>
     <w:p>
       <w:pPr>
         <w:pStyle w:val="Heading3"/>
@@ -34664,8 +35163,8 @@
         <w:t xml:space="preserve">rate_month matters because FX is dated on the last business day of the month. A join on the exact date silently loses six months.</w:t>
       </w:r>
     </w:p>
-    <w:bookmarkEnd w:id="106"/>
-    <w:bookmarkStart w:id="107" w:name="X6c3ae29bb1d419077d70faceb68f893fd1eee12"/>
+    <w:bookmarkEnd w:id="107"/>
+    <w:bookmarkStart w:id="108" w:name="X6c3ae29bb1d419077d70faceb68f893fd1eee12"/>
     <w:p>
       <w:pPr>
         <w:pStyle w:val="Heading3"/>
@@ -34739,8 +35238,8 @@
         <w:t xml:space="preserve">The 15 facilities with no customer record can go to a second quarantine Output.</w:t>
       </w:r>
     </w:p>
-    <w:bookmarkEnd w:id="107"/>
-    <w:bookmarkStart w:id="108" w:name="X100bd1791b7b2d04993a05eb35837bb6e2fb017"/>
+    <w:bookmarkEnd w:id="108"/>
+    <w:bookmarkStart w:id="109" w:name="X100bd1791b7b2d04993a05eb35837bb6e2fb017"/>
     <w:p>
       <w:pPr>
         <w:pStyle w:val="Heading3"/>
@@ -34797,8 +35296,8 @@
         <w:t xml:space="preserve">When the Output exists, the participant's row turns green on the progress board.</w:t>
       </w:r>
     </w:p>
-    <w:bookmarkEnd w:id="108"/>
-    <w:bookmarkStart w:id="109" w:name="slide-20-lab-1-checkpoint"/>
+    <w:bookmarkEnd w:id="109"/>
+    <w:bookmarkStart w:id="110" w:name="slide-20-lab-1-checkpoint"/>
     <w:p>
       <w:pPr>
         <w:pStyle w:val="Heading3"/>
@@ -34867,8 +35366,8 @@
         <w:t xml:space="preserve">1:15: anyone not past step 5 switches to the gold reference tables.</w:t>
       </w:r>
     </w:p>
-    <w:bookmarkEnd w:id="109"/>
-    <w:bookmarkStart w:id="110" w:name="slide-21-lab-1-stretch-pick-any"/>
+    <w:bookmarkEnd w:id="110"/>
+    <w:bookmarkStart w:id="111" w:name="slide-21-lab-1-stretch-pick-any"/>
     <w:p>
       <w:pPr>
         <w:pStyle w:val="Heading3"/>
@@ -34913,8 +35412,8 @@
         <w:t xml:space="preserve">Document it: better metadata means better Genie answers in Lab 2.</w:t>
       </w:r>
     </w:p>
-    <w:bookmarkEnd w:id="110"/>
-    <w:bookmarkStart w:id="111" w:name="slide-22-lab-1-debrief"/>
+    <w:bookmarkEnd w:id="111"/>
+    <w:bookmarkStart w:id="112" w:name="slide-22-lab-1-debrief"/>
     <w:p>
       <w:pPr>
         <w:pStyle w:val="Heading3"/>
@@ -34971,8 +35470,8 @@
         <w:t xml:space="preserve">Every held-back row has a reason attached. That's your data-quality evidence.</w:t>
       </w:r>
     </w:p>
-    <w:bookmarkEnd w:id="111"/>
-    <w:bookmarkStart w:id="112" w:name="slide-23-15-minute-break"/>
+    <w:bookmarkEnd w:id="112"/>
+    <w:bookmarkStart w:id="113" w:name="slide-23-15-minute-break"/>
     <w:p>
       <w:pPr>
         <w:pStyle w:val="Heading3"/>
@@ -35017,9 +35516,9 @@
         <w:t xml:space="preserve">Put the progress board on screen during the break.</w:t>
       </w:r>
     </w:p>
-    <w:bookmarkEnd w:id="112"/>
     <w:bookmarkEnd w:id="113"/>
-    <w:bookmarkStart w:id="119" w:name="self-service-analytics--140"/>
+    <w:bookmarkEnd w:id="114"/>
+    <w:bookmarkStart w:id="120" w:name="self-service-analytics--140"/>
     <w:p>
       <w:pPr>
         <w:pStyle w:val="Heading2"/>
@@ -35028,7 +35527,7 @@
         <w:t xml:space="preserve">Self-service analytics · 1:40</w:t>
       </w:r>
     </w:p>
-    <w:bookmarkStart w:id="114" w:name="slide-24-self-service-analytics"/>
+    <w:bookmarkStart w:id="115" w:name="slide-24-self-service-analytics"/>
     <w:p>
       <w:pPr>
         <w:pStyle w:val="Heading3"/>
@@ -35061,8 +35560,8 @@
         <w:t xml:space="preserve">At most 8 minutes of slides, the rest live.</w:t>
       </w:r>
     </w:p>
-    <w:bookmarkEnd w:id="114"/>
-    <w:bookmarkStart w:id="115" w:name="slide-25-three-tools-one-message"/>
+    <w:bookmarkEnd w:id="115"/>
+    <w:bookmarkStart w:id="116" w:name="slide-25-three-tools-one-message"/>
     <w:p>
       <w:pPr>
         <w:pStyle w:val="Heading3"/>
@@ -35107,8 +35606,8 @@
         <w:t xml:space="preserve">Product names changed in 2026, and the workshop uses the current names: that's what people see in the product and the documentation.</w:t>
       </w:r>
     </w:p>
-    <w:bookmarkEnd w:id="115"/>
-    <w:bookmarkStart w:id="116" w:name="slide-26-curation-is-the-job"/>
+    <w:bookmarkEnd w:id="116"/>
+    <w:bookmarkStart w:id="117" w:name="slide-26-curation-is-the-job"/>
     <w:p>
       <w:pPr>
         <w:pStyle w:val="Heading3"/>
@@ -35153,8 +35652,8 @@
         <w:t xml:space="preserve">Lab 2 shows what happens without a fiscal-year instruction.</w:t>
       </w:r>
     </w:p>
-    <w:bookmarkEnd w:id="116"/>
-    <w:bookmarkStart w:id="117" w:name="slide-27-trust-but-verify"/>
+    <w:bookmarkEnd w:id="117"/>
+    <w:bookmarkStart w:id="118" w:name="slide-27-trust-but-verify"/>
     <w:p>
       <w:pPr>
         <w:pStyle w:val="Heading3"/>
@@ -35211,8 +35710,8 @@
         <w:t xml:space="preserve">Keep the BI point general: coexistence, not replacement.</w:t>
       </w:r>
     </w:p>
-    <w:bookmarkEnd w:id="117"/>
-    <w:bookmarkStart w:id="118" w:name="slide-28-live-demo-what-youll-see"/>
+    <w:bookmarkEnd w:id="118"/>
+    <w:bookmarkStart w:id="119" w:name="slide-28-live-demo-what-youll-see"/>
     <w:p>
       <w:pPr>
         <w:pStyle w:val="Heading3"/>
@@ -35350,9 +35849,9 @@
         <w:t xml:space="preserve">Fallback: if the Consumer-access user or Genie One chat fails, use the agent from Genie Agents in your own session.</w:t>
       </w:r>
     </w:p>
-    <w:bookmarkEnd w:id="118"/>
     <w:bookmarkEnd w:id="119"/>
-    <w:bookmarkStart w:id="131" w:name="lab-2--200"/>
+    <w:bookmarkEnd w:id="120"/>
+    <w:bookmarkStart w:id="132" w:name="lab-2--200"/>
     <w:p>
       <w:pPr>
         <w:pStyle w:val="Heading2"/>
@@ -35361,7 +35860,7 @@
         <w:t xml:space="preserve">Lab 2 · 2:00</w:t>
       </w:r>
     </w:p>
-    <w:bookmarkStart w:id="120" w:name="X1f1db69b59a00b69ceaa33c7ebe736cc7b6a670"/>
+    <w:bookmarkStart w:id="121" w:name="X1f1db69b59a00b69ceaa33c7ebe736cc7b6a670"/>
     <w:p>
       <w:pPr>
         <w:pStyle w:val="Heading3"/>
@@ -35406,8 +35905,8 @@
         <w:t xml:space="preserve">The tables: smbc_workshop.gold.group_exposure and smbc_workshop.gold.facility_exposure.</w:t>
       </w:r>
     </w:p>
-    <w:bookmarkEnd w:id="120"/>
-    <w:bookmarkStart w:id="121" w:name="slide-30-lab-2-at-a-glance"/>
+    <w:bookmarkEnd w:id="121"/>
+    <w:bookmarkStart w:id="122" w:name="slide-30-lab-2-at-a-glance"/>
     <w:p>
       <w:pPr>
         <w:pStyle w:val="Heading3"/>
@@ -35492,8 +35991,8 @@
         <w:t xml:space="preserve">The load on Genie is staggered naturally: everyone starts with the dashboard.</w:t>
       </w:r>
     </w:p>
-    <w:bookmarkEnd w:id="121"/>
-    <w:bookmarkStart w:id="122" w:name="X1c17fc4e57e81d82926ec051b57fee48ef979ec"/>
+    <w:bookmarkEnd w:id="122"/>
+    <w:bookmarkStart w:id="123" w:name="X1c17fc4e57e81d82926ec051b57fee48ef979ec"/>
     <w:p>
       <w:pPr>
         <w:pStyle w:val="Heading3"/>
@@ -35538,8 +36037,8 @@
         <w:t xml:space="preserve">Shortlist 2–3 good dashboards for the Best dashboard vote during the second break.</w:t>
       </w:r>
     </w:p>
-    <w:bookmarkEnd w:id="122"/>
-    <w:bookmarkStart w:id="123" w:name="X93c0fce7c9cde55797d3ff7b4573ac06ac49f3a"/>
+    <w:bookmarkEnd w:id="123"/>
+    <w:bookmarkStart w:id="124" w:name="X93c0fce7c9cde55797d3ff7b4573ac06ac49f3a"/>
     <w:p>
       <w:pPr>
         <w:pStyle w:val="Heading3"/>
@@ -35584,8 +36083,8 @@
         <w:t xml:space="preserve">Holding back A.4 is deliberate: step 4 shows what happens without it.</w:t>
       </w:r>
     </w:p>
-    <w:bookmarkEnd w:id="123"/>
-    <w:bookmarkStart w:id="124" w:name="X925ea6e2594bbbf1be65f72499464e22d347648"/>
+    <w:bookmarkEnd w:id="124"/>
+    <w:bookmarkStart w:id="125" w:name="X925ea6e2594bbbf1be65f72499464e22d347648"/>
     <w:p>
       <w:pPr>
         <w:pStyle w:val="Heading3"/>
@@ -35630,8 +36129,8 @@
         <w:t xml:space="preserve">In testing, the first question put the most utilised group at the top, at 94%.</w:t>
       </w:r>
     </w:p>
-    <w:bookmarkEnd w:id="124"/>
-    <w:bookmarkStart w:id="125" w:name="X81c8b339e9e45dec45065a4f8d6f4ef08a7ea62"/>
+    <w:bookmarkEnd w:id="125"/>
+    <w:bookmarkStart w:id="126" w:name="X81c8b339e9e45dec45065a4f8d6f4ef08a7ea62"/>
     <w:p>
       <w:pPr>
         <w:pStyle w:val="Heading3"/>
@@ -35676,8 +36175,8 @@
         <w:t xml:space="preserve">The instruction (A.4): the fiscal year runs from 1 April to 31 March and is named after the calendar year it starts in. FY2026 = 1 April 2026 to 31 March 2027.</w:t>
       </w:r>
     </w:p>
-    <w:bookmarkEnd w:id="125"/>
-    <w:bookmarkStart w:id="126" w:name="slide-35-lab-2-checkpoint"/>
+    <w:bookmarkEnd w:id="126"/>
+    <w:bookmarkStart w:id="127" w:name="slide-35-lab-2-checkpoint"/>
     <w:p>
       <w:pPr>
         <w:pStyle w:val="Heading3"/>
@@ -35722,8 +36221,8 @@
         <w:t xml:space="preserve">If an answer looks wrong, check the as_of_date in the SQL: FY2026 H1 ends on 30 September 2026.</w:t>
       </w:r>
     </w:p>
-    <w:bookmarkEnd w:id="126"/>
-    <w:bookmarkStart w:id="127" w:name="slide-36-lab-2-stretch-pick-any"/>
+    <w:bookmarkEnd w:id="127"/>
+    <w:bookmarkStart w:id="128" w:name="slide-36-lab-2-stretch-pick-any"/>
     <w:p>
       <w:pPr>
         <w:pStyle w:val="Heading3"/>
@@ -35780,8 +36279,8 @@
         <w:t xml:space="preserve">In Japanese: answers may sometimes come back in English.</w:t>
       </w:r>
     </w:p>
-    <w:bookmarkEnd w:id="127"/>
-    <w:bookmarkStart w:id="128" w:name="X3844b1df921221e4178b1e0dc04ae5221cb5fd7"/>
+    <w:bookmarkEnd w:id="128"/>
+    <w:bookmarkStart w:id="129" w:name="X3844b1df921221e4178b1e0dc04ae5221cb5fd7"/>
     <w:p>
       <w:pPr>
         <w:pStyle w:val="Heading3"/>
@@ -35838,8 +36337,8 @@
         <w:t xml:space="preserve">The finding: at the end of calendar H1 (30 June) no group was above 90%; at the end of FY2026 H1, Orchid Group was at 94%. It's invisible one subsidiary at a time.</w:t>
       </w:r>
     </w:p>
-    <w:bookmarkEnd w:id="128"/>
-    <w:bookmarkStart w:id="129" w:name="Xac96626fb8cbd7ee451eacbb53f594e81eb513b"/>
+    <w:bookmarkEnd w:id="129"/>
+    <w:bookmarkStart w:id="130" w:name="Xac96626fb8cbd7ee451eacbb53f594e81eb513b"/>
     <w:p>
       <w:pPr>
         <w:pStyle w:val="Heading3"/>
@@ -35896,8 +36395,8 @@
         <w:t xml:space="preserve">In testing, the facilitator saw all 12 branches; the attendee saw SIN only, with names masked.</w:t>
       </w:r>
     </w:p>
-    <w:bookmarkEnd w:id="129"/>
-    <w:bookmarkStart w:id="130" w:name="slide-39-15-minute-break"/>
+    <w:bookmarkEnd w:id="130"/>
+    <w:bookmarkStart w:id="131" w:name="slide-39-15-minute-break"/>
     <w:p>
       <w:pPr>
         <w:pStyle w:val="Heading3"/>
@@ -35942,9 +36441,9 @@
         <w:t xml:space="preserve">Progress board on screen: read out how many people found the group.</w:t>
       </w:r>
     </w:p>
-    <w:bookmarkEnd w:id="130"/>
     <w:bookmarkEnd w:id="131"/>
-    <w:bookmarkStart w:id="138" w:name="genie-code--255"/>
+    <w:bookmarkEnd w:id="132"/>
+    <w:bookmarkStart w:id="139" w:name="genie-code--255"/>
     <w:p>
       <w:pPr>
         <w:pStyle w:val="Heading2"/>
@@ -35953,7 +36452,7 @@
         <w:t xml:space="preserve">Genie Code · 2:55</w:t>
       </w:r>
     </w:p>
-    <w:bookmarkStart w:id="132" w:name="X08a40729537dc60ea912bc97cdf9abda17fc3dd"/>
+    <w:bookmarkStart w:id="133" w:name="X08a40729537dc60ea912bc97cdf9abda17fc3dd"/>
     <w:p>
       <w:pPr>
         <w:pStyle w:val="Heading3"/>
@@ -35998,8 +36497,8 @@
         <w:t xml:space="preserve">Many people already use Genie Code, so skip the autocomplete basics: lead with agent mode, the legacy-SQL conversion and the approval settings.</w:t>
       </w:r>
     </w:p>
-    <w:bookmarkEnd w:id="132"/>
-    <w:bookmarkStart w:id="133" w:name="slide-41-genie-code--1-explore"/>
+    <w:bookmarkEnd w:id="133"/>
+    <w:bookmarkStart w:id="134" w:name="slide-41-genie-code--1-explore"/>
     <w:p>
       <w:pPr>
         <w:pStyle w:val="Heading3"/>
@@ -36044,8 +36543,8 @@
         <w:t xml:space="preserve">Fallback: rehearse these exact prompts in the dry run and keep screenshots. If the output varies on the day, say so: that's why the human stays in the loop.</w:t>
       </w:r>
     </w:p>
-    <w:bookmarkEnd w:id="133"/>
-    <w:bookmarkStart w:id="134" w:name="slide-42-genie-code--2-generate"/>
+    <w:bookmarkEnd w:id="134"/>
+    <w:bookmarkStart w:id="135" w:name="slide-42-genie-code--2-generate"/>
     <w:p>
       <w:pPr>
         <w:pStyle w:val="Heading3"/>
@@ -36090,8 +36589,8 @@
         <w:t xml:space="preserve">Let it run; talk through the plan it shows while it works.</w:t>
       </w:r>
     </w:p>
-    <w:bookmarkEnd w:id="134"/>
-    <w:bookmarkStart w:id="135" w:name="X84781953f5c0511e75456a28caf4b52bd55f198"/>
+    <w:bookmarkEnd w:id="135"/>
+    <w:bookmarkStart w:id="136" w:name="X84781953f5c0511e75456a28caf4b52bd55f198"/>
     <w:p>
       <w:pPr>
         <w:pStyle w:val="Heading3"/>
@@ -36148,8 +36647,8 @@
         <w:t xml:space="preserve">For hundreds of stored procedures, Lakebridge (Databricks' migration toolkit) is the at-scale route.</w:t>
       </w:r>
     </w:p>
-    <w:bookmarkEnd w:id="135"/>
-    <w:bookmarkStart w:id="136" w:name="slide-44-you-stay-in-control"/>
+    <w:bookmarkEnd w:id="136"/>
+    <w:bookmarkStart w:id="137" w:name="slide-44-you-stay-in-control"/>
     <w:p>
       <w:pPr>
         <w:pStyle w:val="Heading3"/>
@@ -36206,8 +36705,8 @@
         <w:t xml:space="preserve">Roll back a change with the notebook's revision history.</w:t>
       </w:r>
     </w:p>
-    <w:bookmarkEnd w:id="136"/>
-    <w:bookmarkStart w:id="137" w:name="X5cf55dd12d448000ca9758895345e91b20013a2"/>
+    <w:bookmarkEnd w:id="137"/>
+    <w:bookmarkStart w:id="138" w:name="X5cf55dd12d448000ca9758895345e91b20013a2"/>
     <w:p>
       <w:pPr>
         <w:pStyle w:val="Heading3"/>
@@ -36252,9 +36751,9 @@
         <w:t xml:space="preserve">Measured on April balances instead, FX is 19%, so say which method you used.</w:t>
       </w:r>
     </w:p>
-    <w:bookmarkEnd w:id="137"/>
     <w:bookmarkEnd w:id="138"/>
-    <w:bookmarkStart w:id="144" w:name="quiz-and-close--310"/>
+    <w:bookmarkEnd w:id="139"/>
+    <w:bookmarkStart w:id="145" w:name="quiz-and-close--310"/>
     <w:p>
       <w:pPr>
         <w:pStyle w:val="Heading2"/>
@@ -36263,7 +36762,7 @@
         <w:t xml:space="preserve">Quiz and close · 3:10</w:t>
       </w:r>
     </w:p>
-    <w:bookmarkStart w:id="139" w:name="slide-46-quiz-join-on-your-phone"/>
+    <w:bookmarkStart w:id="140" w:name="slide-46-quiz-join-on-your-phone"/>
     <w:p>
       <w:pPr>
         <w:pStyle w:val="Heading3"/>
@@ -36320,8 +36819,8 @@
         <w:t xml:space="preserve">If Slido is blocked on the SMBC network: phones on mobile data, or read the questions out and take answers by show of hands.</w:t>
       </w:r>
     </w:p>
-    <w:bookmarkEnd w:id="139"/>
-    <w:bookmarkStart w:id="140" w:name="slide-47-what-you-found-today"/>
+    <w:bookmarkEnd w:id="140"/>
+    <w:bookmarkStart w:id="141" w:name="slide-47-what-you-found-today"/>
     <w:p>
       <w:pPr>
         <w:pStyle w:val="Heading3"/>
@@ -36366,8 +36865,8 @@
         <w:t xml:space="preserve">A second signal to follow up: trade-finance arrears in Ho Chi Minh City crept from 1.1% to 9.6% of exposure, against 0.4% across the whole book.</w:t>
       </w:r>
     </w:p>
-    <w:bookmarkEnd w:id="140"/>
-    <w:bookmarkStart w:id="141" w:name="slide-48-keep-learning"/>
+    <w:bookmarkEnd w:id="141"/>
+    <w:bookmarkStart w:id="142" w:name="slide-48-keep-learning"/>
     <w:p>
       <w:pPr>
         <w:pStyle w:val="Heading3"/>
@@ -36412,8 +36911,8 @@
         <w:t xml:space="preserve">Add a QR code to databricks.com/learn/training when you generate the deck.</w:t>
       </w:r>
     </w:p>
-    <w:bookmarkEnd w:id="141"/>
-    <w:bookmarkStart w:id="142" w:name="X5e5547bbb747112bea4653c240605f567b5bd8f"/>
+    <w:bookmarkEnd w:id="142"/>
+    <w:bookmarkStart w:id="143" w:name="X5e5547bbb747112bea4653c240605f567b5bd8f"/>
     <w:p>
       <w:pPr>
         <w:pStyle w:val="Heading3"/>
@@ -36446,8 +36945,8 @@
         <w:t xml:space="preserve">A proposal: agree the wording with SMBC before the day.</w:t>
       </w:r>
     </w:p>
-    <w:bookmarkEnd w:id="142"/>
-    <w:bookmarkStart w:id="143" w:name="slide-50-thank-you"/>
+    <w:bookmarkEnd w:id="143"/>
+    <w:bookmarkStart w:id="144" w:name="slide-50-thank-you"/>
     <w:p>
       <w:pPr>
         <w:pStyle w:val="Heading3"/>
@@ -36504,9 +37003,9 @@
         <w:t xml:space="preserve">Thank the SMBC organisers and the helpers.</w:t>
       </w:r>
     </w:p>
-    <w:bookmarkEnd w:id="143"/>
     <w:bookmarkEnd w:id="144"/>
     <w:bookmarkEnd w:id="145"/>
+    <w:bookmarkEnd w:id="146"/>
     <w:sectPr>
       <w:footnotePr>
         <w:numRestart w:val="eachSect"/>

</xml_diff>

<commit_message>
Add what the setup creates to the walkthrough and fix its cross-references
- Part 1 of the walkthrough gains the README's asset table, and points to
  Part 3 for the full story instead of the guide's section 6.
- Part 2 refers to its own section numbers (2.8, 2.11, ...) instead of the
  run of show's, including its links to the quiz and the polls.
- Guide 3.6 no longer says the catalog is tagged workshop_date: the setup
  now removes that tag. The guide and requirements handouts are rebuilt.

Co-authored-by: Isaac <no-reply@databricks.com>
</commit_message>
<xml_diff>
--- a/facilitator/dist/Workshop_Walkthrough.docx
+++ b/facilitator/dist/Workshop_Walkthrough.docx
@@ -41,7 +41,7 @@
         <w:pStyle w:val="BodyText"/>
       </w:pPr>
       <w:r>
-        <w:t xml:space="preserve">This document walks through the whole workshop, from setting up the workspace to the follow-up email. It's assembled from the workshop's source materials (the workshop guide, the run of show, the attendee workbook and the presenter notes), so it matches them.</w:t>
+        <w:t xml:space="preserve">This document walks through the whole workshop, from setting up the workspace to the follow-up email. It's assembled from the workshop's source materials (the workshop guide, the README, the run of show, the attendee workbook and the presenter notes), so it matches them.</w:t>
       </w:r>
     </w:p>
     <w:tbl>
@@ -189,7 +189,7 @@
               <w:pStyle w:val="Compact"/>
             </w:pPr>
             <w:r>
-              <w:t xml:space="preserve">The workshop at a glance: goals, agenda, storyline</w:t>
+              <w:t xml:space="preserve">The workshop at a glance: goals, agenda, storyline, what the setup creates</w:t>
             </w:r>
           </w:p>
         </w:tc>
@@ -615,6 +615,23 @@
       <w:pPr>
         <w:pStyle w:val="Compact"/>
         <w:numPr>
+          <w:ilvl w:val="1"/>
+          <w:numId w:val="1002"/>
+        </w:numPr>
+      </w:pPr>
+      <w:hyperlink w:anchor="X90f35153956b9ced73b03b2d904028e67edfc8e">
+        <w:r>
+          <w:rPr>
+            <w:rStyle w:val="Hyperlink"/>
+          </w:rPr>
+          <w:t xml:space="preserve">1.3 What the setup creates</w:t>
+        </w:r>
+      </w:hyperlink>
+    </w:p>
+    <w:p>
+      <w:pPr>
+        <w:pStyle w:val="Compact"/>
+        <w:numPr>
           <w:ilvl w:val="0"/>
           <w:numId w:val="1001"/>
         </w:numPr>
@@ -1215,7 +1232,7 @@
       </w:hyperlink>
     </w:p>
     <w:bookmarkEnd w:id="9"/>
-    <w:bookmarkStart w:id="12" w:name="part-1-the-workshop-at-a-glance"/>
+    <w:bookmarkStart w:id="13" w:name="part-1-the-workshop-at-a-glance"/>
     <w:p>
       <w:pPr>
         <w:pStyle w:val="Heading1"/>
@@ -1726,7 +1743,7 @@
         <w:t xml:space="preserve"> </w:t>
       </w:r>
       <w:r>
-        <w:t xml:space="preserve">It's 8am on Monday at the APAC hub. The Credit Committee wants the top counterparty-group exposures across all booking branches, in USD and JPY, by 10am. Today that means four system extracts, a spreadsheet of limits, and days of reconciliation. In Lab 1 participants automate it, in Lab 2 they make it self-service, and in the Genie Code segment they investigate what they found. Section 6 tells the full story, as participants read it.</w:t>
+        <w:t xml:space="preserve">It's 8am on Monday at the APAC hub. The Credit Committee wants the top counterparty-group exposures across all booking branches, in USD and JPY, by 10am. Today that means four system extracts, a spreadsheet of limits, and days of reconciliation. In Lab 1 participants automate it, in Lab 2 they make it self-service, and in the Genie Code segment they investigate what they found. Section 1 of Part 3 tells the full story, as participants read it.</w:t>
       </w:r>
     </w:p>
     <w:p>
@@ -2841,8 +2858,751 @@
       </w:r>
     </w:p>
     <w:bookmarkEnd w:id="11"/>
+    <w:bookmarkStart w:id="12" w:name="X90f35153956b9ced73b03b2d904028e67edfc8e"/>
+    <w:p>
+      <w:pPr>
+        <w:pStyle w:val="Heading2"/>
+      </w:pPr>
+      <w:r>
+        <w:t xml:space="preserve">1.3 What the setup creates</w:t>
+      </w:r>
+    </w:p>
+    <w:p>
+      <w:pPr>
+        <w:pStyle w:val="FirstParagraph"/>
+      </w:pPr>
+      <w:r>
+        <w:rPr>
+          <w:rStyle w:val="VerbatimChar"/>
+        </w:rPr>
+        <w:t xml:space="preserve">setup/00_master_setup</w:t>
+      </w:r>
+      <w:r>
+        <w:t xml:space="preserve"> </w:t>
+      </w:r>
+      <w:r>
+        <w:t xml:space="preserve">creates these in the workshop workspace; section 4 of Part 4 has the steps.</w:t>
+      </w:r>
+    </w:p>
+    <w:tbl>
+      <w:tblPr>
+        <w:tblStyle w:val="Table"/>
+        <w:tblW w:type="pct" w:w="5000"/>
+        <w:tblLayout w:type="fixed"/>
+        <w:tblLook w:firstRow="1" w:lastRow="0" w:firstColumn="0" w:lastColumn="0" w:noHBand="0" w:noVBand="0" w:val="0020"/>
+      </w:tblPr>
+      <w:tblGrid>
+        <w:gridCol w:w="2953"/>
+        <w:gridCol w:w="3343"/>
+        <w:gridCol w:w="3343"/>
+      </w:tblGrid>
+      <w:tr>
+        <w:trPr>
+          <w:tblHeader w:val="on"/>
+        </w:trPr>
+        <w:tc>
+          <w:tcPr>
+            <w:tcW w:w="2953" w:type="dxa"/>
+            <w:tcBorders>
+              <w:top w:val="single" w:sz="4" w:space="0" w:color="BFBFBF"/>
+              <w:left w:val="single" w:sz="4" w:space="0" w:color="BFBFBF"/>
+              <w:bottom w:val="single" w:sz="4" w:space="0" w:color="BFBFBF"/>
+              <w:right w:val="single" w:sz="4" w:space="0" w:color="BFBFBF"/>
+            </w:tcBorders>
+            <w:shd w:val="clear" w:color="auto" w:fill="EEEDE9"/>
+          </w:tcPr>
+          <w:p>
+            <w:pPr>
+              <w:pStyle w:val="Compact"/>
+            </w:pPr>
+            <w:r>
+              <w:rPr>
+                <w:b/>
+              </w:rPr>
+              <w:t xml:space="preserve">Asset</w:t>
+            </w:r>
+          </w:p>
+        </w:tc>
+        <w:tc>
+          <w:tcPr>
+            <w:tcW w:w="3343" w:type="dxa"/>
+            <w:tcBorders>
+              <w:top w:val="single" w:sz="4" w:space="0" w:color="BFBFBF"/>
+              <w:left w:val="single" w:sz="4" w:space="0" w:color="BFBFBF"/>
+              <w:bottom w:val="single" w:sz="4" w:space="0" w:color="BFBFBF"/>
+              <w:right w:val="single" w:sz="4" w:space="0" w:color="BFBFBF"/>
+            </w:tcBorders>
+            <w:shd w:val="clear" w:color="auto" w:fill="EEEDE9"/>
+          </w:tcPr>
+          <w:p>
+            <w:pPr>
+              <w:pStyle w:val="Compact"/>
+            </w:pPr>
+            <w:r>
+              <w:rPr>
+                <w:b/>
+              </w:rPr>
+              <w:t xml:space="preserve">What it is</w:t>
+            </w:r>
+          </w:p>
+        </w:tc>
+        <w:tc>
+          <w:tcPr>
+            <w:tcW w:w="3343" w:type="dxa"/>
+            <w:tcBorders>
+              <w:top w:val="single" w:sz="4" w:space="0" w:color="BFBFBF"/>
+              <w:left w:val="single" w:sz="4" w:space="0" w:color="BFBFBF"/>
+              <w:bottom w:val="single" w:sz="4" w:space="0" w:color="BFBFBF"/>
+              <w:right w:val="single" w:sz="4" w:space="0" w:color="BFBFBF"/>
+            </w:tcBorders>
+            <w:shd w:val="clear" w:color="auto" w:fill="EEEDE9"/>
+          </w:tcPr>
+          <w:p>
+            <w:pPr>
+              <w:pStyle w:val="Compact"/>
+            </w:pPr>
+            <w:r>
+              <w:rPr>
+                <w:b/>
+              </w:rPr>
+              <w:t xml:space="preserve">Its part in the story</w:t>
+            </w:r>
+          </w:p>
+        </w:tc>
+      </w:tr>
+      <w:tr>
+        <w:tc>
+          <w:tcPr>
+            <w:tcW w:w="2953" w:type="dxa"/>
+            <w:tcBorders>
+              <w:top w:val="single" w:sz="4" w:space="0" w:color="BFBFBF"/>
+              <w:left w:val="single" w:sz="4" w:space="0" w:color="BFBFBF"/>
+              <w:bottom w:val="single" w:sz="4" w:space="0" w:color="BFBFBF"/>
+              <w:right w:val="single" w:sz="4" w:space="0" w:color="BFBFBF"/>
+            </w:tcBorders>
+          </w:tcPr>
+          <w:p>
+            <w:pPr>
+              <w:pStyle w:val="Compact"/>
+            </w:pPr>
+            <w:r>
+              <w:t xml:space="preserve">Volume</w:t>
+            </w:r>
+            <w:r>
+              <w:t xml:space="preserve"> </w:t>
+            </w:r>
+            <w:r>
+              <w:rPr>
+                <w:rStyle w:val="VerbatimChar"/>
+              </w:rPr>
+              <w:t xml:space="preserve">smbc_workshop.raw.landing</w:t>
+            </w:r>
+          </w:p>
+        </w:tc>
+        <w:tc>
+          <w:tcPr>
+            <w:tcW w:w="3343" w:type="dxa"/>
+            <w:tcBorders>
+              <w:top w:val="single" w:sz="4" w:space="0" w:color="BFBFBF"/>
+              <w:left w:val="single" w:sz="4" w:space="0" w:color="BFBFBF"/>
+              <w:bottom w:val="single" w:sz="4" w:space="0" w:color="BFBFBF"/>
+              <w:right w:val="single" w:sz="4" w:space="0" w:color="BFBFBF"/>
+            </w:tcBorders>
+          </w:tcPr>
+          <w:p>
+            <w:pPr>
+              <w:pStyle w:val="Compact"/>
+            </w:pPr>
+            <w:r>
+              <w:t xml:space="preserve">The four system extracts and the limits spreadsheet as the source systems deliver them, plus an optional ESG file</w:t>
+            </w:r>
+          </w:p>
+        </w:tc>
+        <w:tc>
+          <w:tcPr>
+            <w:tcW w:w="3343" w:type="dxa"/>
+            <w:tcBorders>
+              <w:top w:val="single" w:sz="4" w:space="0" w:color="BFBFBF"/>
+              <w:left w:val="single" w:sz="4" w:space="0" w:color="BFBFBF"/>
+              <w:bottom w:val="single" w:sz="4" w:space="0" w:color="BFBFBF"/>
+              <w:right w:val="single" w:sz="4" w:space="0" w:color="BFBFBF"/>
+            </w:tcBorders>
+          </w:tcPr>
+          <w:p>
+            <w:pPr>
+              <w:pStyle w:val="Compact"/>
+            </w:pPr>
+            <w:r>
+              <w:t xml:space="preserve">Monday morning's inbox</w:t>
+            </w:r>
+          </w:p>
+        </w:tc>
+      </w:tr>
+      <w:tr>
+        <w:tc>
+          <w:tcPr>
+            <w:tcW w:w="2953" w:type="dxa"/>
+            <w:tcBorders>
+              <w:top w:val="single" w:sz="4" w:space="0" w:color="BFBFBF"/>
+              <w:left w:val="single" w:sz="4" w:space="0" w:color="BFBFBF"/>
+              <w:bottom w:val="single" w:sz="4" w:space="0" w:color="BFBFBF"/>
+              <w:right w:val="single" w:sz="4" w:space="0" w:color="BFBFBF"/>
+            </w:tcBorders>
+          </w:tcPr>
+          <w:p>
+            <w:pPr>
+              <w:pStyle w:val="Compact"/>
+            </w:pPr>
+            <w:r>
+              <w:t xml:space="preserve">Schemas</w:t>
+            </w:r>
+            <w:r>
+              <w:t xml:space="preserve"> </w:t>
+            </w:r>
+            <w:r>
+              <w:rPr>
+                <w:rStyle w:val="VerbatimChar"/>
+              </w:rPr>
+              <w:t xml:space="preserve">bronze</w:t>
+            </w:r>
+            <w:r>
+              <w:t xml:space="preserve">,</w:t>
+            </w:r>
+            <w:r>
+              <w:t xml:space="preserve"> </w:t>
+            </w:r>
+            <w:r>
+              <w:rPr>
+                <w:rStyle w:val="VerbatimChar"/>
+              </w:rPr>
+              <w:t xml:space="preserve">silver</w:t>
+            </w:r>
+            <w:r>
+              <w:t xml:space="preserve"> </w:t>
+            </w:r>
+            <w:r>
+              <w:t xml:space="preserve">and</w:t>
+            </w:r>
+            <w:r>
+              <w:t xml:space="preserve"> </w:t>
+            </w:r>
+            <w:r>
+              <w:rPr>
+                <w:rStyle w:val="VerbatimChar"/>
+              </w:rPr>
+              <w:t xml:space="preserve">gold</w:t>
+            </w:r>
+          </w:p>
+        </w:tc>
+        <w:tc>
+          <w:tcPr>
+            <w:tcW w:w="3343" w:type="dxa"/>
+            <w:tcBorders>
+              <w:top w:val="single" w:sz="4" w:space="0" w:color="BFBFBF"/>
+              <w:left w:val="single" w:sz="4" w:space="0" w:color="BFBFBF"/>
+              <w:bottom w:val="single" w:sz="4" w:space="0" w:color="BFBFBF"/>
+              <w:right w:val="single" w:sz="4" w:space="0" w:color="BFBFBF"/>
+            </w:tcBorders>
+          </w:tcPr>
+          <w:p>
+            <w:pPr>
+              <w:pStyle w:val="Compact"/>
+            </w:pPr>
+            <w:r>
+              <w:t xml:space="preserve">The extracts as tables; the cleaned data, with rejected rows in</w:t>
+            </w:r>
+            <w:r>
+              <w:t xml:space="preserve"> </w:t>
+            </w:r>
+            <w:r>
+              <w:rPr>
+                <w:rStyle w:val="VerbatimChar"/>
+              </w:rPr>
+              <w:t xml:space="preserve">silver.quarantine_facilities</w:t>
+            </w:r>
+            <w:r>
+              <w:t xml:space="preserve">; and</w:t>
+            </w:r>
+            <w:r>
+              <w:t xml:space="preserve"> </w:t>
+            </w:r>
+            <w:r>
+              <w:rPr>
+                <w:rStyle w:val="VerbatimChar"/>
+              </w:rPr>
+              <w:t xml:space="preserve">gold.group_exposure</w:t>
+            </w:r>
+            <w:r>
+              <w:t xml:space="preserve"> </w:t>
+            </w:r>
+            <w:r>
+              <w:t xml:space="preserve">and</w:t>
+            </w:r>
+            <w:r>
+              <w:t xml:space="preserve"> </w:t>
+            </w:r>
+            <w:r>
+              <w:rPr>
+                <w:rStyle w:val="VerbatimChar"/>
+              </w:rPr>
+              <w:t xml:space="preserve">gold.facility_exposure</w:t>
+            </w:r>
+          </w:p>
+        </w:tc>
+        <w:tc>
+          <w:tcPr>
+            <w:tcW w:w="3343" w:type="dxa"/>
+            <w:tcBorders>
+              <w:top w:val="single" w:sz="4" w:space="0" w:color="BFBFBF"/>
+              <w:left w:val="single" w:sz="4" w:space="0" w:color="BFBFBF"/>
+              <w:bottom w:val="single" w:sz="4" w:space="0" w:color="BFBFBF"/>
+              <w:right w:val="single" w:sz="4" w:space="0" w:color="BFBFBF"/>
+            </w:tcBorders>
+          </w:tcPr>
+          <w:p>
+            <w:pPr>
+              <w:pStyle w:val="Compact"/>
+            </w:pPr>
+            <w:r>
+              <w:t xml:space="preserve">The trusted tables: Lab 1's reference answer, and the source for everything below</w:t>
+            </w:r>
+          </w:p>
+        </w:tc>
+      </w:tr>
+      <w:tr>
+        <w:tc>
+          <w:tcPr>
+            <w:tcW w:w="2953" w:type="dxa"/>
+            <w:tcBorders>
+              <w:top w:val="single" w:sz="4" w:space="0" w:color="BFBFBF"/>
+              <w:left w:val="single" w:sz="4" w:space="0" w:color="BFBFBF"/>
+              <w:bottom w:val="single" w:sz="4" w:space="0" w:color="BFBFBF"/>
+              <w:right w:val="single" w:sz="4" w:space="0" w:color="BFBFBF"/>
+            </w:tcBorders>
+          </w:tcPr>
+          <w:p>
+            <w:pPr>
+              <w:pStyle w:val="Compact"/>
+            </w:pPr>
+            <w:r>
+              <w:t xml:space="preserve">Dashboard</w:t>
+            </w:r>
+            <w:r>
+              <w:t xml:space="preserve"> </w:t>
+            </w:r>
+            <w:r>
+              <w:rPr>
+                <w:b/>
+                <w:bCs/>
+              </w:rPr>
+              <w:t xml:space="preserve">Credit Committee: APAC exposure (reference)</w:t>
+            </w:r>
+          </w:p>
+        </w:tc>
+        <w:tc>
+          <w:tcPr>
+            <w:tcW w:w="3343" w:type="dxa"/>
+            <w:tcBorders>
+              <w:top w:val="single" w:sz="4" w:space="0" w:color="BFBFBF"/>
+              <w:left w:val="single" w:sz="4" w:space="0" w:color="BFBFBF"/>
+              <w:bottom w:val="single" w:sz="4" w:space="0" w:color="BFBFBF"/>
+              <w:right w:val="single" w:sz="4" w:space="0" w:color="BFBFBF"/>
+            </w:tcBorders>
+          </w:tcPr>
+          <w:p>
+            <w:pPr>
+              <w:pStyle w:val="Compact"/>
+            </w:pPr>
+            <w:r>
+              <w:t xml:space="preserve">Total exposure, the groups above 80% and 90% of their limits, the top 10 groups, the monthly trend, exposure by country, the five largest groups' utilisation, a watchlist and trade-finance arrears</w:t>
+            </w:r>
+          </w:p>
+        </w:tc>
+        <w:tc>
+          <w:tcPr>
+            <w:tcW w:w="3343" w:type="dxa"/>
+            <w:tcBorders>
+              <w:top w:val="single" w:sz="4" w:space="0" w:color="BFBFBF"/>
+              <w:left w:val="single" w:sz="4" w:space="0" w:color="BFBFBF"/>
+              <w:bottom w:val="single" w:sz="4" w:space="0" w:color="BFBFBF"/>
+              <w:right w:val="single" w:sz="4" w:space="0" w:color="BFBFBF"/>
+            </w:tcBorders>
+          </w:tcPr>
+          <w:p>
+            <w:pPr>
+              <w:pStyle w:val="Compact"/>
+            </w:pPr>
+            <w:r>
+              <w:t xml:space="preserve">The Monday report, on one page</w:t>
+            </w:r>
+          </w:p>
+        </w:tc>
+      </w:tr>
+      <w:tr>
+        <w:tc>
+          <w:tcPr>
+            <w:tcW w:w="2953" w:type="dxa"/>
+            <w:tcBorders>
+              <w:top w:val="single" w:sz="4" w:space="0" w:color="BFBFBF"/>
+              <w:left w:val="single" w:sz="4" w:space="0" w:color="BFBFBF"/>
+              <w:bottom w:val="single" w:sz="4" w:space="0" w:color="BFBFBF"/>
+              <w:right w:val="single" w:sz="4" w:space="0" w:color="BFBFBF"/>
+            </w:tcBorders>
+          </w:tcPr>
+          <w:p>
+            <w:pPr>
+              <w:pStyle w:val="Compact"/>
+            </w:pPr>
+            <w:r>
+              <w:t xml:space="preserve">Genie Agent</w:t>
+            </w:r>
+            <w:r>
+              <w:t xml:space="preserve"> </w:t>
+            </w:r>
+            <w:r>
+              <w:rPr>
+                <w:b/>
+                <w:bCs/>
+              </w:rPr>
+              <w:t xml:space="preserve">Credit Risk (reference)</w:t>
+            </w:r>
+          </w:p>
+        </w:tc>
+        <w:tc>
+          <w:tcPr>
+            <w:tcW w:w="3343" w:type="dxa"/>
+            <w:tcBorders>
+              <w:top w:val="single" w:sz="4" w:space="0" w:color="BFBFBF"/>
+              <w:left w:val="single" w:sz="4" w:space="0" w:color="BFBFBF"/>
+              <w:bottom w:val="single" w:sz="4" w:space="0" w:color="BFBFBF"/>
+              <w:right w:val="single" w:sz="4" w:space="0" w:color="BFBFBF"/>
+            </w:tcBorders>
+          </w:tcPr>
+          <w:p>
+            <w:pPr>
+              <w:pStyle w:val="Compact"/>
+            </w:pPr>
+            <w:r>
+              <w:t xml:space="preserve">Plain-language questions over the gold tables, with the bank's definitions and fiscal-year rules, example SQL and benchmark questions</w:t>
+            </w:r>
+          </w:p>
+        </w:tc>
+        <w:tc>
+          <w:tcPr>
+            <w:tcW w:w="3343" w:type="dxa"/>
+            <w:tcBorders>
+              <w:top w:val="single" w:sz="4" w:space="0" w:color="BFBFBF"/>
+              <w:left w:val="single" w:sz="4" w:space="0" w:color="BFBFBF"/>
+              <w:bottom w:val="single" w:sz="4" w:space="0" w:color="BFBFBF"/>
+              <w:right w:val="single" w:sz="4" w:space="0" w:color="BFBFBF"/>
+            </w:tcBorders>
+          </w:tcPr>
+          <w:p>
+            <w:pPr>
+              <w:pStyle w:val="Compact"/>
+            </w:pPr>
+            <w:r>
+              <w:t xml:space="preserve">The questions nobody has asked yet</w:t>
+            </w:r>
+          </w:p>
+        </w:tc>
+      </w:tr>
+      <w:tr>
+        <w:tc>
+          <w:tcPr>
+            <w:tcW w:w="2953" w:type="dxa"/>
+            <w:tcBorders>
+              <w:top w:val="single" w:sz="4" w:space="0" w:color="BFBFBF"/>
+              <w:left w:val="single" w:sz="4" w:space="0" w:color="BFBFBF"/>
+              <w:bottom w:val="single" w:sz="4" w:space="0" w:color="BFBFBF"/>
+              <w:right w:val="single" w:sz="4" w:space="0" w:color="BFBFBF"/>
+            </w:tcBorders>
+          </w:tcPr>
+          <w:p>
+            <w:pPr>
+              <w:pStyle w:val="Compact"/>
+            </w:pPr>
+            <w:r>
+              <w:t xml:space="preserve">Genie Agent</w:t>
+            </w:r>
+            <w:r>
+              <w:t xml:space="preserve"> </w:t>
+            </w:r>
+            <w:r>
+              <w:rPr>
+                <w:b/>
+                <w:bCs/>
+              </w:rPr>
+              <w:t xml:space="preserve">Credit Risk (secured demo)</w:t>
+            </w:r>
+          </w:p>
+        </w:tc>
+        <w:tc>
+          <w:tcPr>
+            <w:tcW w:w="3343" w:type="dxa"/>
+            <w:tcBorders>
+              <w:top w:val="single" w:sz="4" w:space="0" w:color="BFBFBF"/>
+              <w:left w:val="single" w:sz="4" w:space="0" w:color="BFBFBF"/>
+              <w:bottom w:val="single" w:sz="4" w:space="0" w:color="BFBFBF"/>
+              <w:right w:val="single" w:sz="4" w:space="0" w:color="BFBFBF"/>
+            </w:tcBorders>
+          </w:tcPr>
+          <w:p>
+            <w:pPr>
+              <w:pStyle w:val="Compact"/>
+            </w:pPr>
+            <w:r>
+              <w:t xml:space="preserve">The same data behind a Unity Catalog row filter and column mask</w:t>
+            </w:r>
+          </w:p>
+        </w:tc>
+        <w:tc>
+          <w:tcPr>
+            <w:tcW w:w="3343" w:type="dxa"/>
+            <w:tcBorders>
+              <w:top w:val="single" w:sz="4" w:space="0" w:color="BFBFBF"/>
+              <w:left w:val="single" w:sz="4" w:space="0" w:color="BFBFBF"/>
+              <w:bottom w:val="single" w:sz="4" w:space="0" w:color="BFBFBF"/>
+              <w:right w:val="single" w:sz="4" w:space="0" w:color="BFBFBF"/>
+            </w:tcBorders>
+          </w:tcPr>
+          <w:p>
+            <w:pPr>
+              <w:pStyle w:val="Compact"/>
+            </w:pPr>
+            <w:r>
+              <w:t xml:space="preserve">Proof that permissions follow the data into AI answers</w:t>
+            </w:r>
+          </w:p>
+        </w:tc>
+      </w:tr>
+      <w:tr>
+        <w:tc>
+          <w:tcPr>
+            <w:tcW w:w="2953" w:type="dxa"/>
+            <w:tcBorders>
+              <w:top w:val="single" w:sz="4" w:space="0" w:color="BFBFBF"/>
+              <w:left w:val="single" w:sz="4" w:space="0" w:color="BFBFBF"/>
+              <w:bottom w:val="single" w:sz="4" w:space="0" w:color="BFBFBF"/>
+              <w:right w:val="single" w:sz="4" w:space="0" w:color="BFBFBF"/>
+            </w:tcBorders>
+          </w:tcPr>
+          <w:p>
+            <w:pPr>
+              <w:pStyle w:val="Compact"/>
+            </w:pPr>
+            <w:r>
+              <w:t xml:space="preserve">Job</w:t>
+            </w:r>
+            <w:r>
+              <w:t xml:space="preserve"> </w:t>
+            </w:r>
+            <w:r>
+              <w:rPr>
+                <w:b/>
+                <w:bCs/>
+              </w:rPr>
+              <w:t xml:space="preserve">SMBC Workshop: daily data refresh</w:t>
+            </w:r>
+          </w:p>
+        </w:tc>
+        <w:tc>
+          <w:tcPr>
+            <w:tcW w:w="3343" w:type="dxa"/>
+            <w:tcBorders>
+              <w:top w:val="single" w:sz="4" w:space="0" w:color="BFBFBF"/>
+              <w:left w:val="single" w:sz="4" w:space="0" w:color="BFBFBF"/>
+              <w:bottom w:val="single" w:sz="4" w:space="0" w:color="BFBFBF"/>
+              <w:right w:val="single" w:sz="4" w:space="0" w:color="BFBFBF"/>
+            </w:tcBorders>
+          </w:tcPr>
+          <w:p>
+            <w:pPr>
+              <w:pStyle w:val="Compact"/>
+            </w:pPr>
+            <w:r>
+              <w:t xml:space="preserve">Regenerates the extracts, then rebuilds and validates the tables, every day at 06:00 Singapore time</w:t>
+            </w:r>
+          </w:p>
+        </w:tc>
+        <w:tc>
+          <w:tcPr>
+            <w:tcW w:w="3343" w:type="dxa"/>
+            <w:tcBorders>
+              <w:top w:val="single" w:sz="4" w:space="0" w:color="BFBFBF"/>
+              <w:left w:val="single" w:sz="4" w:space="0" w:color="BFBFBF"/>
+              <w:bottom w:val="single" w:sz="4" w:space="0" w:color="BFBFBF"/>
+              <w:right w:val="single" w:sz="4" w:space="0" w:color="BFBFBF"/>
+            </w:tcBorders>
+          </w:tcPr>
+          <w:p>
+            <w:pPr>
+              <w:pStyle w:val="Compact"/>
+            </w:pPr>
+            <w:r>
+              <w:t xml:space="preserve">The report is ready every morning</w:t>
+            </w:r>
+          </w:p>
+        </w:tc>
+      </w:tr>
+      <w:tr>
+        <w:tc>
+          <w:tcPr>
+            <w:tcW w:w="2953" w:type="dxa"/>
+            <w:tcBorders>
+              <w:top w:val="single" w:sz="4" w:space="0" w:color="BFBFBF"/>
+              <w:left w:val="single" w:sz="4" w:space="0" w:color="BFBFBF"/>
+              <w:bottom w:val="single" w:sz="4" w:space="0" w:color="BFBFBF"/>
+              <w:right w:val="single" w:sz="4" w:space="0" w:color="BFBFBF"/>
+            </w:tcBorders>
+          </w:tcPr>
+          <w:p>
+            <w:pPr>
+              <w:pStyle w:val="Compact"/>
+            </w:pPr>
+            <w:r>
+              <w:t xml:space="preserve">Folder</w:t>
+            </w:r>
+            <w:r>
+              <w:t xml:space="preserve"> </w:t>
+            </w:r>
+            <w:r>
+              <w:rPr>
+                <w:b/>
+                <w:bCs/>
+              </w:rPr>
+              <w:t xml:space="preserve">Labs</w:t>
+            </w:r>
+          </w:p>
+        </w:tc>
+        <w:tc>
+          <w:tcPr>
+            <w:tcW w:w="3343" w:type="dxa"/>
+            <w:tcBorders>
+              <w:top w:val="single" w:sz="4" w:space="0" w:color="BFBFBF"/>
+              <w:left w:val="single" w:sz="4" w:space="0" w:color="BFBFBF"/>
+              <w:bottom w:val="single" w:sz="4" w:space="0" w:color="BFBFBF"/>
+              <w:right w:val="single" w:sz="4" w:space="0" w:color="BFBFBF"/>
+            </w:tcBorders>
+          </w:tcPr>
+          <w:p>
+            <w:pPr>
+              <w:pStyle w:val="Compact"/>
+            </w:pPr>
+            <w:r>
+              <w:t xml:space="preserve">The five attendee notebooks;</w:t>
+            </w:r>
+            <w:r>
+              <w:t xml:space="preserve"> </w:t>
+            </w:r>
+            <w:r>
+              <w:rPr>
+                <w:i/>
+                <w:iCs/>
+              </w:rPr>
+              <w:t xml:space="preserve">00 Start here</w:t>
+            </w:r>
+            <w:r>
+              <w:t xml:space="preserve"> </w:t>
+            </w:r>
+            <w:r>
+              <w:t xml:space="preserve">opens with this story</w:t>
+            </w:r>
+          </w:p>
+        </w:tc>
+        <w:tc>
+          <w:tcPr>
+            <w:tcW w:w="3343" w:type="dxa"/>
+            <w:tcBorders>
+              <w:top w:val="single" w:sz="4" w:space="0" w:color="BFBFBF"/>
+              <w:left w:val="single" w:sz="4" w:space="0" w:color="BFBFBF"/>
+              <w:bottom w:val="single" w:sz="4" w:space="0" w:color="BFBFBF"/>
+              <w:right w:val="single" w:sz="4" w:space="0" w:color="BFBFBF"/>
+            </w:tcBorders>
+          </w:tcPr>
+          <w:p>
+            <w:pPr>
+              <w:pStyle w:val="Compact"/>
+            </w:pPr>
+            <w:r>
+              <w:t xml:space="preserve">Where attendees follow it</w:t>
+            </w:r>
+          </w:p>
+        </w:tc>
+      </w:tr>
+      <w:tr>
+        <w:tc>
+          <w:tcPr>
+            <w:tcW w:w="2953" w:type="dxa"/>
+            <w:tcBorders>
+              <w:top w:val="single" w:sz="4" w:space="0" w:color="BFBFBF"/>
+              <w:left w:val="single" w:sz="4" w:space="0" w:color="BFBFBF"/>
+              <w:bottom w:val="single" w:sz="4" w:space="0" w:color="BFBFBF"/>
+              <w:right w:val="single" w:sz="4" w:space="0" w:color="BFBFBF"/>
+            </w:tcBorders>
+          </w:tcPr>
+          <w:p>
+            <w:pPr>
+              <w:pStyle w:val="Compact"/>
+            </w:pPr>
+            <w:r>
+              <w:t xml:space="preserve">Dashboard</w:t>
+            </w:r>
+            <w:r>
+              <w:t xml:space="preserve"> </w:t>
+            </w:r>
+            <w:r>
+              <w:rPr>
+                <w:b/>
+                <w:bCs/>
+              </w:rPr>
+              <w:t xml:space="preserve">SMBC Workshop: progress board</w:t>
+            </w:r>
+          </w:p>
+        </w:tc>
+        <w:tc>
+          <w:tcPr>
+            <w:tcW w:w="3343" w:type="dxa"/>
+            <w:tcBorders>
+              <w:top w:val="single" w:sz="4" w:space="0" w:color="BFBFBF"/>
+              <w:left w:val="single" w:sz="4" w:space="0" w:color="BFBFBF"/>
+              <w:bottom w:val="single" w:sz="4" w:space="0" w:color="BFBFBF"/>
+              <w:right w:val="single" w:sz="4" w:space="0" w:color="BFBFBF"/>
+            </w:tcBorders>
+          </w:tcPr>
+          <w:p>
+            <w:pPr>
+              <w:pStyle w:val="Compact"/>
+            </w:pPr>
+            <w:r>
+              <w:t xml:space="preserve">Check-ins and lab progress, live</w:t>
+            </w:r>
+          </w:p>
+        </w:tc>
+        <w:tc>
+          <w:tcPr>
+            <w:tcW w:w="3343" w:type="dxa"/>
+            <w:tcBorders>
+              <w:top w:val="single" w:sz="4" w:space="0" w:color="BFBFBF"/>
+              <w:left w:val="single" w:sz="4" w:space="0" w:color="BFBFBF"/>
+              <w:bottom w:val="single" w:sz="4" w:space="0" w:color="BFBFBF"/>
+              <w:right w:val="single" w:sz="4" w:space="0" w:color="BFBFBF"/>
+            </w:tcBorders>
+          </w:tcPr>
+          <w:p>
+            <w:pPr>
+              <w:pStyle w:val="Compact"/>
+            </w:pPr>
+            <w:r>
+              <w:t xml:space="preserve">For the facilitators, on the projector</w:t>
+            </w:r>
+          </w:p>
+        </w:tc>
+      </w:tr>
+    </w:tbl>
     <w:bookmarkEnd w:id="12"/>
-    <w:bookmarkStart w:id="40" w:name="part-2-facilitator-guide"/>
+    <w:bookmarkEnd w:id="13"/>
+    <w:bookmarkStart w:id="41" w:name="part-2-facilitator-guide"/>
     <w:p>
       <w:pPr>
         <w:pStyle w:val="Heading1"/>
@@ -2869,7 +3629,7 @@
         <w:t xml:space="preserve">This part contains the answer key and the planted findings. Don't share it with attendees.</w:t>
       </w:r>
     </w:p>
-    <w:bookmarkStart w:id="13" w:name="X991db0bef4196466a7032bab8170dcf260a1e06"/>
+    <w:bookmarkStart w:id="14" w:name="X991db0bef4196466a7032bab8170dcf260a1e06"/>
     <w:p>
       <w:pPr>
         <w:pStyle w:val="Heading2"/>
@@ -3313,7 +4073,7 @@
               <w:pStyle w:val="Compact"/>
             </w:pPr>
             <w:r>
-              <w:t xml:space="preserve">Watch for red cards; know the helper briefing (section 8)</w:t>
+              <w:t xml:space="preserve">Watch for red cards; know the helper briefing (section 2.8)</w:t>
             </w:r>
           </w:p>
         </w:tc>
@@ -3496,8 +4256,8 @@
         </w:tc>
       </w:tr>
     </w:tbl>
-    <w:bookmarkEnd w:id="13"/>
-    <w:bookmarkStart w:id="14" w:name="X599fe51cb9c487d8e5c653c07a665b831c29bee"/>
+    <w:bookmarkEnd w:id="14"/>
+    <w:bookmarkStart w:id="15" w:name="X599fe51cb9c487d8e5c653c07a665b831c29bee"/>
     <w:p>
       <w:pPr>
         <w:pStyle w:val="Heading2"/>
@@ -3745,7 +4505,7 @@
               <w:pStyle w:val="Compact"/>
             </w:pPr>
             <w:r>
-              <w:t xml:space="preserve">Internal dry run (section 6)</w:t>
+              <w:t xml:space="preserve">Internal dry run (section 2.6)</w:t>
             </w:r>
           </w:p>
         </w:tc>
@@ -3967,7 +4727,7 @@
               <w:pStyle w:val="Compact"/>
             </w:pPr>
             <w:r>
-              <w:t xml:space="preserve">Send the pre-work email (guide §5), with the workspace URL and warehouse name filled in. Agree the executive briefing with Richard and Peter (section 7)</w:t>
+              <w:t xml:space="preserve">Send the pre-work email (guide §5), with the workspace URL and warehouse name filled in. Agree the executive briefing with Richard and Peter (section 2.7)</w:t>
             </w:r>
           </w:p>
         </w:tc>
@@ -4026,7 +4786,7 @@
               <w:pStyle w:val="Compact"/>
             </w:pPr>
             <w:r>
-              <w:t xml:space="preserve">Freeze the content. Set up the quiz (Quiz (Part 2)), the polls and the survey (Polls and survey (Part 2)) in Slido, and test them on a phone</w:t>
+              <w:t xml:space="preserve">Freeze the content. Set up the quiz (section 2.11), the polls and the survey (section 2.12) in Slido, and test them on a phone</w:t>
             </w:r>
           </w:p>
         </w:tc>
@@ -4094,7 +4854,7 @@
               <w:t xml:space="preserve">handouts/dist/Cheat_Sheet.pdf</w:t>
             </w:r>
             <w:r>
-              <w:t xml:space="preserve">, rebuilt with the real workspace URL), and red/green cards. Record the fallback videos (section 5)</w:t>
+              <w:t xml:space="preserve">, rebuilt with the real workspace URL), and red/green cards. Record the fallback videos (section 2.5)</w:t>
             </w:r>
           </w:p>
         </w:tc>
@@ -4254,7 +5014,7 @@
               <w:pStyle w:val="Compact"/>
             </w:pPr>
             <w:r>
-              <w:t xml:space="preserve">Arrive. Test the projector, clicker and Wi-Fi. Open the presenter tabs (section 3). Start the workshop's SQL warehouse (the one</w:t>
+              <w:t xml:space="preserve">Arrive. Test the projector, clicker and Wi-Fi. Open the presenter tabs (section 2.3). Start the workshop's SQL warehouse (the one</w:t>
             </w:r>
             <w:r>
               <w:t xml:space="preserve"> </w:t>
@@ -4382,8 +5142,8 @@
         </w:tc>
       </w:tr>
     </w:tbl>
-    <w:bookmarkEnd w:id="14"/>
-    <w:bookmarkStart w:id="15" w:name="X46e9a4ff640d205cb9450e3fd86301b5f08750d"/>
+    <w:bookmarkEnd w:id="15"/>
+    <w:bookmarkStart w:id="16" w:name="X46e9a4ff640d205cb9450e3fd86301b5f08750d"/>
     <w:p>
       <w:pPr>
         <w:pStyle w:val="Heading2"/>
@@ -4585,8 +5345,8 @@
         <w:t xml:space="preserve">Slido, signed in, with the polls and the quiz ready.</w:t>
       </w:r>
     </w:p>
-    <w:bookmarkEnd w:id="15"/>
-    <w:bookmarkStart w:id="16" w:name="Xa5b05ba7b3608be5a0e003e0206bd5ba6b89802"/>
+    <w:bookmarkEnd w:id="16"/>
+    <w:bookmarkStart w:id="17" w:name="Xa5b05ba7b3608be5a0e003e0206bd5ba6b89802"/>
     <w:p>
       <w:pPr>
         <w:pStyle w:val="Heading2"/>
@@ -5023,7 +5783,7 @@
               <w:pStyle w:val="Compact"/>
             </w:pPr>
             <w:r>
-              <w:t xml:space="preserve">Richard 5 min, Peter 5 min, fireside 5 min (section 7). Richard asks</w:t>
+              <w:t xml:space="preserve">Richard 5 min, Peter 5 min, fireside 5 min (section 2.7). Richard asks</w:t>
             </w:r>
             <w:r>
               <w:t xml:space="preserve"> </w:t>
@@ -6097,7 +6857,7 @@
               <w:pStyle w:val="Compact"/>
             </w:pPr>
             <w:r>
-              <w:t xml:space="preserve">12 questions; after each one, say its teaching point (Quiz (Part 2)). Richard awards: quiz top three,</w:t>
+              <w:t xml:space="preserve">12 questions; after each one, say its teaching point (section 2.11). Richard awards: quiz top three,</w:t>
             </w:r>
             <w:r>
               <w:t xml:space="preserve"> </w:t>
@@ -6282,8 +7042,8 @@
         <w:t xml:space="preserve">If the organisers swap the last two slots (guide §2), the prizes close the session and the raffle draw comes straight after the survey.</w:t>
       </w:r>
     </w:p>
-    <w:bookmarkEnd w:id="16"/>
-    <w:bookmarkStart w:id="17" w:name="X5243c238140bc5a8a357a8efe6840cdab954f16"/>
+    <w:bookmarkEnd w:id="17"/>
+    <w:bookmarkStart w:id="18" w:name="X5243c238140bc5a8a357a8efe6840cdab954f16"/>
     <w:p>
       <w:pPr>
         <w:pStyle w:val="Heading2"/>
@@ -6872,8 +7632,8 @@
         <w:t xml:space="preserve">A Genie Agents agent-mode answer.</w:t>
       </w:r>
     </w:p>
-    <w:bookmarkEnd w:id="17"/>
-    <w:bookmarkStart w:id="18" w:name="X53f38a644c195c26de836fb4e5bfd21d7f92adc"/>
+    <w:bookmarkEnd w:id="18"/>
+    <w:bookmarkStart w:id="19" w:name="X53f38a644c195c26de836fb4e5bfd21d7f92adc"/>
     <w:p>
       <w:pPr>
         <w:pStyle w:val="Heading2"/>
@@ -7320,8 +8080,8 @@
         <w:t xml:space="preserve">again.</w:t>
       </w:r>
     </w:p>
-    <w:bookmarkEnd w:id="18"/>
-    <w:bookmarkStart w:id="19" w:name="X47c3c66b80dccacc9bb53089ebce152d0f6d4c1"/>
+    <w:bookmarkEnd w:id="19"/>
+    <w:bookmarkStart w:id="20" w:name="X47c3c66b80dccacc9bb53089ebce152d0f6d4c1"/>
     <w:p>
       <w:pPr>
         <w:pStyle w:val="Heading2"/>
@@ -7531,8 +8291,8 @@
         <w:t xml:space="preserve">Expect questions about where the AI features process data. Answer from guide §3.9; don't improvise.</w:t>
       </w:r>
     </w:p>
-    <w:bookmarkEnd w:id="19"/>
-    <w:bookmarkStart w:id="20" w:name="X163d16f08b98b727634de023db41ceb1b3bc08c"/>
+    <w:bookmarkEnd w:id="20"/>
+    <w:bookmarkStart w:id="21" w:name="X163d16f08b98b727634de023db41ceb1b3bc08c"/>
     <w:p>
       <w:pPr>
         <w:pStyle w:val="Heading2"/>
@@ -8169,8 +8929,8 @@
         <w:t xml:space="preserve">show participants the answer key, or tell them the planted findings before the reveals.</w:t>
       </w:r>
     </w:p>
-    <w:bookmarkEnd w:id="20"/>
-    <w:bookmarkStart w:id="24" w:name="Xbd73a7961540eb54c703e43bec027300a9605d0"/>
+    <w:bookmarkEnd w:id="21"/>
+    <w:bookmarkStart w:id="25" w:name="Xbd73a7961540eb54c703e43bec027300a9605d0"/>
     <w:p>
       <w:pPr>
         <w:pStyle w:val="Heading2"/>
@@ -8187,7 +8947,7 @@
         <w:t xml:space="preserve">These parts of the labs are run by a facilitator and aren't in the attendee guide.</w:t>
       </w:r>
     </w:p>
-    <w:bookmarkStart w:id="21" w:name="lab-1-facilitator-close-3-min"/>
+    <w:bookmarkStart w:id="22" w:name="lab-1-facilitator-close-3-min"/>
     <w:p>
       <w:pPr>
         <w:pStyle w:val="Heading3"/>
@@ -8272,8 +9032,8 @@
         </w:pict>
       </w:r>
     </w:p>
-    <w:bookmarkEnd w:id="21"/>
-    <w:bookmarkStart w:id="22" w:name="X1b995b6b6f24ff5642288ea412327520c1c696a"/>
+    <w:bookmarkEnd w:id="22"/>
+    <w:bookmarkStart w:id="23" w:name="X1b995b6b6f24ff5642288ea412327520c1c696a"/>
     <w:p>
       <w:pPr>
         <w:pStyle w:val="Heading3"/>
@@ -8345,8 +9105,8 @@
         <w:t xml:space="preserve">That's why curation and benchmarks matter before anyone shares an agent with a credit committee.</w:t>
       </w:r>
     </w:p>
-    <w:bookmarkEnd w:id="22"/>
-    <w:bookmarkStart w:id="23" w:name="lab-2-governance-moment-3-min"/>
+    <w:bookmarkEnd w:id="23"/>
+    <w:bookmarkStart w:id="24" w:name="lab-2-governance-moment-3-min"/>
     <w:p>
       <w:pPr>
         <w:pStyle w:val="Heading3"/>
@@ -8402,9 +9162,9 @@
         </w:pict>
       </w:r>
     </w:p>
-    <w:bookmarkEnd w:id="23"/>
     <w:bookmarkEnd w:id="24"/>
-    <w:bookmarkStart w:id="32" w:name="X3c59dc2060b0a533f2a1256f962ccd8795dae3f"/>
+    <w:bookmarkEnd w:id="25"/>
+    <w:bookmarkStart w:id="33" w:name="X3c59dc2060b0a533f2a1256f962ccd8795dae3f"/>
     <w:p>
       <w:pPr>
         <w:pStyle w:val="Heading2"/>
@@ -8458,7 +9218,7 @@
         <w:t xml:space="preserve">Don't share this with participants.</w:t>
       </w:r>
     </w:p>
-    <w:bookmarkStart w:id="25" w:name="the-story-in-five-numbers"/>
+    <w:bookmarkStart w:id="26" w:name="the-story-in-five-numbers"/>
     <w:p>
       <w:pPr>
         <w:pStyle w:val="Heading3"/>
@@ -8662,8 +9422,8 @@
         <w:t xml:space="preserve">.</w:t>
       </w:r>
     </w:p>
-    <w:bookmarkEnd w:id="25"/>
-    <w:bookmarkStart w:id="26" w:name="totals-at-30-sep-2026"/>
+    <w:bookmarkEnd w:id="26"/>
+    <w:bookmarkStart w:id="27" w:name="totals-at-30-sep-2026"/>
     <w:p>
       <w:pPr>
         <w:pStyle w:val="Heading3"/>
@@ -8935,8 +9695,8 @@
         </w:tc>
       </w:tr>
     </w:tbl>
-    <w:bookmarkEnd w:id="26"/>
-    <w:bookmarkStart w:id="27" w:name="top-5-groups-by-exposure"/>
+    <w:bookmarkEnd w:id="27"/>
+    <w:bookmarkStart w:id="28" w:name="top-5-groups-by-exposure"/>
     <w:p>
       <w:pPr>
         <w:pStyle w:val="Heading3"/>
@@ -9327,8 +10087,8 @@
         </w:tc>
       </w:tr>
     </w:tbl>
-    <w:bookmarkEnd w:id="27"/>
-    <w:bookmarkStart w:id="28" w:name="orchid-group-by-month"/>
+    <w:bookmarkEnd w:id="28"/>
+    <w:bookmarkStart w:id="29" w:name="orchid-group-by-month"/>
     <w:p>
       <w:pPr>
         <w:pStyle w:val="Heading3"/>
@@ -10486,8 +11246,8 @@
         </w:tc>
       </w:tr>
     </w:tbl>
-    <w:bookmarkEnd w:id="28"/>
-    <w:bookmarkStart w:id="29" w:name="orchid-subsidiaries-at-30-sep-2026"/>
+    <w:bookmarkEnd w:id="29"/>
+    <w:bookmarkStart w:id="30" w:name="orchid-subsidiaries-at-30-sep-2026"/>
     <w:p>
       <w:pPr>
         <w:pStyle w:val="Heading3"/>
@@ -12029,8 +12789,8 @@
         </w:tc>
       </w:tr>
     </w:tbl>
-    <w:bookmarkEnd w:id="29"/>
-    <w:bookmarkStart w:id="30" w:name="planted-data-quality-problems"/>
+    <w:bookmarkEnd w:id="30"/>
+    <w:bookmarkStart w:id="31" w:name="planted-data-quality-problems"/>
     <w:p>
       <w:pPr>
         <w:pStyle w:val="Heading3"/>
@@ -12693,8 +13453,8 @@
         <w:t xml:space="preserve">an exact-date join loses 2025-05-31, 2025-08-31, 2025-11-30, 2026-01-31, 2026-02-28, 2026-05-31. Join on currency and month instead.</w:t>
       </w:r>
     </w:p>
-    <w:bookmarkEnd w:id="30"/>
-    <w:bookmarkStart w:id="31" w:name="X5f1b806dc93d8b412bf4f40f93efef141ded4c6"/>
+    <w:bookmarkEnd w:id="31"/>
+    <w:bookmarkStart w:id="32" w:name="X5f1b806dc93d8b412bf4f40f93efef141ded4c6"/>
     <w:p>
       <w:pPr>
         <w:pStyle w:val="Heading3"/>
@@ -12717,9 +13477,9 @@
         <w:t xml:space="preserve">(whole book at 30 Sep 2026: 0.4%)</w:t>
       </w:r>
     </w:p>
-    <w:bookmarkEnd w:id="31"/>
     <w:bookmarkEnd w:id="32"/>
-    <w:bookmarkStart w:id="33" w:name="Xf807041c63855e3ac4d2cfe7b772bd3953782d4"/>
+    <w:bookmarkEnd w:id="33"/>
+    <w:bookmarkStart w:id="34" w:name="Xf807041c63855e3ac4d2cfe7b772bd3953782d4"/>
     <w:p>
       <w:pPr>
         <w:pStyle w:val="Heading2"/>
@@ -14208,8 +14968,8 @@
         <w:t xml:space="preserve">(a Slido vote of 2–3 shortlisted dashboards)</w:t>
       </w:r>
     </w:p>
-    <w:bookmarkEnd w:id="33"/>
-    <w:bookmarkStart w:id="36" w:name="Xef549c501c4442434b464fb58e0447ef79c1b92"/>
+    <w:bookmarkEnd w:id="34"/>
+    <w:bookmarkStart w:id="37" w:name="Xef549c501c4442434b464fb58e0447ef79c1b92"/>
     <w:p>
       <w:pPr>
         <w:pStyle w:val="Heading2"/>
@@ -14236,10 +14996,10 @@
         <w:t xml:space="preserve">the day before the workshop</w:t>
       </w:r>
       <w:r>
-        <w:t xml:space="preserve">: polls and Q&amp;A in Slido, and the survey in Slido or Microsoft Forms, whichever SMBC allows. The quiz runs in Slido too: enter the 12 questions from Quiz (Part 2) as a Slido quiz.</w:t>
-      </w:r>
-    </w:p>
-    <w:bookmarkStart w:id="34" w:name="during-the-day"/>
+        <w:t xml:space="preserve">: polls and Q&amp;A in Slido, and the survey in Slido or Microsoft Forms, whichever SMBC allows. The quiz runs in Slido too: enter the 12 questions from section 2.11 as a Slido quiz.</w:t>
+      </w:r>
+    </w:p>
+    <w:bookmarkStart w:id="35" w:name="during-the-day"/>
     <w:p>
       <w:pPr>
         <w:pStyle w:val="Heading3"/>
@@ -14671,8 +15431,8 @@
         </w:tc>
       </w:tr>
     </w:tbl>
-    <w:bookmarkEnd w:id="34"/>
-    <w:bookmarkStart w:id="35" w:name="X71f0768953fea8d1d0a1c6d9eed47a1b8044502"/>
+    <w:bookmarkEnd w:id="35"/>
+    <w:bookmarkStart w:id="36" w:name="X71f0768953fea8d1d0a1c6d9eed47a1b8044502"/>
     <w:p>
       <w:pPr>
         <w:pStyle w:val="Heading3"/>
@@ -14900,9 +15660,9 @@
         <w:t xml:space="preserve">Say on the survey how emails will be used (the raffle draw and the recap email only). Draw the winners from respondents who left an email, and announce them at the close, or in the recap email if the survey stays open.</w:t>
       </w:r>
     </w:p>
-    <w:bookmarkEnd w:id="35"/>
     <w:bookmarkEnd w:id="36"/>
-    <w:bookmarkStart w:id="39" w:name="Xe1f7004776edffa0a0778647a97a23aec98f0f1"/>
+    <w:bookmarkEnd w:id="37"/>
+    <w:bookmarkStart w:id="40" w:name="Xe1f7004776edffa0a0778647a97a23aec98f0f1"/>
     <w:p>
       <w:pPr>
         <w:pStyle w:val="Heading2"/>
@@ -15204,7 +15964,7 @@
       <w:r>
         <w:t xml:space="preserve"> </w:t>
       </w:r>
-      <w:hyperlink r:id="rId37">
+      <w:hyperlink r:id="rId38">
         <w:r>
           <w:rPr>
             <w:rStyle w:val="Hyperlink"/>
@@ -15218,7 +15978,7 @@
       <w:r>
         <w:t xml:space="preserve"> </w:t>
       </w:r>
-      <w:hyperlink r:id="rId38">
+      <w:hyperlink r:id="rId39">
         <w:r>
           <w:rPr>
             <w:rStyle w:val="Hyperlink"/>
@@ -15271,9 +16031,9 @@
         <w:t xml:space="preserve">If you haven't filled in the feedback survey yet, it's here: &lt;link&gt;. Thank you again.</w:t>
       </w:r>
     </w:p>
-    <w:bookmarkEnd w:id="39"/>
     <w:bookmarkEnd w:id="40"/>
-    <w:bookmarkStart w:id="72" w:name="part-3-attendee-guide"/>
+    <w:bookmarkEnd w:id="41"/>
+    <w:bookmarkStart w:id="73" w:name="part-3-attendee-guide"/>
     <w:p>
       <w:pPr>
         <w:pStyle w:val="Heading1"/>
@@ -15308,7 +16068,7 @@
         <w:t xml:space="preserve">The labs use a made-up SMBC APAC corporate lending book: every borrower, group, limit and balance is fictional. No SMBC data, systems or customer information is used at any point.</w:t>
       </w:r>
     </w:p>
-    <w:bookmarkStart w:id="41" w:name="before-you-start"/>
+    <w:bookmarkStart w:id="42" w:name="before-you-start"/>
     <w:p>
       <w:pPr>
         <w:pStyle w:val="Heading2"/>
@@ -15971,8 +16731,8 @@
         </w:pict>
       </w:r>
     </w:p>
-    <w:bookmarkEnd w:id="41"/>
-    <w:bookmarkStart w:id="46" w:name="Xfefe26028280eea74e7821ddeaaf7a5053f6189"/>
+    <w:bookmarkEnd w:id="42"/>
+    <w:bookmarkStart w:id="47" w:name="Xfefe26028280eea74e7821ddeaaf7a5053f6189"/>
     <w:p>
       <w:pPr>
         <w:pStyle w:val="Heading2"/>
@@ -16005,7 +16765,7 @@
         <w:t xml:space="preserve">corporate lending book with about USD 27bn of drawn exposure across 12 booking branches in Asia Pacific. Every borrower, group and figure is made up. Borrowers belong to counterparty groups, such as a conglomerate and its subsidiaries in several countries, and each group has an approved credit limit set by the risk team. As at SMBC, the fiscal year runs from April to March.</w:t>
       </w:r>
     </w:p>
-    <w:bookmarkStart w:id="42" w:name="the-story-the-monday-exposure-report"/>
+    <w:bookmarkStart w:id="43" w:name="the-story-the-monday-exposure-report"/>
     <w:p>
       <w:pPr>
         <w:pStyle w:val="Heading3"/>
@@ -16503,8 +17263,8 @@
         <w:t xml:space="preserve">By the end of the day you can answer the CDAO's question yourself, with numbers you can trace back to the source files. The quiz checks what you found.</w:t>
       </w:r>
     </w:p>
-    <w:bookmarkEnd w:id="42"/>
-    <w:bookmarkStart w:id="43" w:name="X92c5b160c37b36e6dbf9bd624ddb1aaf92445e3"/>
+    <w:bookmarkEnd w:id="43"/>
+    <w:bookmarkStart w:id="44" w:name="X92c5b160c37b36e6dbf9bd624ddb1aaf92445e3"/>
     <w:p>
       <w:pPr>
         <w:pStyle w:val="Heading3"/>
@@ -17137,8 +17897,8 @@
         </w:tc>
       </w:tr>
     </w:tbl>
-    <w:bookmarkEnd w:id="43"/>
-    <w:bookmarkStart w:id="44" w:name="notes-from-the-source-system-owners"/>
+    <w:bookmarkEnd w:id="44"/>
+    <w:bookmarkStart w:id="45" w:name="notes-from-the-source-system-owners"/>
     <w:p>
       <w:pPr>
         <w:pStyle w:val="Heading3"/>
@@ -17368,8 +18128,8 @@
         <w:t xml:space="preserve">"A few facilities were booked before the customer record was created in the master."</w:t>
       </w:r>
     </w:p>
-    <w:bookmarkEnd w:id="44"/>
-    <w:bookmarkStart w:id="45" w:name="reference-tables-bronze-silver-and-gold"/>
+    <w:bookmarkEnd w:id="45"/>
+    <w:bookmarkStart w:id="46" w:name="reference-tables-bronze-silver-and-gold"/>
     <w:p>
       <w:pPr>
         <w:pStyle w:val="Heading3"/>
@@ -17791,9 +18551,9 @@
         </w:pict>
       </w:r>
     </w:p>
-    <w:bookmarkEnd w:id="45"/>
     <w:bookmarkEnd w:id="46"/>
-    <w:bookmarkStart w:id="49" w:name="Xf9ab387f240c1d7b77102b3fc5a313034401255"/>
+    <w:bookmarkEnd w:id="47"/>
+    <w:bookmarkStart w:id="50" w:name="Xf9ab387f240c1d7b77102b3fc5a313034401255"/>
     <w:p>
       <w:pPr>
         <w:pStyle w:val="Heading2"/>
@@ -17882,7 +18642,7 @@
         <w:t xml:space="preserve">Nothing in Lab 2 depends on finishing Lab 1: the gold reference tables have the same result. Work in pairs, ideally one analyst and one engineer, with the engineer driving.</w:t>
       </w:r>
     </w:p>
-    <w:bookmarkStart w:id="47" w:name="core-path"/>
+    <w:bookmarkStart w:id="48" w:name="core-path"/>
     <w:p>
       <w:pPr>
         <w:pStyle w:val="Heading3"/>
@@ -19910,8 +20670,8 @@
         <w:t xml:space="preserve">;</w:t>
       </w:r>
     </w:p>
-    <w:bookmarkEnd w:id="47"/>
-    <w:bookmarkStart w:id="48" w:name="stretch-pick-any"/>
+    <w:bookmarkEnd w:id="48"/>
+    <w:bookmarkStart w:id="49" w:name="stretch-pick-any"/>
     <w:p>
       <w:pPr>
         <w:pStyle w:val="Heading3"/>
@@ -20068,9 +20828,9 @@
         </w:pict>
       </w:r>
     </w:p>
-    <w:bookmarkEnd w:id="48"/>
     <w:bookmarkEnd w:id="49"/>
-    <w:bookmarkStart w:id="52" w:name="X9a77c333740725278a0e5799fead1c7fecd3a5a"/>
+    <w:bookmarkEnd w:id="50"/>
+    <w:bookmarkStart w:id="53" w:name="X9a77c333740725278a0e5799fead1c7fecd3a5a"/>
     <w:p>
       <w:pPr>
         <w:pStyle w:val="Heading2"/>
@@ -20177,7 +20937,7 @@
         <w:t xml:space="preserve">) so everyone's answers match. If you finished Lab 1, your own tables give the same numbers.</w:t>
       </w:r>
     </w:p>
-    <w:bookmarkStart w:id="50" w:name="core-path-1"/>
+    <w:bookmarkStart w:id="51" w:name="core-path-1"/>
     <w:p>
       <w:pPr>
         <w:pStyle w:val="Heading3"/>
@@ -20821,8 +21581,8 @@
         <w:t xml:space="preserve">();</w:t>
       </w:r>
     </w:p>
-    <w:bookmarkEnd w:id="50"/>
-    <w:bookmarkStart w:id="51" w:name="stretch-pick-any-1"/>
+    <w:bookmarkEnd w:id="51"/>
+    <w:bookmarkStart w:id="52" w:name="stretch-pick-any-1"/>
     <w:p>
       <w:pPr>
         <w:pStyle w:val="Heading3"/>
@@ -21059,9 +21819,9 @@
         </w:pict>
       </w:r>
     </w:p>
-    <w:bookmarkEnd w:id="51"/>
     <w:bookmarkEnd w:id="52"/>
-    <w:bookmarkStart w:id="53" w:name="Xc8c189ae206b9c8161ed9c9b5ce289ed9124509"/>
+    <w:bookmarkEnd w:id="53"/>
+    <w:bookmarkStart w:id="54" w:name="Xc8c189ae206b9c8161ed9c9b5ce289ed9124509"/>
     <w:p>
       <w:pPr>
         <w:pStyle w:val="Heading2"/>
@@ -21295,8 +22055,8 @@
         </w:pict>
       </w:r>
     </w:p>
-    <w:bookmarkEnd w:id="53"/>
-    <w:bookmarkStart w:id="60" w:name="X89f83c886faea839ce07249a229743169fcb775"/>
+    <w:bookmarkEnd w:id="54"/>
+    <w:bookmarkStart w:id="61" w:name="X89f83c886faea839ce07249a229743169fcb775"/>
     <w:p>
       <w:pPr>
         <w:pStyle w:val="Heading2"/>
@@ -21401,7 +22161,7 @@
             <w:pPr>
               <w:pStyle w:val="Compact"/>
             </w:pPr>
-            <w:hyperlink r:id="rId37">
+            <w:hyperlink r:id="rId38">
               <w:r>
                 <w:rPr>
                   <w:rStyle w:val="Hyperlink"/>
@@ -21446,7 +22206,7 @@
             <w:pPr>
               <w:pStyle w:val="Compact"/>
             </w:pPr>
-            <w:hyperlink r:id="rId54">
+            <w:hyperlink r:id="rId55">
               <w:r>
                 <w:rPr>
                   <w:rStyle w:val="Hyperlink"/>
@@ -21491,7 +22251,7 @@
             <w:pPr>
               <w:pStyle w:val="Compact"/>
             </w:pPr>
-            <w:hyperlink r:id="rId38">
+            <w:hyperlink r:id="rId39">
               <w:r>
                 <w:rPr>
                   <w:rStyle w:val="Hyperlink"/>
@@ -21575,7 +22335,7 @@
             <w:pPr>
               <w:pStyle w:val="Compact"/>
             </w:pPr>
-            <w:hyperlink r:id="rId55">
+            <w:hyperlink r:id="rId56">
               <w:r>
                 <w:rPr>
                   <w:rStyle w:val="Hyperlink"/>
@@ -21620,7 +22380,7 @@
             <w:pPr>
               <w:pStyle w:val="Compact"/>
             </w:pPr>
-            <w:hyperlink r:id="rId56">
+            <w:hyperlink r:id="rId57">
               <w:r>
                 <w:rPr>
                   <w:rStyle w:val="Hyperlink"/>
@@ -21665,7 +22425,7 @@
             <w:pPr>
               <w:pStyle w:val="Compact"/>
             </w:pPr>
-            <w:hyperlink r:id="rId57">
+            <w:hyperlink r:id="rId58">
               <w:r>
                 <w:rPr>
                   <w:rStyle w:val="Hyperlink"/>
@@ -21710,7 +22470,7 @@
             <w:pPr>
               <w:pStyle w:val="Compact"/>
             </w:pPr>
-            <w:hyperlink r:id="rId58">
+            <w:hyperlink r:id="rId59">
               <w:r>
                 <w:rPr>
                   <w:rStyle w:val="Hyperlink"/>
@@ -21755,7 +22515,7 @@
             <w:pPr>
               <w:pStyle w:val="Compact"/>
             </w:pPr>
-            <w:hyperlink r:id="rId59">
+            <w:hyperlink r:id="rId60">
               <w:r>
                 <w:rPr>
                   <w:rStyle w:val="Hyperlink"/>
@@ -21774,8 +22534,8 @@
         </w:pict>
       </w:r>
     </w:p>
-    <w:bookmarkEnd w:id="60"/>
-    <w:bookmarkStart w:id="70" w:name="appendix-a-copy-paste-kit"/>
+    <w:bookmarkEnd w:id="61"/>
+    <w:bookmarkStart w:id="71" w:name="appendix-a-copy-paste-kit"/>
     <w:p>
       <w:pPr>
         <w:pStyle w:val="Heading2"/>
@@ -21784,7 +22544,7 @@
         <w:t xml:space="preserve">Appendix A: Copy-paste kit</w:t>
       </w:r>
     </w:p>
-    <w:bookmarkStart w:id="61" w:name="a1-check-in-and-checkpoint-queries"/>
+    <w:bookmarkStart w:id="62" w:name="a1-check-in-and-checkpoint-queries"/>
     <w:p>
       <w:pPr>
         <w:pStyle w:val="Heading3"/>
@@ -22245,8 +23005,8 @@
         <w:t xml:space="preserve">();</w:t>
       </w:r>
     </w:p>
-    <w:bookmarkEnd w:id="61"/>
-    <w:bookmarkStart w:id="62" w:name="a2-genie-code-prompts-for-lab-1-designer"/>
+    <w:bookmarkEnd w:id="62"/>
+    <w:bookmarkStart w:id="63" w:name="a2-genie-code-prompts-for-lab-1-designer"/>
     <w:p>
       <w:pPr>
         <w:pStyle w:val="Heading3"/>
@@ -22304,8 +23064,8 @@
         <w:t xml:space="preserve">and exposure_jpy = drawn_amount × jpy_rate.</w:t>
       </w:r>
     </w:p>
-    <w:bookmarkEnd w:id="62"/>
-    <w:bookmarkStart w:id="63" w:name="a3-genie-agent-starter-instructions"/>
+    <w:bookmarkEnd w:id="63"/>
+    <w:bookmarkStart w:id="64" w:name="a3-genie-agent-starter-instructions"/>
     <w:p>
       <w:pPr>
         <w:pStyle w:val="Heading3"/>
@@ -22418,8 +23178,8 @@
         <w:t xml:space="preserve">- Show amounts in USD millions with one decimal place unless asked otherwise.</w:t>
       </w:r>
     </w:p>
-    <w:bookmarkEnd w:id="63"/>
-    <w:bookmarkStart w:id="64" w:name="X913b63a9cedc050a49fab46dfe5b57d22f41418"/>
+    <w:bookmarkEnd w:id="64"/>
+    <w:bookmarkStart w:id="65" w:name="X913b63a9cedc050a49fab46dfe5b57d22f41418"/>
     <w:p>
       <w:pPr>
         <w:pStyle w:val="Heading3"/>
@@ -22466,8 +23226,8 @@
         <w:t xml:space="preserve">"End of FY2026 H1" means as_of_date = 2026-09-30. "FY2026 to date" means as_of_date from 2026-04-30 onwards.</w:t>
       </w:r>
     </w:p>
-    <w:bookmarkEnd w:id="64"/>
-    <w:bookmarkStart w:id="65" w:name="a5-example-sql-queries"/>
+    <w:bookmarkEnd w:id="65"/>
+    <w:bookmarkStart w:id="66" w:name="a5-example-sql-queries"/>
     <w:p>
       <w:pPr>
         <w:pStyle w:val="Heading3"/>
@@ -22924,8 +23684,8 @@
         <w:t xml:space="preserve">;</w:t>
       </w:r>
     </w:p>
-    <w:bookmarkEnd w:id="65"/>
-    <w:bookmarkStart w:id="66" w:name="a6-common-questions"/>
+    <w:bookmarkEnd w:id="66"/>
+    <w:bookmarkStart w:id="67" w:name="a6-common-questions"/>
     <w:p>
       <w:pPr>
         <w:pStyle w:val="Heading3"/>
@@ -22981,8 +23741,8 @@
         <w:t xml:space="preserve">Which booking branch has the highest share of trade finance in arrears?</w:t>
       </w:r>
     </w:p>
-    <w:bookmarkEnd w:id="66"/>
-    <w:bookmarkStart w:id="67" w:name="a7-benchmark-questions-stretch"/>
+    <w:bookmarkEnd w:id="67"/>
+    <w:bookmarkStart w:id="68" w:name="a7-benchmark-questions-stretch"/>
     <w:p>
       <w:pPr>
         <w:pStyle w:val="Heading3"/>
@@ -23269,8 +24029,8 @@
         </w:tc>
       </w:tr>
     </w:tbl>
-    <w:bookmarkEnd w:id="67"/>
-    <w:bookmarkStart w:id="68" w:name="Xb3d8e474c82359234fd09f77a8d7b31c614c80c"/>
+    <w:bookmarkEnd w:id="68"/>
+    <w:bookmarkStart w:id="69" w:name="Xb3d8e474c82359234fd09f77a8d7b31c614c80c"/>
     <w:p>
       <w:pPr>
         <w:pStyle w:val="Heading3"/>
@@ -23366,8 +24126,8 @@
         <w:t xml:space="preserve">&lt;paste A.9&gt;</w:t>
       </w:r>
     </w:p>
-    <w:bookmarkEnd w:id="68"/>
-    <w:bookmarkStart w:id="69" w:name="X9d3a8470de6a6dcb4c47fe21df728324d6cdb51"/>
+    <w:bookmarkEnd w:id="69"/>
+    <w:bookmarkStart w:id="70" w:name="X9d3a8470de6a6dcb4c47fe21df728324d6cdb51"/>
     <w:p>
       <w:pPr>
         <w:pStyle w:val="Heading3"/>
@@ -24777,9 +25537,9 @@
         </w:pict>
       </w:r>
     </w:p>
-    <w:bookmarkEnd w:id="69"/>
     <w:bookmarkEnd w:id="70"/>
-    <w:bookmarkStart w:id="71" w:name="appendix-b-troubleshooting"/>
+    <w:bookmarkEnd w:id="71"/>
+    <w:bookmarkStart w:id="72" w:name="appendix-b-troubleshooting"/>
     <w:p>
       <w:pPr>
         <w:pStyle w:val="Heading2"/>
@@ -25704,9 +26464,9 @@
         </w:tc>
       </w:tr>
     </w:tbl>
-    <w:bookmarkEnd w:id="71"/>
     <w:bookmarkEnd w:id="72"/>
-    <w:bookmarkStart w:id="88" w:name="part-4-workspace-setup-and-requirements"/>
+    <w:bookmarkEnd w:id="73"/>
+    <w:bookmarkStart w:id="89" w:name="part-4-workspace-setup-and-requirements"/>
     <w:p>
       <w:pPr>
         <w:pStyle w:val="Heading1"/>
@@ -25723,7 +26483,7 @@
         <w:t xml:space="preserve">For SMBC's SAG team and workspace administrators. Section numbers match the workshop guide.</w:t>
       </w:r>
     </w:p>
-    <w:bookmarkStart w:id="85" w:name="Xf20fa85265cdac618bab9d2b24d1a4c98c219ee"/>
+    <w:bookmarkStart w:id="86" w:name="Xf20fa85265cdac618bab9d2b24d1a4c98c219ee"/>
     <w:p>
       <w:pPr>
         <w:pStyle w:val="Heading2"/>
@@ -25877,7 +26637,7 @@
         <w:t xml:space="preserve">catalog (3.6) and to a SQL warehouse (3.4).</w:t>
       </w:r>
     </w:p>
-    <w:bookmarkStart w:id="73" w:name="X5dc5dde3a9df68ef729f99e5eb74bd5ff0be601"/>
+    <w:bookmarkStart w:id="74" w:name="X5dc5dde3a9df68ef729f99e5eb74bd5ff0be601"/>
     <w:p>
       <w:pPr>
         <w:pStyle w:val="Heading3"/>
@@ -27681,8 +28441,8 @@
         </w:tc>
       </w:tr>
     </w:tbl>
-    <w:bookmarkEnd w:id="73"/>
-    <w:bookmarkStart w:id="75" w:name="Xf30590ce4a84f32cf4a268d95d7672d47800670"/>
+    <w:bookmarkEnd w:id="74"/>
+    <w:bookmarkStart w:id="76" w:name="Xf30590ce4a84f32cf4a268d95d7672d47800670"/>
     <w:p>
       <w:pPr>
         <w:pStyle w:val="Heading3"/>
@@ -27723,7 +28483,7 @@
       <w:r>
         <w:t xml:space="preserve"> </w:t>
       </w:r>
-      <w:hyperlink r:id="rId74">
+      <w:hyperlink r:id="rId75">
         <w:r>
           <w:rPr>
             <w:rStyle w:val="Hyperlink"/>
@@ -28074,8 +28834,8 @@
         <w:t xml:space="preserve">If the workspace uses the compliance security profile, partner-powered AI features are off by default and need an explicit decision.</w:t>
       </w:r>
     </w:p>
-    <w:bookmarkEnd w:id="75"/>
-    <w:bookmarkStart w:id="76" w:name="Xbf4e7e8e32e083c059fe423220621a83f34cf88"/>
+    <w:bookmarkEnd w:id="76"/>
+    <w:bookmarkStart w:id="77" w:name="Xbf4e7e8e32e083c059fe423220621a83f34cf88"/>
     <w:p>
       <w:pPr>
         <w:pStyle w:val="Heading3"/>
@@ -28428,8 +29188,8 @@
         <w:t xml:space="preserve">*All data in this workspace is synthetic: the borrowers, groups and figures are made up.*</w:t>
       </w:r>
     </w:p>
-    <w:bookmarkEnd w:id="76"/>
-    <w:bookmarkStart w:id="77" w:name="X44b15ffcb6afdd166114388f8b2940e61e1b035"/>
+    <w:bookmarkEnd w:id="77"/>
+    <w:bookmarkStart w:id="78" w:name="X44b15ffcb6afdd166114388f8b2940e61e1b035"/>
     <w:p>
       <w:pPr>
         <w:pStyle w:val="Heading3"/>
@@ -28620,8 +29380,8 @@
         </w:tc>
       </w:tr>
     </w:tbl>
-    <w:bookmarkEnd w:id="77"/>
-    <w:bookmarkStart w:id="78" w:name="X00dda23f184f8e2af5a3ed11efc1074a5a73d10"/>
+    <w:bookmarkEnd w:id="78"/>
+    <w:bookmarkStart w:id="79" w:name="X00dda23f184f8e2af5a3ed11efc1074a5a73d10"/>
     <w:p>
       <w:pPr>
         <w:pStyle w:val="Heading3"/>
@@ -29011,8 +29771,8 @@
         <w:t xml:space="preserve">.</w:t>
       </w:r>
     </w:p>
-    <w:bookmarkEnd w:id="78"/>
-    <w:bookmarkStart w:id="79" w:name="X5db55288a7920b91a07c9e8c53af9bfe0f63358"/>
+    <w:bookmarkEnd w:id="79"/>
+    <w:bookmarkStart w:id="80" w:name="X5db55288a7920b91a07c9e8c53af9bfe0f63358"/>
     <w:p>
       <w:pPr>
         <w:pStyle w:val="Heading3"/>
@@ -29234,22 +29994,7 @@
               <w:t xml:space="preserve"> </w:t>
             </w:r>
             <w:r>
-              <w:t xml:space="preserve">and</w:t>
-            </w:r>
-            <w:r>
-              <w:t xml:space="preserve"> </w:t>
-            </w:r>
-            <w:r>
-              <w:rPr>
-                <w:rStyle w:val="VerbatimChar"/>
-              </w:rPr>
-              <w:t xml:space="preserve">workshop_date</w:t>
-            </w:r>
-            <w:r>
-              <w:t xml:space="preserve"> </w:t>
-            </w:r>
-            <w:r>
-              <w:t xml:space="preserve">(any tag a governed tag policy rejects is skipped)</w:t>
+              <w:t xml:space="preserve">(the tag is skipped if a governed tag policy rejects it)</w:t>
             </w:r>
           </w:p>
         </w:tc>
@@ -30005,8 +30750,8 @@
         <w:t xml:space="preserve">reports whether attendees have everything they need.</w:t>
       </w:r>
     </w:p>
-    <w:bookmarkEnd w:id="79"/>
-    <w:bookmarkStart w:id="80" w:name="X0037348c626822b3e16d4414267eaa49ca3c9ca"/>
+    <w:bookmarkEnd w:id="80"/>
+    <w:bookmarkStart w:id="81" w:name="X0037348c626822b3e16d4414267eaa49ca3c9ca"/>
     <w:p>
       <w:pPr>
         <w:pStyle w:val="Heading3"/>
@@ -30104,8 +30849,8 @@
         <w:t xml:space="preserve">The quiz and the polls run on phones (Slido), so nothing needs installing on laptops.</w:t>
       </w:r>
     </w:p>
-    <w:bookmarkEnd w:id="80"/>
-    <w:bookmarkStart w:id="81" w:name="Xd3127dabbb551814d087718d40b85244929ca6e"/>
+    <w:bookmarkEnd w:id="81"/>
+    <w:bookmarkStart w:id="82" w:name="Xd3127dabbb551814d087718d40b85244929ca6e"/>
     <w:p>
       <w:pPr>
         <w:pStyle w:val="Heading3"/>
@@ -31364,8 +32109,8 @@
         </w:tc>
       </w:tr>
     </w:tbl>
-    <w:bookmarkEnd w:id="81"/>
-    <w:bookmarkStart w:id="84" w:name="Xa5d620a28da4d36d3a4410e0035cdfeb40b6c47"/>
+    <w:bookmarkEnd w:id="82"/>
+    <w:bookmarkStart w:id="85" w:name="Xa5d620a28da4d36d3a4410e0035cdfeb40b6c47"/>
     <w:p>
       <w:pPr>
         <w:pStyle w:val="Heading3"/>
@@ -31384,7 +32129,7 @@
       <w:r>
         <w:t xml:space="preserve"> </w:t>
       </w:r>
-      <w:hyperlink r:id="rId82">
+      <w:hyperlink r:id="rId83">
         <w:r>
           <w:rPr>
             <w:rStyle w:val="Hyperlink"/>
@@ -31401,7 +32146,7 @@
       <w:r>
         <w:t xml:space="preserve"> </w:t>
       </w:r>
-      <w:hyperlink r:id="rId83">
+      <w:hyperlink r:id="rId84">
         <w:r>
           <w:rPr>
             <w:rStyle w:val="Hyperlink"/>
@@ -32206,9 +32951,9 @@
         </w:pict>
       </w:r>
     </w:p>
-    <w:bookmarkEnd w:id="84"/>
     <w:bookmarkEnd w:id="85"/>
-    <w:bookmarkStart w:id="86" w:name="Xe01c5abbc6e4ee016d304d30e8a24c868a0ea7b"/>
+    <w:bookmarkEnd w:id="86"/>
+    <w:bookmarkStart w:id="87" w:name="Xe01c5abbc6e4ee016d304d30e8a24c868a0ea7b"/>
     <w:p>
       <w:pPr>
         <w:pStyle w:val="Heading2"/>
@@ -33710,8 +34455,8 @@
         </w:pict>
       </w:r>
     </w:p>
-    <w:bookmarkEnd w:id="86"/>
-    <w:bookmarkStart w:id="87" w:name="X619fa5f6e8179904930625f3a8be4545e9a5b1d"/>
+    <w:bookmarkEnd w:id="87"/>
+    <w:bookmarkStart w:id="88" w:name="X619fa5f6e8179904930625f3a8be4545e9a5b1d"/>
     <w:p>
       <w:pPr>
         <w:pStyle w:val="Heading2"/>
@@ -33966,9 +34711,9 @@
         </w:pict>
       </w:r>
     </w:p>
-    <w:bookmarkEnd w:id="87"/>
     <w:bookmarkEnd w:id="88"/>
-    <w:bookmarkStart w:id="146" w:name="part-5-presenter-script"/>
+    <w:bookmarkEnd w:id="89"/>
+    <w:bookmarkStart w:id="147" w:name="part-5-presenter-script"/>
     <w:p>
       <w:pPr>
         <w:pStyle w:val="Heading1"/>
@@ -33985,7 +34730,7 @@
         <w:t xml:space="preserve">Slide-by-slide speaker notes from the workshop slides: timing, what to say, what helpers should watch for, and fallbacks.</w:t>
       </w:r>
     </w:p>
-    <w:bookmarkStart w:id="95" w:name="welcome-and-check-in--000"/>
+    <w:bookmarkStart w:id="96" w:name="welcome-and-check-in--000"/>
     <w:p>
       <w:pPr>
         <w:pStyle w:val="Heading2"/>
@@ -33994,7 +34739,7 @@
         <w:t xml:space="preserve">Welcome and check-in · 0:00</w:t>
       </w:r>
     </w:p>
-    <w:bookmarkStart w:id="89" w:name="X0010a600bda366d4ed8cfff064b54f12afa2de9"/>
+    <w:bookmarkStart w:id="90" w:name="X0010a600bda366d4ed8cfff064b54f12afa2de9"/>
     <w:p>
       <w:pPr>
         <w:pStyle w:val="Heading3"/>
@@ -34051,8 +34796,8 @@
         <w:t xml:space="preserve">Say it early and often: everything today uses a synthetic SMBC APAC lending book. The borrowers, groups and figures are made up, and no SMBC data, systems or customer information is used at any point.</w:t>
       </w:r>
     </w:p>
-    <w:bookmarkEnd w:id="89"/>
-    <w:bookmarkStart w:id="90" w:name="slide-2-get-set-up"/>
+    <w:bookmarkEnd w:id="90"/>
+    <w:bookmarkStart w:id="91" w:name="slide-2-get-set-up"/>
     <w:p>
       <w:pPr>
         <w:pStyle w:val="Heading3"/>
@@ -34145,8 +34890,8 @@
         <w:t xml:space="preserve">Red card up: a helper comes over. Pair anyone who is still blocked with a neighbour so they don't miss Lab 1.</w:t>
       </w:r>
     </w:p>
-    <w:bookmarkEnd w:id="90"/>
-    <w:bookmarkStart w:id="91" w:name="slide-3-todays-agenda"/>
+    <w:bookmarkEnd w:id="91"/>
+    <w:bookmarkStart w:id="92" w:name="slide-3-todays-agenda"/>
     <w:p>
       <w:pPr>
         <w:pStyle w:val="Heading3"/>
@@ -34215,8 +34960,8 @@
         <w:t xml:space="preserve">Times are relative to the start time.</w:t>
       </w:r>
     </w:p>
-    <w:bookmarkEnd w:id="91"/>
-    <w:bookmarkStart w:id="92" w:name="slide-4-the-monday-exposure-report"/>
+    <w:bookmarkEnd w:id="92"/>
+    <w:bookmarkStart w:id="93" w:name="slide-4-the-monday-exposure-report"/>
     <w:p>
       <w:pPr>
         <w:pStyle w:val="Heading3"/>
@@ -34273,8 +35018,8 @@
         <w:t xml:space="preserve">By the end, everyone has built a pipeline, a dashboard and a Genie Agent themselves.</w:t>
       </w:r>
     </w:p>
-    <w:bookmarkEnd w:id="92"/>
-    <w:bookmarkStart w:id="93" w:name="X6ec7a79ce4c1f4295c2ed85c9fe7953127e345d"/>
+    <w:bookmarkEnd w:id="93"/>
+    <w:bookmarkStart w:id="94" w:name="X6ec7a79ce4c1f4295c2ed85c9fe7953127e345d"/>
     <w:p>
       <w:pPr>
         <w:pStyle w:val="Heading3"/>
@@ -34343,8 +35088,8 @@
         <w:t xml:space="preserve">The fiscal year runs April to March. Remember that for Lab 2.</w:t>
       </w:r>
     </w:p>
-    <w:bookmarkEnd w:id="93"/>
-    <w:bookmarkStart w:id="94" w:name="slide-6-your-inbox-this-morning"/>
+    <w:bookmarkEnd w:id="94"/>
+    <w:bookmarkStart w:id="95" w:name="slide-6-your-inbox-this-morning"/>
     <w:p>
       <w:pPr>
         <w:pStyle w:val="Heading3"/>
@@ -34389,9 +35134,9 @@
         <w:t xml:space="preserve">Ask the room: which one would hurt the Credit Committee most? Don't answer yet; we reveal it after Lab 1.</w:t>
       </w:r>
     </w:p>
-    <w:bookmarkEnd w:id="94"/>
     <w:bookmarkEnd w:id="95"/>
-    <w:bookmarkStart w:id="101" w:name="data-engineering-with-lakeflow--025"/>
+    <w:bookmarkEnd w:id="96"/>
+    <w:bookmarkStart w:id="102" w:name="data-engineering-with-lakeflow--025"/>
     <w:p>
       <w:pPr>
         <w:pStyle w:val="Heading2"/>
@@ -34400,7 +35145,7 @@
         <w:t xml:space="preserve">Data engineering with Lakeflow · 0:25</w:t>
       </w:r>
     </w:p>
-    <w:bookmarkStart w:id="96" w:name="slide-7-data-engineering-with-lakeflow"/>
+    <w:bookmarkStart w:id="97" w:name="slide-7-data-engineering-with-lakeflow"/>
     <w:p>
       <w:pPr>
         <w:pStyle w:val="Heading3"/>
@@ -34445,8 +35190,8 @@
         <w:t xml:space="preserve">Slides: the date hook, Lakeflow at a glance, and the trust message. Then the live demo, which is the first few steps of Lab 1.</w:t>
       </w:r>
     </w:p>
-    <w:bookmarkEnd w:id="96"/>
-    <w:bookmarkStart w:id="97" w:name="slide-8-quick-question"/>
+    <w:bookmarkEnd w:id="97"/>
+    <w:bookmarkStart w:id="98" w:name="slide-8-quick-question"/>
     <w:p>
       <w:pPr>
         <w:pStyle w:val="Heading3"/>
@@ -34503,8 +35248,8 @@
         <w:t xml:space="preserve">In this data, parsing only the ISO format silently drops USD 4,789.2m of exposure at 30 September 2026. Lab 1 handles both formats.</w:t>
       </w:r>
     </w:p>
-    <w:bookmarkEnd w:id="97"/>
-    <w:bookmarkStart w:id="98" w:name="slide-9-lakeflow-at-a-glance"/>
+    <w:bookmarkEnd w:id="98"/>
+    <w:bookmarkStart w:id="99" w:name="slide-9-lakeflow-at-a-glance"/>
     <w:p>
       <w:pPr>
         <w:pStyle w:val="Heading3"/>
@@ -34549,8 +35294,8 @@
         <w:t xml:space="preserve">Position it next to what people run today. Nobody has to replace everything at once.</w:t>
       </w:r>
     </w:p>
-    <w:bookmarkEnd w:id="98"/>
-    <w:bookmarkStart w:id="99" w:name="slide-10-no-code-without-shadow-it"/>
+    <w:bookmarkEnd w:id="99"/>
+    <w:bookmarkStart w:id="100" w:name="slide-10-no-code-without-shadow-it"/>
     <w:p>
       <w:pPr>
         <w:pStyle w:val="Heading3"/>
@@ -34619,8 +35364,8 @@
         <w:t xml:space="preserve">The Schedule button turns it into a Lakeflow Job, and Unity Catalog governs every table it reads and writes.</w:t>
       </w:r>
     </w:p>
-    <w:bookmarkEnd w:id="99"/>
-    <w:bookmarkStart w:id="100" w:name="slide-11-live-demo-what-youll-see"/>
+    <w:bookmarkEnd w:id="100"/>
+    <w:bookmarkStart w:id="101" w:name="slide-11-live-demo-what-youll-see"/>
     <w:p>
       <w:pPr>
         <w:pStyle w:val="Heading3"/>
@@ -34753,9 +35498,9 @@
         <w:t xml:space="preserve">The AI output differs from the rehearsal: use it. That's why a person reviews every step.</w:t>
       </w:r>
     </w:p>
-    <w:bookmarkEnd w:id="100"/>
     <w:bookmarkEnd w:id="101"/>
-    <w:bookmarkStart w:id="114" w:name="lab-1--045"/>
+    <w:bookmarkEnd w:id="102"/>
+    <w:bookmarkStart w:id="115" w:name="lab-1--045"/>
     <w:p>
       <w:pPr>
         <w:pStyle w:val="Heading2"/>
@@ -34764,7 +35509,7 @@
         <w:t xml:space="preserve">Lab 1 · 0:45</w:t>
       </w:r>
     </w:p>
-    <w:bookmarkStart w:id="102" w:name="X4b2238570d6b8f98274335b9bb21a628f65872f"/>
+    <w:bookmarkStart w:id="103" w:name="X4b2238570d6b8f98274335b9bb21a628f65872f"/>
     <w:p>
       <w:pPr>
         <w:pStyle w:val="Heading3"/>
@@ -34833,8 +35578,8 @@
         <w:t xml:space="preserve">Helpers: watch for red cards, and for anyone who hasn't added a Source after five minutes.</w:t>
       </w:r>
     </w:p>
-    <w:bookmarkEnd w:id="102"/>
-    <w:bookmarkStart w:id="103" w:name="slide-13-lab-1-at-a-glance"/>
+    <w:bookmarkEnd w:id="103"/>
+    <w:bookmarkStart w:id="104" w:name="slide-13-lab-1-at-a-glance"/>
     <w:p>
       <w:pPr>
         <w:pStyle w:val="Heading3"/>
@@ -34931,8 +35676,8 @@
         <w:t xml:space="preserve">Genie Code prompts unavailable: partner-powered AI features or cross-Geo processing. Tell a facilitator.</w:t>
       </w:r>
     </w:p>
-    <w:bookmarkEnd w:id="103"/>
-    <w:bookmarkStart w:id="104" w:name="X17c3d8f5b1acf57d84db7715baf014bc43c4c6c"/>
+    <w:bookmarkEnd w:id="104"/>
+    <w:bookmarkStart w:id="105" w:name="X17c3d8f5b1acf57d84db7715baf014bc43c4c6c"/>
     <w:p>
       <w:pPr>
         <w:pStyle w:val="Heading3"/>
@@ -34989,8 +35734,8 @@
         <w:t xml:space="preserve">The two date formats are the 03/04/2026 problem from the intro.</w:t>
       </w:r>
     </w:p>
-    <w:bookmarkEnd w:id="104"/>
-    <w:bookmarkStart w:id="105" w:name="Xe75cd0f73f55fb90dc50667fb271e4f4e3087a8"/>
+    <w:bookmarkEnd w:id="105"/>
+    <w:bookmarkStart w:id="106" w:name="Xe75cd0f73f55fb90dc50667fb271e4f4e3087a8"/>
     <w:p>
       <w:pPr>
         <w:pStyle w:val="Heading3"/>
@@ -35059,8 +35804,8 @@
         <w:t xml:space="preserve">If the prompt doesn't respond: partner-powered AI features or cross-Geo processing are off. Add the Prepare actions by hand.</w:t>
       </w:r>
     </w:p>
-    <w:bookmarkEnd w:id="105"/>
-    <w:bookmarkStart w:id="106" w:name="X751c85537caf6858db90cdb1dff01422ea22e8e"/>
+    <w:bookmarkEnd w:id="106"/>
+    <w:bookmarkStart w:id="107" w:name="X751c85537caf6858db90cdb1dff01422ea22e8e"/>
     <w:p>
       <w:pPr>
         <w:pStyle w:val="Heading3"/>
@@ -35117,8 +35862,8 @@
         <w:t xml:space="preserve">Helpers: if someone sees far more than 21, the dates weren't parsed in step 4 (unparsed dates fail the not-null check).</w:t>
       </w:r>
     </w:p>
-    <w:bookmarkEnd w:id="106"/>
-    <w:bookmarkStart w:id="107" w:name="X1314540178eba9401cf3181bd1ea63caa52290a"/>
+    <w:bookmarkEnd w:id="107"/>
+    <w:bookmarkStart w:id="108" w:name="X1314540178eba9401cf3181bd1ea63caa52290a"/>
     <w:p>
       <w:pPr>
         <w:pStyle w:val="Heading3"/>
@@ -35163,8 +35908,8 @@
         <w:t xml:space="preserve">rate_month matters because FX is dated on the last business day of the month. A join on the exact date silently loses six months.</w:t>
       </w:r>
     </w:p>
-    <w:bookmarkEnd w:id="107"/>
-    <w:bookmarkStart w:id="108" w:name="X6c3ae29bb1d419077d70faceb68f893fd1eee12"/>
+    <w:bookmarkEnd w:id="108"/>
+    <w:bookmarkStart w:id="109" w:name="X6c3ae29bb1d419077d70faceb68f893fd1eee12"/>
     <w:p>
       <w:pPr>
         <w:pStyle w:val="Heading3"/>
@@ -35238,8 +35983,8 @@
         <w:t xml:space="preserve">The 15 facilities with no customer record can go to a second quarantine Output.</w:t>
       </w:r>
     </w:p>
-    <w:bookmarkEnd w:id="108"/>
-    <w:bookmarkStart w:id="109" w:name="X100bd1791b7b2d04993a05eb35837bb6e2fb017"/>
+    <w:bookmarkEnd w:id="109"/>
+    <w:bookmarkStart w:id="110" w:name="X100bd1791b7b2d04993a05eb35837bb6e2fb017"/>
     <w:p>
       <w:pPr>
         <w:pStyle w:val="Heading3"/>
@@ -35296,8 +36041,8 @@
         <w:t xml:space="preserve">When the Output exists, the participant's row turns green on the progress board.</w:t>
       </w:r>
     </w:p>
-    <w:bookmarkEnd w:id="109"/>
-    <w:bookmarkStart w:id="110" w:name="slide-20-lab-1-checkpoint"/>
+    <w:bookmarkEnd w:id="110"/>
+    <w:bookmarkStart w:id="111" w:name="slide-20-lab-1-checkpoint"/>
     <w:p>
       <w:pPr>
         <w:pStyle w:val="Heading3"/>
@@ -35366,8 +36111,8 @@
         <w:t xml:space="preserve">1:15: anyone not past step 5 switches to the gold reference tables.</w:t>
       </w:r>
     </w:p>
-    <w:bookmarkEnd w:id="110"/>
-    <w:bookmarkStart w:id="111" w:name="slide-21-lab-1-stretch-pick-any"/>
+    <w:bookmarkEnd w:id="111"/>
+    <w:bookmarkStart w:id="112" w:name="slide-21-lab-1-stretch-pick-any"/>
     <w:p>
       <w:pPr>
         <w:pStyle w:val="Heading3"/>
@@ -35412,8 +36157,8 @@
         <w:t xml:space="preserve">Document it: better metadata means better Genie answers in Lab 2.</w:t>
       </w:r>
     </w:p>
-    <w:bookmarkEnd w:id="111"/>
-    <w:bookmarkStart w:id="112" w:name="slide-22-lab-1-debrief"/>
+    <w:bookmarkEnd w:id="112"/>
+    <w:bookmarkStart w:id="113" w:name="slide-22-lab-1-debrief"/>
     <w:p>
       <w:pPr>
         <w:pStyle w:val="Heading3"/>
@@ -35470,8 +36215,8 @@
         <w:t xml:space="preserve">Every held-back row has a reason attached. That's your data-quality evidence.</w:t>
       </w:r>
     </w:p>
-    <w:bookmarkEnd w:id="112"/>
-    <w:bookmarkStart w:id="113" w:name="slide-23-15-minute-break"/>
+    <w:bookmarkEnd w:id="113"/>
+    <w:bookmarkStart w:id="114" w:name="slide-23-15-minute-break"/>
     <w:p>
       <w:pPr>
         <w:pStyle w:val="Heading3"/>
@@ -35516,9 +36261,9 @@
         <w:t xml:space="preserve">Put the progress board on screen during the break.</w:t>
       </w:r>
     </w:p>
-    <w:bookmarkEnd w:id="113"/>
     <w:bookmarkEnd w:id="114"/>
-    <w:bookmarkStart w:id="120" w:name="self-service-analytics--140"/>
+    <w:bookmarkEnd w:id="115"/>
+    <w:bookmarkStart w:id="121" w:name="self-service-analytics--140"/>
     <w:p>
       <w:pPr>
         <w:pStyle w:val="Heading2"/>
@@ -35527,7 +36272,7 @@
         <w:t xml:space="preserve">Self-service analytics · 1:40</w:t>
       </w:r>
     </w:p>
-    <w:bookmarkStart w:id="115" w:name="slide-24-self-service-analytics"/>
+    <w:bookmarkStart w:id="116" w:name="slide-24-self-service-analytics"/>
     <w:p>
       <w:pPr>
         <w:pStyle w:val="Heading3"/>
@@ -35560,8 +36305,8 @@
         <w:t xml:space="preserve">At most 8 minutes of slides, the rest live.</w:t>
       </w:r>
     </w:p>
-    <w:bookmarkEnd w:id="115"/>
-    <w:bookmarkStart w:id="116" w:name="slide-25-three-tools-one-message"/>
+    <w:bookmarkEnd w:id="116"/>
+    <w:bookmarkStart w:id="117" w:name="slide-25-three-tools-one-message"/>
     <w:p>
       <w:pPr>
         <w:pStyle w:val="Heading3"/>
@@ -35606,8 +36351,8 @@
         <w:t xml:space="preserve">Product names changed in 2026, and the workshop uses the current names: that's what people see in the product and the documentation.</w:t>
       </w:r>
     </w:p>
-    <w:bookmarkEnd w:id="116"/>
-    <w:bookmarkStart w:id="117" w:name="slide-26-curation-is-the-job"/>
+    <w:bookmarkEnd w:id="117"/>
+    <w:bookmarkStart w:id="118" w:name="slide-26-curation-is-the-job"/>
     <w:p>
       <w:pPr>
         <w:pStyle w:val="Heading3"/>
@@ -35652,8 +36397,8 @@
         <w:t xml:space="preserve">Lab 2 shows what happens without a fiscal-year instruction.</w:t>
       </w:r>
     </w:p>
-    <w:bookmarkEnd w:id="117"/>
-    <w:bookmarkStart w:id="118" w:name="slide-27-trust-but-verify"/>
+    <w:bookmarkEnd w:id="118"/>
+    <w:bookmarkStart w:id="119" w:name="slide-27-trust-but-verify"/>
     <w:p>
       <w:pPr>
         <w:pStyle w:val="Heading3"/>
@@ -35710,8 +36455,8 @@
         <w:t xml:space="preserve">Keep the BI point general: coexistence, not replacement.</w:t>
       </w:r>
     </w:p>
-    <w:bookmarkEnd w:id="118"/>
-    <w:bookmarkStart w:id="119" w:name="slide-28-live-demo-what-youll-see"/>
+    <w:bookmarkEnd w:id="119"/>
+    <w:bookmarkStart w:id="120" w:name="slide-28-live-demo-what-youll-see"/>
     <w:p>
       <w:pPr>
         <w:pStyle w:val="Heading3"/>
@@ -35849,9 +36594,9 @@
         <w:t xml:space="preserve">Fallback: if the Consumer-access user or Genie One chat fails, use the agent from Genie Agents in your own session.</w:t>
       </w:r>
     </w:p>
-    <w:bookmarkEnd w:id="119"/>
     <w:bookmarkEnd w:id="120"/>
-    <w:bookmarkStart w:id="132" w:name="lab-2--200"/>
+    <w:bookmarkEnd w:id="121"/>
+    <w:bookmarkStart w:id="133" w:name="lab-2--200"/>
     <w:p>
       <w:pPr>
         <w:pStyle w:val="Heading2"/>
@@ -35860,7 +36605,7 @@
         <w:t xml:space="preserve">Lab 2 · 2:00</w:t>
       </w:r>
     </w:p>
-    <w:bookmarkStart w:id="121" w:name="X1f1db69b59a00b69ceaa33c7ebe736cc7b6a670"/>
+    <w:bookmarkStart w:id="122" w:name="X1f1db69b59a00b69ceaa33c7ebe736cc7b6a670"/>
     <w:p>
       <w:pPr>
         <w:pStyle w:val="Heading3"/>
@@ -35905,8 +36650,8 @@
         <w:t xml:space="preserve">The tables: smbc_workshop.gold.group_exposure and smbc_workshop.gold.facility_exposure.</w:t>
       </w:r>
     </w:p>
-    <w:bookmarkEnd w:id="121"/>
-    <w:bookmarkStart w:id="122" w:name="slide-30-lab-2-at-a-glance"/>
+    <w:bookmarkEnd w:id="122"/>
+    <w:bookmarkStart w:id="123" w:name="slide-30-lab-2-at-a-glance"/>
     <w:p>
       <w:pPr>
         <w:pStyle w:val="Heading3"/>
@@ -35991,8 +36736,8 @@
         <w:t xml:space="preserve">The load on Genie is staggered naturally: everyone starts with the dashboard.</w:t>
       </w:r>
     </w:p>
-    <w:bookmarkEnd w:id="122"/>
-    <w:bookmarkStart w:id="123" w:name="X1c17fc4e57e81d82926ec051b57fee48ef979ec"/>
+    <w:bookmarkEnd w:id="123"/>
+    <w:bookmarkStart w:id="124" w:name="X1c17fc4e57e81d82926ec051b57fee48ef979ec"/>
     <w:p>
       <w:pPr>
         <w:pStyle w:val="Heading3"/>
@@ -36037,8 +36782,8 @@
         <w:t xml:space="preserve">Shortlist 2–3 good dashboards for the Best dashboard vote during the second break.</w:t>
       </w:r>
     </w:p>
-    <w:bookmarkEnd w:id="123"/>
-    <w:bookmarkStart w:id="124" w:name="X93c0fce7c9cde55797d3ff7b4573ac06ac49f3a"/>
+    <w:bookmarkEnd w:id="124"/>
+    <w:bookmarkStart w:id="125" w:name="X93c0fce7c9cde55797d3ff7b4573ac06ac49f3a"/>
     <w:p>
       <w:pPr>
         <w:pStyle w:val="Heading3"/>
@@ -36083,8 +36828,8 @@
         <w:t xml:space="preserve">Holding back A.4 is deliberate: step 4 shows what happens without it.</w:t>
       </w:r>
     </w:p>
-    <w:bookmarkEnd w:id="124"/>
-    <w:bookmarkStart w:id="125" w:name="X925ea6e2594bbbf1be65f72499464e22d347648"/>
+    <w:bookmarkEnd w:id="125"/>
+    <w:bookmarkStart w:id="126" w:name="X925ea6e2594bbbf1be65f72499464e22d347648"/>
     <w:p>
       <w:pPr>
         <w:pStyle w:val="Heading3"/>
@@ -36129,8 +36874,8 @@
         <w:t xml:space="preserve">In testing, the first question put the most utilised group at the top, at 94%.</w:t>
       </w:r>
     </w:p>
-    <w:bookmarkEnd w:id="125"/>
-    <w:bookmarkStart w:id="126" w:name="X81c8b339e9e45dec45065a4f8d6f4ef08a7ea62"/>
+    <w:bookmarkEnd w:id="126"/>
+    <w:bookmarkStart w:id="127" w:name="X81c8b339e9e45dec45065a4f8d6f4ef08a7ea62"/>
     <w:p>
       <w:pPr>
         <w:pStyle w:val="Heading3"/>
@@ -36175,8 +36920,8 @@
         <w:t xml:space="preserve">The instruction (A.4): the fiscal year runs from 1 April to 31 March and is named after the calendar year it starts in. FY2026 = 1 April 2026 to 31 March 2027.</w:t>
       </w:r>
     </w:p>
-    <w:bookmarkEnd w:id="126"/>
-    <w:bookmarkStart w:id="127" w:name="slide-35-lab-2-checkpoint"/>
+    <w:bookmarkEnd w:id="127"/>
+    <w:bookmarkStart w:id="128" w:name="slide-35-lab-2-checkpoint"/>
     <w:p>
       <w:pPr>
         <w:pStyle w:val="Heading3"/>
@@ -36221,8 +36966,8 @@
         <w:t xml:space="preserve">If an answer looks wrong, check the as_of_date in the SQL: FY2026 H1 ends on 30 September 2026.</w:t>
       </w:r>
     </w:p>
-    <w:bookmarkEnd w:id="127"/>
-    <w:bookmarkStart w:id="128" w:name="slide-36-lab-2-stretch-pick-any"/>
+    <w:bookmarkEnd w:id="128"/>
+    <w:bookmarkStart w:id="129" w:name="slide-36-lab-2-stretch-pick-any"/>
     <w:p>
       <w:pPr>
         <w:pStyle w:val="Heading3"/>
@@ -36279,8 +37024,8 @@
         <w:t xml:space="preserve">In Japanese: answers may sometimes come back in English.</w:t>
       </w:r>
     </w:p>
-    <w:bookmarkEnd w:id="128"/>
-    <w:bookmarkStart w:id="129" w:name="X3844b1df921221e4178b1e0dc04ae5221cb5fd7"/>
+    <w:bookmarkEnd w:id="129"/>
+    <w:bookmarkStart w:id="130" w:name="X3844b1df921221e4178b1e0dc04ae5221cb5fd7"/>
     <w:p>
       <w:pPr>
         <w:pStyle w:val="Heading3"/>
@@ -36337,8 +37082,8 @@
         <w:t xml:space="preserve">The finding: at the end of calendar H1 (30 June) no group was above 90%; at the end of FY2026 H1, Orchid Group was at 94%. It's invisible one subsidiary at a time.</w:t>
       </w:r>
     </w:p>
-    <w:bookmarkEnd w:id="129"/>
-    <w:bookmarkStart w:id="130" w:name="Xac96626fb8cbd7ee451eacbb53f594e81eb513b"/>
+    <w:bookmarkEnd w:id="130"/>
+    <w:bookmarkStart w:id="131" w:name="Xac96626fb8cbd7ee451eacbb53f594e81eb513b"/>
     <w:p>
       <w:pPr>
         <w:pStyle w:val="Heading3"/>
@@ -36395,8 +37140,8 @@
         <w:t xml:space="preserve">In testing, the facilitator saw all 12 branches; the attendee saw SIN only, with names masked.</w:t>
       </w:r>
     </w:p>
-    <w:bookmarkEnd w:id="130"/>
-    <w:bookmarkStart w:id="131" w:name="slide-39-15-minute-break"/>
+    <w:bookmarkEnd w:id="131"/>
+    <w:bookmarkStart w:id="132" w:name="slide-39-15-minute-break"/>
     <w:p>
       <w:pPr>
         <w:pStyle w:val="Heading3"/>
@@ -36441,9 +37186,9 @@
         <w:t xml:space="preserve">Progress board on screen: read out how many people found the group.</w:t>
       </w:r>
     </w:p>
-    <w:bookmarkEnd w:id="131"/>
     <w:bookmarkEnd w:id="132"/>
-    <w:bookmarkStart w:id="139" w:name="genie-code--255"/>
+    <w:bookmarkEnd w:id="133"/>
+    <w:bookmarkStart w:id="140" w:name="genie-code--255"/>
     <w:p>
       <w:pPr>
         <w:pStyle w:val="Heading2"/>
@@ -36452,7 +37197,7 @@
         <w:t xml:space="preserve">Genie Code · 2:55</w:t>
       </w:r>
     </w:p>
-    <w:bookmarkStart w:id="133" w:name="X08a40729537dc60ea912bc97cdf9abda17fc3dd"/>
+    <w:bookmarkStart w:id="134" w:name="X08a40729537dc60ea912bc97cdf9abda17fc3dd"/>
     <w:p>
       <w:pPr>
         <w:pStyle w:val="Heading3"/>
@@ -36497,8 +37242,8 @@
         <w:t xml:space="preserve">Many people already use Genie Code, so skip the autocomplete basics: lead with agent mode, the legacy-SQL conversion and the approval settings.</w:t>
       </w:r>
     </w:p>
-    <w:bookmarkEnd w:id="133"/>
-    <w:bookmarkStart w:id="134" w:name="slide-41-genie-code--1-explore"/>
+    <w:bookmarkEnd w:id="134"/>
+    <w:bookmarkStart w:id="135" w:name="slide-41-genie-code--1-explore"/>
     <w:p>
       <w:pPr>
         <w:pStyle w:val="Heading3"/>
@@ -36543,8 +37288,8 @@
         <w:t xml:space="preserve">Fallback: rehearse these exact prompts in the dry run and keep screenshots. If the output varies on the day, say so: that's why the human stays in the loop.</w:t>
       </w:r>
     </w:p>
-    <w:bookmarkEnd w:id="134"/>
-    <w:bookmarkStart w:id="135" w:name="slide-42-genie-code--2-generate"/>
+    <w:bookmarkEnd w:id="135"/>
+    <w:bookmarkStart w:id="136" w:name="slide-42-genie-code--2-generate"/>
     <w:p>
       <w:pPr>
         <w:pStyle w:val="Heading3"/>
@@ -36589,8 +37334,8 @@
         <w:t xml:space="preserve">Let it run; talk through the plan it shows while it works.</w:t>
       </w:r>
     </w:p>
-    <w:bookmarkEnd w:id="135"/>
-    <w:bookmarkStart w:id="136" w:name="X84781953f5c0511e75456a28caf4b52bd55f198"/>
+    <w:bookmarkEnd w:id="136"/>
+    <w:bookmarkStart w:id="137" w:name="X84781953f5c0511e75456a28caf4b52bd55f198"/>
     <w:p>
       <w:pPr>
         <w:pStyle w:val="Heading3"/>
@@ -36647,8 +37392,8 @@
         <w:t xml:space="preserve">For hundreds of stored procedures, Lakebridge (Databricks' migration toolkit) is the at-scale route.</w:t>
       </w:r>
     </w:p>
-    <w:bookmarkEnd w:id="136"/>
-    <w:bookmarkStart w:id="137" w:name="slide-44-you-stay-in-control"/>
+    <w:bookmarkEnd w:id="137"/>
+    <w:bookmarkStart w:id="138" w:name="slide-44-you-stay-in-control"/>
     <w:p>
       <w:pPr>
         <w:pStyle w:val="Heading3"/>
@@ -36705,8 +37450,8 @@
         <w:t xml:space="preserve">Roll back a change with the notebook's revision history.</w:t>
       </w:r>
     </w:p>
-    <w:bookmarkEnd w:id="137"/>
-    <w:bookmarkStart w:id="138" w:name="X5cf55dd12d448000ca9758895345e91b20013a2"/>
+    <w:bookmarkEnd w:id="138"/>
+    <w:bookmarkStart w:id="139" w:name="X5cf55dd12d448000ca9758895345e91b20013a2"/>
     <w:p>
       <w:pPr>
         <w:pStyle w:val="Heading3"/>
@@ -36751,9 +37496,9 @@
         <w:t xml:space="preserve">Measured on April balances instead, FX is 19%, so say which method you used.</w:t>
       </w:r>
     </w:p>
-    <w:bookmarkEnd w:id="138"/>
     <w:bookmarkEnd w:id="139"/>
-    <w:bookmarkStart w:id="145" w:name="quiz-and-close--310"/>
+    <w:bookmarkEnd w:id="140"/>
+    <w:bookmarkStart w:id="146" w:name="quiz-and-close--310"/>
     <w:p>
       <w:pPr>
         <w:pStyle w:val="Heading2"/>
@@ -36762,7 +37507,7 @@
         <w:t xml:space="preserve">Quiz and close · 3:10</w:t>
       </w:r>
     </w:p>
-    <w:bookmarkStart w:id="140" w:name="slide-46-quiz-join-on-your-phone"/>
+    <w:bookmarkStart w:id="141" w:name="slide-46-quiz-join-on-your-phone"/>
     <w:p>
       <w:pPr>
         <w:pStyle w:val="Heading3"/>
@@ -36819,8 +37564,8 @@
         <w:t xml:space="preserve">If Slido is blocked on the SMBC network: phones on mobile data, or read the questions out and take answers by show of hands.</w:t>
       </w:r>
     </w:p>
-    <w:bookmarkEnd w:id="140"/>
-    <w:bookmarkStart w:id="141" w:name="slide-47-what-you-found-today"/>
+    <w:bookmarkEnd w:id="141"/>
+    <w:bookmarkStart w:id="142" w:name="slide-47-what-you-found-today"/>
     <w:p>
       <w:pPr>
         <w:pStyle w:val="Heading3"/>
@@ -36865,8 +37610,8 @@
         <w:t xml:space="preserve">A second signal to follow up: trade-finance arrears in Ho Chi Minh City crept from 1.1% to 9.6% of exposure, against 0.4% across the whole book.</w:t>
       </w:r>
     </w:p>
-    <w:bookmarkEnd w:id="141"/>
-    <w:bookmarkStart w:id="142" w:name="slide-48-keep-learning"/>
+    <w:bookmarkEnd w:id="142"/>
+    <w:bookmarkStart w:id="143" w:name="slide-48-keep-learning"/>
     <w:p>
       <w:pPr>
         <w:pStyle w:val="Heading3"/>
@@ -36911,8 +37656,8 @@
         <w:t xml:space="preserve">Add a QR code to databricks.com/learn/training when you generate the deck.</w:t>
       </w:r>
     </w:p>
-    <w:bookmarkEnd w:id="142"/>
-    <w:bookmarkStart w:id="143" w:name="X5e5547bbb747112bea4653c240605f567b5bd8f"/>
+    <w:bookmarkEnd w:id="143"/>
+    <w:bookmarkStart w:id="144" w:name="X5e5547bbb747112bea4653c240605f567b5bd8f"/>
     <w:p>
       <w:pPr>
         <w:pStyle w:val="Heading3"/>
@@ -36945,8 +37690,8 @@
         <w:t xml:space="preserve">A proposal: agree the wording with SMBC before the day.</w:t>
       </w:r>
     </w:p>
-    <w:bookmarkEnd w:id="143"/>
-    <w:bookmarkStart w:id="144" w:name="slide-50-thank-you"/>
+    <w:bookmarkEnd w:id="144"/>
+    <w:bookmarkStart w:id="145" w:name="slide-50-thank-you"/>
     <w:p>
       <w:pPr>
         <w:pStyle w:val="Heading3"/>
@@ -37003,9 +37748,9 @@
         <w:t xml:space="preserve">Thank the SMBC organisers and the helpers.</w:t>
       </w:r>
     </w:p>
-    <w:bookmarkEnd w:id="144"/>
     <w:bookmarkEnd w:id="145"/>
     <w:bookmarkEnd w:id="146"/>
+    <w:bookmarkEnd w:id="147"/>
     <w:sectPr>
       <w:footnotePr>
         <w:numRestart w:val="eachSect"/>

</xml_diff>

<commit_message>
Use only current product names, and space out the walkthrough's sections
- Genie One, Genie Agents and Genie Code throughout, as in the current
  Azure Databricks docs: no "formerly" notes or old-to-new names table,
  Genie Code (not "the AI assistant") on the dashboard canvas, and Agent
  mode only for Genie Agents. Quiz question 9 no longer asks for an old
  name. Lakeflow Pipelines is described as Spark Declarative Pipelines.
- The walkthrough Doc gets 24 pt above each section, 18 pt above each
  subsection and room after tables, lists and code blocks; its uneven
  horizontal rules are dropped.
- The workbook, lab notebooks, handouts and walkthrough are rebuilt.

Co-authored-by: Isaac <no-reply@databricks.com>
</commit_message>
<xml_diff>
--- a/facilitator/dist/Workshop_Walkthrough.docx
+++ b/facilitator/dist/Workshop_Walkthrough.docx
@@ -1568,6 +1568,7 @@
     <w:p>
       <w:pPr>
         <w:pStyle w:val="BodyText"/>
+        <w:spacing w:before="200"/>
       </w:pPr>
       <w:r>
         <w:rPr>
@@ -1731,6 +1732,7 @@
     <w:p>
       <w:pPr>
         <w:pStyle w:val="FirstParagraph"/>
+        <w:spacing w:before="200"/>
       </w:pPr>
       <w:r>
         <w:rPr>
@@ -1744,13 +1746,6 @@
       </w:r>
       <w:r>
         <w:t xml:space="preserve">It's 8am on Monday at the APAC hub. The Credit Committee wants the top counterparty-group exposures across all booking branches, in USD and JPY, by 10am. Today that means four system extracts, a spreadsheet of limits, and days of reconciliation. In Lab 1 participants automate it, in Lab 2 they make it self-service, and in the Genie Code segment they investigate what they found. Section 1 of Part 3 tells the full story, as participants read it.</w:t>
-      </w:r>
-    </w:p>
-    <w:p>
-      <w:r>
-        <w:pict>
-          <v:rect style="width:0;height:1.5pt" o:hralign="center" o:hrstd="t" o:hr="t"/>
-        </w:pict>
       </w:r>
     </w:p>
     <w:bookmarkEnd w:id="10"/>
@@ -2361,7 +2356,7 @@
               <w:pStyle w:val="Compact"/>
             </w:pPr>
             <w:r>
-              <w:t xml:space="preserve">AI/BI dashboards, Genie Agents, and Genie One (formerly Databricks One)</w:t>
+              <w:t xml:space="preserve">AI/BI dashboards, Genie Agents, and Genie One</w:t>
             </w:r>
           </w:p>
         </w:tc>
@@ -2773,50 +2768,7 @@
     <w:p>
       <w:pPr>
         <w:pStyle w:val="BodyText"/>
-      </w:pPr>
-      <w:r>
-        <w:rPr>
-          <w:b/>
-          <w:bCs/>
-        </w:rPr>
-        <w:t xml:space="preserve">Product names changed in 2026.</w:t>
-      </w:r>
-      <w:r>
-        <w:t xml:space="preserve"> </w:t>
-      </w:r>
-      <w:r>
-        <w:t xml:space="preserve">Genie spaces are now</w:t>
-      </w:r>
-      <w:r>
-        <w:t xml:space="preserve"> </w:t>
-      </w:r>
-      <w:r>
-        <w:rPr>
-          <w:b/>
-          <w:bCs/>
-        </w:rPr>
-        <w:t xml:space="preserve">Genie Agents</w:t>
-      </w:r>
-      <w:r>
-        <w:t xml:space="preserve">, and Databricks One is now</w:t>
-      </w:r>
-      <w:r>
-        <w:t xml:space="preserve"> </w:t>
-      </w:r>
-      <w:r>
-        <w:rPr>
-          <w:b/>
-          <w:bCs/>
-        </w:rPr>
-        <w:t xml:space="preserve">Genie One</w:t>
-      </w:r>
-      <w:r>
-        <w:t xml:space="preserve">. This guide uses the current names, which match the product and the documentation participants will see.</w:t>
-      </w:r>
-    </w:p>
-    <w:p>
-      <w:pPr>
-        <w:pStyle w:val="BodyText"/>
+        <w:spacing w:before="200"/>
       </w:pPr>
       <w:r>
         <w:rPr>
@@ -2848,13 +2800,6 @@
       </w:pPr>
       <w:r>
         <w:t xml:space="preserve">Consider swapping the last two slots so the prize-giving closes the session, and make the feedback survey the raffle ticket.</w:t>
-      </w:r>
-    </w:p>
-    <w:p>
-      <w:r>
-        <w:pict>
-          <v:rect style="width:0;height:1.5pt" o:hralign="center" o:hrstd="t" o:hr="t"/>
-        </w:pict>
       </w:r>
     </w:p>
     <w:bookmarkEnd w:id="11"/>
@@ -7037,6 +6982,7 @@
     <w:p>
       <w:pPr>
         <w:pStyle w:val="BodyText"/>
+        <w:spacing w:before="200"/>
       </w:pPr>
       <w:r>
         <w:t xml:space="preserve">If the organisers swap the last two slots (guide §2), the prizes close the session and the raffle draw comes straight after the survey.</w:t>
@@ -7560,6 +7506,7 @@
     <w:p>
       <w:pPr>
         <w:pStyle w:val="BodyText"/>
+        <w:spacing w:before="200"/>
       </w:pPr>
       <w:r>
         <w:rPr>
@@ -7817,7 +7764,7 @@
               <w:pStyle w:val="Compact"/>
             </w:pPr>
             <w:r>
-              <w:t xml:space="preserve">The AI-assisted chart prompt, Genie Agent creation and its suggested descriptions, the fiscal-year test, agent mode, Export to metric view</w:t>
+              <w:t xml:space="preserve">The Genie Code chart prompt, Genie Agent creation and its suggested descriptions, the fiscal-year test, Agent mode, Export to metric view</w:t>
             </w:r>
           </w:p>
         </w:tc>
@@ -8008,6 +7955,7 @@
     <w:p>
       <w:pPr>
         <w:pStyle w:val="BodyText"/>
+        <w:spacing w:before="200"/>
       </w:pPr>
       <w:r>
         <w:rPr>
@@ -8659,6 +8607,7 @@
     <w:p>
       <w:pPr>
         <w:pStyle w:val="BodyText"/>
+        <w:spacing w:before="200"/>
       </w:pPr>
       <w:r>
         <w:rPr>
@@ -8866,6 +8815,7 @@
     <w:p>
       <w:pPr>
         <w:pStyle w:val="FirstParagraph"/>
+        <w:spacing w:before="200"/>
       </w:pPr>
       <w:r>
         <w:rPr>
@@ -9025,13 +8975,6 @@
         <w:t xml:space="preserve">Then reveal what the duplicate extract would have done to the Credit Committee pack.</w:t>
       </w:r>
     </w:p>
-    <w:p>
-      <w:r>
-        <w:pict>
-          <v:rect style="width:0;height:1.5pt" o:hralign="center" o:hrstd="t" o:hr="t"/>
-        </w:pict>
-      </w:r>
-    </w:p>
     <w:bookmarkEnd w:id="22"/>
     <w:bookmarkStart w:id="23" w:name="X1b995b6b6f24ff5642288ea412327520c1c696a"/>
     <w:p>
@@ -9153,13 +9096,6 @@
       </w:r>
       <w:r>
         <w:t xml:space="preserve">on borrower names. A facilitator and a volunteer ask the same question and get different, correct answers: the Genie Agent inherits Unity Catalog permissions rather than bypassing them.</w:t>
-      </w:r>
-    </w:p>
-    <w:p>
-      <w:r>
-        <w:pict>
-          <v:rect style="width:0;height:1.5pt" o:hralign="center" o:hrstd="t" o:hr="t"/>
-        </w:pict>
       </w:r>
     </w:p>
     <w:bookmarkEnd w:id="24"/>
@@ -14481,7 +14417,7 @@
               <w:pStyle w:val="Compact"/>
             </w:pPr>
             <w:r>
-              <w:t xml:space="preserve">What's the new name for Databricks One?</w:t>
+              <w:t xml:space="preserve">Where do business users open dashboards and ask questions, without the rest of the workspace?</w:t>
             </w:r>
           </w:p>
         </w:tc>
@@ -14535,7 +14471,7 @@
               <w:pStyle w:val="Compact"/>
             </w:pPr>
             <w:r>
-              <w:t xml:space="preserve">And Genie spaces are now Genie Agents.</w:t>
+              <w:t xml:space="preserve">Users with only Consumer access land there, and see only what's been shared with them.</w:t>
             </w:r>
           </w:p>
         </w:tc>
@@ -14851,6 +14787,7 @@
     <w:p>
       <w:pPr>
         <w:pStyle w:val="BodyText"/>
+        <w:spacing w:before="200"/>
       </w:pPr>
       <w:r>
         <w:rPr>
@@ -15655,6 +15592,7 @@
     <w:p>
       <w:pPr>
         <w:pStyle w:val="FirstParagraph"/>
+        <w:spacing w:before="200"/>
       </w:pPr>
       <w:r>
         <w:t xml:space="preserve">Say on the survey how emails will be used (the raffle draw and the recap email only). Draw the winners from respondents who left an email, and announce them at the close, or in the recap email if the survey stays open.</w:t>
@@ -15845,6 +15783,7 @@
     <w:p>
       <w:pPr>
         <w:pStyle w:val="FirstParagraph"/>
+        <w:spacing w:before="200"/>
       </w:pPr>
       <w:r>
         <w:rPr>
@@ -15990,6 +15929,7 @@
     <w:p>
       <w:pPr>
         <w:pStyle w:val="BlockText"/>
+        <w:spacing w:before="200"/>
       </w:pPr>
       <w:r>
         <w:rPr>
@@ -16607,6 +16547,7 @@
     <w:p>
       <w:pPr>
         <w:pStyle w:val="FirstParagraph"/>
+        <w:spacing w:before="200"/>
       </w:pPr>
       <w:r>
         <w:rPr>
@@ -16722,13 +16663,6 @@
       </w:r>
       <w:r>
         <w:t xml:space="preserve">hold the Lab 1 result, so you can carry on with Lab 2 and the Genie Code segment whatever happens in Lab 1.</w:t>
-      </w:r>
-    </w:p>
-    <w:p>
-      <w:r>
-        <w:pict>
-          <v:rect style="width:0;height:1.5pt" o:hralign="center" o:hrstd="t" o:hr="t"/>
-        </w:pict>
       </w:r>
     </w:p>
     <w:bookmarkEnd w:id="42"/>
@@ -17258,6 +17192,7 @@
     <w:p>
       <w:pPr>
         <w:pStyle w:val="BodyText"/>
+        <w:spacing w:before="200"/>
       </w:pPr>
       <w:r>
         <w:t xml:space="preserve">By the end of the day you can answer the CDAO's question yourself, with numbers you can trace back to the source files. The quiz checks what you found.</w:t>
@@ -18544,13 +18479,6 @@
         </w:tc>
       </w:tr>
     </w:tbl>
-    <w:p>
-      <w:r>
-        <w:pict>
-          <v:rect style="width:0;height:1.5pt" o:hralign="center" o:hrstd="t" o:hr="t"/>
-        </w:pict>
-      </w:r>
-    </w:p>
     <w:bookmarkEnd w:id="46"/>
     <w:bookmarkEnd w:id="47"/>
     <w:bookmarkStart w:id="50" w:name="Xf9ab387f240c1d7b77102b3fc5a313034401255"/>
@@ -19469,6 +19397,7 @@
     <w:p>
       <w:pPr>
         <w:pStyle w:val="FirstParagraph"/>
+        <w:spacing w:before="200"/>
       </w:pPr>
       <w:r>
         <w:t xml:space="preserve">Set</w:t>
@@ -19887,6 +19816,7 @@
     <w:p>
       <w:pPr>
         <w:pStyle w:val="FirstParagraph"/>
+        <w:spacing w:before="200"/>
       </w:pPr>
       <w:r>
         <w:rPr>
@@ -20008,6 +19938,7 @@
     <w:p>
       <w:pPr>
         <w:pStyle w:val="FirstParagraph"/>
+        <w:spacing w:before="200"/>
       </w:pPr>
       <w:r>
         <w:rPr>
@@ -20230,6 +20161,7 @@
     <w:p>
       <w:pPr>
         <w:pStyle w:val="FirstParagraph"/>
+        <w:spacing w:before="200"/>
       </w:pPr>
       <w:r>
         <w:rPr>
@@ -20737,7 +20669,7 @@
         <w:t xml:space="preserve"> </w:t>
       </w:r>
       <w:r>
-        <w:t xml:space="preserve">with Genie Code in agent mode, using expectations (</w:t>
+        <w:t xml:space="preserve">with Genie Code, using expectations (</w:t>
       </w:r>
       <w:r>
         <w:rPr>
@@ -20821,13 +20753,6 @@
         <w:t xml:space="preserve">. Better metadata means better Genie answers in Lab 2.</w:t>
       </w:r>
     </w:p>
-    <w:p>
-      <w:r>
-        <w:pict>
-          <v:rect style="width:0;height:1.5pt" o:hralign="center" o:hrstd="t" o:hr="t"/>
-        </w:pict>
-      </w:r>
-    </w:p>
     <w:bookmarkEnd w:id="49"/>
     <w:bookmarkEnd w:id="50"/>
     <w:bookmarkStart w:id="53" w:name="X9a77c333740725278a0e5799fead1c7fecd3a5a"/>
@@ -21008,7 +20933,7 @@
         </w:numPr>
       </w:pPr>
       <w:r>
-        <w:t xml:space="preserve">On the canvas, ask the AI assistant:</w:t>
+        <w:t xml:space="preserve">On the canvas, ask Genie Code:</w:t>
       </w:r>
       <w:r>
         <w:t xml:space="preserve"> </w:t>
@@ -21224,6 +21149,7 @@
     <w:p>
       <w:pPr>
         <w:pStyle w:val="FirstParagraph"/>
+        <w:spacing w:before="200"/>
       </w:pPr>
       <w:r>
         <w:rPr>
@@ -21362,6 +21288,7 @@
     <w:p>
       <w:pPr>
         <w:pStyle w:val="FirstParagraph"/>
+        <w:spacing w:before="200"/>
       </w:pPr>
       <w:r>
         <w:rPr>
@@ -21462,6 +21389,7 @@
     <w:p>
       <w:pPr>
         <w:pStyle w:val="FirstParagraph"/>
+        <w:spacing w:before="200"/>
       </w:pPr>
       <w:r>
         <w:t xml:space="preserve">Open the SQL and check which dates Genie used. Then add the fiscal-year instruction (A.4) and ask both again.</w:t>
@@ -21812,13 +21740,6 @@
         <w:t xml:space="preserve">to turn the definitions you taught it into a governed metric view.</w:t>
       </w:r>
     </w:p>
-    <w:p>
-      <w:r>
-        <w:pict>
-          <v:rect style="width:0;height:1.5pt" o:hralign="center" o:hrstd="t" o:hr="t"/>
-        </w:pict>
-      </w:r>
-    </w:p>
     <w:bookmarkEnd w:id="52"/>
     <w:bookmarkEnd w:id="53"/>
     <w:bookmarkStart w:id="54" w:name="Xc8c189ae206b9c8161ed9c9b5ce289ed9124509"/>
@@ -22046,13 +21967,6 @@
       </w:pPr>
       <w:r>
         <w:t xml:space="preserve">Roll back a change with revision history.</w:t>
-      </w:r>
-    </w:p>
-    <w:p>
-      <w:r>
-        <w:pict>
-          <v:rect style="width:0;height:1.5pt" o:hralign="center" o:hrstd="t" o:hr="t"/>
-        </w:pict>
       </w:r>
     </w:p>
     <w:bookmarkEnd w:id="54"/>
@@ -22527,13 +22441,6 @@
         </w:tc>
       </w:tr>
     </w:tbl>
-    <w:p>
-      <w:r>
-        <w:pict>
-          <v:rect style="width:0;height:1.5pt" o:hralign="center" o:hrstd="t" o:hr="t"/>
-        </w:pict>
-      </w:r>
-    </w:p>
     <w:bookmarkEnd w:id="61"/>
     <w:bookmarkStart w:id="71" w:name="appendix-a-copy-paste-kit"/>
     <w:p>
@@ -23466,6 +23373,7 @@
     <w:p>
       <w:pPr>
         <w:pStyle w:val="FirstParagraph"/>
+        <w:spacing w:before="200"/>
       </w:pPr>
       <w:r>
         <w:rPr>
@@ -25528,13 +25436,6 @@
           <w:rStyle w:val="ControlFlowTok"/>
         </w:rPr>
         <w:t xml:space="preserve">END</w:t>
-      </w:r>
-    </w:p>
-    <w:p>
-      <w:r>
-        <w:pict>
-          <v:rect style="width:0;height:1.5pt" o:hralign="center" o:hrstd="t" o:hr="t"/>
-        </w:pict>
       </w:r>
     </w:p>
     <w:bookmarkEnd w:id="70"/>
@@ -25719,7 +25620,7 @@
               <w:pStyle w:val="Compact"/>
             </w:pPr>
             <w:r>
-              <w:t xml:space="preserve">Genie Code prompts in Designer or agent mode are unavailable</w:t>
+              <w:t xml:space="preserve">Genie Code prompts in Designer, or a Genie Agent's Agent mode, are unavailable</w:t>
             </w:r>
           </w:p>
         </w:tc>
@@ -26654,13 +26555,13 @@
         <w:tblLook w:firstRow="1" w:lastRow="0" w:firstColumn="0" w:lastColumn="0" w:noHBand="0" w:noVBand="0" w:val="0020"/>
       </w:tblPr>
       <w:tblGrid>
-        <w:gridCol w:w="447"/>
-        <w:gridCol w:w="1931"/>
-        <w:gridCol w:w="2045"/>
-        <w:gridCol w:w="1361"/>
-        <w:gridCol w:w="1246"/>
-        <w:gridCol w:w="1703"/>
-        <w:gridCol w:w="904"/>
+        <w:gridCol w:w="464"/>
+        <w:gridCol w:w="2002"/>
+        <w:gridCol w:w="1766"/>
+        <w:gridCol w:w="1411"/>
+        <w:gridCol w:w="1292"/>
+        <w:gridCol w:w="1766"/>
+        <w:gridCol w:w="937"/>
       </w:tblGrid>
       <w:tr>
         <w:trPr>
@@ -26668,7 +26569,7 @@
         </w:trPr>
         <w:tc>
           <w:tcPr>
-            <w:tcW w:w="447" w:type="dxa"/>
+            <w:tcW w:w="464" w:type="dxa"/>
             <w:tcBorders>
               <w:top w:val="single" w:sz="4" w:space="0" w:color="BFBFBF"/>
               <w:left w:val="single" w:sz="4" w:space="0" w:color="BFBFBF"/>
@@ -26691,7 +26592,7 @@
         </w:tc>
         <w:tc>
           <w:tcPr>
-            <w:tcW w:w="1931" w:type="dxa"/>
+            <w:tcW w:w="2002" w:type="dxa"/>
             <w:tcBorders>
               <w:top w:val="single" w:sz="4" w:space="0" w:color="BFBFBF"/>
               <w:left w:val="single" w:sz="4" w:space="0" w:color="BFBFBF"/>
@@ -26714,7 +26615,7 @@
         </w:tc>
         <w:tc>
           <w:tcPr>
-            <w:tcW w:w="2045" w:type="dxa"/>
+            <w:tcW w:w="1766" w:type="dxa"/>
             <w:tcBorders>
               <w:top w:val="single" w:sz="4" w:space="0" w:color="BFBFBF"/>
               <w:left w:val="single" w:sz="4" w:space="0" w:color="BFBFBF"/>
@@ -26737,7 +26638,7 @@
         </w:tc>
         <w:tc>
           <w:tcPr>
-            <w:tcW w:w="1361" w:type="dxa"/>
+            <w:tcW w:w="1411" w:type="dxa"/>
             <w:tcBorders>
               <w:top w:val="single" w:sz="4" w:space="0" w:color="BFBFBF"/>
               <w:left w:val="single" w:sz="4" w:space="0" w:color="BFBFBF"/>
@@ -26760,7 +26661,7 @@
         </w:tc>
         <w:tc>
           <w:tcPr>
-            <w:tcW w:w="1246" w:type="dxa"/>
+            <w:tcW w:w="1292" w:type="dxa"/>
             <w:tcBorders>
               <w:top w:val="single" w:sz="4" w:space="0" w:color="BFBFBF"/>
               <w:left w:val="single" w:sz="4" w:space="0" w:color="BFBFBF"/>
@@ -26783,7 +26684,7 @@
         </w:tc>
         <w:tc>
           <w:tcPr>
-            <w:tcW w:w="1703" w:type="dxa"/>
+            <w:tcW w:w="1766" w:type="dxa"/>
             <w:tcBorders>
               <w:top w:val="single" w:sz="4" w:space="0" w:color="BFBFBF"/>
               <w:left w:val="single" w:sz="4" w:space="0" w:color="BFBFBF"/>
@@ -26806,7 +26707,7 @@
         </w:tc>
         <w:tc>
           <w:tcPr>
-            <w:tcW w:w="904" w:type="dxa"/>
+            <w:tcW w:w="937" w:type="dxa"/>
             <w:tcBorders>
               <w:top w:val="single" w:sz="4" w:space="0" w:color="BFBFBF"/>
               <w:left w:val="single" w:sz="4" w:space="0" w:color="BFBFBF"/>
@@ -26831,7 +26732,7 @@
       <w:tr>
         <w:tc>
           <w:tcPr>
-            <w:tcW w:w="447" w:type="dxa"/>
+            <w:tcW w:w="464" w:type="dxa"/>
             <w:tcBorders>
               <w:top w:val="single" w:sz="4" w:space="0" w:color="BFBFBF"/>
               <w:left w:val="single" w:sz="4" w:space="0" w:color="BFBFBF"/>
@@ -26850,7 +26751,7 @@
         </w:tc>
         <w:tc>
           <w:tcPr>
-            <w:tcW w:w="1931" w:type="dxa"/>
+            <w:tcW w:w="2002" w:type="dxa"/>
             <w:tcBorders>
               <w:top w:val="single" w:sz="4" w:space="0" w:color="BFBFBF"/>
               <w:left w:val="single" w:sz="4" w:space="0" w:color="BFBFBF"/>
@@ -26869,7 +26770,7 @@
         </w:tc>
         <w:tc>
           <w:tcPr>
-            <w:tcW w:w="2045" w:type="dxa"/>
+            <w:tcW w:w="1766" w:type="dxa"/>
             <w:tcBorders>
               <w:top w:val="single" w:sz="4" w:space="0" w:color="BFBFBF"/>
               <w:left w:val="single" w:sz="4" w:space="0" w:color="BFBFBF"/>
@@ -26888,7 +26789,7 @@
         </w:tc>
         <w:tc>
           <w:tcPr>
-            <w:tcW w:w="1361" w:type="dxa"/>
+            <w:tcW w:w="1411" w:type="dxa"/>
             <w:tcBorders>
               <w:top w:val="single" w:sz="4" w:space="0" w:color="BFBFBF"/>
               <w:left w:val="single" w:sz="4" w:space="0" w:color="BFBFBF"/>
@@ -26907,7 +26808,7 @@
         </w:tc>
         <w:tc>
           <w:tcPr>
-            <w:tcW w:w="1246" w:type="dxa"/>
+            <w:tcW w:w="1292" w:type="dxa"/>
             <w:tcBorders>
               <w:top w:val="single" w:sz="4" w:space="0" w:color="BFBFBF"/>
               <w:left w:val="single" w:sz="4" w:space="0" w:color="BFBFBF"/>
@@ -26926,7 +26827,7 @@
         </w:tc>
         <w:tc>
           <w:tcPr>
-            <w:tcW w:w="1703" w:type="dxa"/>
+            <w:tcW w:w="1766" w:type="dxa"/>
             <w:tcBorders>
               <w:top w:val="single" w:sz="4" w:space="0" w:color="BFBFBF"/>
               <w:left w:val="single" w:sz="4" w:space="0" w:color="BFBFBF"/>
@@ -26945,7 +26846,7 @@
         </w:tc>
         <w:tc>
           <w:tcPr>
-            <w:tcW w:w="904" w:type="dxa"/>
+            <w:tcW w:w="937" w:type="dxa"/>
             <w:tcBorders>
               <w:top w:val="single" w:sz="4" w:space="0" w:color="BFBFBF"/>
               <w:left w:val="single" w:sz="4" w:space="0" w:color="BFBFBF"/>
@@ -26966,7 +26867,7 @@
       <w:tr>
         <w:tc>
           <w:tcPr>
-            <w:tcW w:w="447" w:type="dxa"/>
+            <w:tcW w:w="464" w:type="dxa"/>
             <w:tcBorders>
               <w:top w:val="single" w:sz="4" w:space="0" w:color="BFBFBF"/>
               <w:left w:val="single" w:sz="4" w:space="0" w:color="BFBFBF"/>
@@ -26985,7 +26886,7 @@
         </w:tc>
         <w:tc>
           <w:tcPr>
-            <w:tcW w:w="1931" w:type="dxa"/>
+            <w:tcW w:w="2002" w:type="dxa"/>
             <w:tcBorders>
               <w:top w:val="single" w:sz="4" w:space="0" w:color="BFBFBF"/>
               <w:left w:val="single" w:sz="4" w:space="0" w:color="BFBFBF"/>
@@ -27004,7 +26905,7 @@
         </w:tc>
         <w:tc>
           <w:tcPr>
-            <w:tcW w:w="2045" w:type="dxa"/>
+            <w:tcW w:w="1766" w:type="dxa"/>
             <w:tcBorders>
               <w:top w:val="single" w:sz="4" w:space="0" w:color="BFBFBF"/>
               <w:left w:val="single" w:sz="4" w:space="0" w:color="BFBFBF"/>
@@ -27023,7 +26924,7 @@
         </w:tc>
         <w:tc>
           <w:tcPr>
-            <w:tcW w:w="1361" w:type="dxa"/>
+            <w:tcW w:w="1411" w:type="dxa"/>
             <w:tcBorders>
               <w:top w:val="single" w:sz="4" w:space="0" w:color="BFBFBF"/>
               <w:left w:val="single" w:sz="4" w:space="0" w:color="BFBFBF"/>
@@ -27042,7 +26943,7 @@
         </w:tc>
         <w:tc>
           <w:tcPr>
-            <w:tcW w:w="1246" w:type="dxa"/>
+            <w:tcW w:w="1292" w:type="dxa"/>
             <w:tcBorders>
               <w:top w:val="single" w:sz="4" w:space="0" w:color="BFBFBF"/>
               <w:left w:val="single" w:sz="4" w:space="0" w:color="BFBFBF"/>
@@ -27061,23 +26962,23 @@
         </w:tc>
         <w:tc>
           <w:tcPr>
-            <w:tcW w:w="1703" w:type="dxa"/>
-            <w:tcBorders>
-              <w:top w:val="single" w:sz="4" w:space="0" w:color="BFBFBF"/>
-              <w:left w:val="single" w:sz="4" w:space="0" w:color="BFBFBF"/>
-              <w:bottom w:val="single" w:sz="4" w:space="0" w:color="BFBFBF"/>
-              <w:right w:val="single" w:sz="4" w:space="0" w:color="BFBFBF"/>
-            </w:tcBorders>
-          </w:tcPr>
-          <w:p>
-            <w:pPr>
-              <w:pStyle w:val="Compact"/>
-            </w:pPr>
-          </w:p>
-        </w:tc>
-        <w:tc>
-          <w:tcPr>
-            <w:tcW w:w="904" w:type="dxa"/>
+            <w:tcW w:w="1766" w:type="dxa"/>
+            <w:tcBorders>
+              <w:top w:val="single" w:sz="4" w:space="0" w:color="BFBFBF"/>
+              <w:left w:val="single" w:sz="4" w:space="0" w:color="BFBFBF"/>
+              <w:bottom w:val="single" w:sz="4" w:space="0" w:color="BFBFBF"/>
+              <w:right w:val="single" w:sz="4" w:space="0" w:color="BFBFBF"/>
+            </w:tcBorders>
+          </w:tcPr>
+          <w:p>
+            <w:pPr>
+              <w:pStyle w:val="Compact"/>
+            </w:pPr>
+          </w:p>
+        </w:tc>
+        <w:tc>
+          <w:tcPr>
+            <w:tcW w:w="937" w:type="dxa"/>
             <w:tcBorders>
               <w:top w:val="single" w:sz="4" w:space="0" w:color="BFBFBF"/>
               <w:left w:val="single" w:sz="4" w:space="0" w:color="BFBFBF"/>
@@ -27098,7 +26999,7 @@
       <w:tr>
         <w:tc>
           <w:tcPr>
-            <w:tcW w:w="447" w:type="dxa"/>
+            <w:tcW w:w="464" w:type="dxa"/>
             <w:tcBorders>
               <w:top w:val="single" w:sz="4" w:space="0" w:color="BFBFBF"/>
               <w:left w:val="single" w:sz="4" w:space="0" w:color="BFBFBF"/>
@@ -27117,7 +27018,7 @@
         </w:tc>
         <w:tc>
           <w:tcPr>
-            <w:tcW w:w="1931" w:type="dxa"/>
+            <w:tcW w:w="2002" w:type="dxa"/>
             <w:tcBorders>
               <w:top w:val="single" w:sz="4" w:space="0" w:color="BFBFBF"/>
               <w:left w:val="single" w:sz="4" w:space="0" w:color="BFBFBF"/>
@@ -27152,7 +27053,7 @@
         </w:tc>
         <w:tc>
           <w:tcPr>
-            <w:tcW w:w="2045" w:type="dxa"/>
+            <w:tcW w:w="1766" w:type="dxa"/>
             <w:tcBorders>
               <w:top w:val="single" w:sz="4" w:space="0" w:color="BFBFBF"/>
               <w:left w:val="single" w:sz="4" w:space="0" w:color="BFBFBF"/>
@@ -27171,7 +27072,7 @@
         </w:tc>
         <w:tc>
           <w:tcPr>
-            <w:tcW w:w="1361" w:type="dxa"/>
+            <w:tcW w:w="1411" w:type="dxa"/>
             <w:tcBorders>
               <w:top w:val="single" w:sz="4" w:space="0" w:color="BFBFBF"/>
               <w:left w:val="single" w:sz="4" w:space="0" w:color="BFBFBF"/>
@@ -27190,7 +27091,7 @@
         </w:tc>
         <w:tc>
           <w:tcPr>
-            <w:tcW w:w="1246" w:type="dxa"/>
+            <w:tcW w:w="1292" w:type="dxa"/>
             <w:tcBorders>
               <w:top w:val="single" w:sz="4" w:space="0" w:color="BFBFBF"/>
               <w:left w:val="single" w:sz="4" w:space="0" w:color="BFBFBF"/>
@@ -27209,23 +27110,23 @@
         </w:tc>
         <w:tc>
           <w:tcPr>
-            <w:tcW w:w="1703" w:type="dxa"/>
-            <w:tcBorders>
-              <w:top w:val="single" w:sz="4" w:space="0" w:color="BFBFBF"/>
-              <w:left w:val="single" w:sz="4" w:space="0" w:color="BFBFBF"/>
-              <w:bottom w:val="single" w:sz="4" w:space="0" w:color="BFBFBF"/>
-              <w:right w:val="single" w:sz="4" w:space="0" w:color="BFBFBF"/>
-            </w:tcBorders>
-          </w:tcPr>
-          <w:p>
-            <w:pPr>
-              <w:pStyle w:val="Compact"/>
-            </w:pPr>
-          </w:p>
-        </w:tc>
-        <w:tc>
-          <w:tcPr>
-            <w:tcW w:w="904" w:type="dxa"/>
+            <w:tcW w:w="1766" w:type="dxa"/>
+            <w:tcBorders>
+              <w:top w:val="single" w:sz="4" w:space="0" w:color="BFBFBF"/>
+              <w:left w:val="single" w:sz="4" w:space="0" w:color="BFBFBF"/>
+              <w:bottom w:val="single" w:sz="4" w:space="0" w:color="BFBFBF"/>
+              <w:right w:val="single" w:sz="4" w:space="0" w:color="BFBFBF"/>
+            </w:tcBorders>
+          </w:tcPr>
+          <w:p>
+            <w:pPr>
+              <w:pStyle w:val="Compact"/>
+            </w:pPr>
+          </w:p>
+        </w:tc>
+        <w:tc>
+          <w:tcPr>
+            <w:tcW w:w="937" w:type="dxa"/>
             <w:tcBorders>
               <w:top w:val="single" w:sz="4" w:space="0" w:color="BFBFBF"/>
               <w:left w:val="single" w:sz="4" w:space="0" w:color="BFBFBF"/>
@@ -27246,7 +27147,7 @@
       <w:tr>
         <w:tc>
           <w:tcPr>
-            <w:tcW w:w="447" w:type="dxa"/>
+            <w:tcW w:w="464" w:type="dxa"/>
             <w:tcBorders>
               <w:top w:val="single" w:sz="4" w:space="0" w:color="BFBFBF"/>
               <w:left w:val="single" w:sz="4" w:space="0" w:color="BFBFBF"/>
@@ -27265,7 +27166,7 @@
         </w:tc>
         <w:tc>
           <w:tcPr>
-            <w:tcW w:w="1931" w:type="dxa"/>
+            <w:tcW w:w="2002" w:type="dxa"/>
             <w:tcBorders>
               <w:top w:val="single" w:sz="4" w:space="0" w:color="BFBFBF"/>
               <w:left w:val="single" w:sz="4" w:space="0" w:color="BFBFBF"/>
@@ -27310,26 +27211,26 @@
         </w:tc>
         <w:tc>
           <w:tcPr>
-            <w:tcW w:w="2045" w:type="dxa"/>
-            <w:tcBorders>
-              <w:top w:val="single" w:sz="4" w:space="0" w:color="BFBFBF"/>
-              <w:left w:val="single" w:sz="4" w:space="0" w:color="BFBFBF"/>
-              <w:bottom w:val="single" w:sz="4" w:space="0" w:color="BFBFBF"/>
-              <w:right w:val="single" w:sz="4" w:space="0" w:color="BFBFBF"/>
-            </w:tcBorders>
-          </w:tcPr>
-          <w:p>
-            <w:pPr>
-              <w:pStyle w:val="Compact"/>
-            </w:pPr>
-            <w:r>
-              <w:t xml:space="preserve">Genie Agents, chat in Genie One, Genie Code's agentic features (including Designer's natural-language prompts), AI-assisted dashboard charts</w:t>
-            </w:r>
-          </w:p>
-        </w:tc>
-        <w:tc>
-          <w:tcPr>
-            <w:tcW w:w="1361" w:type="dxa"/>
+            <w:tcW w:w="1766" w:type="dxa"/>
+            <w:tcBorders>
+              <w:top w:val="single" w:sz="4" w:space="0" w:color="BFBFBF"/>
+              <w:left w:val="single" w:sz="4" w:space="0" w:color="BFBFBF"/>
+              <w:bottom w:val="single" w:sz="4" w:space="0" w:color="BFBFBF"/>
+              <w:right w:val="single" w:sz="4" w:space="0" w:color="BFBFBF"/>
+            </w:tcBorders>
+          </w:tcPr>
+          <w:p>
+            <w:pPr>
+              <w:pStyle w:val="Compact"/>
+            </w:pPr>
+            <w:r>
+              <w:t xml:space="preserve">Genie Agents, chat in Genie One, Genie Code's agentic features (including its prompts in Designer and on dashboards)</w:t>
+            </w:r>
+          </w:p>
+        </w:tc>
+        <w:tc>
+          <w:tcPr>
+            <w:tcW w:w="1411" w:type="dxa"/>
             <w:tcBorders>
               <w:top w:val="single" w:sz="4" w:space="0" w:color="BFBFBF"/>
               <w:left w:val="single" w:sz="4" w:space="0" w:color="BFBFBF"/>
@@ -27348,7 +27249,7 @@
         </w:tc>
         <w:tc>
           <w:tcPr>
-            <w:tcW w:w="1246" w:type="dxa"/>
+            <w:tcW w:w="1292" w:type="dxa"/>
             <w:tcBorders>
               <w:top w:val="single" w:sz="4" w:space="0" w:color="BFBFBF"/>
               <w:left w:val="single" w:sz="4" w:space="0" w:color="BFBFBF"/>
@@ -27367,7 +27268,7 @@
         </w:tc>
         <w:tc>
           <w:tcPr>
-            <w:tcW w:w="1703" w:type="dxa"/>
+            <w:tcW w:w="1766" w:type="dxa"/>
             <w:tcBorders>
               <w:top w:val="single" w:sz="4" w:space="0" w:color="BFBFBF"/>
               <w:left w:val="single" w:sz="4" w:space="0" w:color="BFBFBF"/>
@@ -27386,7 +27287,7 @@
         </w:tc>
         <w:tc>
           <w:tcPr>
-            <w:tcW w:w="904" w:type="dxa"/>
+            <w:tcW w:w="937" w:type="dxa"/>
             <w:tcBorders>
               <w:top w:val="single" w:sz="4" w:space="0" w:color="BFBFBF"/>
               <w:left w:val="single" w:sz="4" w:space="0" w:color="BFBFBF"/>
@@ -27407,7 +27308,7 @@
       <w:tr>
         <w:tc>
           <w:tcPr>
-            <w:tcW w:w="447" w:type="dxa"/>
+            <w:tcW w:w="464" w:type="dxa"/>
             <w:tcBorders>
               <w:top w:val="single" w:sz="4" w:space="0" w:color="BFBFBF"/>
               <w:left w:val="single" w:sz="4" w:space="0" w:color="BFBFBF"/>
@@ -27426,7 +27327,7 @@
         </w:tc>
         <w:tc>
           <w:tcPr>
-            <w:tcW w:w="1931" w:type="dxa"/>
+            <w:tcW w:w="2002" w:type="dxa"/>
             <w:tcBorders>
               <w:top w:val="single" w:sz="4" w:space="0" w:color="BFBFBF"/>
               <w:left w:val="single" w:sz="4" w:space="0" w:color="BFBFBF"/>
@@ -27455,26 +27356,26 @@
         </w:tc>
         <w:tc>
           <w:tcPr>
-            <w:tcW w:w="2045" w:type="dxa"/>
-            <w:tcBorders>
-              <w:top w:val="single" w:sz="4" w:space="0" w:color="BFBFBF"/>
-              <w:left w:val="single" w:sz="4" w:space="0" w:color="BFBFBF"/>
-              <w:bottom w:val="single" w:sz="4" w:space="0" w:color="BFBFBF"/>
-              <w:right w:val="single" w:sz="4" w:space="0" w:color="BFBFBF"/>
-            </w:tcBorders>
-          </w:tcPr>
-          <w:p>
-            <w:pPr>
-              <w:pStyle w:val="Compact"/>
-            </w:pPr>
-            <w:r>
-              <w:t xml:space="preserve">In the Asia Pacific Geo: Genie Agents (chat and agent mode), chat in Genie One, Genie Code's agentic features</w:t>
-            </w:r>
-          </w:p>
-        </w:tc>
-        <w:tc>
-          <w:tcPr>
-            <w:tcW w:w="1361" w:type="dxa"/>
+            <w:tcW w:w="1766" w:type="dxa"/>
+            <w:tcBorders>
+              <w:top w:val="single" w:sz="4" w:space="0" w:color="BFBFBF"/>
+              <w:left w:val="single" w:sz="4" w:space="0" w:color="BFBFBF"/>
+              <w:bottom w:val="single" w:sz="4" w:space="0" w:color="BFBFBF"/>
+              <w:right w:val="single" w:sz="4" w:space="0" w:color="BFBFBF"/>
+            </w:tcBorders>
+          </w:tcPr>
+          <w:p>
+            <w:pPr>
+              <w:pStyle w:val="Compact"/>
+            </w:pPr>
+            <w:r>
+              <w:t xml:space="preserve">In the Asia Pacific Geo: Genie Agents (Chat mode and Agent mode), chat in Genie One, Genie Code's agentic features</w:t>
+            </w:r>
+          </w:p>
+        </w:tc>
+        <w:tc>
+          <w:tcPr>
+            <w:tcW w:w="1411" w:type="dxa"/>
             <w:tcBorders>
               <w:top w:val="single" w:sz="4" w:space="0" w:color="BFBFBF"/>
               <w:left w:val="single" w:sz="4" w:space="0" w:color="BFBFBF"/>
@@ -27493,7 +27394,7 @@
         </w:tc>
         <w:tc>
           <w:tcPr>
-            <w:tcW w:w="1246" w:type="dxa"/>
+            <w:tcW w:w="1292" w:type="dxa"/>
             <w:tcBorders>
               <w:top w:val="single" w:sz="4" w:space="0" w:color="BFBFBF"/>
               <w:left w:val="single" w:sz="4" w:space="0" w:color="BFBFBF"/>
@@ -27522,7 +27423,7 @@
         </w:tc>
         <w:tc>
           <w:tcPr>
-            <w:tcW w:w="1703" w:type="dxa"/>
+            <w:tcW w:w="1766" w:type="dxa"/>
             <w:tcBorders>
               <w:top w:val="single" w:sz="4" w:space="0" w:color="BFBFBF"/>
               <w:left w:val="single" w:sz="4" w:space="0" w:color="BFBFBF"/>
@@ -27541,7 +27442,7 @@
         </w:tc>
         <w:tc>
           <w:tcPr>
-            <w:tcW w:w="904" w:type="dxa"/>
+            <w:tcW w:w="937" w:type="dxa"/>
             <w:tcBorders>
               <w:top w:val="single" w:sz="4" w:space="0" w:color="BFBFBF"/>
               <w:left w:val="single" w:sz="4" w:space="0" w:color="BFBFBF"/>
@@ -27562,7 +27463,7 @@
       <w:tr>
         <w:tc>
           <w:tcPr>
-            <w:tcW w:w="447" w:type="dxa"/>
+            <w:tcW w:w="464" w:type="dxa"/>
             <w:tcBorders>
               <w:top w:val="single" w:sz="4" w:space="0" w:color="BFBFBF"/>
               <w:left w:val="single" w:sz="4" w:space="0" w:color="BFBFBF"/>
@@ -27581,7 +27482,7 @@
         </w:tc>
         <w:tc>
           <w:tcPr>
-            <w:tcW w:w="1931" w:type="dxa"/>
+            <w:tcW w:w="2002" w:type="dxa"/>
             <w:tcBorders>
               <w:top w:val="single" w:sz="4" w:space="0" w:color="BFBFBF"/>
               <w:left w:val="single" w:sz="4" w:space="0" w:color="BFBFBF"/>
@@ -27600,7 +27501,7 @@
         </w:tc>
         <w:tc>
           <w:tcPr>
-            <w:tcW w:w="2045" w:type="dxa"/>
+            <w:tcW w:w="1766" w:type="dxa"/>
             <w:tcBorders>
               <w:top w:val="single" w:sz="4" w:space="0" w:color="BFBFBF"/>
               <w:left w:val="single" w:sz="4" w:space="0" w:color="BFBFBF"/>
@@ -27619,7 +27520,7 @@
         </w:tc>
         <w:tc>
           <w:tcPr>
-            <w:tcW w:w="1361" w:type="dxa"/>
+            <w:tcW w:w="1411" w:type="dxa"/>
             <w:tcBorders>
               <w:top w:val="single" w:sz="4" w:space="0" w:color="BFBFBF"/>
               <w:left w:val="single" w:sz="4" w:space="0" w:color="BFBFBF"/>
@@ -27654,7 +27555,7 @@
         </w:tc>
         <w:tc>
           <w:tcPr>
-            <w:tcW w:w="1246" w:type="dxa"/>
+            <w:tcW w:w="1292" w:type="dxa"/>
             <w:tcBorders>
               <w:top w:val="single" w:sz="4" w:space="0" w:color="BFBFBF"/>
               <w:left w:val="single" w:sz="4" w:space="0" w:color="BFBFBF"/>
@@ -27673,23 +27574,23 @@
         </w:tc>
         <w:tc>
           <w:tcPr>
-            <w:tcW w:w="1703" w:type="dxa"/>
-            <w:tcBorders>
-              <w:top w:val="single" w:sz="4" w:space="0" w:color="BFBFBF"/>
-              <w:left w:val="single" w:sz="4" w:space="0" w:color="BFBFBF"/>
-              <w:bottom w:val="single" w:sz="4" w:space="0" w:color="BFBFBF"/>
-              <w:right w:val="single" w:sz="4" w:space="0" w:color="BFBFBF"/>
-            </w:tcBorders>
-          </w:tcPr>
-          <w:p>
-            <w:pPr>
-              <w:pStyle w:val="Compact"/>
-            </w:pPr>
-          </w:p>
-        </w:tc>
-        <w:tc>
-          <w:tcPr>
-            <w:tcW w:w="904" w:type="dxa"/>
+            <w:tcW w:w="1766" w:type="dxa"/>
+            <w:tcBorders>
+              <w:top w:val="single" w:sz="4" w:space="0" w:color="BFBFBF"/>
+              <w:left w:val="single" w:sz="4" w:space="0" w:color="BFBFBF"/>
+              <w:bottom w:val="single" w:sz="4" w:space="0" w:color="BFBFBF"/>
+              <w:right w:val="single" w:sz="4" w:space="0" w:color="BFBFBF"/>
+            </w:tcBorders>
+          </w:tcPr>
+          <w:p>
+            <w:pPr>
+              <w:pStyle w:val="Compact"/>
+            </w:pPr>
+          </w:p>
+        </w:tc>
+        <w:tc>
+          <w:tcPr>
+            <w:tcW w:w="937" w:type="dxa"/>
             <w:tcBorders>
               <w:top w:val="single" w:sz="4" w:space="0" w:color="BFBFBF"/>
               <w:left w:val="single" w:sz="4" w:space="0" w:color="BFBFBF"/>
@@ -27710,7 +27611,7 @@
       <w:tr>
         <w:tc>
           <w:tcPr>
-            <w:tcW w:w="447" w:type="dxa"/>
+            <w:tcW w:w="464" w:type="dxa"/>
             <w:tcBorders>
               <w:top w:val="single" w:sz="4" w:space="0" w:color="BFBFBF"/>
               <w:left w:val="single" w:sz="4" w:space="0" w:color="BFBFBF"/>
@@ -27729,7 +27630,7 @@
         </w:tc>
         <w:tc>
           <w:tcPr>
-            <w:tcW w:w="1931" w:type="dxa"/>
+            <w:tcW w:w="2002" w:type="dxa"/>
             <w:tcBorders>
               <w:top w:val="single" w:sz="4" w:space="0" w:color="BFBFBF"/>
               <w:left w:val="single" w:sz="4" w:space="0" w:color="BFBFBF"/>
@@ -27777,7 +27678,7 @@
         </w:tc>
         <w:tc>
           <w:tcPr>
-            <w:tcW w:w="2045" w:type="dxa"/>
+            <w:tcW w:w="1766" w:type="dxa"/>
             <w:tcBorders>
               <w:top w:val="single" w:sz="4" w:space="0" w:color="BFBFBF"/>
               <w:left w:val="single" w:sz="4" w:space="0" w:color="BFBFBF"/>
@@ -27796,7 +27697,7 @@
         </w:tc>
         <w:tc>
           <w:tcPr>
-            <w:tcW w:w="1361" w:type="dxa"/>
+            <w:tcW w:w="1411" w:type="dxa"/>
             <w:tcBorders>
               <w:top w:val="single" w:sz="4" w:space="0" w:color="BFBFBF"/>
               <w:left w:val="single" w:sz="4" w:space="0" w:color="BFBFBF"/>
@@ -27815,7 +27716,7 @@
         </w:tc>
         <w:tc>
           <w:tcPr>
-            <w:tcW w:w="1246" w:type="dxa"/>
+            <w:tcW w:w="1292" w:type="dxa"/>
             <w:tcBorders>
               <w:top w:val="single" w:sz="4" w:space="0" w:color="BFBFBF"/>
               <w:left w:val="single" w:sz="4" w:space="0" w:color="BFBFBF"/>
@@ -27834,7 +27735,7 @@
         </w:tc>
         <w:tc>
           <w:tcPr>
-            <w:tcW w:w="1703" w:type="dxa"/>
+            <w:tcW w:w="1766" w:type="dxa"/>
             <w:tcBorders>
               <w:top w:val="single" w:sz="4" w:space="0" w:color="BFBFBF"/>
               <w:left w:val="single" w:sz="4" w:space="0" w:color="BFBFBF"/>
@@ -27853,7 +27754,7 @@
         </w:tc>
         <w:tc>
           <w:tcPr>
-            <w:tcW w:w="904" w:type="dxa"/>
+            <w:tcW w:w="937" w:type="dxa"/>
             <w:tcBorders>
               <w:top w:val="single" w:sz="4" w:space="0" w:color="BFBFBF"/>
               <w:left w:val="single" w:sz="4" w:space="0" w:color="BFBFBF"/>
@@ -27874,7 +27775,7 @@
       <w:tr>
         <w:tc>
           <w:tcPr>
-            <w:tcW w:w="447" w:type="dxa"/>
+            <w:tcW w:w="464" w:type="dxa"/>
             <w:tcBorders>
               <w:top w:val="single" w:sz="4" w:space="0" w:color="BFBFBF"/>
               <w:left w:val="single" w:sz="4" w:space="0" w:color="BFBFBF"/>
@@ -27893,7 +27794,7 @@
         </w:tc>
         <w:tc>
           <w:tcPr>
-            <w:tcW w:w="1931" w:type="dxa"/>
+            <w:tcW w:w="2002" w:type="dxa"/>
             <w:tcBorders>
               <w:top w:val="single" w:sz="4" w:space="0" w:color="BFBFBF"/>
               <w:left w:val="single" w:sz="4" w:space="0" w:color="BFBFBF"/>
@@ -27928,7 +27829,7 @@
         </w:tc>
         <w:tc>
           <w:tcPr>
-            <w:tcW w:w="2045" w:type="dxa"/>
+            <w:tcW w:w="1766" w:type="dxa"/>
             <w:tcBorders>
               <w:top w:val="single" w:sz="4" w:space="0" w:color="BFBFBF"/>
               <w:left w:val="single" w:sz="4" w:space="0" w:color="BFBFBF"/>
@@ -27947,7 +27848,7 @@
         </w:tc>
         <w:tc>
           <w:tcPr>
-            <w:tcW w:w="1361" w:type="dxa"/>
+            <w:tcW w:w="1411" w:type="dxa"/>
             <w:tcBorders>
               <w:top w:val="single" w:sz="4" w:space="0" w:color="BFBFBF"/>
               <w:left w:val="single" w:sz="4" w:space="0" w:color="BFBFBF"/>
@@ -27966,7 +27867,7 @@
         </w:tc>
         <w:tc>
           <w:tcPr>
-            <w:tcW w:w="1246" w:type="dxa"/>
+            <w:tcW w:w="1292" w:type="dxa"/>
             <w:tcBorders>
               <w:top w:val="single" w:sz="4" w:space="0" w:color="BFBFBF"/>
               <w:left w:val="single" w:sz="4" w:space="0" w:color="BFBFBF"/>
@@ -27985,23 +27886,23 @@
         </w:tc>
         <w:tc>
           <w:tcPr>
-            <w:tcW w:w="1703" w:type="dxa"/>
-            <w:tcBorders>
-              <w:top w:val="single" w:sz="4" w:space="0" w:color="BFBFBF"/>
-              <w:left w:val="single" w:sz="4" w:space="0" w:color="BFBFBF"/>
-              <w:bottom w:val="single" w:sz="4" w:space="0" w:color="BFBFBF"/>
-              <w:right w:val="single" w:sz="4" w:space="0" w:color="BFBFBF"/>
-            </w:tcBorders>
-          </w:tcPr>
-          <w:p>
-            <w:pPr>
-              <w:pStyle w:val="Compact"/>
-            </w:pPr>
-          </w:p>
-        </w:tc>
-        <w:tc>
-          <w:tcPr>
-            <w:tcW w:w="904" w:type="dxa"/>
+            <w:tcW w:w="1766" w:type="dxa"/>
+            <w:tcBorders>
+              <w:top w:val="single" w:sz="4" w:space="0" w:color="BFBFBF"/>
+              <w:left w:val="single" w:sz="4" w:space="0" w:color="BFBFBF"/>
+              <w:bottom w:val="single" w:sz="4" w:space="0" w:color="BFBFBF"/>
+              <w:right w:val="single" w:sz="4" w:space="0" w:color="BFBFBF"/>
+            </w:tcBorders>
+          </w:tcPr>
+          <w:p>
+            <w:pPr>
+              <w:pStyle w:val="Compact"/>
+            </w:pPr>
+          </w:p>
+        </w:tc>
+        <w:tc>
+          <w:tcPr>
+            <w:tcW w:w="937" w:type="dxa"/>
             <w:tcBorders>
               <w:top w:val="single" w:sz="4" w:space="0" w:color="BFBFBF"/>
               <w:left w:val="single" w:sz="4" w:space="0" w:color="BFBFBF"/>
@@ -28022,7 +27923,7 @@
       <w:tr>
         <w:tc>
           <w:tcPr>
-            <w:tcW w:w="447" w:type="dxa"/>
+            <w:tcW w:w="464" w:type="dxa"/>
             <w:tcBorders>
               <w:top w:val="single" w:sz="4" w:space="0" w:color="BFBFBF"/>
               <w:left w:val="single" w:sz="4" w:space="0" w:color="BFBFBF"/>
@@ -28041,7 +27942,7 @@
         </w:tc>
         <w:tc>
           <w:tcPr>
-            <w:tcW w:w="1931" w:type="dxa"/>
+            <w:tcW w:w="2002" w:type="dxa"/>
             <w:tcBorders>
               <w:top w:val="single" w:sz="4" w:space="0" w:color="BFBFBF"/>
               <w:left w:val="single" w:sz="4" w:space="0" w:color="BFBFBF"/>
@@ -28075,7 +27976,7 @@
         </w:tc>
         <w:tc>
           <w:tcPr>
-            <w:tcW w:w="2045" w:type="dxa"/>
+            <w:tcW w:w="1766" w:type="dxa"/>
             <w:tcBorders>
               <w:top w:val="single" w:sz="4" w:space="0" w:color="BFBFBF"/>
               <w:left w:val="single" w:sz="4" w:space="0" w:color="BFBFBF"/>
@@ -28094,7 +27995,7 @@
         </w:tc>
         <w:tc>
           <w:tcPr>
-            <w:tcW w:w="1361" w:type="dxa"/>
+            <w:tcW w:w="1411" w:type="dxa"/>
             <w:tcBorders>
               <w:top w:val="single" w:sz="4" w:space="0" w:color="BFBFBF"/>
               <w:left w:val="single" w:sz="4" w:space="0" w:color="BFBFBF"/>
@@ -28113,7 +28014,7 @@
         </w:tc>
         <w:tc>
           <w:tcPr>
-            <w:tcW w:w="1246" w:type="dxa"/>
+            <w:tcW w:w="1292" w:type="dxa"/>
             <w:tcBorders>
               <w:top w:val="single" w:sz="4" w:space="0" w:color="BFBFBF"/>
               <w:left w:val="single" w:sz="4" w:space="0" w:color="BFBFBF"/>
@@ -28132,23 +28033,23 @@
         </w:tc>
         <w:tc>
           <w:tcPr>
-            <w:tcW w:w="1703" w:type="dxa"/>
-            <w:tcBorders>
-              <w:top w:val="single" w:sz="4" w:space="0" w:color="BFBFBF"/>
-              <w:left w:val="single" w:sz="4" w:space="0" w:color="BFBFBF"/>
-              <w:bottom w:val="single" w:sz="4" w:space="0" w:color="BFBFBF"/>
-              <w:right w:val="single" w:sz="4" w:space="0" w:color="BFBFBF"/>
-            </w:tcBorders>
-          </w:tcPr>
-          <w:p>
-            <w:pPr>
-              <w:pStyle w:val="Compact"/>
-            </w:pPr>
-          </w:p>
-        </w:tc>
-        <w:tc>
-          <w:tcPr>
-            <w:tcW w:w="904" w:type="dxa"/>
+            <w:tcW w:w="1766" w:type="dxa"/>
+            <w:tcBorders>
+              <w:top w:val="single" w:sz="4" w:space="0" w:color="BFBFBF"/>
+              <w:left w:val="single" w:sz="4" w:space="0" w:color="BFBFBF"/>
+              <w:bottom w:val="single" w:sz="4" w:space="0" w:color="BFBFBF"/>
+              <w:right w:val="single" w:sz="4" w:space="0" w:color="BFBFBF"/>
+            </w:tcBorders>
+          </w:tcPr>
+          <w:p>
+            <w:pPr>
+              <w:pStyle w:val="Compact"/>
+            </w:pPr>
+          </w:p>
+        </w:tc>
+        <w:tc>
+          <w:tcPr>
+            <w:tcW w:w="937" w:type="dxa"/>
             <w:tcBorders>
               <w:top w:val="single" w:sz="4" w:space="0" w:color="BFBFBF"/>
               <w:left w:val="single" w:sz="4" w:space="0" w:color="BFBFBF"/>
@@ -28169,7 +28070,7 @@
       <w:tr>
         <w:tc>
           <w:tcPr>
-            <w:tcW w:w="447" w:type="dxa"/>
+            <w:tcW w:w="464" w:type="dxa"/>
             <w:tcBorders>
               <w:top w:val="single" w:sz="4" w:space="0" w:color="BFBFBF"/>
               <w:left w:val="single" w:sz="4" w:space="0" w:color="BFBFBF"/>
@@ -28188,7 +28089,7 @@
         </w:tc>
         <w:tc>
           <w:tcPr>
-            <w:tcW w:w="1931" w:type="dxa"/>
+            <w:tcW w:w="2002" w:type="dxa"/>
             <w:tcBorders>
               <w:top w:val="single" w:sz="4" w:space="0" w:color="BFBFBF"/>
               <w:left w:val="single" w:sz="4" w:space="0" w:color="BFBFBF"/>
@@ -28207,7 +28108,7 @@
         </w:tc>
         <w:tc>
           <w:tcPr>
-            <w:tcW w:w="2045" w:type="dxa"/>
+            <w:tcW w:w="1766" w:type="dxa"/>
             <w:tcBorders>
               <w:top w:val="single" w:sz="4" w:space="0" w:color="BFBFBF"/>
               <w:left w:val="single" w:sz="4" w:space="0" w:color="BFBFBF"/>
@@ -28226,7 +28127,7 @@
         </w:tc>
         <w:tc>
           <w:tcPr>
-            <w:tcW w:w="1361" w:type="dxa"/>
+            <w:tcW w:w="1411" w:type="dxa"/>
             <w:tcBorders>
               <w:top w:val="single" w:sz="4" w:space="0" w:color="BFBFBF"/>
               <w:left w:val="single" w:sz="4" w:space="0" w:color="BFBFBF"/>
@@ -28245,7 +28146,7 @@
         </w:tc>
         <w:tc>
           <w:tcPr>
-            <w:tcW w:w="1246" w:type="dxa"/>
+            <w:tcW w:w="1292" w:type="dxa"/>
             <w:tcBorders>
               <w:top w:val="single" w:sz="4" w:space="0" w:color="BFBFBF"/>
               <w:left w:val="single" w:sz="4" w:space="0" w:color="BFBFBF"/>
@@ -28264,23 +28165,23 @@
         </w:tc>
         <w:tc>
           <w:tcPr>
-            <w:tcW w:w="1703" w:type="dxa"/>
-            <w:tcBorders>
-              <w:top w:val="single" w:sz="4" w:space="0" w:color="BFBFBF"/>
-              <w:left w:val="single" w:sz="4" w:space="0" w:color="BFBFBF"/>
-              <w:bottom w:val="single" w:sz="4" w:space="0" w:color="BFBFBF"/>
-              <w:right w:val="single" w:sz="4" w:space="0" w:color="BFBFBF"/>
-            </w:tcBorders>
-          </w:tcPr>
-          <w:p>
-            <w:pPr>
-              <w:pStyle w:val="Compact"/>
-            </w:pPr>
-          </w:p>
-        </w:tc>
-        <w:tc>
-          <w:tcPr>
-            <w:tcW w:w="904" w:type="dxa"/>
+            <w:tcW w:w="1766" w:type="dxa"/>
+            <w:tcBorders>
+              <w:top w:val="single" w:sz="4" w:space="0" w:color="BFBFBF"/>
+              <w:left w:val="single" w:sz="4" w:space="0" w:color="BFBFBF"/>
+              <w:bottom w:val="single" w:sz="4" w:space="0" w:color="BFBFBF"/>
+              <w:right w:val="single" w:sz="4" w:space="0" w:color="BFBFBF"/>
+            </w:tcBorders>
+          </w:tcPr>
+          <w:p>
+            <w:pPr>
+              <w:pStyle w:val="Compact"/>
+            </w:pPr>
+          </w:p>
+        </w:tc>
+        <w:tc>
+          <w:tcPr>
+            <w:tcW w:w="937" w:type="dxa"/>
             <w:tcBorders>
               <w:top w:val="single" w:sz="4" w:space="0" w:color="BFBFBF"/>
               <w:left w:val="single" w:sz="4" w:space="0" w:color="BFBFBF"/>
@@ -28301,7 +28202,7 @@
       <w:tr>
         <w:tc>
           <w:tcPr>
-            <w:tcW w:w="447" w:type="dxa"/>
+            <w:tcW w:w="464" w:type="dxa"/>
             <w:tcBorders>
               <w:top w:val="single" w:sz="4" w:space="0" w:color="BFBFBF"/>
               <w:left w:val="single" w:sz="4" w:space="0" w:color="BFBFBF"/>
@@ -28320,7 +28221,7 @@
         </w:tc>
         <w:tc>
           <w:tcPr>
-            <w:tcW w:w="1931" w:type="dxa"/>
+            <w:tcW w:w="2002" w:type="dxa"/>
             <w:tcBorders>
               <w:top w:val="single" w:sz="4" w:space="0" w:color="BFBFBF"/>
               <w:left w:val="single" w:sz="4" w:space="0" w:color="BFBFBF"/>
@@ -28349,7 +28250,7 @@
         </w:tc>
         <w:tc>
           <w:tcPr>
-            <w:tcW w:w="2045" w:type="dxa"/>
+            <w:tcW w:w="1766" w:type="dxa"/>
             <w:tcBorders>
               <w:top w:val="single" w:sz="4" w:space="0" w:color="BFBFBF"/>
               <w:left w:val="single" w:sz="4" w:space="0" w:color="BFBFBF"/>
@@ -28368,7 +28269,7 @@
         </w:tc>
         <w:tc>
           <w:tcPr>
-            <w:tcW w:w="1361" w:type="dxa"/>
+            <w:tcW w:w="1411" w:type="dxa"/>
             <w:tcBorders>
               <w:top w:val="single" w:sz="4" w:space="0" w:color="BFBFBF"/>
               <w:left w:val="single" w:sz="4" w:space="0" w:color="BFBFBF"/>
@@ -28387,7 +28288,7 @@
         </w:tc>
         <w:tc>
           <w:tcPr>
-            <w:tcW w:w="1246" w:type="dxa"/>
+            <w:tcW w:w="1292" w:type="dxa"/>
             <w:tcBorders>
               <w:top w:val="single" w:sz="4" w:space="0" w:color="BFBFBF"/>
               <w:left w:val="single" w:sz="4" w:space="0" w:color="BFBFBF"/>
@@ -28406,23 +28307,23 @@
         </w:tc>
         <w:tc>
           <w:tcPr>
-            <w:tcW w:w="1703" w:type="dxa"/>
-            <w:tcBorders>
-              <w:top w:val="single" w:sz="4" w:space="0" w:color="BFBFBF"/>
-              <w:left w:val="single" w:sz="4" w:space="0" w:color="BFBFBF"/>
-              <w:bottom w:val="single" w:sz="4" w:space="0" w:color="BFBFBF"/>
-              <w:right w:val="single" w:sz="4" w:space="0" w:color="BFBFBF"/>
-            </w:tcBorders>
-          </w:tcPr>
-          <w:p>
-            <w:pPr>
-              <w:pStyle w:val="Compact"/>
-            </w:pPr>
-          </w:p>
-        </w:tc>
-        <w:tc>
-          <w:tcPr>
-            <w:tcW w:w="904" w:type="dxa"/>
+            <w:tcW w:w="1766" w:type="dxa"/>
+            <w:tcBorders>
+              <w:top w:val="single" w:sz="4" w:space="0" w:color="BFBFBF"/>
+              <w:left w:val="single" w:sz="4" w:space="0" w:color="BFBFBF"/>
+              <w:bottom w:val="single" w:sz="4" w:space="0" w:color="BFBFBF"/>
+              <w:right w:val="single" w:sz="4" w:space="0" w:color="BFBFBF"/>
+            </w:tcBorders>
+          </w:tcPr>
+          <w:p>
+            <w:pPr>
+              <w:pStyle w:val="Compact"/>
+            </w:pPr>
+          </w:p>
+        </w:tc>
+        <w:tc>
+          <w:tcPr>
+            <w:tcW w:w="937" w:type="dxa"/>
             <w:tcBorders>
               <w:top w:val="single" w:sz="4" w:space="0" w:color="BFBFBF"/>
               <w:left w:val="single" w:sz="4" w:space="0" w:color="BFBFBF"/>
@@ -28466,7 +28367,7 @@
         <w:t xml:space="preserve"> </w:t>
       </w:r>
       <w:r>
-        <w:t xml:space="preserve">Genie Agents, chat in Genie One, Genie Code's agentic capabilities and AI-assisted dashboard charts are only available with this setting on. When it is off, Genie Code still works without its agentic capabilities, using a Databricks-hosted model.</w:t>
+        <w:t xml:space="preserve">Genie Agents, chat in Genie One and Genie Code's agentic capabilities, including dashboard authoring and Designer's prompts, are only available with this setting on. When it is off, Genie Code still works without its agentic capabilities, using a Databricks-hosted model.</w:t>
       </w:r>
     </w:p>
     <w:p>
@@ -28596,6 +28497,7 @@
     <w:p>
       <w:pPr>
         <w:pStyle w:val="FirstParagraph"/>
+        <w:spacing w:before="200"/>
       </w:pPr>
       <w:r>
         <w:t xml:space="preserve">Enabling or disabling this setting is recorded as an account event in the audit logs.</w:t>
@@ -28752,6 +28654,7 @@
     <w:p>
       <w:pPr>
         <w:pStyle w:val="FirstParagraph"/>
+        <w:spacing w:before="200"/>
       </w:pPr>
       <w:r>
         <w:t xml:space="preserve">The documentation says:</w:t>
@@ -29151,6 +29054,7 @@
     <w:p>
       <w:pPr>
         <w:pStyle w:val="FirstParagraph"/>
+        <w:spacing w:before="200"/>
       </w:pPr>
       <w:r>
         <w:t xml:space="preserve">Welcome message for the Genie One homepage:</w:t>
@@ -29708,6 +29612,7 @@
     <w:p>
       <w:pPr>
         <w:pStyle w:val="BodyText"/>
+        <w:spacing w:before="200"/>
       </w:pPr>
       <w:r>
         <w:t xml:space="preserve">Sign-in is through SSO (Microsoft Entra ID).</w:t>
@@ -30443,6 +30348,7 @@
     <w:p>
       <w:pPr>
         <w:pStyle w:val="BodyText"/>
+        <w:spacing w:before="200"/>
       </w:pPr>
       <w:r>
         <w:rPr>
@@ -30715,6 +30621,7 @@
     <w:p>
       <w:pPr>
         <w:pStyle w:val="FirstParagraph"/>
+        <w:spacing w:before="200"/>
       </w:pPr>
       <w:r>
         <w:t xml:space="preserve">Granting</w:t>
@@ -30920,9 +30827,9 @@
       </w:tblPr>
       <w:tblGrid>
         <w:gridCol w:w="490"/>
-        <w:gridCol w:w="3287"/>
-        <w:gridCol w:w="3122"/>
-        <w:gridCol w:w="2739"/>
+        <w:gridCol w:w="3101"/>
+        <w:gridCol w:w="2946"/>
+        <w:gridCol w:w="3101"/>
       </w:tblGrid>
       <w:tr>
         <w:trPr>
@@ -30953,7 +30860,7 @@
         </w:tc>
         <w:tc>
           <w:tcPr>
-            <w:tcW w:w="3287" w:type="dxa"/>
+            <w:tcW w:w="3101" w:type="dxa"/>
             <w:tcBorders>
               <w:top w:val="single" w:sz="4" w:space="0" w:color="BFBFBF"/>
               <w:left w:val="single" w:sz="4" w:space="0" w:color="BFBFBF"/>
@@ -30976,7 +30883,7 @@
         </w:tc>
         <w:tc>
           <w:tcPr>
-            <w:tcW w:w="3122" w:type="dxa"/>
+            <w:tcW w:w="2946" w:type="dxa"/>
             <w:tcBorders>
               <w:top w:val="single" w:sz="4" w:space="0" w:color="BFBFBF"/>
               <w:left w:val="single" w:sz="4" w:space="0" w:color="BFBFBF"/>
@@ -30999,7 +30906,7 @@
         </w:tc>
         <w:tc>
           <w:tcPr>
-            <w:tcW w:w="2739" w:type="dxa"/>
+            <w:tcW w:w="3101" w:type="dxa"/>
             <w:tcBorders>
               <w:top w:val="single" w:sz="4" w:space="0" w:color="BFBFBF"/>
               <w:left w:val="single" w:sz="4" w:space="0" w:color="BFBFBF"/>
@@ -31043,7 +30950,7 @@
         </w:tc>
         <w:tc>
           <w:tcPr>
-            <w:tcW w:w="3287" w:type="dxa"/>
+            <w:tcW w:w="3101" w:type="dxa"/>
             <w:tcBorders>
               <w:top w:val="single" w:sz="4" w:space="0" w:color="BFBFBF"/>
               <w:left w:val="single" w:sz="4" w:space="0" w:color="BFBFBF"/>
@@ -31062,7 +30969,7 @@
         </w:tc>
         <w:tc>
           <w:tcPr>
-            <w:tcW w:w="3122" w:type="dxa"/>
+            <w:tcW w:w="2946" w:type="dxa"/>
             <w:tcBorders>
               <w:top w:val="single" w:sz="4" w:space="0" w:color="BFBFBF"/>
               <w:left w:val="single" w:sz="4" w:space="0" w:color="BFBFBF"/>
@@ -31090,7 +30997,7 @@
         </w:tc>
         <w:tc>
           <w:tcPr>
-            <w:tcW w:w="2739" w:type="dxa"/>
+            <w:tcW w:w="3101" w:type="dxa"/>
             <w:tcBorders>
               <w:top w:val="single" w:sz="4" w:space="0" w:color="BFBFBF"/>
               <w:left w:val="single" w:sz="4" w:space="0" w:color="BFBFBF"/>
@@ -31130,7 +31037,7 @@
         </w:tc>
         <w:tc>
           <w:tcPr>
-            <w:tcW w:w="3287" w:type="dxa"/>
+            <w:tcW w:w="3101" w:type="dxa"/>
             <w:tcBorders>
               <w:top w:val="single" w:sz="4" w:space="0" w:color="BFBFBF"/>
               <w:left w:val="single" w:sz="4" w:space="0" w:color="BFBFBF"/>
@@ -31165,7 +31072,7 @@
         </w:tc>
         <w:tc>
           <w:tcPr>
-            <w:tcW w:w="3122" w:type="dxa"/>
+            <w:tcW w:w="2946" w:type="dxa"/>
             <w:tcBorders>
               <w:top w:val="single" w:sz="4" w:space="0" w:color="BFBFBF"/>
               <w:left w:val="single" w:sz="4" w:space="0" w:color="BFBFBF"/>
@@ -31184,7 +31091,7 @@
         </w:tc>
         <w:tc>
           <w:tcPr>
-            <w:tcW w:w="2739" w:type="dxa"/>
+            <w:tcW w:w="3101" w:type="dxa"/>
             <w:tcBorders>
               <w:top w:val="single" w:sz="4" w:space="0" w:color="BFBFBF"/>
               <w:left w:val="single" w:sz="4" w:space="0" w:color="BFBFBF"/>
@@ -31224,7 +31131,7 @@
         </w:tc>
         <w:tc>
           <w:tcPr>
-            <w:tcW w:w="3287" w:type="dxa"/>
+            <w:tcW w:w="3101" w:type="dxa"/>
             <w:tcBorders>
               <w:top w:val="single" w:sz="4" w:space="0" w:color="BFBFBF"/>
               <w:left w:val="single" w:sz="4" w:space="0" w:color="BFBFBF"/>
@@ -31253,7 +31160,7 @@
         </w:tc>
         <w:tc>
           <w:tcPr>
-            <w:tcW w:w="3122" w:type="dxa"/>
+            <w:tcW w:w="2946" w:type="dxa"/>
             <w:tcBorders>
               <w:top w:val="single" w:sz="4" w:space="0" w:color="BFBFBF"/>
               <w:left w:val="single" w:sz="4" w:space="0" w:color="BFBFBF"/>
@@ -31272,20 +31179,20 @@
         </w:tc>
         <w:tc>
           <w:tcPr>
-            <w:tcW w:w="2739" w:type="dxa"/>
-            <w:tcBorders>
-              <w:top w:val="single" w:sz="4" w:space="0" w:color="BFBFBF"/>
-              <w:left w:val="single" w:sz="4" w:space="0" w:color="BFBFBF"/>
-              <w:bottom w:val="single" w:sz="4" w:space="0" w:color="BFBFBF"/>
-              <w:right w:val="single" w:sz="4" w:space="0" w:color="BFBFBF"/>
-            </w:tcBorders>
-          </w:tcPr>
-          <w:p>
-            <w:pPr>
-              <w:pStyle w:val="Compact"/>
-            </w:pPr>
-            <w:r>
-              <w:t xml:space="preserve">Partner-powered AI, cross-Geo (Genie Code agentic)</w:t>
+            <w:tcW w:w="3101" w:type="dxa"/>
+            <w:tcBorders>
+              <w:top w:val="single" w:sz="4" w:space="0" w:color="BFBFBF"/>
+              <w:left w:val="single" w:sz="4" w:space="0" w:color="BFBFBF"/>
+              <w:bottom w:val="single" w:sz="4" w:space="0" w:color="BFBFBF"/>
+              <w:right w:val="single" w:sz="4" w:space="0" w:color="BFBFBF"/>
+            </w:tcBorders>
+          </w:tcPr>
+          <w:p>
+            <w:pPr>
+              <w:pStyle w:val="Compact"/>
+            </w:pPr>
+            <w:r>
+              <w:t xml:space="preserve">Partner-powered AI, cross-Geo (Genie Code's agentic capabilities)</w:t>
             </w:r>
           </w:p>
         </w:tc>
@@ -31312,7 +31219,7 @@
         </w:tc>
         <w:tc>
           <w:tcPr>
-            <w:tcW w:w="3287" w:type="dxa"/>
+            <w:tcW w:w="3101" w:type="dxa"/>
             <w:tcBorders>
               <w:top w:val="single" w:sz="4" w:space="0" w:color="BFBFBF"/>
               <w:left w:val="single" w:sz="4" w:space="0" w:color="BFBFBF"/>
@@ -31370,7 +31277,7 @@
         </w:tc>
         <w:tc>
           <w:tcPr>
-            <w:tcW w:w="3122" w:type="dxa"/>
+            <w:tcW w:w="2946" w:type="dxa"/>
             <w:tcBorders>
               <w:top w:val="single" w:sz="4" w:space="0" w:color="BFBFBF"/>
               <w:left w:val="single" w:sz="4" w:space="0" w:color="BFBFBF"/>
@@ -31389,7 +31296,7 @@
         </w:tc>
         <w:tc>
           <w:tcPr>
-            <w:tcW w:w="2739" w:type="dxa"/>
+            <w:tcW w:w="3101" w:type="dxa"/>
             <w:tcBorders>
               <w:top w:val="single" w:sz="4" w:space="0" w:color="BFBFBF"/>
               <w:left w:val="single" w:sz="4" w:space="0" w:color="BFBFBF"/>
@@ -31429,7 +31336,7 @@
         </w:tc>
         <w:tc>
           <w:tcPr>
-            <w:tcW w:w="3287" w:type="dxa"/>
+            <w:tcW w:w="3101" w:type="dxa"/>
             <w:tcBorders>
               <w:top w:val="single" w:sz="4" w:space="0" w:color="BFBFBF"/>
               <w:left w:val="single" w:sz="4" w:space="0" w:color="BFBFBF"/>
@@ -31463,7 +31370,7 @@
         </w:tc>
         <w:tc>
           <w:tcPr>
-            <w:tcW w:w="3122" w:type="dxa"/>
+            <w:tcW w:w="2946" w:type="dxa"/>
             <w:tcBorders>
               <w:top w:val="single" w:sz="4" w:space="0" w:color="BFBFBF"/>
               <w:left w:val="single" w:sz="4" w:space="0" w:color="BFBFBF"/>
@@ -31482,7 +31389,7 @@
         </w:tc>
         <w:tc>
           <w:tcPr>
-            <w:tcW w:w="2739" w:type="dxa"/>
+            <w:tcW w:w="3101" w:type="dxa"/>
             <w:tcBorders>
               <w:top w:val="single" w:sz="4" w:space="0" w:color="BFBFBF"/>
               <w:left w:val="single" w:sz="4" w:space="0" w:color="BFBFBF"/>
@@ -31522,7 +31429,7 @@
         </w:tc>
         <w:tc>
           <w:tcPr>
-            <w:tcW w:w="3287" w:type="dxa"/>
+            <w:tcW w:w="3101" w:type="dxa"/>
             <w:tcBorders>
               <w:top w:val="single" w:sz="4" w:space="0" w:color="BFBFBF"/>
               <w:left w:val="single" w:sz="4" w:space="0" w:color="BFBFBF"/>
@@ -31554,7 +31461,7 @@
               <w:t xml:space="preserve">smbc_workshop.gold.group_exposure</w:t>
             </w:r>
             <w:r>
-              <w:t xml:space="preserve">; ask the AI assistant for a bar chart;</w:t>
+              <w:t xml:space="preserve">; ask Genie Code for a bar chart;</w:t>
             </w:r>
             <w:r>
               <w:t xml:space="preserve"> </w:t>
@@ -31570,7 +31477,7 @@
         </w:tc>
         <w:tc>
           <w:tcPr>
-            <w:tcW w:w="3122" w:type="dxa"/>
+            <w:tcW w:w="2946" w:type="dxa"/>
             <w:tcBorders>
               <w:top w:val="single" w:sz="4" w:space="0" w:color="BFBFBF"/>
               <w:left w:val="single" w:sz="4" w:space="0" w:color="BFBFBF"/>
@@ -31589,20 +31496,20 @@
         </w:tc>
         <w:tc>
           <w:tcPr>
-            <w:tcW w:w="2739" w:type="dxa"/>
-            <w:tcBorders>
-              <w:top w:val="single" w:sz="4" w:space="0" w:color="BFBFBF"/>
-              <w:left w:val="single" w:sz="4" w:space="0" w:color="BFBFBF"/>
-              <w:bottom w:val="single" w:sz="4" w:space="0" w:color="BFBFBF"/>
-              <w:right w:val="single" w:sz="4" w:space="0" w:color="BFBFBF"/>
-            </w:tcBorders>
-          </w:tcPr>
-          <w:p>
-            <w:pPr>
-              <w:pStyle w:val="Compact"/>
-            </w:pPr>
-            <w:r>
-              <w:t xml:space="preserve">AI/BI, AI-assisted charts</w:t>
+            <w:tcW w:w="3101" w:type="dxa"/>
+            <w:tcBorders>
+              <w:top w:val="single" w:sz="4" w:space="0" w:color="BFBFBF"/>
+              <w:left w:val="single" w:sz="4" w:space="0" w:color="BFBFBF"/>
+              <w:bottom w:val="single" w:sz="4" w:space="0" w:color="BFBFBF"/>
+              <w:right w:val="single" w:sz="4" w:space="0" w:color="BFBFBF"/>
+            </w:tcBorders>
+          </w:tcPr>
+          <w:p>
+            <w:pPr>
+              <w:pStyle w:val="Compact"/>
+            </w:pPr>
+            <w:r>
+              <w:t xml:space="preserve">AI/BI dashboards, Genie Code</w:t>
             </w:r>
           </w:p>
         </w:tc>
@@ -31629,7 +31536,7 @@
         </w:tc>
         <w:tc>
           <w:tcPr>
-            <w:tcW w:w="3287" w:type="dxa"/>
+            <w:tcW w:w="3101" w:type="dxa"/>
             <w:tcBorders>
               <w:top w:val="single" w:sz="4" w:space="0" w:color="BFBFBF"/>
               <w:left w:val="single" w:sz="4" w:space="0" w:color="BFBFBF"/>
@@ -31702,39 +31609,39 @@
         </w:tc>
         <w:tc>
           <w:tcPr>
-            <w:tcW w:w="3122" w:type="dxa"/>
-            <w:tcBorders>
-              <w:top w:val="single" w:sz="4" w:space="0" w:color="BFBFBF"/>
-              <w:left w:val="single" w:sz="4" w:space="0" w:color="BFBFBF"/>
-              <w:bottom w:val="single" w:sz="4" w:space="0" w:color="BFBFBF"/>
-              <w:right w:val="single" w:sz="4" w:space="0" w:color="BFBFBF"/>
-            </w:tcBorders>
-          </w:tcPr>
-          <w:p>
-            <w:pPr>
-              <w:pStyle w:val="Compact"/>
-            </w:pPr>
-            <w:r>
-              <w:t xml:space="preserve">Answer with SQL; agent-mode report</w:t>
-            </w:r>
-          </w:p>
-        </w:tc>
-        <w:tc>
-          <w:tcPr>
-            <w:tcW w:w="2739" w:type="dxa"/>
-            <w:tcBorders>
-              <w:top w:val="single" w:sz="4" w:space="0" w:color="BFBFBF"/>
-              <w:left w:val="single" w:sz="4" w:space="0" w:color="BFBFBF"/>
-              <w:bottom w:val="single" w:sz="4" w:space="0" w:color="BFBFBF"/>
-              <w:right w:val="single" w:sz="4" w:space="0" w:color="BFBFBF"/>
-            </w:tcBorders>
-          </w:tcPr>
-          <w:p>
-            <w:pPr>
-              <w:pStyle w:val="Compact"/>
-            </w:pPr>
-            <w:r>
-              <w:t xml:space="preserve">Genie Agents (chat and agent mode)</w:t>
+            <w:tcW w:w="2946" w:type="dxa"/>
+            <w:tcBorders>
+              <w:top w:val="single" w:sz="4" w:space="0" w:color="BFBFBF"/>
+              <w:left w:val="single" w:sz="4" w:space="0" w:color="BFBFBF"/>
+              <w:bottom w:val="single" w:sz="4" w:space="0" w:color="BFBFBF"/>
+              <w:right w:val="single" w:sz="4" w:space="0" w:color="BFBFBF"/>
+            </w:tcBorders>
+          </w:tcPr>
+          <w:p>
+            <w:pPr>
+              <w:pStyle w:val="Compact"/>
+            </w:pPr>
+            <w:r>
+              <w:t xml:space="preserve">Answer with SQL; Agent mode report</w:t>
+            </w:r>
+          </w:p>
+        </w:tc>
+        <w:tc>
+          <w:tcPr>
+            <w:tcW w:w="3101" w:type="dxa"/>
+            <w:tcBorders>
+              <w:top w:val="single" w:sz="4" w:space="0" w:color="BFBFBF"/>
+              <w:left w:val="single" w:sz="4" w:space="0" w:color="BFBFBF"/>
+              <w:bottom w:val="single" w:sz="4" w:space="0" w:color="BFBFBF"/>
+              <w:right w:val="single" w:sz="4" w:space="0" w:color="BFBFBF"/>
+            </w:tcBorders>
+          </w:tcPr>
+          <w:p>
+            <w:pPr>
+              <w:pStyle w:val="Compact"/>
+            </w:pPr>
+            <w:r>
+              <w:t xml:space="preserve">Genie Agents (Chat mode and Agent mode)</w:t>
             </w:r>
           </w:p>
         </w:tc>
@@ -31761,7 +31668,7 @@
         </w:tc>
         <w:tc>
           <w:tcPr>
-            <w:tcW w:w="3287" w:type="dxa"/>
+            <w:tcW w:w="3101" w:type="dxa"/>
             <w:tcBorders>
               <w:top w:val="single" w:sz="4" w:space="0" w:color="BFBFBF"/>
               <w:left w:val="single" w:sz="4" w:space="0" w:color="BFBFBF"/>
@@ -31795,7 +31702,7 @@
         </w:tc>
         <w:tc>
           <w:tcPr>
-            <w:tcW w:w="3122" w:type="dxa"/>
+            <w:tcW w:w="2946" w:type="dxa"/>
             <w:tcBorders>
               <w:top w:val="single" w:sz="4" w:space="0" w:color="BFBFBF"/>
               <w:left w:val="single" w:sz="4" w:space="0" w:color="BFBFBF"/>
@@ -31814,7 +31721,7 @@
         </w:tc>
         <w:tc>
           <w:tcPr>
-            <w:tcW w:w="2739" w:type="dxa"/>
+            <w:tcW w:w="3101" w:type="dxa"/>
             <w:tcBorders>
               <w:top w:val="single" w:sz="4" w:space="0" w:color="BFBFBF"/>
               <w:left w:val="single" w:sz="4" w:space="0" w:color="BFBFBF"/>
@@ -31854,7 +31761,7 @@
         </w:tc>
         <w:tc>
           <w:tcPr>
-            <w:tcW w:w="3287" w:type="dxa"/>
+            <w:tcW w:w="3101" w:type="dxa"/>
             <w:tcBorders>
               <w:top w:val="single" w:sz="4" w:space="0" w:color="BFBFBF"/>
               <w:left w:val="single" w:sz="4" w:space="0" w:color="BFBFBF"/>
@@ -31883,7 +31790,7 @@
         </w:tc>
         <w:tc>
           <w:tcPr>
-            <w:tcW w:w="3122" w:type="dxa"/>
+            <w:tcW w:w="2946" w:type="dxa"/>
             <w:tcBorders>
               <w:top w:val="single" w:sz="4" w:space="0" w:color="BFBFBF"/>
               <w:left w:val="single" w:sz="4" w:space="0" w:color="BFBFBF"/>
@@ -31902,20 +31809,20 @@
         </w:tc>
         <w:tc>
           <w:tcPr>
-            <w:tcW w:w="2739" w:type="dxa"/>
-            <w:tcBorders>
-              <w:top w:val="single" w:sz="4" w:space="0" w:color="BFBFBF"/>
-              <w:left w:val="single" w:sz="4" w:space="0" w:color="BFBFBF"/>
-              <w:bottom w:val="single" w:sz="4" w:space="0" w:color="BFBFBF"/>
-              <w:right w:val="single" w:sz="4" w:space="0" w:color="BFBFBF"/>
-            </w:tcBorders>
-          </w:tcPr>
-          <w:p>
-            <w:pPr>
-              <w:pStyle w:val="Compact"/>
-            </w:pPr>
-            <w:r>
-              <w:t xml:space="preserve">Genie Code agent mode</w:t>
+            <w:tcW w:w="3101" w:type="dxa"/>
+            <w:tcBorders>
+              <w:top w:val="single" w:sz="4" w:space="0" w:color="BFBFBF"/>
+              <w:left w:val="single" w:sz="4" w:space="0" w:color="BFBFBF"/>
+              <w:bottom w:val="single" w:sz="4" w:space="0" w:color="BFBFBF"/>
+              <w:right w:val="single" w:sz="4" w:space="0" w:color="BFBFBF"/>
+            </w:tcBorders>
+          </w:tcPr>
+          <w:p>
+            <w:pPr>
+              <w:pStyle w:val="Compact"/>
+            </w:pPr>
+            <w:r>
+              <w:t xml:space="preserve">Genie Code's agentic capabilities</w:t>
             </w:r>
           </w:p>
         </w:tc>
@@ -31942,7 +31849,7 @@
         </w:tc>
         <w:tc>
           <w:tcPr>
-            <w:tcW w:w="3287" w:type="dxa"/>
+            <w:tcW w:w="3101" w:type="dxa"/>
             <w:tcBorders>
               <w:top w:val="single" w:sz="4" w:space="0" w:color="BFBFBF"/>
               <w:left w:val="single" w:sz="4" w:space="0" w:color="BFBFBF"/>
@@ -31977,7 +31884,7 @@
         </w:tc>
         <w:tc>
           <w:tcPr>
-            <w:tcW w:w="3122" w:type="dxa"/>
+            <w:tcW w:w="2946" w:type="dxa"/>
             <w:tcBorders>
               <w:top w:val="single" w:sz="4" w:space="0" w:color="BFBFBF"/>
               <w:left w:val="single" w:sz="4" w:space="0" w:color="BFBFBF"/>
@@ -31996,7 +31903,7 @@
         </w:tc>
         <w:tc>
           <w:tcPr>
-            <w:tcW w:w="2739" w:type="dxa"/>
+            <w:tcW w:w="3101" w:type="dxa"/>
             <w:tcBorders>
               <w:top w:val="single" w:sz="4" w:space="0" w:color="BFBFBF"/>
               <w:left w:val="single" w:sz="4" w:space="0" w:color="BFBFBF"/>
@@ -32036,7 +31943,7 @@
         </w:tc>
         <w:tc>
           <w:tcPr>
-            <w:tcW w:w="3287" w:type="dxa"/>
+            <w:tcW w:w="3101" w:type="dxa"/>
             <w:tcBorders>
               <w:top w:val="single" w:sz="4" w:space="0" w:color="BFBFBF"/>
               <w:left w:val="single" w:sz="4" w:space="0" w:color="BFBFBF"/>
@@ -32071,7 +31978,7 @@
         </w:tc>
         <w:tc>
           <w:tcPr>
-            <w:tcW w:w="3122" w:type="dxa"/>
+            <w:tcW w:w="2946" w:type="dxa"/>
             <w:tcBorders>
               <w:top w:val="single" w:sz="4" w:space="0" w:color="BFBFBF"/>
               <w:left w:val="single" w:sz="4" w:space="0" w:color="BFBFBF"/>
@@ -32090,7 +31997,7 @@
         </w:tc>
         <w:tc>
           <w:tcPr>
-            <w:tcW w:w="2739" w:type="dxa"/>
+            <w:tcW w:w="3101" w:type="dxa"/>
             <w:tcBorders>
               <w:top w:val="single" w:sz="4" w:space="0" w:color="BFBFBF"/>
               <w:left w:val="single" w:sz="4" w:space="0" w:color="BFBFBF"/>
@@ -32287,7 +32194,7 @@
               <w:pStyle w:val="Compact"/>
             </w:pPr>
             <w:r>
-              <w:t xml:space="preserve">Genie Agents: chat mode</w:t>
+              <w:t xml:space="preserve">Genie Agents: Chat mode</w:t>
             </w:r>
           </w:p>
         </w:tc>
@@ -32365,7 +32272,7 @@
               <w:pStyle w:val="Compact"/>
             </w:pPr>
             <w:r>
-              <w:t xml:space="preserve">Genie Agents: agent mode</w:t>
+              <w:t xml:space="preserve">Genie Agents: Agent mode</w:t>
             </w:r>
           </w:p>
         </w:tc>
@@ -32821,6 +32728,7 @@
     <w:p>
       <w:pPr>
         <w:pStyle w:val="BodyText"/>
+        <w:spacing w:before="200"/>
       </w:pPr>
       <w:r>
         <w:t xml:space="preserve">Points the documentation makes that risk and technology reviewers usually ask about:</w:t>
@@ -32944,13 +32852,6 @@
         <w:t xml:space="preserve">Genie One and Genie Agents usage by users is free until 31 January 2027 (service principals are billed). Genie Code has been pay-as-you-go since 8 July 2026, with a free monthly allowance per user. Account admins can set budgets and cost controls for Genie.</w:t>
       </w:r>
     </w:p>
-    <w:p>
-      <w:r>
-        <w:pict>
-          <v:rect style="width:0;height:1.5pt" o:hralign="center" o:hrstd="t" o:hr="t"/>
-        </w:pict>
-      </w:r>
-    </w:p>
     <w:bookmarkEnd w:id="85"/>
     <w:bookmarkEnd w:id="86"/>
     <w:bookmarkStart w:id="87" w:name="Xe01c5abbc6e4ee016d304d30e8a24c868a0ea7b"/>
@@ -33079,6 +32980,7 @@
     <w:p>
       <w:pPr>
         <w:pStyle w:val="FirstParagraph"/>
+        <w:spacing w:before="200"/>
       </w:pPr>
       <w:r>
         <w:t xml:space="preserve">Then attach it to</w:t>
@@ -34319,6 +34221,7 @@
     <w:p>
       <w:pPr>
         <w:pStyle w:val="BodyText"/>
+        <w:spacing w:before="200"/>
       </w:pPr>
       <w:r>
         <w:t xml:space="preserve">Between a dry run and the workshop,</w:t>
@@ -34446,13 +34349,6 @@
       </w:r>
       <w:r>
         <w:t xml:space="preserve">is safe, and so is the daily data job: each morning it writes the same files and tables, an hour before the 07:00 schedule attendees give their Lab 1 pipeline. If a run fails, whoever ran step 6 gets an email. Late registrations need nothing from the setup: once they can sign in and have access to the catalog, their check-in creates their schema.</w:t>
-      </w:r>
-    </w:p>
-    <w:p>
-      <w:r>
-        <w:pict>
-          <v:rect style="width:0;height:1.5pt" o:hralign="center" o:hrstd="t" o:hr="t"/>
-        </w:pict>
       </w:r>
     </w:p>
     <w:bookmarkEnd w:id="87"/>
@@ -34635,6 +34531,7 @@
     <w:p>
       <w:pPr>
         <w:pStyle w:val="BlockText"/>
+        <w:spacing w:before="200"/>
       </w:pPr>
       <w:r>
         <w:t xml:space="preserve">Please bring your laptop and charger, and your phone for the quiz. No preparation or software installation is needed. All workshop data is synthetic.</w:t>
@@ -34702,13 +34599,6 @@
           <w:rStyle w:val="VerbatimChar"/>
         </w:rPr>
         <w:t xml:space="preserve">END</w:t>
-      </w:r>
-    </w:p>
-    <w:p>
-      <w:r>
-        <w:pict>
-          <v:rect style="width:0;height:1.5pt" o:hralign="center" o:hrstd="t" o:hr="t"/>
-        </w:pict>
       </w:r>
     </w:p>
     <w:bookmarkEnd w:id="88"/>
@@ -35457,6 +35347,7 @@
     <w:p>
       <w:pPr>
         <w:pStyle w:val="FirstParagraph"/>
+        <w:spacing w:before="200"/>
       </w:pPr>
       <w:r>
         <w:t xml:space="preserve">Fallbacks:</w:t>
@@ -36142,7 +36033,7 @@
         </w:numPr>
       </w:pPr>
       <w:r>
-        <w:t xml:space="preserve">Engineer's path: Genie Code in agent mode, with expectations, for example CONSTRAINT valid_commitment EXPECT (committed_amount &gt; 0) ON VIOLATION DROP ROW. Compare the data-quality metrics with the Guardrails output.</w:t>
+        <w:t xml:space="preserve">Engineer's path: Genie Code in the Lakeflow Pipelines Editor, with expectations, for example CONSTRAINT valid_commitment EXPECT (committed_amount &gt; 0) ON VIOLATION DROP ROW. Compare the data-quality metrics with the Guardrails output.</w:t>
       </w:r>
     </w:p>
     <w:p>
@@ -36339,18 +36230,6 @@
         <w:t xml:space="preserve">Dashboards answer the questions the Credit Committee always asks. A Genie Agent answers the follow-ups nobody built a chart for. Genie One is the simple front door for business users.</w:t>
       </w:r>
     </w:p>
-    <w:p>
-      <w:pPr>
-        <w:pStyle w:val="Compact"/>
-        <w:numPr>
-          <w:ilvl w:val="0"/>
-          <w:numId w:val="1070"/>
-        </w:numPr>
-      </w:pPr>
-      <w:r>
-        <w:t xml:space="preserve">Product names changed in 2026, and the workshop uses the current names: that's what people see in the product and the documentation.</w:t>
-      </w:r>
-    </w:p>
     <w:bookmarkEnd w:id="117"/>
     <w:bookmarkStart w:id="118" w:name="slide-26-curation-is-the-job"/>
     <w:p>
@@ -36545,6 +36424,7 @@
     <w:p>
       <w:pPr>
         <w:pStyle w:val="FirstParagraph"/>
+        <w:spacing w:before="200"/>
       </w:pPr>
       <w:r>
         <w:t xml:space="preserve">Notes:</w:t>
@@ -36589,6 +36469,7 @@
     <w:p>
       <w:pPr>
         <w:pStyle w:val="FirstParagraph"/>
+        <w:spacing w:before="200"/>
       </w:pPr>
       <w:r>
         <w:t xml:space="preserve">Fallback: if the Consumer-access user or Genie One chat fails, use the agent from Genie Agents in your own session.</w:t>
@@ -36767,7 +36648,7 @@
         </w:numPr>
       </w:pPr>
       <w:r>
-        <w:t xml:space="preserve">The AI assistant drafts the chart; people adjust it. That's the pattern for the whole lab.</w:t>
+        <w:t xml:space="preserve">Genie Code drafts the chart; people adjust it. That's the pattern for the whole lab.</w:t>
       </w:r>
     </w:p>
     <w:p>
@@ -37239,7 +37120,7 @@
         </w:numPr>
       </w:pPr>
       <w:r>
-        <w:t xml:space="preserve">Many people already use Genie Code, so skip the autocomplete basics: lead with agent mode, the legacy-SQL conversion and the approval settings.</w:t>
+        <w:t xml:space="preserve">Many people already use Genie Code, so skip the autocomplete basics: lead with what it does as an agent, the legacy-SQL conversion and the approval settings.</w:t>
       </w:r>
     </w:p>
     <w:bookmarkEnd w:id="134"/>
@@ -37273,7 +37154,7 @@
         </w:numPr>
       </w:pPr>
       <w:r>
-        <w:t xml:space="preserve">Agent mode: it plans, writes and runs code, fixes its own errors and summarises.</w:t>
+        <w:t xml:space="preserve">Genie Code works as an agent: it plans, writes and runs code, fixes its own errors and summarises.</w:t>
       </w:r>
     </w:p>
     <w:p>
@@ -38831,7 +38712,7 @@
       <w:pageBreakBefore/>
       <w:keepNext/>
       <w:keepLines/>
-      <w:spacing w:after="80" w:before="360"/>
+      <w:spacing w:after="240" w:before="0"/>
       <w:outlineLvl w:val="0"/>
     </w:pPr>
     <w:rPr>
@@ -38854,7 +38735,7 @@
     <w:pPr>
       <w:keepNext/>
       <w:keepLines/>
-      <w:spacing w:after="80" w:before="160"/>
+      <w:spacing w:after="120" w:before="480"/>
       <w:outlineLvl w:val="1"/>
     </w:pPr>
     <w:rPr>
@@ -38877,7 +38758,7 @@
     <w:pPr>
       <w:keepNext/>
       <w:keepLines/>
-      <w:spacing w:after="80" w:before="160"/>
+      <w:spacing w:after="100" w:before="360"/>
       <w:outlineLvl w:val="2"/>
     </w:pPr>
     <w:rPr>

</xml_diff>